<commit_message>
Clean + LCL and EL
Cleaned up code and moved functions to a new class.
Created formulas to calculate the LCL and EL.
</commit_message>
<xml_diff>
--- a/SkewTSimDocumentation.docx
+++ b/SkewTSimDocumentation.docx
@@ -28,15 +28,7 @@
       </w:r>
       <w:r>
         <w:br/>
-        <w:t xml:space="preserve">This means much research has to </w:t>
-      </w:r>
-      <w:proofErr w:type="spellStart"/>
-      <w:r>
-        <w:t>ben</w:t>
-      </w:r>
-      <w:proofErr w:type="spellEnd"/>
-      <w:r>
-        <w:t xml:space="preserve"> done first.</w:t>
+        <w:t>This means much research has to ben done first.</w:t>
       </w:r>
     </w:p>
     <w:p>
@@ -167,7 +159,6 @@
       </w:r>
     </w:p>
     <w:p>
-      <w:proofErr w:type="spellStart"/>
       <w:r>
         <w:t>R</w:t>
       </w:r>
@@ -176,15 +167,7 @@
           <w:sz w:val="12"/>
           <w:szCs w:val="12"/>
         </w:rPr>
-        <w:t>specific</w:t>
-      </w:r>
-      <w:proofErr w:type="spellEnd"/>
-      <w:r>
-        <w:rPr>
-          <w:sz w:val="12"/>
-          <w:szCs w:val="12"/>
-        </w:rPr>
-        <w:t xml:space="preserve"> </w:t>
+        <w:t xml:space="preserve">specific </w:t>
       </w:r>
       <w:r>
         <w:rPr>
@@ -443,23 +426,7 @@
     </w:p>
     <w:p>
       <w:r>
-        <w:t>Our given values are: height (m), pressure (</w:t>
-      </w:r>
-      <w:proofErr w:type="spellStart"/>
-      <w:r>
-        <w:t>hPa</w:t>
-      </w:r>
-      <w:proofErr w:type="spellEnd"/>
-      <w:r>
-        <w:t xml:space="preserve">), temperature (C), wet bulb (C), Dew point (C), </w:t>
-      </w:r>
-      <w:proofErr w:type="spellStart"/>
-      <w:r>
-        <w:t>Humity</w:t>
-      </w:r>
-      <w:proofErr w:type="spellEnd"/>
-      <w:r>
-        <w:t xml:space="preserve"> (%), wind speed (km/h) and wind direction (degrees). </w:t>
+        <w:t xml:space="preserve">Our given values are: height (m), pressure (hPa), temperature (C), wet bulb (C), Dew point (C), Humity (%), wind speed (km/h) and wind direction (degrees). </w:t>
       </w:r>
     </w:p>
     <w:p/>
@@ -491,15 +458,7 @@
       </w:r>
       <w:r>
         <w:br/>
-        <w:t xml:space="preserve">10.000 rows of time, pressure, temp, humidity and </w:t>
-      </w:r>
-      <w:proofErr w:type="spellStart"/>
-      <w:r>
-        <w:t>ascentRate</w:t>
-      </w:r>
-      <w:proofErr w:type="spellEnd"/>
-      <w:r>
-        <w:t>:</w:t>
+        <w:t>10.000 rows of time, pressure, temp, humidity and ascentRate:</w:t>
       </w:r>
       <w:r>
         <w:br/>
@@ -565,23 +524,7 @@
       </w:r>
       <w:r>
         <w:br/>
-        <w:t xml:space="preserve">I just got the </w:t>
-      </w:r>
-      <w:proofErr w:type="spellStart"/>
-      <w:r>
-        <w:t>german</w:t>
-      </w:r>
-      <w:proofErr w:type="spellEnd"/>
-      <w:r>
-        <w:t xml:space="preserve"> raw </w:t>
-      </w:r>
-      <w:proofErr w:type="spellStart"/>
-      <w:r>
-        <w:t>radiosconde</w:t>
-      </w:r>
-      <w:proofErr w:type="spellEnd"/>
-      <w:r>
-        <w:t>, and it does not look good, it is way different than the one of KNMI.</w:t>
+        <w:t>I just got the german raw radiosconde, and it does not look good, it is way different than the one of KNMI.</w:t>
       </w:r>
     </w:p>
     <w:p>
@@ -600,35 +543,11 @@
         <w:br/>
       </w:r>
       <w:r>
-        <w:t xml:space="preserve">I found out the KNMI offers a file called </w:t>
-      </w:r>
-      <w:proofErr w:type="spellStart"/>
-      <w:r>
-        <w:t>synchronizedSoundingData</w:t>
-      </w:r>
-      <w:proofErr w:type="spellEnd"/>
-      <w:r>
-        <w:t xml:space="preserve">, this has the things I need. </w:t>
-      </w:r>
-      <w:r>
-        <w:br/>
-        <w:t xml:space="preserve">Sounding-ID, Time since idk, exact date and time, pressure in </w:t>
-      </w:r>
-      <w:proofErr w:type="spellStart"/>
-      <w:r>
-        <w:t>hPa</w:t>
-      </w:r>
-      <w:proofErr w:type="spellEnd"/>
-      <w:r>
-        <w:t xml:space="preserve">, temp, humid, </w:t>
-      </w:r>
-      <w:proofErr w:type="spellStart"/>
-      <w:r>
-        <w:t>windDir</w:t>
-      </w:r>
-      <w:proofErr w:type="spellEnd"/>
-      <w:r>
-        <w:t xml:space="preserve">, windspeed, height, </w:t>
+        <w:t xml:space="preserve">I found out the KNMI offers a file called synchronizedSoundingData, this has the things I need. </w:t>
+      </w:r>
+      <w:r>
+        <w:br/>
+        <w:t xml:space="preserve">Sounding-ID, Time since idk, exact date and time, pressure in hPa, temp, humid, windDir, windspeed, height, </w:t>
       </w:r>
       <w:r>
         <w:t>Lat- and Longitude, altitude. These are the main things I need.</w:t>
@@ -640,15 +559,7 @@
     </w:p>
     <w:p>
       <w:r>
-        <w:t xml:space="preserve">In the </w:t>
-      </w:r>
-      <w:proofErr w:type="spellStart"/>
-      <w:r>
-        <w:t>german</w:t>
-      </w:r>
-      <w:proofErr w:type="spellEnd"/>
-      <w:r>
-        <w:t xml:space="preserve"> files, I can use the </w:t>
+        <w:t xml:space="preserve">In the german files, I can use the </w:t>
       </w:r>
       <w:r>
         <w:t>Metadaten_Sekunde_Aero_03015.txt</w:t>
@@ -675,7 +586,7 @@
         </w:rPr>
         <w:lastRenderedPageBreak/>
         <w:drawing>
-          <wp:anchor distT="0" distB="0" distL="114300" distR="114300" simplePos="0" relativeHeight="251662336" behindDoc="1" locked="0" layoutInCell="1" allowOverlap="1" wp14:anchorId="1B50E1EB" wp14:editId="677B395A">
+          <wp:anchor distT="0" distB="0" distL="114300" distR="114300" simplePos="0" relativeHeight="251662336" behindDoc="1" locked="0" layoutInCell="1" allowOverlap="1" wp14:anchorId="1B50E1EB" wp14:editId="7AE2786A">
             <wp:simplePos x="0" y="0"/>
             <wp:positionH relativeFrom="column">
               <wp:posOffset>-361481</wp:posOffset>
@@ -754,7 +665,7 @@
           <w:noProof/>
         </w:rPr>
         <w:drawing>
-          <wp:anchor distT="0" distB="0" distL="114300" distR="114300" simplePos="0" relativeHeight="251663360" behindDoc="1" locked="0" layoutInCell="1" allowOverlap="1" wp14:anchorId="6BDF185A" wp14:editId="69C28BD4">
+          <wp:anchor distT="0" distB="0" distL="114300" distR="114300" simplePos="0" relativeHeight="251663360" behindDoc="1" locked="0" layoutInCell="1" allowOverlap="1" wp14:anchorId="6BDF185A" wp14:editId="50377724">
             <wp:simplePos x="0" y="0"/>
             <wp:positionH relativeFrom="column">
               <wp:posOffset>1385918</wp:posOffset>
@@ -816,15 +727,7 @@
       </w:r>
       <w:r>
         <w:br/>
-        <w:t xml:space="preserve">And instead of using windspeed + </w:t>
-      </w:r>
-      <w:proofErr w:type="spellStart"/>
-      <w:r>
-        <w:t>windDir</w:t>
-      </w:r>
-      <w:proofErr w:type="spellEnd"/>
-      <w:r>
-        <w:t xml:space="preserve"> I could use north and east, but I won’t.</w:t>
+        <w:t>And instead of using windspeed + windDir I could use north and east, but I won’t.</w:t>
       </w:r>
     </w:p>
     <w:p>
@@ -833,26 +736,13 @@
       </w:r>
     </w:p>
     <w:p>
-      <w:proofErr w:type="spellStart"/>
-      <w:r>
-        <w:t>Lets</w:t>
-      </w:r>
-      <w:proofErr w:type="spellEnd"/>
-      <w:r>
-        <w:t xml:space="preserve"> make DWD work.</w:t>
-      </w:r>
-    </w:p>
-    <w:p>
-      <w:r>
-        <w:t xml:space="preserve">Alrighty, got it also working, it was way more complicated. </w:t>
-      </w:r>
-      <w:proofErr w:type="spellStart"/>
-      <w:r>
-        <w:t>Its</w:t>
-      </w:r>
-      <w:proofErr w:type="spellEnd"/>
-      <w:r>
-        <w:t xml:space="preserve"> is not that much slower luckily. But I do need a way to choose the date of these.</w:t>
+      <w:r>
+        <w:t>Lets make DWD work.</w:t>
+      </w:r>
+    </w:p>
+    <w:p>
+      <w:r>
+        <w:t>Alrighty, got it also working, it was way more complicated. Its is not that much slower luckily. But I do need a way to choose the date of these.</w:t>
       </w:r>
     </w:p>
     <w:p>
@@ -866,7 +756,7 @@
           <w:noProof/>
         </w:rPr>
         <w:drawing>
-          <wp:anchor distT="0" distB="0" distL="114300" distR="114300" simplePos="0" relativeHeight="251664384" behindDoc="1" locked="0" layoutInCell="1" allowOverlap="1" wp14:anchorId="1061808A" wp14:editId="06E3BC7C">
+          <wp:anchor distT="0" distB="0" distL="114300" distR="114300" simplePos="0" relativeHeight="251664384" behindDoc="1" locked="0" layoutInCell="1" allowOverlap="1" wp14:anchorId="1061808A" wp14:editId="1CD5C6C7">
             <wp:simplePos x="0" y="0"/>
             <wp:positionH relativeFrom="page">
               <wp:align>left</wp:align>
@@ -929,13 +819,8 @@
           </wp:anchor>
         </w:drawing>
       </w:r>
-      <w:proofErr w:type="spellStart"/>
-      <w:r>
-        <w:t>Lets</w:t>
-      </w:r>
-      <w:proofErr w:type="spellEnd"/>
-      <w:r>
-        <w:t xml:space="preserve"> make it actually skewed.</w:t>
+      <w:r>
+        <w:t>Lets make it actually skewed.</w:t>
       </w:r>
     </w:p>
     <w:p>
@@ -955,16 +840,11 @@
         <w:br/>
         <w:t xml:space="preserve">I also need the dry and moist </w:t>
       </w:r>
-      <w:proofErr w:type="spellStart"/>
       <w:r>
         <w:t>adiabatic</w:t>
       </w:r>
       <w:r>
-        <w:t>s</w:t>
-      </w:r>
-      <w:proofErr w:type="spellEnd"/>
-      <w:r>
-        <w:t xml:space="preserve">. </w:t>
+        <w:t xml:space="preserve">s. </w:t>
       </w:r>
     </w:p>
     <w:p/>
@@ -992,7 +872,7 @@
           <w:noProof/>
         </w:rPr>
         <w:drawing>
-          <wp:anchor distT="0" distB="0" distL="114300" distR="114300" simplePos="0" relativeHeight="251666432" behindDoc="1" locked="0" layoutInCell="1" allowOverlap="1" wp14:anchorId="30EAEABE" wp14:editId="7B22F37B">
+          <wp:anchor distT="0" distB="0" distL="114300" distR="114300" simplePos="0" relativeHeight="251666432" behindDoc="1" locked="0" layoutInCell="1" allowOverlap="1" wp14:anchorId="30EAEABE" wp14:editId="0C1F037F">
             <wp:simplePos x="0" y="0"/>
             <wp:positionH relativeFrom="column">
               <wp:posOffset>1936185</wp:posOffset>
@@ -1152,34 +1032,13 @@
         <w:t xml:space="preserve">Tw = g * ((1 + </w:t>
       </w:r>
       <w:r>
-        <w:t>(Hv * r) / (</w:t>
-      </w:r>
-      <w:proofErr w:type="spellStart"/>
-      <w:r>
-        <w:t>Rsd</w:t>
-      </w:r>
-      <w:proofErr w:type="spellEnd"/>
-      <w:r>
-        <w:t xml:space="preserve"> * T)</w:t>
+        <w:t>(Hv * r) / (Rsd * T)</w:t>
       </w:r>
       <w:r>
         <w:t>) / (</w:t>
       </w:r>
-      <w:proofErr w:type="spellStart"/>
-      <w:r>
-        <w:t>cpd</w:t>
-      </w:r>
-      <w:proofErr w:type="spellEnd"/>
-      <w:r>
-        <w:t xml:space="preserve"> + (Hv^2 * r) / </w:t>
-      </w:r>
-      <w:proofErr w:type="spellStart"/>
-      <w:r>
-        <w:t>Rsw</w:t>
-      </w:r>
-      <w:proofErr w:type="spellEnd"/>
-      <w:r>
-        <w:t xml:space="preserve"> * T^2</w:t>
+      <w:r>
+        <w:t>cpd + (Hv^2 * r) / Rsw * T^2</w:t>
       </w:r>
       <w:r>
         <w:t>))</w:t>
@@ -1209,15 +1068,7 @@
       </w:r>
       <w:r>
         <w:br/>
-        <w:t xml:space="preserve">I </w:t>
-      </w:r>
-      <w:proofErr w:type="spellStart"/>
-      <w:r>
-        <w:t>cant</w:t>
-      </w:r>
-      <w:proofErr w:type="spellEnd"/>
-      <w:r>
-        <w:t xml:space="preserve"> seem to get them right.</w:t>
+        <w:t>I cant seem to get them right.</w:t>
       </w:r>
       <w:r>
         <w:br/>
@@ -1293,13 +1144,8 @@
       </w:r>
       <w:r>
         <w:br/>
-        <w:t xml:space="preserve">dh = Cp * dT + a / ã * g  * </w:t>
-      </w:r>
-      <w:proofErr w:type="spellStart"/>
-      <w:r>
-        <w:t>dz</w:t>
-      </w:r>
-      <w:proofErr w:type="spellEnd"/>
+        <w:t>dh = Cp * dT + a / ã * g  * dz</w:t>
+      </w:r>
       <w:r>
         <w:br/>
         <w:t>ã =  (a1 + a2) / 2</w:t>
@@ -1314,31 +1160,16 @@
       </w:r>
       <w:r>
         <w:br/>
-        <w:t xml:space="preserve">0 = Cp * dT + a/ã * g * </w:t>
-      </w:r>
-      <w:proofErr w:type="spellStart"/>
-      <w:r>
-        <w:t>dz</w:t>
-      </w:r>
-      <w:proofErr w:type="spellEnd"/>
-      <w:r>
-        <w:br/>
-        <w:t xml:space="preserve">Cp * dT = -a/ã * g * </w:t>
-      </w:r>
-      <w:proofErr w:type="spellStart"/>
-      <w:r>
-        <w:t>dz</w:t>
-      </w:r>
-      <w:proofErr w:type="spellEnd"/>
-      <w:r>
-        <w:br/>
-        <w:t xml:space="preserve">dT = -a/ã * g /Cp * </w:t>
-      </w:r>
-      <w:proofErr w:type="spellStart"/>
-      <w:r>
-        <w:t>dz</w:t>
-      </w:r>
-      <w:proofErr w:type="spellEnd"/>
+        <w:t>0 = Cp * dT + a/ã * g * dz</w:t>
+      </w:r>
+      <w:r>
+        <w:br/>
+        <w:t>Cp * dT = -a/ã * g * dz</w:t>
+      </w:r>
+      <w:r>
+        <w:br/>
+        <w:t>dT = -a/ã * g /Cp * dz</w:t>
+      </w:r>
       <w:r>
         <w:br/>
         <w:t>Good enough</w:t>
@@ -1412,15 +1243,7 @@
       </w:r>
       <w:r>
         <w:br/>
-        <w:t xml:space="preserve">Okay also Cp – </w:t>
-      </w:r>
-      <w:proofErr w:type="spellStart"/>
-      <w:r>
-        <w:t>Cv</w:t>
-      </w:r>
-      <w:proofErr w:type="spellEnd"/>
-      <w:r>
-        <w:t xml:space="preserve"> = R;</w:t>
+        <w:t>Okay also Cp – Cv = R;</w:t>
       </w:r>
       <w:r>
         <w:br/>
@@ -1428,15 +1251,7 @@
       </w:r>
       <w:r>
         <w:br/>
-        <w:t xml:space="preserve">The author believes that we do not work in a constant pressure environment thus we use </w:t>
-      </w:r>
-      <w:proofErr w:type="spellStart"/>
-      <w:r>
-        <w:t>Cv</w:t>
-      </w:r>
-      <w:proofErr w:type="spellEnd"/>
-      <w:r>
-        <w:t>, because our volume is constant. (I think)</w:t>
+        <w:t>The author believes that we do not work in a constant pressure environment thus we use Cv, because our volume is constant. (I think)</w:t>
       </w:r>
       <w:r>
         <w:br/>
@@ -1470,15 +1285,7 @@
       </w:r>
       <w:r>
         <w:br/>
-        <w:t xml:space="preserve">I found out why. So, they are called also log-p diagrams, this means that the distance between 1000 and 500 </w:t>
-      </w:r>
-      <w:proofErr w:type="spellStart"/>
-      <w:r>
-        <w:t>hPa</w:t>
-      </w:r>
-      <w:proofErr w:type="spellEnd"/>
-      <w:r>
-        <w:t xml:space="preserve"> is the same as 500 and 250. </w:t>
+        <w:t xml:space="preserve">I found out why. So, they are called also log-p diagrams, this means that the distance between 1000 and 500 hPa is the same as 500 and 250. </w:t>
       </w:r>
       <w:r>
         <w:br/>
@@ -1512,15 +1319,7 @@
         </w:r>
       </w:hyperlink>
       <w:r>
-        <w:t xml:space="preserve"> This is exactly what I want to do, but it is not open source unfortunately. </w:t>
-      </w:r>
-      <w:proofErr w:type="spellStart"/>
-      <w:r>
-        <w:t>Nvm</w:t>
-      </w:r>
-      <w:proofErr w:type="spellEnd"/>
-      <w:r>
-        <w:t xml:space="preserve">, got it: </w:t>
+        <w:t xml:space="preserve"> This is exactly what I want to do, but it is not open source unfortunately. Nvm, got it: </w:t>
       </w:r>
       <w:hyperlink r:id="rId25" w:history="1">
         <w:r>
@@ -1584,15 +1383,7 @@
     </w:p>
     <w:p>
       <w:r>
-        <w:t xml:space="preserve">Seems to not fully work, I tried using it on a dry </w:t>
-      </w:r>
-      <w:proofErr w:type="spellStart"/>
-      <w:r>
-        <w:t>adiabatics</w:t>
-      </w:r>
-      <w:proofErr w:type="spellEnd"/>
-      <w:r>
-        <w:t xml:space="preserve">, but they curved okay but bended to the right. </w:t>
+        <w:t xml:space="preserve">Seems to not fully work, I tried using it on a dry adiabatics, but they curved okay but bended to the right. </w:t>
       </w:r>
       <w:r>
         <w:br/>
@@ -1616,28 +1407,12 @@
         <w:t>Okay, s</w:t>
       </w:r>
       <w:r>
-        <w:t xml:space="preserve">o I got the height I think working, so the pressure height now scales correctly, I wanted to use this with the dry adiabatic, yet it seems that the curvature is </w:t>
-      </w:r>
-      <w:proofErr w:type="spellStart"/>
-      <w:r>
-        <w:t>sooo</w:t>
-      </w:r>
-      <w:proofErr w:type="spellEnd"/>
-      <w:r>
-        <w:t xml:space="preserve"> small that I am still confused. </w:t>
-      </w:r>
-    </w:p>
-    <w:p>
-      <w:r>
-        <w:t xml:space="preserve">So, what do we do? In like 48 we did not move a </w:t>
-      </w:r>
-      <w:proofErr w:type="spellStart"/>
-      <w:r>
-        <w:t>centimeter</w:t>
-      </w:r>
-      <w:proofErr w:type="spellEnd"/>
-      <w:r>
-        <w:t>.</w:t>
+        <w:t xml:space="preserve">o I got the height I think working, so the pressure height now scales correctly, I wanted to use this with the dry adiabatic, yet it seems that the curvature is sooo small that I am still confused. </w:t>
+      </w:r>
+    </w:p>
+    <w:p>
+      <w:r>
+        <w:t>So, what do we do? In like 48 we did not move a centimeter.</w:t>
       </w:r>
       <w:r>
         <w:br/>
@@ -1652,7 +1427,7 @@
           <w:noProof/>
         </w:rPr>
         <w:drawing>
-          <wp:anchor distT="0" distB="0" distL="114300" distR="114300" simplePos="0" relativeHeight="251667456" behindDoc="1" locked="0" layoutInCell="1" allowOverlap="1" wp14:anchorId="06503D00" wp14:editId="219563D0">
+          <wp:anchor distT="0" distB="0" distL="114300" distR="114300" simplePos="0" relativeHeight="251667456" behindDoc="1" locked="0" layoutInCell="1" allowOverlap="1" wp14:anchorId="06503D00" wp14:editId="6A16EA14">
             <wp:simplePos x="0" y="0"/>
             <wp:positionH relativeFrom="page">
               <wp:align>left</wp:align>
@@ -1747,15 +1522,7 @@
         <w:br/>
       </w:r>
       <w:r>
-        <w:t xml:space="preserve">The moist </w:t>
-      </w:r>
-      <w:proofErr w:type="spellStart"/>
-      <w:r>
-        <w:t>adiabatics</w:t>
-      </w:r>
-      <w:proofErr w:type="spellEnd"/>
-      <w:r>
-        <w:t>. I tried some formulas, but they did not work. So, I took a look at the one the other codebase uses:</w:t>
+        <w:t>The moist adiabatics. I tried some formulas, but they did not work. So, I took a look at the one the other codebase uses:</w:t>
       </w:r>
       <w:r>
         <w:br/>
@@ -1834,15 +1601,7 @@
     <w:p>
       <w:r>
         <w:lastRenderedPageBreak/>
-        <w:t xml:space="preserve">Uhm, yeah, so I think I see nothing wrong, but so many ways to calculate </w:t>
-      </w:r>
-      <w:proofErr w:type="spellStart"/>
-      <w:r>
-        <w:t>rs</w:t>
-      </w:r>
-      <w:proofErr w:type="spellEnd"/>
-      <w:r>
-        <w:t xml:space="preserve">. Jeez. </w:t>
+        <w:t xml:space="preserve">Uhm, yeah, so I think I see nothing wrong, but so many ways to calculate rs. Jeez. </w:t>
       </w:r>
       <w:r>
         <w:br/>
@@ -1866,27 +1625,11 @@
       </w:r>
       <w:r>
         <w:br/>
-        <w:t xml:space="preserve">Okay that was because I was using the wrong </w:t>
-      </w:r>
-      <w:proofErr w:type="spellStart"/>
-      <w:r>
-        <w:t>ws</w:t>
-      </w:r>
-      <w:proofErr w:type="spellEnd"/>
-      <w:r>
-        <w:t xml:space="preserve"> formula?</w:t>
-      </w:r>
-      <w:r>
-        <w:br/>
-        <w:t xml:space="preserve">Still the plotting is not correct. They are bended way </w:t>
-      </w:r>
-      <w:proofErr w:type="spellStart"/>
-      <w:r>
-        <w:t>to</w:t>
-      </w:r>
-      <w:proofErr w:type="spellEnd"/>
-      <w:r>
-        <w:t xml:space="preserve"> much to the right.</w:t>
+        <w:t>Okay that was because I was using the wrong ws formula?</w:t>
+      </w:r>
+      <w:r>
+        <w:br/>
+        <w:t>Still the plotting is not correct. They are bended way to much to the right.</w:t>
       </w:r>
       <w:r>
         <w:br/>
@@ -1906,28 +1649,12 @@
     </w:p>
     <w:p>
       <w:r>
-        <w:t xml:space="preserve">I feel like I am at the same problem at where I was with the dry </w:t>
-      </w:r>
-      <w:proofErr w:type="spellStart"/>
-      <w:r>
-        <w:t>adiabatics</w:t>
-      </w:r>
-      <w:proofErr w:type="spellEnd"/>
-      <w:r>
-        <w:t>. Getting the correct change in temps but plotting it seems weird. I believe I have to reconstruct my function, but how.</w:t>
-      </w:r>
-    </w:p>
-    <w:p>
-      <w:r>
-        <w:t xml:space="preserve">Okay I implemented the code from that pdf, but </w:t>
-      </w:r>
-      <w:proofErr w:type="spellStart"/>
-      <w:r>
-        <w:t>its</w:t>
-      </w:r>
-      <w:proofErr w:type="spellEnd"/>
-      <w:r>
-        <w:t xml:space="preserve"> weird…</w:t>
+        <w:t>I feel like I am at the same problem at where I was with the dry adiabatics. Getting the correct change in temps but plotting it seems weird. I believe I have to reconstruct my function, but how.</w:t>
+      </w:r>
+    </w:p>
+    <w:p>
+      <w:r>
+        <w:t>Okay I implemented the code from that pdf, but its weird…</w:t>
       </w:r>
     </w:p>
     <w:p>
@@ -2022,27 +1749,11 @@
       </w:r>
       <w:r>
         <w:br/>
-        <w:t xml:space="preserve">I think I need to give again a look at the </w:t>
-      </w:r>
-      <w:proofErr w:type="spellStart"/>
-      <w:r>
-        <w:t>py</w:t>
-      </w:r>
-      <w:proofErr w:type="spellEnd"/>
-      <w:r>
-        <w:t xml:space="preserve"> code. </w:t>
-      </w:r>
-      <w:r>
-        <w:br/>
-        <w:t xml:space="preserve">Btw, good </w:t>
-      </w:r>
-      <w:proofErr w:type="spellStart"/>
-      <w:r>
-        <w:t>yt</w:t>
-      </w:r>
-      <w:proofErr w:type="spellEnd"/>
-      <w:r>
-        <w:t xml:space="preserve"> video: </w:t>
+        <w:t xml:space="preserve">I think I need to give again a look at the py code. </w:t>
+      </w:r>
+      <w:r>
+        <w:br/>
+        <w:t xml:space="preserve">Btw, good yt video: </w:t>
       </w:r>
       <w:hyperlink r:id="rId36" w:history="1">
         <w:r>
@@ -2057,23 +1768,7 @@
       </w:r>
       <w:r>
         <w:br/>
-        <w:t xml:space="preserve">I may see the problem, what I have been doing is checking temperature change between 1000 </w:t>
-      </w:r>
-      <w:proofErr w:type="spellStart"/>
-      <w:r>
-        <w:t>hPa</w:t>
-      </w:r>
-      <w:proofErr w:type="spellEnd"/>
-      <w:r>
-        <w:t xml:space="preserve"> and 600 </w:t>
-      </w:r>
-      <w:proofErr w:type="spellStart"/>
-      <w:r>
-        <w:t>hPa</w:t>
-      </w:r>
-      <w:proofErr w:type="spellEnd"/>
-      <w:r>
-        <w:t xml:space="preserve">, but I should take small steps: 600 and 605 and 605 and 610 etc. </w:t>
+        <w:t xml:space="preserve">I may see the problem, what I have been doing is checking temperature change between 1000 hPa and 600 hPa, but I should take small steps: 600 and 605 and 605 and 610 etc. </w:t>
       </w:r>
     </w:p>
     <w:p>
@@ -2128,22 +1823,17 @@
       </w:r>
       <w:r>
         <w:br/>
-        <w:t xml:space="preserve">I think </w:t>
-      </w:r>
-      <w:proofErr w:type="spellStart"/>
-      <w:r>
-        <w:t>its</w:t>
-      </w:r>
-      <w:proofErr w:type="spellEnd"/>
-      <w:r>
-        <w:t xml:space="preserve"> good enough:</w:t>
-      </w:r>
-    </w:p>
-    <w:p>
-      <w:r>
+        <w:t>I think its good enough:</w:t>
+      </w:r>
+    </w:p>
+    <w:p>
+      <w:r>
+        <w:rPr>
+          <w:noProof/>
+        </w:rPr>
         <w:lastRenderedPageBreak/>
         <w:drawing>
-          <wp:anchor distT="0" distB="0" distL="114300" distR="114300" simplePos="0" relativeHeight="251669504" behindDoc="1" locked="0" layoutInCell="1" allowOverlap="1" wp14:anchorId="5FB435B6" wp14:editId="6A92449B">
+          <wp:anchor distT="0" distB="0" distL="114300" distR="114300" simplePos="0" relativeHeight="251669504" behindDoc="1" locked="0" layoutInCell="1" allowOverlap="1" wp14:anchorId="5FB435B6" wp14:editId="382121B5">
             <wp:simplePos x="0" y="0"/>
             <wp:positionH relativeFrom="page">
               <wp:align>left</wp:align>
@@ -2211,28 +1901,1030 @@
       </w:r>
       <w:r>
         <w:br/>
-        <w:t xml:space="preserve">So the first few </w:t>
-      </w:r>
-      <w:proofErr w:type="spellStart"/>
-      <w:r>
-        <w:t>hPa</w:t>
-      </w:r>
-      <w:proofErr w:type="spellEnd"/>
-      <w:r>
-        <w:t xml:space="preserve"> is direct on point, but the higher the worse. </w:t>
-      </w:r>
-    </w:p>
-    <w:p>
-      <w:r>
-        <w:t xml:space="preserve">I am going to make this a </w:t>
-      </w:r>
-      <w:proofErr w:type="spellStart"/>
-      <w:r>
-        <w:t>github</w:t>
-      </w:r>
-      <w:proofErr w:type="spellEnd"/>
-      <w:r>
-        <w:t xml:space="preserve"> project since I see a future in this. </w:t>
+        <w:t xml:space="preserve">So the first few hPa is direct on point, but the higher the worse. </w:t>
+      </w:r>
+    </w:p>
+    <w:p>
+      <w:r>
+        <w:t>I am going to make this a github project since I see a future in this.</w:t>
+      </w:r>
+    </w:p>
+    <w:p/>
+    <w:p/>
+    <w:p/>
+    <w:p/>
+    <w:p/>
+    <w:p>
+      <w:pPr>
+        <w:pStyle w:val="Kop1"/>
+      </w:pPr>
+      <w:r>
+        <w:t>Thursday 6-3-2025</w:t>
+      </w:r>
+    </w:p>
+    <w:p>
+      <w:r>
+        <w:t>Alrighty, lets tidy it up a bit, create a new class for the functions.</w:t>
+      </w:r>
+    </w:p>
+    <w:p>
+      <w:r>
+        <w:t>Now, what is the next step?</w:t>
+      </w:r>
+      <w:r>
+        <w:br/>
+      </w:r>
+      <w:r>
+        <w:br/>
+        <w:t>Lets calculate the LCL, EL and more.</w:t>
+      </w:r>
+    </w:p>
+    <w:p>
+      <w:r>
+        <w:rPr>
+          <w:noProof/>
+        </w:rPr>
+        <w:drawing>
+          <wp:anchor distT="0" distB="0" distL="114300" distR="114300" simplePos="0" relativeHeight="251670528" behindDoc="1" locked="0" layoutInCell="1" allowOverlap="1" wp14:anchorId="3FC24AEA" wp14:editId="0773C5D4">
+            <wp:simplePos x="0" y="0"/>
+            <wp:positionH relativeFrom="page">
+              <wp:align>left</wp:align>
+            </wp:positionH>
+            <wp:positionV relativeFrom="paragraph">
+              <wp:posOffset>608965</wp:posOffset>
+            </wp:positionV>
+            <wp:extent cx="3467100" cy="1750366"/>
+            <wp:effectExtent l="19050" t="19050" r="19050" b="21590"/>
+            <wp:wrapTight wrapText="bothSides">
+              <wp:wrapPolygon edited="0">
+                <wp:start x="-119" y="-235"/>
+                <wp:lineTo x="-119" y="21631"/>
+                <wp:lineTo x="21600" y="21631"/>
+                <wp:lineTo x="21600" y="-235"/>
+                <wp:lineTo x="-119" y="-235"/>
+              </wp:wrapPolygon>
+            </wp:wrapTight>
+            <wp:docPr id="1696415565" name="Afbeelding 1" descr="Afbeelding met tekst, schermopname, Lettertype, nummer&#10;&#10;Door AI gegenereerde inhoud is mogelijk onjuist."/>
+            <wp:cNvGraphicFramePr>
+              <a:graphicFrameLocks xmlns:a="http://schemas.openxmlformats.org/drawingml/2006/main" noChangeAspect="1"/>
+            </wp:cNvGraphicFramePr>
+            <a:graphic xmlns:a="http://schemas.openxmlformats.org/drawingml/2006/main">
+              <a:graphicData uri="http://schemas.openxmlformats.org/drawingml/2006/picture">
+                <pic:pic xmlns:pic="http://schemas.openxmlformats.org/drawingml/2006/picture">
+                  <pic:nvPicPr>
+                    <pic:cNvPr id="1696415565" name="Afbeelding 1" descr="Afbeelding met tekst, schermopname, Lettertype, nummer&#10;&#10;Door AI gegenereerde inhoud is mogelijk onjuist."/>
+                    <pic:cNvPicPr/>
+                  </pic:nvPicPr>
+                  <pic:blipFill>
+                    <a:blip r:embed="rId39" cstate="print">
+                      <a:extLst>
+                        <a:ext uri="{28A0092B-C50C-407E-A947-70E740481C1C}">
+                          <a14:useLocalDpi xmlns:a14="http://schemas.microsoft.com/office/drawing/2010/main" val="0"/>
+                        </a:ext>
+                      </a:extLst>
+                    </a:blip>
+                    <a:stretch>
+                      <a:fillRect/>
+                    </a:stretch>
+                  </pic:blipFill>
+                  <pic:spPr>
+                    <a:xfrm>
+                      <a:off x="0" y="0"/>
+                      <a:ext cx="3467100" cy="1750366"/>
+                    </a:xfrm>
+                    <a:prstGeom prst="rect">
+                      <a:avLst/>
+                    </a:prstGeom>
+                    <a:ln>
+                      <a:solidFill>
+                        <a:schemeClr val="accent1"/>
+                      </a:solidFill>
+                    </a:ln>
+                  </pic:spPr>
+                </pic:pic>
+              </a:graphicData>
+            </a:graphic>
+          </wp:anchor>
+        </w:drawing>
+      </w:r>
+      <w:r>
+        <w:t>Starting with the LCL, pretty easy it should be.</w:t>
+      </w:r>
+      <w:r>
+        <w:br/>
+      </w:r>
+      <w:hyperlink r:id="rId40" w:history="1">
+        <w:r>
+          <w:rPr>
+            <w:rStyle w:val="Hyperlink"/>
+          </w:rPr>
+          <w:t>https://en.wikipedia.org/wiki/Lifting_condensation_level</w:t>
+        </w:r>
+      </w:hyperlink>
+      <w:r>
+        <w:t xml:space="preserve"> </w:t>
+      </w:r>
+      <w:r>
+        <w:br/>
+        <w:t xml:space="preserve">Wow, the LCL was not able to be depicted until like 2015, that’s crazy. </w:t>
+      </w:r>
+    </w:p>
+    <w:p>
+      <w:r>
+        <w:t>Sounds doable, I just need to create some more constants.</w:t>
+      </w:r>
+      <w:r>
+        <w:br/>
+        <w:t>What is Cva? Is that not just Cpd and Cpv</w:t>
+      </w:r>
+      <w:r>
+        <w:br/>
+        <w:t>but why are the values different?</w:t>
+      </w:r>
+      <w:r>
+        <w:br/>
+        <w:t xml:space="preserve">For latent heat at evaporation at the triple point I get or 2.48 or </w:t>
+      </w:r>
+      <w:r>
+        <w:tab/>
+        <w:t>2.2, and as example it is in between: 2.37, confusing. Lets use the 2.2 for now.</w:t>
+      </w:r>
+      <w:r>
+        <w:br/>
+        <w:t>oeh! I could use laberts function of boost.</w:t>
+      </w:r>
+    </w:p>
+    <w:p>
+      <w:r>
+        <w:t>First test, went okay. Values are wrong, but I think its pretty easy solvable.</w:t>
+      </w:r>
+    </w:p>
+    <w:p>
+      <w:hyperlink r:id="rId41" w:history="1">
+        <w:r>
+          <w:rPr>
+            <w:rStyle w:val="Hyperlink"/>
+          </w:rPr>
+          <w:t>https://escholarship.org/content/qt0d72911v/qt0d72911v.pdf?t=pghwe7</w:t>
+        </w:r>
+      </w:hyperlink>
+      <w:r>
+        <w:t xml:space="preserve"> This is where the wiki is based on.</w:t>
+      </w:r>
+      <w:r>
+        <w:br/>
+        <w:t>Ah, the e is just Euler’s number.</w:t>
+      </w:r>
+      <w:r>
+        <w:br/>
+        <w:t>Okay after debugging and fixing many different constants, I think I may got it.</w:t>
+      </w:r>
+    </w:p>
+    <w:p>
+      <w:r>
+        <w:rPr>
+          <w:noProof/>
+        </w:rPr>
+        <w:drawing>
+          <wp:anchor distT="0" distB="0" distL="114300" distR="114300" simplePos="0" relativeHeight="251673600" behindDoc="1" locked="0" layoutInCell="1" allowOverlap="1" wp14:anchorId="301D5EFD" wp14:editId="0310D752">
+            <wp:simplePos x="0" y="0"/>
+            <wp:positionH relativeFrom="column">
+              <wp:posOffset>3367405</wp:posOffset>
+            </wp:positionH>
+            <wp:positionV relativeFrom="paragraph">
+              <wp:posOffset>5715</wp:posOffset>
+            </wp:positionV>
+            <wp:extent cx="2038350" cy="516890"/>
+            <wp:effectExtent l="0" t="0" r="0" b="0"/>
+            <wp:wrapTight wrapText="bothSides">
+              <wp:wrapPolygon edited="0">
+                <wp:start x="0" y="0"/>
+                <wp:lineTo x="0" y="20698"/>
+                <wp:lineTo x="21398" y="20698"/>
+                <wp:lineTo x="21398" y="0"/>
+                <wp:lineTo x="0" y="0"/>
+              </wp:wrapPolygon>
+            </wp:wrapTight>
+            <wp:docPr id="1012092232" name="Afbeelding 1" descr="Afbeelding met schermopname, lijn, Elektrisch blauw&#10;&#10;Door AI gegenereerde inhoud is mogelijk onjuist."/>
+            <wp:cNvGraphicFramePr>
+              <a:graphicFrameLocks xmlns:a="http://schemas.openxmlformats.org/drawingml/2006/main" noChangeAspect="1"/>
+            </wp:cNvGraphicFramePr>
+            <a:graphic xmlns:a="http://schemas.openxmlformats.org/drawingml/2006/main">
+              <a:graphicData uri="http://schemas.openxmlformats.org/drawingml/2006/picture">
+                <pic:pic xmlns:pic="http://schemas.openxmlformats.org/drawingml/2006/picture">
+                  <pic:nvPicPr>
+                    <pic:cNvPr id="1012092232" name="Afbeelding 1" descr="Afbeelding met schermopname, lijn, Elektrisch blauw&#10;&#10;Door AI gegenereerde inhoud is mogelijk onjuist."/>
+                    <pic:cNvPicPr/>
+                  </pic:nvPicPr>
+                  <pic:blipFill>
+                    <a:blip r:embed="rId42" cstate="print">
+                      <a:extLst>
+                        <a:ext uri="{28A0092B-C50C-407E-A947-70E740481C1C}">
+                          <a14:useLocalDpi xmlns:a14="http://schemas.microsoft.com/office/drawing/2010/main" val="0"/>
+                        </a:ext>
+                      </a:extLst>
+                    </a:blip>
+                    <a:stretch>
+                      <a:fillRect/>
+                    </a:stretch>
+                  </pic:blipFill>
+                  <pic:spPr>
+                    <a:xfrm>
+                      <a:off x="0" y="0"/>
+                      <a:ext cx="2038350" cy="516890"/>
+                    </a:xfrm>
+                    <a:prstGeom prst="rect">
+                      <a:avLst/>
+                    </a:prstGeom>
+                  </pic:spPr>
+                </pic:pic>
+              </a:graphicData>
+            </a:graphic>
+            <wp14:sizeRelH relativeFrom="margin">
+              <wp14:pctWidth>0</wp14:pctWidth>
+            </wp14:sizeRelH>
+            <wp14:sizeRelV relativeFrom="margin">
+              <wp14:pctHeight>0</wp14:pctHeight>
+            </wp14:sizeRelV>
+          </wp:anchor>
+        </w:drawing>
+      </w:r>
+      <w:r>
+        <w:rPr>
+          <w:noProof/>
+        </w:rPr>
+        <w:drawing>
+          <wp:anchor distT="0" distB="0" distL="114300" distR="114300" simplePos="0" relativeHeight="251672576" behindDoc="1" locked="0" layoutInCell="1" allowOverlap="1" wp14:anchorId="63A07F16" wp14:editId="3CBD3B24">
+            <wp:simplePos x="0" y="0"/>
+            <wp:positionH relativeFrom="column">
+              <wp:posOffset>1367155</wp:posOffset>
+            </wp:positionH>
+            <wp:positionV relativeFrom="paragraph">
+              <wp:posOffset>503555</wp:posOffset>
+            </wp:positionV>
+            <wp:extent cx="3366135" cy="668655"/>
+            <wp:effectExtent l="0" t="0" r="5715" b="0"/>
+            <wp:wrapTight wrapText="bothSides">
+              <wp:wrapPolygon edited="0">
+                <wp:start x="0" y="0"/>
+                <wp:lineTo x="0" y="20923"/>
+                <wp:lineTo x="21514" y="20923"/>
+                <wp:lineTo x="21514" y="0"/>
+                <wp:lineTo x="0" y="0"/>
+              </wp:wrapPolygon>
+            </wp:wrapTight>
+            <wp:docPr id="675071047" name="Afbeelding 1" descr="Afbeelding met lijn, schermopname, Elektrisch blauw, diagram&#10;&#10;Door AI gegenereerde inhoud is mogelijk onjuist."/>
+            <wp:cNvGraphicFramePr>
+              <a:graphicFrameLocks xmlns:a="http://schemas.openxmlformats.org/drawingml/2006/main" noChangeAspect="1"/>
+            </wp:cNvGraphicFramePr>
+            <a:graphic xmlns:a="http://schemas.openxmlformats.org/drawingml/2006/main">
+              <a:graphicData uri="http://schemas.openxmlformats.org/drawingml/2006/picture">
+                <pic:pic xmlns:pic="http://schemas.openxmlformats.org/drawingml/2006/picture">
+                  <pic:nvPicPr>
+                    <pic:cNvPr id="675071047" name="Afbeelding 1" descr="Afbeelding met lijn, schermopname, Elektrisch blauw, diagram&#10;&#10;Door AI gegenereerde inhoud is mogelijk onjuist."/>
+                    <pic:cNvPicPr/>
+                  </pic:nvPicPr>
+                  <pic:blipFill>
+                    <a:blip r:embed="rId43">
+                      <a:extLst>
+                        <a:ext uri="{28A0092B-C50C-407E-A947-70E740481C1C}">
+                          <a14:useLocalDpi xmlns:a14="http://schemas.microsoft.com/office/drawing/2010/main" val="0"/>
+                        </a:ext>
+                      </a:extLst>
+                    </a:blip>
+                    <a:stretch>
+                      <a:fillRect/>
+                    </a:stretch>
+                  </pic:blipFill>
+                  <pic:spPr>
+                    <a:xfrm>
+                      <a:off x="0" y="0"/>
+                      <a:ext cx="3366135" cy="668655"/>
+                    </a:xfrm>
+                    <a:prstGeom prst="rect">
+                      <a:avLst/>
+                    </a:prstGeom>
+                  </pic:spPr>
+                </pic:pic>
+              </a:graphicData>
+            </a:graphic>
+            <wp14:sizeRelH relativeFrom="margin">
+              <wp14:pctWidth>0</wp14:pctWidth>
+            </wp14:sizeRelH>
+            <wp14:sizeRelV relativeFrom="margin">
+              <wp14:pctHeight>0</wp14:pctHeight>
+            </wp14:sizeRelV>
+          </wp:anchor>
+        </w:drawing>
+      </w:r>
+      <w:r>
+        <w:rPr>
+          <w:noProof/>
+        </w:rPr>
+        <w:drawing>
+          <wp:anchor distT="0" distB="0" distL="114300" distR="114300" simplePos="0" relativeHeight="251671552" behindDoc="1" locked="0" layoutInCell="1" allowOverlap="1" wp14:anchorId="3B1247BB" wp14:editId="1B5E1323">
+            <wp:simplePos x="0" y="0"/>
+            <wp:positionH relativeFrom="margin">
+              <wp:posOffset>-819150</wp:posOffset>
+            </wp:positionH>
+            <wp:positionV relativeFrom="paragraph">
+              <wp:posOffset>185420</wp:posOffset>
+            </wp:positionV>
+            <wp:extent cx="2127250" cy="850900"/>
+            <wp:effectExtent l="0" t="0" r="6350" b="6350"/>
+            <wp:wrapTight wrapText="bothSides">
+              <wp:wrapPolygon edited="0">
+                <wp:start x="0" y="0"/>
+                <wp:lineTo x="0" y="21278"/>
+                <wp:lineTo x="21471" y="21278"/>
+                <wp:lineTo x="21471" y="0"/>
+                <wp:lineTo x="0" y="0"/>
+              </wp:wrapPolygon>
+            </wp:wrapTight>
+            <wp:docPr id="168845504" name="Afbeelding 1" descr="Afbeelding met lijn, schermopname, diagram, Elektrisch blauw&#10;&#10;Door AI gegenereerde inhoud is mogelijk onjuist."/>
+            <wp:cNvGraphicFramePr>
+              <a:graphicFrameLocks xmlns:a="http://schemas.openxmlformats.org/drawingml/2006/main" noChangeAspect="1"/>
+            </wp:cNvGraphicFramePr>
+            <a:graphic xmlns:a="http://schemas.openxmlformats.org/drawingml/2006/main">
+              <a:graphicData uri="http://schemas.openxmlformats.org/drawingml/2006/picture">
+                <pic:pic xmlns:pic="http://schemas.openxmlformats.org/drawingml/2006/picture">
+                  <pic:nvPicPr>
+                    <pic:cNvPr id="168845504" name="Afbeelding 1" descr="Afbeelding met lijn, schermopname, diagram, Elektrisch blauw&#10;&#10;Door AI gegenereerde inhoud is mogelijk onjuist."/>
+                    <pic:cNvPicPr/>
+                  </pic:nvPicPr>
+                  <pic:blipFill>
+                    <a:blip r:embed="rId44" cstate="print">
+                      <a:extLst>
+                        <a:ext uri="{28A0092B-C50C-407E-A947-70E740481C1C}">
+                          <a14:useLocalDpi xmlns:a14="http://schemas.microsoft.com/office/drawing/2010/main" val="0"/>
+                        </a:ext>
+                      </a:extLst>
+                    </a:blip>
+                    <a:stretch>
+                      <a:fillRect/>
+                    </a:stretch>
+                  </pic:blipFill>
+                  <pic:spPr>
+                    <a:xfrm>
+                      <a:off x="0" y="0"/>
+                      <a:ext cx="2127250" cy="850900"/>
+                    </a:xfrm>
+                    <a:prstGeom prst="rect">
+                      <a:avLst/>
+                    </a:prstGeom>
+                  </pic:spPr>
+                </pic:pic>
+              </a:graphicData>
+            </a:graphic>
+            <wp14:sizeRelH relativeFrom="margin">
+              <wp14:pctWidth>0</wp14:pctWidth>
+            </wp14:sizeRelH>
+            <wp14:sizeRelV relativeFrom="margin">
+              <wp14:pctHeight>0</wp14:pctHeight>
+            </wp14:sizeRelV>
+          </wp:anchor>
+        </w:drawing>
+      </w:r>
+      <w:r>
+        <w:t>Yeah, it appears to be pretty accurate, green line is LCL:</w:t>
+      </w:r>
+      <w:r>
+        <w:br/>
+      </w:r>
+    </w:p>
+    <w:p/>
+    <w:p/>
+    <w:p/>
+    <w:p>
+      <w:r>
+        <w:lastRenderedPageBreak/>
+        <w:t xml:space="preserve">Answer is an exact replica of </w:t>
+      </w:r>
+      <w:hyperlink r:id="rId45" w:history="1">
+        <w:r>
+          <w:rPr>
+            <w:rStyle w:val="Hyperlink"/>
+          </w:rPr>
+          <w:t>http://www.csgnetwork.com/lclcalc.html</w:t>
+        </w:r>
+      </w:hyperlink>
+      <w:r>
+        <w:t xml:space="preserve"> </w:t>
+      </w:r>
+      <w:r>
+        <w:br/>
+        <w:t xml:space="preserve">So, it must be correct </w:t>
+      </w:r>
+      <w:r>
+        <w:rPr>
+          <mc:AlternateContent>
+            <mc:Choice Requires="w16se"/>
+            <mc:Fallback>
+              <w:rFonts w:ascii="Segoe UI Emoji" w:eastAsia="Segoe UI Emoji" w:hAnsi="Segoe UI Emoji" w:cs="Segoe UI Emoji"/>
+            </mc:Fallback>
+          </mc:AlternateContent>
+        </w:rPr>
+        <mc:AlternateContent>
+          <mc:Choice Requires="w16se">
+            <w16se:symEx w16se:font="Segoe UI Emoji" w16se:char="1F60A"/>
+          </mc:Choice>
+          <mc:Fallback>
+            <w:t>😊</w:t>
+          </mc:Fallback>
+        </mc:AlternateContent>
+      </w:r>
+    </w:p>
+    <w:p>
+      <w:r>
+        <w:t>Alrighty, now I guess the EL, must be fun to calculate.</w:t>
+      </w:r>
+    </w:p>
+    <w:p>
+      <w:r>
+        <w:t>Can I just do that by grabbing the LCL, following the wet adiabatic until the temp at that height is lower than the observed height?</w:t>
+      </w:r>
+    </w:p>
+    <w:p>
+      <w:r>
+        <w:rPr>
+          <w:noProof/>
+        </w:rPr>
+        <w:drawing>
+          <wp:anchor distT="0" distB="0" distL="114300" distR="114300" simplePos="0" relativeHeight="251674624" behindDoc="1" locked="0" layoutInCell="1" allowOverlap="1" wp14:anchorId="07A877E6" wp14:editId="6DCA42DD">
+            <wp:simplePos x="0" y="0"/>
+            <wp:positionH relativeFrom="margin">
+              <wp:posOffset>-285750</wp:posOffset>
+            </wp:positionH>
+            <wp:positionV relativeFrom="paragraph">
+              <wp:posOffset>730885</wp:posOffset>
+            </wp:positionV>
+            <wp:extent cx="2049145" cy="577850"/>
+            <wp:effectExtent l="0" t="0" r="8255" b="0"/>
+            <wp:wrapTight wrapText="bothSides">
+              <wp:wrapPolygon edited="0">
+                <wp:start x="0" y="0"/>
+                <wp:lineTo x="0" y="20651"/>
+                <wp:lineTo x="21486" y="20651"/>
+                <wp:lineTo x="21486" y="0"/>
+                <wp:lineTo x="0" y="0"/>
+              </wp:wrapPolygon>
+            </wp:wrapTight>
+            <wp:docPr id="1176403871" name="Afbeelding 1" descr="Afbeelding met Lettertype, wit, diagram, lijn&#10;&#10;Door AI gegenereerde inhoud is mogelijk onjuist."/>
+            <wp:cNvGraphicFramePr>
+              <a:graphicFrameLocks xmlns:a="http://schemas.openxmlformats.org/drawingml/2006/main" noChangeAspect="1"/>
+            </wp:cNvGraphicFramePr>
+            <a:graphic xmlns:a="http://schemas.openxmlformats.org/drawingml/2006/main">
+              <a:graphicData uri="http://schemas.openxmlformats.org/drawingml/2006/picture">
+                <pic:pic xmlns:pic="http://schemas.openxmlformats.org/drawingml/2006/picture">
+                  <pic:nvPicPr>
+                    <pic:cNvPr id="1176403871" name="Afbeelding 1" descr="Afbeelding met Lettertype, wit, diagram, lijn&#10;&#10;Door AI gegenereerde inhoud is mogelijk onjuist."/>
+                    <pic:cNvPicPr/>
+                  </pic:nvPicPr>
+                  <pic:blipFill>
+                    <a:blip r:embed="rId46">
+                      <a:extLst>
+                        <a:ext uri="{28A0092B-C50C-407E-A947-70E740481C1C}">
+                          <a14:useLocalDpi xmlns:a14="http://schemas.microsoft.com/office/drawing/2010/main" val="0"/>
+                        </a:ext>
+                      </a:extLst>
+                    </a:blip>
+                    <a:stretch>
+                      <a:fillRect/>
+                    </a:stretch>
+                  </pic:blipFill>
+                  <pic:spPr>
+                    <a:xfrm>
+                      <a:off x="0" y="0"/>
+                      <a:ext cx="2049145" cy="577850"/>
+                    </a:xfrm>
+                    <a:prstGeom prst="rect">
+                      <a:avLst/>
+                    </a:prstGeom>
+                  </pic:spPr>
+                </pic:pic>
+              </a:graphicData>
+            </a:graphic>
+            <wp14:sizeRelH relativeFrom="margin">
+              <wp14:pctWidth>0</wp14:pctWidth>
+            </wp14:sizeRelH>
+            <wp14:sizeRelV relativeFrom="margin">
+              <wp14:pctHeight>0</wp14:pctHeight>
+            </wp14:sizeRelV>
+          </wp:anchor>
+        </w:drawing>
+      </w:r>
+      <w:r>
+        <w:t xml:space="preserve">This is a gem: </w:t>
+      </w:r>
+      <w:hyperlink r:id="rId47" w:history="1">
+        <w:r>
+          <w:rPr>
+            <w:rStyle w:val="Hyperlink"/>
+          </w:rPr>
+          <w:t>https://www.gnss-x.ac.cn/docs/Atmospheric%20Science%20An%20Introductory%20Survey%20(John%20M.%20Wallace,%20Peter%20V.%20Hobbs)%20(z-lib.org).pdf</w:t>
+        </w:r>
+      </w:hyperlink>
+      <w:r>
+        <w:t xml:space="preserve"> </w:t>
+      </w:r>
+      <w:r>
+        <w:br/>
+        <w:t>It contains every information you need</w:t>
+      </w:r>
+    </w:p>
+    <w:p>
+      <w:r>
+        <w:t>Velocity of air parcel.</w:t>
+      </w:r>
+    </w:p>
+    <w:p/>
+    <w:p>
+      <w:r>
+        <w:t>Lets just do what I said. Weird how I can just not find a formula for EL.</w:t>
+      </w:r>
+    </w:p>
+    <w:p>
+      <w:r>
+        <w:t>MetPy: “</w:t>
+      </w:r>
+      <w:r>
+        <w:t>This works by finding the last intersection of the ideal parcel path and the measured environmental temperature. If there is one or fewer intersections, there is no equilibrium level.</w:t>
+      </w:r>
+      <w:r>
+        <w:t xml:space="preserve">” </w:t>
+      </w:r>
+      <w:r>
+        <w:br/>
+        <w:t xml:space="preserve">Seems easy I guess, I can’t really use a formula to calculate an intersection since the observed data is not just a line. </w:t>
+      </w:r>
+      <w:r>
+        <w:br/>
+        <w:t>So, for each n amount of height, I have to check if we intersected. And I believe n is just the next observed temp.</w:t>
+      </w:r>
+    </w:p>
+    <w:p>
+      <w:r>
+        <w:t>Oh, I screwed up my moist lapse rates, probably because of usage of kelvin/pascal.</w:t>
+      </w:r>
+      <w:r>
+        <w:br/>
+        <w:t>Ah I see, at the return I divided by Pa instead of hPa.</w:t>
+      </w:r>
+    </w:p>
+    <w:p>
+      <w:r>
+        <w:t xml:space="preserve">It seems my MLR is a bit off. More than usual. </w:t>
+      </w:r>
+    </w:p>
+    <w:p>
+      <w:r>
+        <w:t>I think I changed a value used by both the moist and dry lapse rate. A constant.</w:t>
+      </w:r>
+    </w:p>
+    <w:p>
+      <w:r>
+        <w:t xml:space="preserve">Huh, since when is my Hv value incorrect, it was always 2.501.000, now I get </w:t>
+      </w:r>
+      <w:r>
+        <w:t>2,268,000</w:t>
+      </w:r>
+      <w:r>
+        <w:br/>
+        <w:t>That helped, but not all.</w:t>
+      </w:r>
+      <w:r>
+        <w:br/>
+        <w:t>It may could be because the values start at hPa of 993 instead of above 1000</w:t>
+      </w:r>
+      <w:r>
+        <w:br/>
+        <w:t>And the fact that I use observed pressure data changes the adiabatics. Yes I believe this is the main case.</w:t>
+      </w:r>
+      <w:r>
+        <w:br/>
+        <w:t>Looked right, but nah.</w:t>
+      </w:r>
+      <w:r>
+        <w:br/>
+      </w:r>
+      <w:hyperlink r:id="rId48" w:history="1">
+        <w:r>
+          <w:rPr>
+            <w:rStyle w:val="Hyperlink"/>
+          </w:rPr>
+          <w:t>https://www.mide.com/air-pressure-at-altitude-calculator</w:t>
+        </w:r>
+      </w:hyperlink>
+      <w:r>
+        <w:t xml:space="preserve"> Changing formulas</w:t>
+      </w:r>
+      <w:r>
+        <w:br/>
+      </w:r>
+      <w:r>
+        <w:t>It looks alright but at some places it is still wrong, its weird…</w:t>
+      </w:r>
+      <w:r>
+        <w:t xml:space="preserve"> </w:t>
+      </w:r>
+    </w:p>
+    <w:p/>
+    <w:p>
+      <w:pPr>
+        <w:pStyle w:val="Kop1"/>
+      </w:pPr>
+      <w:r>
+        <w:lastRenderedPageBreak/>
+        <w:t>Friday 7-3-2025</w:t>
+      </w:r>
+    </w:p>
+    <w:p>
+      <w:r>
+        <w:drawing>
+          <wp:anchor distT="0" distB="0" distL="114300" distR="114300" simplePos="0" relativeHeight="251675648" behindDoc="1" locked="0" layoutInCell="1" allowOverlap="1" wp14:anchorId="1CB9B646" wp14:editId="736DB34C">
+            <wp:simplePos x="0" y="0"/>
+            <wp:positionH relativeFrom="column">
+              <wp:posOffset>-86995</wp:posOffset>
+            </wp:positionH>
+            <wp:positionV relativeFrom="paragraph">
+              <wp:posOffset>384175</wp:posOffset>
+            </wp:positionV>
+            <wp:extent cx="1473200" cy="1378585"/>
+            <wp:effectExtent l="0" t="0" r="0" b="0"/>
+            <wp:wrapTight wrapText="bothSides">
+              <wp:wrapPolygon edited="0">
+                <wp:start x="0" y="0"/>
+                <wp:lineTo x="0" y="21192"/>
+                <wp:lineTo x="21228" y="21192"/>
+                <wp:lineTo x="21228" y="0"/>
+                <wp:lineTo x="0" y="0"/>
+              </wp:wrapPolygon>
+            </wp:wrapTight>
+            <wp:docPr id="1691196931" name="Afbeelding 1" descr="Afbeelding met tekst, lijn, diagram, Perceel&#10;&#10;Door AI gegenereerde inhoud is mogelijk onjuist."/>
+            <wp:cNvGraphicFramePr>
+              <a:graphicFrameLocks xmlns:a="http://schemas.openxmlformats.org/drawingml/2006/main" noChangeAspect="1"/>
+            </wp:cNvGraphicFramePr>
+            <a:graphic xmlns:a="http://schemas.openxmlformats.org/drawingml/2006/main">
+              <a:graphicData uri="http://schemas.openxmlformats.org/drawingml/2006/picture">
+                <pic:pic xmlns:pic="http://schemas.openxmlformats.org/drawingml/2006/picture">
+                  <pic:nvPicPr>
+                    <pic:cNvPr id="1691196931" name="Afbeelding 1" descr="Afbeelding met tekst, lijn, diagram, Perceel&#10;&#10;Door AI gegenereerde inhoud is mogelijk onjuist."/>
+                    <pic:cNvPicPr/>
+                  </pic:nvPicPr>
+                  <pic:blipFill>
+                    <a:blip r:embed="rId49" cstate="print">
+                      <a:extLst>
+                        <a:ext uri="{28A0092B-C50C-407E-A947-70E740481C1C}">
+                          <a14:useLocalDpi xmlns:a14="http://schemas.microsoft.com/office/drawing/2010/main" val="0"/>
+                        </a:ext>
+                      </a:extLst>
+                    </a:blip>
+                    <a:stretch>
+                      <a:fillRect/>
+                    </a:stretch>
+                  </pic:blipFill>
+                  <pic:spPr>
+                    <a:xfrm>
+                      <a:off x="0" y="0"/>
+                      <a:ext cx="1473200" cy="1378585"/>
+                    </a:xfrm>
+                    <a:prstGeom prst="rect">
+                      <a:avLst/>
+                    </a:prstGeom>
+                  </pic:spPr>
+                </pic:pic>
+              </a:graphicData>
+            </a:graphic>
+          </wp:anchor>
+        </w:drawing>
+      </w:r>
+      <w:r>
+        <w:drawing>
+          <wp:anchor distT="0" distB="0" distL="114300" distR="114300" simplePos="0" relativeHeight="251676672" behindDoc="1" locked="0" layoutInCell="1" allowOverlap="1" wp14:anchorId="07CF9A42" wp14:editId="7664C6F1">
+            <wp:simplePos x="0" y="0"/>
+            <wp:positionH relativeFrom="column">
+              <wp:posOffset>1564005</wp:posOffset>
+            </wp:positionH>
+            <wp:positionV relativeFrom="paragraph">
+              <wp:posOffset>365760</wp:posOffset>
+            </wp:positionV>
+            <wp:extent cx="1384300" cy="1319530"/>
+            <wp:effectExtent l="0" t="0" r="6350" b="0"/>
+            <wp:wrapTight wrapText="bothSides">
+              <wp:wrapPolygon edited="0">
+                <wp:start x="0" y="0"/>
+                <wp:lineTo x="0" y="21205"/>
+                <wp:lineTo x="21402" y="21205"/>
+                <wp:lineTo x="21402" y="0"/>
+                <wp:lineTo x="0" y="0"/>
+              </wp:wrapPolygon>
+            </wp:wrapTight>
+            <wp:docPr id="1524695930" name="Afbeelding 1" descr="Afbeelding met lijn, Elektrisch blauw, Kleurrijkheid, diagram&#10;&#10;Door AI gegenereerde inhoud is mogelijk onjuist."/>
+            <wp:cNvGraphicFramePr>
+              <a:graphicFrameLocks xmlns:a="http://schemas.openxmlformats.org/drawingml/2006/main" noChangeAspect="1"/>
+            </wp:cNvGraphicFramePr>
+            <a:graphic xmlns:a="http://schemas.openxmlformats.org/drawingml/2006/main">
+              <a:graphicData uri="http://schemas.openxmlformats.org/drawingml/2006/picture">
+                <pic:pic xmlns:pic="http://schemas.openxmlformats.org/drawingml/2006/picture">
+                  <pic:nvPicPr>
+                    <pic:cNvPr id="1524695930" name="Afbeelding 1" descr="Afbeelding met lijn, Elektrisch blauw, Kleurrijkheid, diagram&#10;&#10;Door AI gegenereerde inhoud is mogelijk onjuist."/>
+                    <pic:cNvPicPr/>
+                  </pic:nvPicPr>
+                  <pic:blipFill>
+                    <a:blip r:embed="rId50" cstate="print">
+                      <a:extLst>
+                        <a:ext uri="{28A0092B-C50C-407E-A947-70E740481C1C}">
+                          <a14:useLocalDpi xmlns:a14="http://schemas.microsoft.com/office/drawing/2010/main" val="0"/>
+                        </a:ext>
+                      </a:extLst>
+                    </a:blip>
+                    <a:stretch>
+                      <a:fillRect/>
+                    </a:stretch>
+                  </pic:blipFill>
+                  <pic:spPr>
+                    <a:xfrm>
+                      <a:off x="0" y="0"/>
+                      <a:ext cx="1384300" cy="1319530"/>
+                    </a:xfrm>
+                    <a:prstGeom prst="rect">
+                      <a:avLst/>
+                    </a:prstGeom>
+                  </pic:spPr>
+                </pic:pic>
+              </a:graphicData>
+            </a:graphic>
+            <wp14:sizeRelH relativeFrom="margin">
+              <wp14:pctWidth>0</wp14:pctWidth>
+            </wp14:sizeRelH>
+            <wp14:sizeRelV relativeFrom="margin">
+              <wp14:pctHeight>0</wp14:pctHeight>
+            </wp14:sizeRelV>
+          </wp:anchor>
+        </w:drawing>
+      </w:r>
+      <w:r>
+        <w:t xml:space="preserve">My isobars are not </w:t>
+      </w:r>
+      <w:r>
+        <w:t>compatible with the ones on a real skew-T.</w:t>
+      </w:r>
+      <w:r>
+        <w:br/>
+        <w:t xml:space="preserve">That is what creates the disturbance. </w:t>
+      </w:r>
+      <w:r>
+        <w:br/>
+      </w:r>
+    </w:p>
+    <w:p/>
+    <w:p/>
+    <w:p/>
+    <w:p/>
+    <w:p>
+      <w:r>
+        <w:t xml:space="preserve">Lets compare some values to see if the problem is with our calculations or our plotting. </w:t>
+      </w:r>
+      <w:r>
+        <w:br/>
+        <w:t xml:space="preserve">It indeed seems off. Interesting. </w:t>
+      </w:r>
+      <w:r>
+        <w:br/>
+        <w:t xml:space="preserve">But my constants are exactly the same as for example metPy uses. </w:t>
+      </w:r>
+      <w:r>
+        <w:br/>
+        <w:t>I may have screwed up with kelvin and Celsius.</w:t>
+      </w:r>
+      <w:r>
+        <w:br/>
+        <w:t>Found an issue, I was calculating the vapor pressure using 611 instead of 6.11 (triple point in hPa)</w:t>
+      </w:r>
+    </w:p>
+    <w:p>
+      <w:r>
+        <w:t>Currently my values are very close to the ones of metPy, but still off.</w:t>
+      </w:r>
+    </w:p>
+    <w:p>
+      <w:r>
+        <w:t xml:space="preserve">Huh, I get a weird offset of value,it should be </w:t>
+      </w:r>
+      <w:r>
+        <w:t xml:space="preserve">20.7079, but I get 20.709, small difference but still. </w:t>
+      </w:r>
+      <w:r>
+        <w:br/>
+        <w:t>Now the temps are off again… nvm its closer again.</w:t>
+      </w:r>
+      <w:r>
+        <w:br/>
+        <w:t xml:space="preserve">My adiabatics are plotted around 0.3 temp to cold. </w:t>
+      </w:r>
+    </w:p>
+    <w:p>
+      <w:r>
+        <w:t xml:space="preserve">For the DWD, I may also should read the ground temps, this differs from the first iteration in the radiosonde. </w:t>
+      </w:r>
+    </w:p>
+    <w:p>
+      <w:r>
+        <w:t xml:space="preserve">Using the height at standard pressure, the height at 1000 hPa (bottom line in skew-T) should be </w:t>
+      </w:r>
+      <w:r>
+        <w:t>89.7071991</w:t>
+      </w:r>
+      <w:r>
+        <w:br/>
+        <w:t>What does this mean for our observed temps?</w:t>
+      </w:r>
+      <w:r>
+        <w:br/>
+        <w:t>It looks like in the skew-T they plant the ground temp at 1000 hPa</w:t>
+      </w:r>
+      <w:r>
+        <w:t>.</w:t>
+      </w:r>
+      <w:r>
+        <w:br/>
+        <w:t>what I should do is grab the ground temp, add it to the list and make it 1000 hPa (bottom)</w:t>
+      </w:r>
+      <w:r>
+        <w:br/>
+        <w:t xml:space="preserve">I don’t get an altitude at the ground level, station level is higher than first reading, so idk where to put the ground temps in terms of difference in height of the second value. </w:t>
+      </w:r>
+    </w:p>
+    <w:p>
+      <w:r>
+        <w:t>Wait, it does read ground temp (sort of) but I never included those values in the skew-T?</w:t>
+      </w:r>
+      <w:r>
+        <w:br/>
+        <w:t>I see, I skip always 2 extra lines for some reason (reason is obvious).</w:t>
+      </w:r>
+      <w:r>
+        <w:br/>
+        <w:t>Fixed it.</w:t>
+      </w:r>
+    </w:p>
+    <w:p>
+      <w:r>
+        <w:t>Now the EL seem to be the same as the one on meteologix, nice. Now just offset the temps.</w:t>
+      </w:r>
+      <w:r>
+        <w:br/>
+        <w:t>Do I just put them lower, or do I need to change everything?</w:t>
+      </w:r>
+      <w:r>
+        <w:br/>
+        <w:t>For now I will just lower them.</w:t>
+      </w:r>
+    </w:p>
+    <w:p>
+      <w:r>
+        <w:t>Okay, did that, but it did not fix the adiabatic problems…</w:t>
+      </w:r>
+    </w:p>
+    <w:p>
+      <w:r>
+        <w:lastRenderedPageBreak/>
+        <w:drawing>
+          <wp:anchor distT="0" distB="0" distL="114300" distR="114300" simplePos="0" relativeHeight="251678720" behindDoc="1" locked="0" layoutInCell="1" allowOverlap="1" wp14:anchorId="5A7E72E5" wp14:editId="3611AF36">
+            <wp:simplePos x="0" y="0"/>
+            <wp:positionH relativeFrom="column">
+              <wp:posOffset>3665855</wp:posOffset>
+            </wp:positionH>
+            <wp:positionV relativeFrom="paragraph">
+              <wp:posOffset>1905</wp:posOffset>
+            </wp:positionV>
+            <wp:extent cx="1797050" cy="1772289"/>
+            <wp:effectExtent l="0" t="0" r="0" b="0"/>
+            <wp:wrapTight wrapText="bothSides">
+              <wp:wrapPolygon edited="0">
+                <wp:start x="0" y="0"/>
+                <wp:lineTo x="0" y="21360"/>
+                <wp:lineTo x="21295" y="21360"/>
+                <wp:lineTo x="21295" y="0"/>
+                <wp:lineTo x="0" y="0"/>
+              </wp:wrapPolygon>
+            </wp:wrapTight>
+            <wp:docPr id="1099302219" name="Afbeelding 1" descr="Afbeelding met schermopname, lijn, Kleurrijkheid, Parallel&#10;&#10;Door AI gegenereerde inhoud is mogelijk onjuist."/>
+            <wp:cNvGraphicFramePr>
+              <a:graphicFrameLocks xmlns:a="http://schemas.openxmlformats.org/drawingml/2006/main" noChangeAspect="1"/>
+            </wp:cNvGraphicFramePr>
+            <a:graphic xmlns:a="http://schemas.openxmlformats.org/drawingml/2006/main">
+              <a:graphicData uri="http://schemas.openxmlformats.org/drawingml/2006/picture">
+                <pic:pic xmlns:pic="http://schemas.openxmlformats.org/drawingml/2006/picture">
+                  <pic:nvPicPr>
+                    <pic:cNvPr id="1099302219" name="Afbeelding 1" descr="Afbeelding met schermopname, lijn, Kleurrijkheid, Parallel&#10;&#10;Door AI gegenereerde inhoud is mogelijk onjuist."/>
+                    <pic:cNvPicPr/>
+                  </pic:nvPicPr>
+                  <pic:blipFill>
+                    <a:blip r:embed="rId51" cstate="print">
+                      <a:extLst>
+                        <a:ext uri="{28A0092B-C50C-407E-A947-70E740481C1C}">
+                          <a14:useLocalDpi xmlns:a14="http://schemas.microsoft.com/office/drawing/2010/main" val="0"/>
+                        </a:ext>
+                      </a:extLst>
+                    </a:blip>
+                    <a:stretch>
+                      <a:fillRect/>
+                    </a:stretch>
+                  </pic:blipFill>
+                  <pic:spPr>
+                    <a:xfrm>
+                      <a:off x="0" y="0"/>
+                      <a:ext cx="1797050" cy="1772289"/>
+                    </a:xfrm>
+                    <a:prstGeom prst="rect">
+                      <a:avLst/>
+                    </a:prstGeom>
+                  </pic:spPr>
+                </pic:pic>
+              </a:graphicData>
+            </a:graphic>
+          </wp:anchor>
+        </w:drawing>
+      </w:r>
+      <w:r>
+        <w:drawing>
+          <wp:anchor distT="0" distB="0" distL="114300" distR="114300" simplePos="0" relativeHeight="251677696" behindDoc="1" locked="0" layoutInCell="1" allowOverlap="1" wp14:anchorId="71EE4695" wp14:editId="3FAB9F79">
+            <wp:simplePos x="0" y="0"/>
+            <wp:positionH relativeFrom="column">
+              <wp:posOffset>1798955</wp:posOffset>
+            </wp:positionH>
+            <wp:positionV relativeFrom="paragraph">
+              <wp:posOffset>14605</wp:posOffset>
+            </wp:positionV>
+            <wp:extent cx="1771650" cy="1757680"/>
+            <wp:effectExtent l="0" t="0" r="0" b="0"/>
+            <wp:wrapTight wrapText="bothSides">
+              <wp:wrapPolygon edited="0">
+                <wp:start x="0" y="0"/>
+                <wp:lineTo x="0" y="21303"/>
+                <wp:lineTo x="21368" y="21303"/>
+                <wp:lineTo x="21368" y="0"/>
+                <wp:lineTo x="0" y="0"/>
+              </wp:wrapPolygon>
+            </wp:wrapTight>
+            <wp:docPr id="172979401" name="Afbeelding 1" descr="Afbeelding met tekst, lijn, diagram, Perceel&#10;&#10;Door AI gegenereerde inhoud is mogelijk onjuist."/>
+            <wp:cNvGraphicFramePr>
+              <a:graphicFrameLocks xmlns:a="http://schemas.openxmlformats.org/drawingml/2006/main" noChangeAspect="1"/>
+            </wp:cNvGraphicFramePr>
+            <a:graphic xmlns:a="http://schemas.openxmlformats.org/drawingml/2006/main">
+              <a:graphicData uri="http://schemas.openxmlformats.org/drawingml/2006/picture">
+                <pic:pic xmlns:pic="http://schemas.openxmlformats.org/drawingml/2006/picture">
+                  <pic:nvPicPr>
+                    <pic:cNvPr id="172979401" name="Afbeelding 1" descr="Afbeelding met tekst, lijn, diagram, Perceel&#10;&#10;Door AI gegenereerde inhoud is mogelijk onjuist."/>
+                    <pic:cNvPicPr/>
+                  </pic:nvPicPr>
+                  <pic:blipFill>
+                    <a:blip r:embed="rId52" cstate="print">
+                      <a:extLst>
+                        <a:ext uri="{28A0092B-C50C-407E-A947-70E740481C1C}">
+                          <a14:useLocalDpi xmlns:a14="http://schemas.microsoft.com/office/drawing/2010/main" val="0"/>
+                        </a:ext>
+                      </a:extLst>
+                    </a:blip>
+                    <a:stretch>
+                      <a:fillRect/>
+                    </a:stretch>
+                  </pic:blipFill>
+                  <pic:spPr>
+                    <a:xfrm>
+                      <a:off x="0" y="0"/>
+                      <a:ext cx="1771650" cy="1757680"/>
+                    </a:xfrm>
+                    <a:prstGeom prst="rect">
+                      <a:avLst/>
+                    </a:prstGeom>
+                  </pic:spPr>
+                </pic:pic>
+              </a:graphicData>
+            </a:graphic>
+          </wp:anchor>
+        </w:drawing>
+      </w:r>
+      <w:r>
+        <w:t>As seen, if you compare them both, even though I set them 1-1 next to each other. The adiabatic still go very wrong below 0, also temps differ</w:t>
+      </w:r>
+      <w:r>
+        <w:t>.</w:t>
+      </w:r>
+    </w:p>
+    <w:p>
+      <w:r>
+        <w:t>I am a bit confused on how it still is wrong. The temp difference I got from my calculations (comparing) was only like 1 degree. So it must be the plotting. The temps probably have to be plotted somehow else? No its probably the adiabatics that are wrong. But also temps differ?</w:t>
+      </w:r>
+    </w:p>
+    <w:p>
+      <w:r>
+        <w:t>Yeah I feel like 2 things are going on, first the temps are not scaled for log-P which is very obvious the lower you go in the chart.</w:t>
+      </w:r>
+      <w:r>
+        <w:br/>
+        <w:t>The second thing is that the adiabatics don’t correctly follow.</w:t>
       </w:r>
     </w:p>
     <w:sectPr>
@@ -2833,7 +3525,6 @@
     <w:next w:val="Standaard"/>
     <w:link w:val="Kop2Char"/>
     <w:uiPriority w:val="9"/>
-    <w:semiHidden/>
     <w:unhideWhenUsed/>
     <w:qFormat/>
     <w:rsid w:val="00E6228F"/>
@@ -3051,7 +3742,6 @@
     <w:basedOn w:val="Standaardalinea-lettertype"/>
     <w:link w:val="Kop2"/>
     <w:uiPriority w:val="9"/>
-    <w:semiHidden/>
     <w:rsid w:val="00E6228F"/>
     <w:rPr>
       <w:rFonts w:asciiTheme="majorHAnsi" w:eastAsiaTheme="majorEastAsia" w:hAnsiTheme="majorHAnsi" w:cstheme="majorBidi"/>

</xml_diff>

<commit_message>
Fix, CCL, LFC, CAPE and cleanup
Fixed values of MLR incrementing more than 1. This now results in a correct display of the MLR.
Added a way to convert easily to plotting coordinates
Added CCL, LFC and CAPE to calculations and debug.
Cleaned up some files.
</commit_message>
<xml_diff>
--- a/SkewTSimDocumentation.docx
+++ b/SkewTSimDocumentation.docx
@@ -28,7 +28,15 @@
       </w:r>
       <w:r>
         <w:br/>
-        <w:t>This means much research has to ben done first.</w:t>
+        <w:t xml:space="preserve">This means much research has to </w:t>
+      </w:r>
+      <w:proofErr w:type="spellStart"/>
+      <w:r>
+        <w:t>ben</w:t>
+      </w:r>
+      <w:proofErr w:type="spellEnd"/>
+      <w:r>
+        <w:t xml:space="preserve"> done first.</w:t>
       </w:r>
     </w:p>
     <w:p>
@@ -159,6 +167,7 @@
       </w:r>
     </w:p>
     <w:p>
+      <w:proofErr w:type="spellStart"/>
       <w:r>
         <w:t>R</w:t>
       </w:r>
@@ -167,7 +176,15 @@
           <w:sz w:val="12"/>
           <w:szCs w:val="12"/>
         </w:rPr>
-        <w:t xml:space="preserve">specific </w:t>
+        <w:t>specific</w:t>
+      </w:r>
+      <w:proofErr w:type="spellEnd"/>
+      <w:r>
+        <w:rPr>
+          <w:sz w:val="12"/>
+          <w:szCs w:val="12"/>
+        </w:rPr>
+        <w:t xml:space="preserve"> </w:t>
       </w:r>
       <w:r>
         <w:rPr>
@@ -426,7 +443,23 @@
     </w:p>
     <w:p>
       <w:r>
-        <w:t xml:space="preserve">Our given values are: height (m), pressure (hPa), temperature (C), wet bulb (C), Dew point (C), Humity (%), wind speed (km/h) and wind direction (degrees). </w:t>
+        <w:t>Our given values are: height (m), pressure (</w:t>
+      </w:r>
+      <w:proofErr w:type="spellStart"/>
+      <w:r>
+        <w:t>hPa</w:t>
+      </w:r>
+      <w:proofErr w:type="spellEnd"/>
+      <w:r>
+        <w:t xml:space="preserve">), temperature (C), wet bulb (C), Dew point (C), </w:t>
+      </w:r>
+      <w:proofErr w:type="spellStart"/>
+      <w:r>
+        <w:t>Humity</w:t>
+      </w:r>
+      <w:proofErr w:type="spellEnd"/>
+      <w:r>
+        <w:t xml:space="preserve"> (%), wind speed (km/h) and wind direction (degrees). </w:t>
       </w:r>
     </w:p>
     <w:p/>
@@ -458,7 +491,15 @@
       </w:r>
       <w:r>
         <w:br/>
-        <w:t>10.000 rows of time, pressure, temp, humidity and ascentRate:</w:t>
+        <w:t xml:space="preserve">10.000 rows of time, pressure, temp, humidity and </w:t>
+      </w:r>
+      <w:proofErr w:type="spellStart"/>
+      <w:r>
+        <w:t>ascentRate</w:t>
+      </w:r>
+      <w:proofErr w:type="spellEnd"/>
+      <w:r>
+        <w:t>:</w:t>
       </w:r>
       <w:r>
         <w:br/>
@@ -524,7 +565,23 @@
       </w:r>
       <w:r>
         <w:br/>
-        <w:t>I just got the german raw radiosconde, and it does not look good, it is way different than the one of KNMI.</w:t>
+        <w:t xml:space="preserve">I just got the </w:t>
+      </w:r>
+      <w:proofErr w:type="spellStart"/>
+      <w:r>
+        <w:t>german</w:t>
+      </w:r>
+      <w:proofErr w:type="spellEnd"/>
+      <w:r>
+        <w:t xml:space="preserve"> raw </w:t>
+      </w:r>
+      <w:proofErr w:type="spellStart"/>
+      <w:r>
+        <w:t>radiosconde</w:t>
+      </w:r>
+      <w:proofErr w:type="spellEnd"/>
+      <w:r>
+        <w:t>, and it does not look good, it is way different than the one of KNMI.</w:t>
       </w:r>
     </w:p>
     <w:p>
@@ -543,11 +600,35 @@
         <w:br/>
       </w:r>
       <w:r>
-        <w:t xml:space="preserve">I found out the KNMI offers a file called synchronizedSoundingData, this has the things I need. </w:t>
-      </w:r>
-      <w:r>
-        <w:br/>
-        <w:t xml:space="preserve">Sounding-ID, Time since idk, exact date and time, pressure in hPa, temp, humid, windDir, windspeed, height, </w:t>
+        <w:t xml:space="preserve">I found out the KNMI offers a file called </w:t>
+      </w:r>
+      <w:proofErr w:type="spellStart"/>
+      <w:r>
+        <w:t>synchronizedSoundingData</w:t>
+      </w:r>
+      <w:proofErr w:type="spellEnd"/>
+      <w:r>
+        <w:t xml:space="preserve">, this has the things I need. </w:t>
+      </w:r>
+      <w:r>
+        <w:br/>
+        <w:t xml:space="preserve">Sounding-ID, Time since idk, exact date and time, pressure in </w:t>
+      </w:r>
+      <w:proofErr w:type="spellStart"/>
+      <w:r>
+        <w:t>hPa</w:t>
+      </w:r>
+      <w:proofErr w:type="spellEnd"/>
+      <w:r>
+        <w:t xml:space="preserve">, temp, humid, </w:t>
+      </w:r>
+      <w:proofErr w:type="spellStart"/>
+      <w:r>
+        <w:t>windDir</w:t>
+      </w:r>
+      <w:proofErr w:type="spellEnd"/>
+      <w:r>
+        <w:t xml:space="preserve">, windspeed, height, </w:t>
       </w:r>
       <w:r>
         <w:t>Lat- and Longitude, altitude. These are the main things I need.</w:t>
@@ -559,7 +640,15 @@
     </w:p>
     <w:p>
       <w:r>
-        <w:t xml:space="preserve">In the german files, I can use the </w:t>
+        <w:t xml:space="preserve">In the </w:t>
+      </w:r>
+      <w:proofErr w:type="spellStart"/>
+      <w:r>
+        <w:t>german</w:t>
+      </w:r>
+      <w:proofErr w:type="spellEnd"/>
+      <w:r>
+        <w:t xml:space="preserve"> files, I can use the </w:t>
       </w:r>
       <w:r>
         <w:t>Metadaten_Sekunde_Aero_03015.txt</w:t>
@@ -586,7 +675,7 @@
         </w:rPr>
         <w:lastRenderedPageBreak/>
         <w:drawing>
-          <wp:anchor distT="0" distB="0" distL="114300" distR="114300" simplePos="0" relativeHeight="251662336" behindDoc="1" locked="0" layoutInCell="1" allowOverlap="1" wp14:anchorId="1B50E1EB" wp14:editId="7AE2786A">
+          <wp:anchor distT="0" distB="0" distL="114300" distR="114300" simplePos="0" relativeHeight="251662336" behindDoc="1" locked="0" layoutInCell="1" allowOverlap="1" wp14:anchorId="1B50E1EB" wp14:editId="4498E52C">
             <wp:simplePos x="0" y="0"/>
             <wp:positionH relativeFrom="column">
               <wp:posOffset>-361481</wp:posOffset>
@@ -665,7 +754,7 @@
           <w:noProof/>
         </w:rPr>
         <w:drawing>
-          <wp:anchor distT="0" distB="0" distL="114300" distR="114300" simplePos="0" relativeHeight="251663360" behindDoc="1" locked="0" layoutInCell="1" allowOverlap="1" wp14:anchorId="6BDF185A" wp14:editId="50377724">
+          <wp:anchor distT="0" distB="0" distL="114300" distR="114300" simplePos="0" relativeHeight="251663360" behindDoc="1" locked="0" layoutInCell="1" allowOverlap="1" wp14:anchorId="6BDF185A" wp14:editId="265FCF1A">
             <wp:simplePos x="0" y="0"/>
             <wp:positionH relativeFrom="column">
               <wp:posOffset>1385918</wp:posOffset>
@@ -727,7 +816,15 @@
       </w:r>
       <w:r>
         <w:br/>
-        <w:t>And instead of using windspeed + windDir I could use north and east, but I won’t.</w:t>
+        <w:t xml:space="preserve">And instead of using windspeed + </w:t>
+      </w:r>
+      <w:proofErr w:type="spellStart"/>
+      <w:r>
+        <w:t>windDir</w:t>
+      </w:r>
+      <w:proofErr w:type="spellEnd"/>
+      <w:r>
+        <w:t xml:space="preserve"> I could use north and east, but I won’t.</w:t>
       </w:r>
     </w:p>
     <w:p>
@@ -736,13 +833,26 @@
       </w:r>
     </w:p>
     <w:p>
-      <w:r>
-        <w:t>Lets make DWD work.</w:t>
-      </w:r>
-    </w:p>
-    <w:p>
-      <w:r>
-        <w:t>Alrighty, got it also working, it was way more complicated. Its is not that much slower luckily. But I do need a way to choose the date of these.</w:t>
+      <w:proofErr w:type="spellStart"/>
+      <w:r>
+        <w:t>Lets</w:t>
+      </w:r>
+      <w:proofErr w:type="spellEnd"/>
+      <w:r>
+        <w:t xml:space="preserve"> make DWD work.</w:t>
+      </w:r>
+    </w:p>
+    <w:p>
+      <w:r>
+        <w:t xml:space="preserve">Alrighty, got it also working, it was way more complicated. </w:t>
+      </w:r>
+      <w:proofErr w:type="spellStart"/>
+      <w:r>
+        <w:t>Its</w:t>
+      </w:r>
+      <w:proofErr w:type="spellEnd"/>
+      <w:r>
+        <w:t xml:space="preserve"> is not that much slower luckily. But I do need a way to choose the date of these.</w:t>
       </w:r>
     </w:p>
     <w:p>
@@ -756,7 +866,7 @@
           <w:noProof/>
         </w:rPr>
         <w:drawing>
-          <wp:anchor distT="0" distB="0" distL="114300" distR="114300" simplePos="0" relativeHeight="251664384" behindDoc="1" locked="0" layoutInCell="1" allowOverlap="1" wp14:anchorId="1061808A" wp14:editId="1CD5C6C7">
+          <wp:anchor distT="0" distB="0" distL="114300" distR="114300" simplePos="0" relativeHeight="251664384" behindDoc="1" locked="0" layoutInCell="1" allowOverlap="1" wp14:anchorId="1061808A" wp14:editId="2C327283">
             <wp:simplePos x="0" y="0"/>
             <wp:positionH relativeFrom="page">
               <wp:align>left</wp:align>
@@ -819,8 +929,13 @@
           </wp:anchor>
         </w:drawing>
       </w:r>
-      <w:r>
-        <w:t>Lets make it actually skewed.</w:t>
+      <w:proofErr w:type="spellStart"/>
+      <w:r>
+        <w:t>Lets</w:t>
+      </w:r>
+      <w:proofErr w:type="spellEnd"/>
+      <w:r>
+        <w:t xml:space="preserve"> make it actually skewed.</w:t>
       </w:r>
     </w:p>
     <w:p>
@@ -840,11 +955,16 @@
         <w:br/>
         <w:t xml:space="preserve">I also need the dry and moist </w:t>
       </w:r>
+      <w:proofErr w:type="spellStart"/>
       <w:r>
         <w:t>adiabatic</w:t>
       </w:r>
       <w:r>
-        <w:t xml:space="preserve">s. </w:t>
+        <w:t>s</w:t>
+      </w:r>
+      <w:proofErr w:type="spellEnd"/>
+      <w:r>
+        <w:t xml:space="preserve">. </w:t>
       </w:r>
     </w:p>
     <w:p/>
@@ -872,7 +992,7 @@
           <w:noProof/>
         </w:rPr>
         <w:drawing>
-          <wp:anchor distT="0" distB="0" distL="114300" distR="114300" simplePos="0" relativeHeight="251666432" behindDoc="1" locked="0" layoutInCell="1" allowOverlap="1" wp14:anchorId="30EAEABE" wp14:editId="0C1F037F">
+          <wp:anchor distT="0" distB="0" distL="114300" distR="114300" simplePos="0" relativeHeight="251666432" behindDoc="1" locked="0" layoutInCell="1" allowOverlap="1" wp14:anchorId="30EAEABE" wp14:editId="5AFCB82D">
             <wp:simplePos x="0" y="0"/>
             <wp:positionH relativeFrom="column">
               <wp:posOffset>1936185</wp:posOffset>
@@ -1032,13 +1152,34 @@
         <w:t xml:space="preserve">Tw = g * ((1 + </w:t>
       </w:r>
       <w:r>
-        <w:t>(Hv * r) / (Rsd * T)</w:t>
+        <w:t>(Hv * r) / (</w:t>
+      </w:r>
+      <w:proofErr w:type="spellStart"/>
+      <w:r>
+        <w:t>Rsd</w:t>
+      </w:r>
+      <w:proofErr w:type="spellEnd"/>
+      <w:r>
+        <w:t xml:space="preserve"> * T)</w:t>
       </w:r>
       <w:r>
         <w:t>) / (</w:t>
       </w:r>
-      <w:r>
-        <w:t>cpd + (Hv^2 * r) / Rsw * T^2</w:t>
+      <w:proofErr w:type="spellStart"/>
+      <w:r>
+        <w:t>cpd</w:t>
+      </w:r>
+      <w:proofErr w:type="spellEnd"/>
+      <w:r>
+        <w:t xml:space="preserve"> + (Hv^2 * r) / </w:t>
+      </w:r>
+      <w:proofErr w:type="spellStart"/>
+      <w:r>
+        <w:t>Rsw</w:t>
+      </w:r>
+      <w:proofErr w:type="spellEnd"/>
+      <w:r>
+        <w:t xml:space="preserve"> * T^2</w:t>
       </w:r>
       <w:r>
         <w:t>))</w:t>
@@ -1068,7 +1209,15 @@
       </w:r>
       <w:r>
         <w:br/>
-        <w:t>I cant seem to get them right.</w:t>
+        <w:t xml:space="preserve">I </w:t>
+      </w:r>
+      <w:proofErr w:type="spellStart"/>
+      <w:r>
+        <w:t>cant</w:t>
+      </w:r>
+      <w:proofErr w:type="spellEnd"/>
+      <w:r>
+        <w:t xml:space="preserve"> seem to get them right.</w:t>
       </w:r>
       <w:r>
         <w:br/>
@@ -1144,8 +1293,13 @@
       </w:r>
       <w:r>
         <w:br/>
-        <w:t>dh = Cp * dT + a / ã * g  * dz</w:t>
-      </w:r>
+        <w:t xml:space="preserve">dh = Cp * dT + a / ã * g  * </w:t>
+      </w:r>
+      <w:proofErr w:type="spellStart"/>
+      <w:r>
+        <w:t>dz</w:t>
+      </w:r>
+      <w:proofErr w:type="spellEnd"/>
       <w:r>
         <w:br/>
         <w:t>ã =  (a1 + a2) / 2</w:t>
@@ -1160,16 +1314,31 @@
       </w:r>
       <w:r>
         <w:br/>
-        <w:t>0 = Cp * dT + a/ã * g * dz</w:t>
-      </w:r>
-      <w:r>
-        <w:br/>
-        <w:t>Cp * dT = -a/ã * g * dz</w:t>
-      </w:r>
-      <w:r>
-        <w:br/>
-        <w:t>dT = -a/ã * g /Cp * dz</w:t>
-      </w:r>
+        <w:t xml:space="preserve">0 = Cp * dT + a/ã * g * </w:t>
+      </w:r>
+      <w:proofErr w:type="spellStart"/>
+      <w:r>
+        <w:t>dz</w:t>
+      </w:r>
+      <w:proofErr w:type="spellEnd"/>
+      <w:r>
+        <w:br/>
+        <w:t xml:space="preserve">Cp * dT = -a/ã * g * </w:t>
+      </w:r>
+      <w:proofErr w:type="spellStart"/>
+      <w:r>
+        <w:t>dz</w:t>
+      </w:r>
+      <w:proofErr w:type="spellEnd"/>
+      <w:r>
+        <w:br/>
+        <w:t xml:space="preserve">dT = -a/ã * g /Cp * </w:t>
+      </w:r>
+      <w:proofErr w:type="spellStart"/>
+      <w:r>
+        <w:t>dz</w:t>
+      </w:r>
+      <w:proofErr w:type="spellEnd"/>
       <w:r>
         <w:br/>
         <w:t>Good enough</w:t>
@@ -1243,7 +1412,15 @@
       </w:r>
       <w:r>
         <w:br/>
-        <w:t>Okay also Cp – Cv = R;</w:t>
+        <w:t xml:space="preserve">Okay also Cp – </w:t>
+      </w:r>
+      <w:proofErr w:type="spellStart"/>
+      <w:r>
+        <w:t>Cv</w:t>
+      </w:r>
+      <w:proofErr w:type="spellEnd"/>
+      <w:r>
+        <w:t xml:space="preserve"> = R;</w:t>
       </w:r>
       <w:r>
         <w:br/>
@@ -1251,7 +1428,15 @@
       </w:r>
       <w:r>
         <w:br/>
-        <w:t>The author believes that we do not work in a constant pressure environment thus we use Cv, because our volume is constant. (I think)</w:t>
+        <w:t xml:space="preserve">The author believes that we do not work in a constant pressure environment thus we use </w:t>
+      </w:r>
+      <w:proofErr w:type="spellStart"/>
+      <w:r>
+        <w:t>Cv</w:t>
+      </w:r>
+      <w:proofErr w:type="spellEnd"/>
+      <w:r>
+        <w:t>, because our volume is constant. (I think)</w:t>
       </w:r>
       <w:r>
         <w:br/>
@@ -1285,7 +1470,15 @@
       </w:r>
       <w:r>
         <w:br/>
-        <w:t xml:space="preserve">I found out why. So, they are called also log-p diagrams, this means that the distance between 1000 and 500 hPa is the same as 500 and 250. </w:t>
+        <w:t xml:space="preserve">I found out why. So, they are called also log-p diagrams, this means that the distance between 1000 and 500 </w:t>
+      </w:r>
+      <w:proofErr w:type="spellStart"/>
+      <w:r>
+        <w:t>hPa</w:t>
+      </w:r>
+      <w:proofErr w:type="spellEnd"/>
+      <w:r>
+        <w:t xml:space="preserve"> is the same as 500 and 250. </w:t>
       </w:r>
       <w:r>
         <w:br/>
@@ -1319,7 +1512,15 @@
         </w:r>
       </w:hyperlink>
       <w:r>
-        <w:t xml:space="preserve"> This is exactly what I want to do, but it is not open source unfortunately. Nvm, got it: </w:t>
+        <w:t xml:space="preserve"> This is exactly what I want to do, but it is not open source unfortunately. </w:t>
+      </w:r>
+      <w:proofErr w:type="spellStart"/>
+      <w:r>
+        <w:t>Nvm</w:t>
+      </w:r>
+      <w:proofErr w:type="spellEnd"/>
+      <w:r>
+        <w:t xml:space="preserve">, got it: </w:t>
       </w:r>
       <w:hyperlink r:id="rId25" w:history="1">
         <w:r>
@@ -1383,7 +1584,15 @@
     </w:p>
     <w:p>
       <w:r>
-        <w:t xml:space="preserve">Seems to not fully work, I tried using it on a dry adiabatics, but they curved okay but bended to the right. </w:t>
+        <w:t xml:space="preserve">Seems to not fully work, I tried using it on a dry </w:t>
+      </w:r>
+      <w:proofErr w:type="spellStart"/>
+      <w:r>
+        <w:t>adiabatics</w:t>
+      </w:r>
+      <w:proofErr w:type="spellEnd"/>
+      <w:r>
+        <w:t xml:space="preserve">, but they curved okay but bended to the right. </w:t>
       </w:r>
       <w:r>
         <w:br/>
@@ -1407,12 +1616,28 @@
         <w:t>Okay, s</w:t>
       </w:r>
       <w:r>
-        <w:t xml:space="preserve">o I got the height I think working, so the pressure height now scales correctly, I wanted to use this with the dry adiabatic, yet it seems that the curvature is sooo small that I am still confused. </w:t>
-      </w:r>
-    </w:p>
-    <w:p>
-      <w:r>
-        <w:t>So, what do we do? In like 48 we did not move a centimeter.</w:t>
+        <w:t xml:space="preserve">o I got the height I think working, so the pressure height now scales correctly, I wanted to use this with the dry adiabatic, yet it seems that the curvature is </w:t>
+      </w:r>
+      <w:proofErr w:type="spellStart"/>
+      <w:r>
+        <w:t>sooo</w:t>
+      </w:r>
+      <w:proofErr w:type="spellEnd"/>
+      <w:r>
+        <w:t xml:space="preserve"> small that I am still confused. </w:t>
+      </w:r>
+    </w:p>
+    <w:p>
+      <w:r>
+        <w:t xml:space="preserve">So, what do we do? In like 48 we did not move a </w:t>
+      </w:r>
+      <w:proofErr w:type="spellStart"/>
+      <w:r>
+        <w:t>centimeter</w:t>
+      </w:r>
+      <w:proofErr w:type="spellEnd"/>
+      <w:r>
+        <w:t>.</w:t>
       </w:r>
       <w:r>
         <w:br/>
@@ -1427,7 +1652,7 @@
           <w:noProof/>
         </w:rPr>
         <w:drawing>
-          <wp:anchor distT="0" distB="0" distL="114300" distR="114300" simplePos="0" relativeHeight="251667456" behindDoc="1" locked="0" layoutInCell="1" allowOverlap="1" wp14:anchorId="06503D00" wp14:editId="6A16EA14">
+          <wp:anchor distT="0" distB="0" distL="114300" distR="114300" simplePos="0" relativeHeight="251667456" behindDoc="1" locked="0" layoutInCell="1" allowOverlap="1" wp14:anchorId="06503D00" wp14:editId="4A05C8FF">
             <wp:simplePos x="0" y="0"/>
             <wp:positionH relativeFrom="page">
               <wp:align>left</wp:align>
@@ -1522,7 +1747,15 @@
         <w:br/>
       </w:r>
       <w:r>
-        <w:t>The moist adiabatics. I tried some formulas, but they did not work. So, I took a look at the one the other codebase uses:</w:t>
+        <w:t xml:space="preserve">The moist </w:t>
+      </w:r>
+      <w:proofErr w:type="spellStart"/>
+      <w:r>
+        <w:t>adiabatics</w:t>
+      </w:r>
+      <w:proofErr w:type="spellEnd"/>
+      <w:r>
+        <w:t>. I tried some formulas, but they did not work. So, I took a look at the one the other codebase uses:</w:t>
       </w:r>
       <w:r>
         <w:br/>
@@ -1601,7 +1834,15 @@
     <w:p>
       <w:r>
         <w:lastRenderedPageBreak/>
-        <w:t xml:space="preserve">Uhm, yeah, so I think I see nothing wrong, but so many ways to calculate rs. Jeez. </w:t>
+        <w:t xml:space="preserve">Uhm, yeah, so I think I see nothing wrong, but so many ways to calculate </w:t>
+      </w:r>
+      <w:proofErr w:type="spellStart"/>
+      <w:r>
+        <w:t>rs</w:t>
+      </w:r>
+      <w:proofErr w:type="spellEnd"/>
+      <w:r>
+        <w:t xml:space="preserve">. Jeez. </w:t>
       </w:r>
       <w:r>
         <w:br/>
@@ -1625,11 +1866,27 @@
       </w:r>
       <w:r>
         <w:br/>
-        <w:t>Okay that was because I was using the wrong ws formula?</w:t>
-      </w:r>
-      <w:r>
-        <w:br/>
-        <w:t>Still the plotting is not correct. They are bended way to much to the right.</w:t>
+        <w:t xml:space="preserve">Okay that was because I was using the wrong </w:t>
+      </w:r>
+      <w:proofErr w:type="spellStart"/>
+      <w:r>
+        <w:t>ws</w:t>
+      </w:r>
+      <w:proofErr w:type="spellEnd"/>
+      <w:r>
+        <w:t xml:space="preserve"> formula?</w:t>
+      </w:r>
+      <w:r>
+        <w:br/>
+        <w:t xml:space="preserve">Still the plotting is not correct. They are bended way </w:t>
+      </w:r>
+      <w:proofErr w:type="spellStart"/>
+      <w:r>
+        <w:t>to</w:t>
+      </w:r>
+      <w:proofErr w:type="spellEnd"/>
+      <w:r>
+        <w:t xml:space="preserve"> much to the right.</w:t>
       </w:r>
       <w:r>
         <w:br/>
@@ -1649,12 +1906,28 @@
     </w:p>
     <w:p>
       <w:r>
-        <w:t>I feel like I am at the same problem at where I was with the dry adiabatics. Getting the correct change in temps but plotting it seems weird. I believe I have to reconstruct my function, but how.</w:t>
-      </w:r>
-    </w:p>
-    <w:p>
-      <w:r>
-        <w:t>Okay I implemented the code from that pdf, but its weird…</w:t>
+        <w:t xml:space="preserve">I feel like I am at the same problem at where I was with the dry </w:t>
+      </w:r>
+      <w:proofErr w:type="spellStart"/>
+      <w:r>
+        <w:t>adiabatics</w:t>
+      </w:r>
+      <w:proofErr w:type="spellEnd"/>
+      <w:r>
+        <w:t>. Getting the correct change in temps but plotting it seems weird. I believe I have to reconstruct my function, but how.</w:t>
+      </w:r>
+    </w:p>
+    <w:p>
+      <w:r>
+        <w:t xml:space="preserve">Okay I implemented the code from that pdf, but </w:t>
+      </w:r>
+      <w:proofErr w:type="spellStart"/>
+      <w:r>
+        <w:t>its</w:t>
+      </w:r>
+      <w:proofErr w:type="spellEnd"/>
+      <w:r>
+        <w:t xml:space="preserve"> weird…</w:t>
       </w:r>
     </w:p>
     <w:p>
@@ -1749,11 +2022,27 @@
       </w:r>
       <w:r>
         <w:br/>
-        <w:t xml:space="preserve">I think I need to give again a look at the py code. </w:t>
-      </w:r>
-      <w:r>
-        <w:br/>
-        <w:t xml:space="preserve">Btw, good yt video: </w:t>
+        <w:t xml:space="preserve">I think I need to give again a look at the </w:t>
+      </w:r>
+      <w:proofErr w:type="spellStart"/>
+      <w:r>
+        <w:t>py</w:t>
+      </w:r>
+      <w:proofErr w:type="spellEnd"/>
+      <w:r>
+        <w:t xml:space="preserve"> code. </w:t>
+      </w:r>
+      <w:r>
+        <w:br/>
+        <w:t xml:space="preserve">Btw, good </w:t>
+      </w:r>
+      <w:proofErr w:type="spellStart"/>
+      <w:r>
+        <w:t>yt</w:t>
+      </w:r>
+      <w:proofErr w:type="spellEnd"/>
+      <w:r>
+        <w:t xml:space="preserve"> video: </w:t>
       </w:r>
       <w:hyperlink r:id="rId36" w:history="1">
         <w:r>
@@ -1768,7 +2057,23 @@
       </w:r>
       <w:r>
         <w:br/>
-        <w:t xml:space="preserve">I may see the problem, what I have been doing is checking temperature change between 1000 hPa and 600 hPa, but I should take small steps: 600 and 605 and 605 and 610 etc. </w:t>
+        <w:t xml:space="preserve">I may see the problem, what I have been doing is checking temperature change between 1000 </w:t>
+      </w:r>
+      <w:proofErr w:type="spellStart"/>
+      <w:r>
+        <w:t>hPa</w:t>
+      </w:r>
+      <w:proofErr w:type="spellEnd"/>
+      <w:r>
+        <w:t xml:space="preserve"> and 600 </w:t>
+      </w:r>
+      <w:proofErr w:type="spellStart"/>
+      <w:r>
+        <w:t>hPa</w:t>
+      </w:r>
+      <w:proofErr w:type="spellEnd"/>
+      <w:r>
+        <w:t xml:space="preserve">, but I should take small steps: 600 and 605 and 605 and 610 etc. </w:t>
       </w:r>
     </w:p>
     <w:p>
@@ -1823,7 +2128,15 @@
       </w:r>
       <w:r>
         <w:br/>
-        <w:t>I think its good enough:</w:t>
+        <w:t xml:space="preserve">I think </w:t>
+      </w:r>
+      <w:proofErr w:type="spellStart"/>
+      <w:r>
+        <w:t>its</w:t>
+      </w:r>
+      <w:proofErr w:type="spellEnd"/>
+      <w:r>
+        <w:t xml:space="preserve"> good enough:</w:t>
       </w:r>
     </w:p>
     <w:p>
@@ -1833,7 +2146,7 @@
         </w:rPr>
         <w:lastRenderedPageBreak/>
         <w:drawing>
-          <wp:anchor distT="0" distB="0" distL="114300" distR="114300" simplePos="0" relativeHeight="251669504" behindDoc="1" locked="0" layoutInCell="1" allowOverlap="1" wp14:anchorId="5FB435B6" wp14:editId="382121B5">
+          <wp:anchor distT="0" distB="0" distL="114300" distR="114300" simplePos="0" relativeHeight="251669504" behindDoc="1" locked="0" layoutInCell="1" allowOverlap="1" wp14:anchorId="5FB435B6" wp14:editId="710E3B4C">
             <wp:simplePos x="0" y="0"/>
             <wp:positionH relativeFrom="page">
               <wp:align>left</wp:align>
@@ -1901,12 +2214,28 @@
       </w:r>
       <w:r>
         <w:br/>
-        <w:t xml:space="preserve">So the first few hPa is direct on point, but the higher the worse. </w:t>
-      </w:r>
-    </w:p>
-    <w:p>
-      <w:r>
-        <w:t>I am going to make this a github project since I see a future in this.</w:t>
+        <w:t xml:space="preserve">So the first few </w:t>
+      </w:r>
+      <w:proofErr w:type="spellStart"/>
+      <w:r>
+        <w:t>hPa</w:t>
+      </w:r>
+      <w:proofErr w:type="spellEnd"/>
+      <w:r>
+        <w:t xml:space="preserve"> is direct on point, but the higher the worse. </w:t>
+      </w:r>
+    </w:p>
+    <w:p>
+      <w:r>
+        <w:t xml:space="preserve">I am going to make this a </w:t>
+      </w:r>
+      <w:proofErr w:type="spellStart"/>
+      <w:r>
+        <w:t>github</w:t>
+      </w:r>
+      <w:proofErr w:type="spellEnd"/>
+      <w:r>
+        <w:t xml:space="preserve"> project since I see a future in this.</w:t>
       </w:r>
     </w:p>
     <w:p/>
@@ -1936,7 +2265,14 @@
       </w:r>
       <w:r>
         <w:br/>
-        <w:t>Lets calculate the LCL, EL and more.</w:t>
+      </w:r>
+      <w:proofErr w:type="spellStart"/>
+      <w:r>
+        <w:t>Lets</w:t>
+      </w:r>
+      <w:proofErr w:type="spellEnd"/>
+      <w:r>
+        <w:t xml:space="preserve"> calculate the LCL, EL and more.</w:t>
       </w:r>
     </w:p>
     <w:p>
@@ -2035,8 +2371,29 @@
       </w:r>
       <w:r>
         <w:br/>
-        <w:t>What is Cva? Is that not just Cpd and Cpv</w:t>
-      </w:r>
+        <w:t xml:space="preserve">What is </w:t>
+      </w:r>
+      <w:proofErr w:type="spellStart"/>
+      <w:r>
+        <w:t>Cva</w:t>
+      </w:r>
+      <w:proofErr w:type="spellEnd"/>
+      <w:r>
+        <w:t xml:space="preserve">? Is that not just </w:t>
+      </w:r>
+      <w:proofErr w:type="spellStart"/>
+      <w:r>
+        <w:t>Cpd</w:t>
+      </w:r>
+      <w:proofErr w:type="spellEnd"/>
+      <w:r>
+        <w:t xml:space="preserve"> and </w:t>
+      </w:r>
+      <w:proofErr w:type="spellStart"/>
+      <w:r>
+        <w:t>Cpv</w:t>
+      </w:r>
+      <w:proofErr w:type="spellEnd"/>
       <w:r>
         <w:br/>
         <w:t>but why are the values different?</w:t>
@@ -2047,16 +2404,47 @@
       </w:r>
       <w:r>
         <w:tab/>
-        <w:t>2.2, and as example it is in between: 2.37, confusing. Lets use the 2.2 for now.</w:t>
-      </w:r>
-      <w:r>
-        <w:br/>
-        <w:t>oeh! I could use laberts function of boost.</w:t>
-      </w:r>
-    </w:p>
-    <w:p>
-      <w:r>
-        <w:t>First test, went okay. Values are wrong, but I think its pretty easy solvable.</w:t>
+        <w:t xml:space="preserve">2.2, and as example it is in between: 2.37, confusing. </w:t>
+      </w:r>
+      <w:proofErr w:type="spellStart"/>
+      <w:r>
+        <w:t>Lets</w:t>
+      </w:r>
+      <w:proofErr w:type="spellEnd"/>
+      <w:r>
+        <w:t xml:space="preserve"> use the 2.2 for now.</w:t>
+      </w:r>
+      <w:r>
+        <w:br/>
+      </w:r>
+      <w:proofErr w:type="spellStart"/>
+      <w:r>
+        <w:t>oeh</w:t>
+      </w:r>
+      <w:proofErr w:type="spellEnd"/>
+      <w:r>
+        <w:t xml:space="preserve">! I could use </w:t>
+      </w:r>
+      <w:proofErr w:type="spellStart"/>
+      <w:r>
+        <w:t>laberts</w:t>
+      </w:r>
+      <w:proofErr w:type="spellEnd"/>
+      <w:r>
+        <w:t xml:space="preserve"> function of boost.</w:t>
+      </w:r>
+    </w:p>
+    <w:p>
+      <w:r>
+        <w:t xml:space="preserve">First test, went okay. Values are wrong, but I think </w:t>
+      </w:r>
+      <w:proofErr w:type="spellStart"/>
+      <w:r>
+        <w:t>its</w:t>
+      </w:r>
+      <w:proofErr w:type="spellEnd"/>
+      <w:r>
+        <w:t xml:space="preserve"> pretty easy solvable.</w:t>
       </w:r>
     </w:p>
     <w:p>
@@ -2086,7 +2474,7 @@
           <w:noProof/>
         </w:rPr>
         <w:drawing>
-          <wp:anchor distT="0" distB="0" distL="114300" distR="114300" simplePos="0" relativeHeight="251673600" behindDoc="1" locked="0" layoutInCell="1" allowOverlap="1" wp14:anchorId="301D5EFD" wp14:editId="0310D752">
+          <wp:anchor distT="0" distB="0" distL="114300" distR="114300" simplePos="0" relativeHeight="251673600" behindDoc="1" locked="0" layoutInCell="1" allowOverlap="1" wp14:anchorId="301D5EFD" wp14:editId="65906F64">
             <wp:simplePos x="0" y="0"/>
             <wp:positionH relativeFrom="column">
               <wp:posOffset>3367405</wp:posOffset>
@@ -2222,7 +2610,7 @@
           <w:noProof/>
         </w:rPr>
         <w:drawing>
-          <wp:anchor distT="0" distB="0" distL="114300" distR="114300" simplePos="0" relativeHeight="251671552" behindDoc="1" locked="0" layoutInCell="1" allowOverlap="1" wp14:anchorId="3B1247BB" wp14:editId="1B5E1323">
+          <wp:anchor distT="0" distB="0" distL="114300" distR="114300" simplePos="0" relativeHeight="251671552" behindDoc="1" locked="0" layoutInCell="1" allowOverlap="1" wp14:anchorId="3B1247BB" wp14:editId="426631C7">
             <wp:simplePos x="0" y="0"/>
             <wp:positionH relativeFrom="margin">
               <wp:posOffset>-819150</wp:posOffset>
@@ -2439,13 +2827,23 @@
     </w:p>
     <w:p/>
     <w:p>
-      <w:r>
-        <w:t>Lets just do what I said. Weird how I can just not find a formula for EL.</w:t>
-      </w:r>
-    </w:p>
-    <w:p>
-      <w:r>
-        <w:t>MetPy: “</w:t>
+      <w:proofErr w:type="spellStart"/>
+      <w:r>
+        <w:t>Lets</w:t>
+      </w:r>
+      <w:proofErr w:type="spellEnd"/>
+      <w:r>
+        <w:t xml:space="preserve"> just do what I said. Weird how I can just not find a formula for EL.</w:t>
+      </w:r>
+    </w:p>
+    <w:p>
+      <w:proofErr w:type="spellStart"/>
+      <w:r>
+        <w:t>MetPy</w:t>
+      </w:r>
+      <w:proofErr w:type="spellEnd"/>
+      <w:r>
+        <w:t>: “</w:t>
       </w:r>
       <w:r>
         <w:t>This works by finding the last intersection of the ideal parcel path and the measured environmental temperature. If there is one or fewer intersections, there is no equilibrium level.</w:t>
@@ -2468,7 +2866,15 @@
       </w:r>
       <w:r>
         <w:br/>
-        <w:t>Ah I see, at the return I divided by Pa instead of hPa.</w:t>
+        <w:t xml:space="preserve">Ah I see, at the return I divided by Pa instead of </w:t>
+      </w:r>
+      <w:proofErr w:type="spellStart"/>
+      <w:r>
+        <w:t>hPa</w:t>
+      </w:r>
+      <w:proofErr w:type="spellEnd"/>
+      <w:r>
+        <w:t>.</w:t>
       </w:r>
     </w:p>
     <w:p>
@@ -2494,11 +2900,27 @@
       </w:r>
       <w:r>
         <w:br/>
-        <w:t>It may could be because the values start at hPa of 993 instead of above 1000</w:t>
-      </w:r>
-      <w:r>
-        <w:br/>
-        <w:t>And the fact that I use observed pressure data changes the adiabatics. Yes I believe this is the main case.</w:t>
+        <w:t xml:space="preserve">It may could be because the values start at </w:t>
+      </w:r>
+      <w:proofErr w:type="spellStart"/>
+      <w:r>
+        <w:t>hPa</w:t>
+      </w:r>
+      <w:proofErr w:type="spellEnd"/>
+      <w:r>
+        <w:t xml:space="preserve"> of 993 instead of above 1000</w:t>
+      </w:r>
+      <w:r>
+        <w:br/>
+        <w:t xml:space="preserve">And the fact that I use observed pressure data changes the </w:t>
+      </w:r>
+      <w:proofErr w:type="spellStart"/>
+      <w:r>
+        <w:t>adiabatics</w:t>
+      </w:r>
+      <w:proofErr w:type="spellEnd"/>
+      <w:r>
+        <w:t>. Yes I believe this is the main case.</w:t>
       </w:r>
       <w:r>
         <w:br/>
@@ -2522,7 +2944,15 @@
         <w:br/>
       </w:r>
       <w:r>
-        <w:t>It looks alright but at some places it is still wrong, its weird…</w:t>
+        <w:t xml:space="preserve">It looks alright but at some places it is still wrong, </w:t>
+      </w:r>
+      <w:proofErr w:type="spellStart"/>
+      <w:r>
+        <w:t>its</w:t>
+      </w:r>
+      <w:proofErr w:type="spellEnd"/>
+      <w:r>
+        <w:t xml:space="preserve"> weird…</w:t>
       </w:r>
       <w:r>
         <w:t xml:space="preserve"> </w:t>
@@ -2540,6 +2970,9 @@
     </w:p>
     <w:p>
       <w:r>
+        <w:rPr>
+          <w:noProof/>
+        </w:rPr>
         <w:drawing>
           <wp:anchor distT="0" distB="0" distL="114300" distR="114300" simplePos="0" relativeHeight="251675648" behindDoc="1" locked="0" layoutInCell="1" allowOverlap="1" wp14:anchorId="1CB9B646" wp14:editId="736DB34C">
             <wp:simplePos x="0" y="0"/>
@@ -2599,6 +3032,9 @@
         </w:drawing>
       </w:r>
       <w:r>
+        <w:rPr>
+          <w:noProof/>
+        </w:rPr>
         <w:drawing>
           <wp:anchor distT="0" distB="0" distL="114300" distR="114300" simplePos="0" relativeHeight="251676672" behindDoc="1" locked="0" layoutInCell="1" allowOverlap="1" wp14:anchorId="07CF9A42" wp14:editId="7664C6F1">
             <wp:simplePos x="0" y="0"/>
@@ -2682,8 +3118,13 @@
     <w:p/>
     <w:p/>
     <w:p>
-      <w:r>
-        <w:t xml:space="preserve">Lets compare some values to see if the problem is with our calculations or our plotting. </w:t>
+      <w:proofErr w:type="spellStart"/>
+      <w:r>
+        <w:t>Lets</w:t>
+      </w:r>
+      <w:proofErr w:type="spellEnd"/>
+      <w:r>
+        <w:t xml:space="preserve"> compare some values to see if the problem is with our calculations or our plotting. </w:t>
       </w:r>
       <w:r>
         <w:br/>
@@ -2691,7 +3132,15 @@
       </w:r>
       <w:r>
         <w:br/>
-        <w:t xml:space="preserve">But my constants are exactly the same as for example metPy uses. </w:t>
+        <w:t xml:space="preserve">But my constants are exactly the same as for example </w:t>
+      </w:r>
+      <w:proofErr w:type="spellStart"/>
+      <w:r>
+        <w:t>metPy</w:t>
+      </w:r>
+      <w:proofErr w:type="spellEnd"/>
+      <w:r>
+        <w:t xml:space="preserve"> uses. </w:t>
       </w:r>
       <w:r>
         <w:br/>
@@ -2699,28 +3148,68 @@
       </w:r>
       <w:r>
         <w:br/>
-        <w:t>Found an issue, I was calculating the vapor pressure using 611 instead of 6.11 (triple point in hPa)</w:t>
-      </w:r>
-    </w:p>
-    <w:p>
-      <w:r>
-        <w:t>Currently my values are very close to the ones of metPy, but still off.</w:t>
-      </w:r>
-    </w:p>
-    <w:p>
-      <w:r>
-        <w:t xml:space="preserve">Huh, I get a weird offset of value,it should be </w:t>
+        <w:t xml:space="preserve">Found an issue, I was calculating the vapor pressure using 611 instead of 6.11 (triple point in </w:t>
+      </w:r>
+      <w:proofErr w:type="spellStart"/>
+      <w:r>
+        <w:t>hPa</w:t>
+      </w:r>
+      <w:proofErr w:type="spellEnd"/>
+      <w:r>
+        <w:t>)</w:t>
+      </w:r>
+    </w:p>
+    <w:p>
+      <w:r>
+        <w:t xml:space="preserve">Currently my values are very close to the ones of </w:t>
+      </w:r>
+      <w:proofErr w:type="spellStart"/>
+      <w:r>
+        <w:t>metPy</w:t>
+      </w:r>
+      <w:proofErr w:type="spellEnd"/>
+      <w:r>
+        <w:t>, but still off.</w:t>
+      </w:r>
+    </w:p>
+    <w:p>
+      <w:r>
+        <w:t xml:space="preserve">Huh, I get a weird offset of </w:t>
+      </w:r>
+      <w:proofErr w:type="spellStart"/>
+      <w:r>
+        <w:t>value,it</w:t>
+      </w:r>
+      <w:proofErr w:type="spellEnd"/>
+      <w:r>
+        <w:t xml:space="preserve"> should be </w:t>
       </w:r>
       <w:r>
         <w:t xml:space="preserve">20.7079, but I get 20.709, small difference but still. </w:t>
       </w:r>
       <w:r>
         <w:br/>
-        <w:t>Now the temps are off again… nvm its closer again.</w:t>
-      </w:r>
-      <w:r>
-        <w:br/>
-        <w:t xml:space="preserve">My adiabatics are plotted around 0.3 temp to cold. </w:t>
+        <w:t xml:space="preserve">Now the temps are off again… </w:t>
+      </w:r>
+      <w:proofErr w:type="spellStart"/>
+      <w:r>
+        <w:t>nvm</w:t>
+      </w:r>
+      <w:proofErr w:type="spellEnd"/>
+      <w:r>
+        <w:t xml:space="preserve"> its closer again.</w:t>
+      </w:r>
+      <w:r>
+        <w:br/>
+        <w:t xml:space="preserve">My </w:t>
+      </w:r>
+      <w:proofErr w:type="spellStart"/>
+      <w:r>
+        <w:t>adiabatics</w:t>
+      </w:r>
+      <w:proofErr w:type="spellEnd"/>
+      <w:r>
+        <w:t xml:space="preserve"> are plotted around 0.3 temp to cold. </w:t>
       </w:r>
     </w:p>
     <w:p>
@@ -2730,7 +3219,15 @@
     </w:p>
     <w:p>
       <w:r>
-        <w:t xml:space="preserve">Using the height at standard pressure, the height at 1000 hPa (bottom line in skew-T) should be </w:t>
+        <w:t xml:space="preserve">Using the height at standard pressure, the height at 1000 </w:t>
+      </w:r>
+      <w:proofErr w:type="spellStart"/>
+      <w:r>
+        <w:t>hPa</w:t>
+      </w:r>
+      <w:proofErr w:type="spellEnd"/>
+      <w:r>
+        <w:t xml:space="preserve"> (bottom line in skew-T) should be </w:t>
       </w:r>
       <w:r>
         <w:t>89.7071991</w:t>
@@ -2741,14 +3238,27 @@
       </w:r>
       <w:r>
         <w:br/>
-        <w:t>It looks like in the skew-T they plant the ground temp at 1000 hPa</w:t>
-      </w:r>
+        <w:t xml:space="preserve">It looks like in the skew-T they plant the ground temp at 1000 </w:t>
+      </w:r>
+      <w:proofErr w:type="spellStart"/>
+      <w:r>
+        <w:t>hPa</w:t>
+      </w:r>
+      <w:proofErr w:type="spellEnd"/>
       <w:r>
         <w:t>.</w:t>
       </w:r>
       <w:r>
         <w:br/>
-        <w:t>what I should do is grab the ground temp, add it to the list and make it 1000 hPa (bottom)</w:t>
+        <w:t xml:space="preserve">what I should do is grab the ground temp, add it to the list and make it 1000 </w:t>
+      </w:r>
+      <w:proofErr w:type="spellStart"/>
+      <w:r>
+        <w:t>hPa</w:t>
+      </w:r>
+      <w:proofErr w:type="spellEnd"/>
+      <w:r>
+        <w:t xml:space="preserve"> (bottom)</w:t>
       </w:r>
       <w:r>
         <w:br/>
@@ -2770,7 +3280,15 @@
     </w:p>
     <w:p>
       <w:r>
-        <w:t>Now the EL seem to be the same as the one on meteologix, nice. Now just offset the temps.</w:t>
+        <w:t xml:space="preserve">Now the EL seem to be the same as the one on </w:t>
+      </w:r>
+      <w:proofErr w:type="spellStart"/>
+      <w:r>
+        <w:t>meteologix</w:t>
+      </w:r>
+      <w:proofErr w:type="spellEnd"/>
+      <w:r>
+        <w:t>, nice. Now just offset the temps.</w:t>
       </w:r>
       <w:r>
         <w:br/>
@@ -2788,9 +3306,12 @@
     </w:p>
     <w:p>
       <w:r>
+        <w:rPr>
+          <w:noProof/>
+        </w:rPr>
         <w:lastRenderedPageBreak/>
         <w:drawing>
-          <wp:anchor distT="0" distB="0" distL="114300" distR="114300" simplePos="0" relativeHeight="251678720" behindDoc="1" locked="0" layoutInCell="1" allowOverlap="1" wp14:anchorId="5A7E72E5" wp14:editId="3611AF36">
+          <wp:anchor distT="0" distB="0" distL="114300" distR="114300" simplePos="0" relativeHeight="251678720" behindDoc="1" locked="0" layoutInCell="1" allowOverlap="1" wp14:anchorId="5A7E72E5" wp14:editId="00EA9517">
             <wp:simplePos x="0" y="0"/>
             <wp:positionH relativeFrom="column">
               <wp:posOffset>3665855</wp:posOffset>
@@ -2848,6 +3369,9 @@
         </w:drawing>
       </w:r>
       <w:r>
+        <w:rPr>
+          <w:noProof/>
+        </w:rPr>
         <w:drawing>
           <wp:anchor distT="0" distB="0" distL="114300" distR="114300" simplePos="0" relativeHeight="251677696" behindDoc="1" locked="0" layoutInCell="1" allowOverlap="1" wp14:anchorId="71EE4695" wp14:editId="3FAB9F79">
             <wp:simplePos x="0" y="0"/>
@@ -2915,7 +3439,23 @@
     </w:p>
     <w:p>
       <w:r>
-        <w:t>I am a bit confused on how it still is wrong. The temp difference I got from my calculations (comparing) was only like 1 degree. So it must be the plotting. The temps probably have to be plotted somehow else? No its probably the adiabatics that are wrong. But also temps differ?</w:t>
+        <w:t xml:space="preserve">I am a bit confused on how it still is wrong. The temp difference I got from my calculations (comparing) was only like 1 degree. So it must be the plotting. The temps probably have to be plotted somehow else? No </w:t>
+      </w:r>
+      <w:proofErr w:type="spellStart"/>
+      <w:r>
+        <w:t>its</w:t>
+      </w:r>
+      <w:proofErr w:type="spellEnd"/>
+      <w:r>
+        <w:t xml:space="preserve"> probably the </w:t>
+      </w:r>
+      <w:proofErr w:type="spellStart"/>
+      <w:r>
+        <w:t>adiabatics</w:t>
+      </w:r>
+      <w:proofErr w:type="spellEnd"/>
+      <w:r>
+        <w:t xml:space="preserve"> that are wrong. But also temps differ?</w:t>
       </w:r>
     </w:p>
     <w:p>
@@ -2924,7 +3464,1118 @@
       </w:r>
       <w:r>
         <w:br/>
-        <w:t>The second thing is that the adiabatics don’t correctly follow.</w:t>
+        <w:t xml:space="preserve">The second thing is that the </w:t>
+      </w:r>
+      <w:proofErr w:type="spellStart"/>
+      <w:r>
+        <w:t>adiabatics</w:t>
+      </w:r>
+      <w:proofErr w:type="spellEnd"/>
+      <w:r>
+        <w:t xml:space="preserve"> don’t correctly follow.</w:t>
+      </w:r>
+    </w:p>
+    <w:p>
+      <w:r>
+        <w:t>I got a plan:</w:t>
+      </w:r>
+      <w:r>
+        <w:br/>
+        <w:t xml:space="preserve">First I want to set the pressure to height to use 0 instead of </w:t>
+      </w:r>
+      <w:proofErr w:type="spellStart"/>
+      <w:r>
+        <w:t>i</w:t>
+      </w:r>
+      <w:proofErr w:type="spellEnd"/>
+      <w:r>
+        <w:t>.</w:t>
+      </w:r>
+      <w:r>
+        <w:br/>
+        <w:t xml:space="preserve">Then I want a function where I convert height to log-P height. </w:t>
+      </w:r>
+      <w:r>
+        <w:br/>
+        <w:t xml:space="preserve">Then I need to debug my values of moist lapse rate vs dry lapse rate at like 0 degrees and 700 </w:t>
+      </w:r>
+      <w:proofErr w:type="spellStart"/>
+      <w:r>
+        <w:t>hPa</w:t>
+      </w:r>
+      <w:proofErr w:type="spellEnd"/>
+      <w:r>
+        <w:t>.</w:t>
+      </w:r>
+      <w:r>
+        <w:br/>
+      </w:r>
+      <w:r>
+        <w:br/>
+        <w:t>Result:</w:t>
+      </w:r>
+      <w:r>
+        <w:br/>
+        <w:t>the use of 0 instead of I differs a lot.</w:t>
+      </w:r>
+      <w:r>
+        <w:t xml:space="preserve"> And it does seem to be better. Alright.</w:t>
+      </w:r>
+      <w:r>
+        <w:br/>
+      </w:r>
+      <w:r>
+        <w:t>The usage of log is not a success. It scales everything way up. Yeah, I absolutely do not agree with the use of log.</w:t>
+      </w:r>
+      <w:r>
+        <w:br/>
+        <w:t>I think lapse rate is correct? Not debugged enough, but I see no solution or problem. So idk.</w:t>
+      </w:r>
+    </w:p>
+    <w:p>
+      <w:r>
+        <w:rPr>
+          <w:noProof/>
+        </w:rPr>
+        <w:drawing>
+          <wp:anchor distT="0" distB="0" distL="114300" distR="114300" simplePos="0" relativeHeight="251679744" behindDoc="1" locked="0" layoutInCell="1" allowOverlap="1" wp14:anchorId="31CDDE59" wp14:editId="470AB5BB">
+            <wp:simplePos x="0" y="0"/>
+            <wp:positionH relativeFrom="page">
+              <wp:align>left</wp:align>
+            </wp:positionH>
+            <wp:positionV relativeFrom="paragraph">
+              <wp:posOffset>151130</wp:posOffset>
+            </wp:positionV>
+            <wp:extent cx="1752600" cy="1869440"/>
+            <wp:effectExtent l="0" t="0" r="0" b="0"/>
+            <wp:wrapTight wrapText="bothSides">
+              <wp:wrapPolygon edited="0">
+                <wp:start x="3287" y="0"/>
+                <wp:lineTo x="0" y="1101"/>
+                <wp:lineTo x="0" y="21351"/>
+                <wp:lineTo x="21365" y="21351"/>
+                <wp:lineTo x="21365" y="1101"/>
+                <wp:lineTo x="4696" y="0"/>
+                <wp:lineTo x="3287" y="0"/>
+              </wp:wrapPolygon>
+            </wp:wrapTight>
+            <wp:docPr id="1286224311" name="Afbeelding 1" descr="Afbeelding met tekst, lijn, diagram, Perceel&#10;&#10;Door AI gegenereerde inhoud is mogelijk onjuist."/>
+            <wp:cNvGraphicFramePr>
+              <a:graphicFrameLocks xmlns:a="http://schemas.openxmlformats.org/drawingml/2006/main" noChangeAspect="1"/>
+            </wp:cNvGraphicFramePr>
+            <a:graphic xmlns:a="http://schemas.openxmlformats.org/drawingml/2006/main">
+              <a:graphicData uri="http://schemas.openxmlformats.org/drawingml/2006/picture">
+                <pic:pic xmlns:pic="http://schemas.openxmlformats.org/drawingml/2006/picture">
+                  <pic:nvPicPr>
+                    <pic:cNvPr id="1286224311" name="Afbeelding 1" descr="Afbeelding met tekst, lijn, diagram, Perceel&#10;&#10;Door AI gegenereerde inhoud is mogelijk onjuist."/>
+                    <pic:cNvPicPr/>
+                  </pic:nvPicPr>
+                  <pic:blipFill>
+                    <a:blip r:embed="rId53" cstate="print">
+                      <a:extLst>
+                        <a:ext uri="{28A0092B-C50C-407E-A947-70E740481C1C}">
+                          <a14:useLocalDpi xmlns:a14="http://schemas.microsoft.com/office/drawing/2010/main" val="0"/>
+                        </a:ext>
+                      </a:extLst>
+                    </a:blip>
+                    <a:stretch>
+                      <a:fillRect/>
+                    </a:stretch>
+                  </pic:blipFill>
+                  <pic:spPr>
+                    <a:xfrm>
+                      <a:off x="0" y="0"/>
+                      <a:ext cx="1754018" cy="1871475"/>
+                    </a:xfrm>
+                    <a:prstGeom prst="rect">
+                      <a:avLst/>
+                    </a:prstGeom>
+                  </pic:spPr>
+                </pic:pic>
+              </a:graphicData>
+            </a:graphic>
+            <wp14:sizeRelH relativeFrom="margin">
+              <wp14:pctWidth>0</wp14:pctWidth>
+            </wp14:sizeRelH>
+            <wp14:sizeRelV relativeFrom="margin">
+              <wp14:pctHeight>0</wp14:pctHeight>
+            </wp14:sizeRelV>
+          </wp:anchor>
+        </w:drawing>
+      </w:r>
+      <w:r>
+        <w:t>Wait, I think I should do log in a way:</w:t>
+      </w:r>
+      <w:r>
+        <w:br/>
+        <w:t xml:space="preserve">The higher the moist lapse rate goes, the smaller the decrease, sure. But the change on a skew-T is much larger, it curves way </w:t>
+      </w:r>
+      <w:proofErr w:type="spellStart"/>
+      <w:r>
+        <w:t>to</w:t>
+      </w:r>
+      <w:proofErr w:type="spellEnd"/>
+      <w:r>
+        <w:t xml:space="preserve"> much to the right.</w:t>
+      </w:r>
+    </w:p>
+    <w:p>
+      <w:r>
+        <w:t xml:space="preserve">On </w:t>
+      </w:r>
+      <w:proofErr w:type="spellStart"/>
+      <w:r>
+        <w:t>metPy</w:t>
+      </w:r>
+      <w:proofErr w:type="spellEnd"/>
+      <w:r>
+        <w:t xml:space="preserve">, the MLR in the higher elevation does not curve back. </w:t>
+      </w:r>
+    </w:p>
+    <w:p>
+      <w:r>
+        <w:t>What I need is a nice plotting function.</w:t>
+      </w:r>
+      <w:r>
+        <w:br/>
+        <w:t xml:space="preserve">I receive x (temps) and y (m or P) </w:t>
+      </w:r>
+      <w:r>
+        <w:br/>
+        <w:t>Then I automatically make coordinates out of it, this way I can control the height way easier and also compare.</w:t>
+      </w:r>
+    </w:p>
+    <w:p>
+      <w:r>
+        <w:t>Do I want to convert meters to pressure or pressure to meters?</w:t>
+      </w:r>
+      <w:r>
+        <w:t xml:space="preserve"> I believe meters to pressure.</w:t>
+      </w:r>
+    </w:p>
+    <w:p>
+      <w:r>
+        <w:t xml:space="preserve">Alright skew-T is </w:t>
+      </w:r>
+      <w:proofErr w:type="spellStart"/>
+      <w:r>
+        <w:t>scaleable</w:t>
+      </w:r>
+      <w:proofErr w:type="spellEnd"/>
+      <w:r>
+        <w:t>, now I need to add a log value so I can check how that works.</w:t>
+      </w:r>
+    </w:p>
+    <w:p>
+      <w:r>
+        <w:t>Seems my LCL calculations are a bit weird, with like 20 T and -30 D, my LCL is still like at 900hPa??</w:t>
+      </w:r>
+      <w:r>
+        <w:br/>
+        <w:t xml:space="preserve">I feel like my </w:t>
+      </w:r>
+      <w:proofErr w:type="spellStart"/>
+      <w:r>
+        <w:t>RHl</w:t>
+      </w:r>
+      <w:proofErr w:type="spellEnd"/>
+      <w:r>
+        <w:t xml:space="preserve"> calculator is broken.|</w:t>
+      </w:r>
+      <w:r>
+        <w:br/>
+      </w:r>
+      <w:proofErr w:type="spellStart"/>
+      <w:r>
+        <w:t>ohhh</w:t>
+      </w:r>
+      <w:proofErr w:type="spellEnd"/>
+      <w:r>
+        <w:t>, I did not update them to Celsius.</w:t>
+      </w:r>
+      <w:r>
+        <w:br/>
+      </w:r>
+      <w:proofErr w:type="spellStart"/>
+      <w:r>
+        <w:t>Lets</w:t>
+      </w:r>
+      <w:proofErr w:type="spellEnd"/>
+      <w:r>
+        <w:t xml:space="preserve"> calculate the LFC  (level of free convection)</w:t>
+      </w:r>
+      <w:r>
+        <w:br/>
+        <w:t>“</w:t>
+      </w:r>
+      <w:r>
+        <w:t xml:space="preserve">This works by finding the first intersection of the ideal parcel path and the measured parcel </w:t>
+      </w:r>
+      <w:r>
+        <w:lastRenderedPageBreak/>
+        <w:t>temperature. If this intersection occurs below the LCL, the LFC is determined to be the same as the LCL</w:t>
+      </w:r>
+      <w:r>
+        <w:t>” -</w:t>
+      </w:r>
+      <w:proofErr w:type="spellStart"/>
+      <w:r>
+        <w:t>metPy</w:t>
+      </w:r>
+      <w:proofErr w:type="spellEnd"/>
+      <w:r>
+        <w:t>.</w:t>
+      </w:r>
+      <w:r>
+        <w:br/>
+        <w:t xml:space="preserve">We will take the same approach, which is essentially the same as the one of EL, but this time we will only look at the first intersection. If we only get </w:t>
+      </w:r>
+      <w:proofErr w:type="spellStart"/>
+      <w:r>
+        <w:t>a</w:t>
+      </w:r>
+      <w:proofErr w:type="spellEnd"/>
+      <w:r>
+        <w:t xml:space="preserve"> intersection going inside, we will put the LFC at the LCL.</w:t>
+      </w:r>
+    </w:p>
+    <w:p>
+      <w:r>
+        <w:rPr>
+          <w:noProof/>
+        </w:rPr>
+        <w:drawing>
+          <wp:anchor distT="0" distB="0" distL="114300" distR="114300" simplePos="0" relativeHeight="251681792" behindDoc="1" locked="0" layoutInCell="1" allowOverlap="1" wp14:anchorId="0E6ECAF8" wp14:editId="79B4524B">
+            <wp:simplePos x="0" y="0"/>
+            <wp:positionH relativeFrom="page">
+              <wp:align>left</wp:align>
+            </wp:positionH>
+            <wp:positionV relativeFrom="paragraph">
+              <wp:posOffset>1016635</wp:posOffset>
+            </wp:positionV>
+            <wp:extent cx="2108200" cy="491490"/>
+            <wp:effectExtent l="19050" t="19050" r="25400" b="22860"/>
+            <wp:wrapTight wrapText="bothSides">
+              <wp:wrapPolygon edited="0">
+                <wp:start x="-195" y="-837"/>
+                <wp:lineTo x="-195" y="21767"/>
+                <wp:lineTo x="21665" y="21767"/>
+                <wp:lineTo x="21665" y="-837"/>
+                <wp:lineTo x="-195" y="-837"/>
+              </wp:wrapPolygon>
+            </wp:wrapTight>
+            <wp:docPr id="463680781" name="Afbeelding 1" descr="Afbeelding met Lettertype, tekst, lijn, wit&#10;&#10;Door AI gegenereerde inhoud is mogelijk onjuist."/>
+            <wp:cNvGraphicFramePr>
+              <a:graphicFrameLocks xmlns:a="http://schemas.openxmlformats.org/drawingml/2006/main" noChangeAspect="1"/>
+            </wp:cNvGraphicFramePr>
+            <a:graphic xmlns:a="http://schemas.openxmlformats.org/drawingml/2006/main">
+              <a:graphicData uri="http://schemas.openxmlformats.org/drawingml/2006/picture">
+                <pic:pic xmlns:pic="http://schemas.openxmlformats.org/drawingml/2006/picture">
+                  <pic:nvPicPr>
+                    <pic:cNvPr id="463680781" name="Afbeelding 1" descr="Afbeelding met Lettertype, tekst, lijn, wit&#10;&#10;Door AI gegenereerde inhoud is mogelijk onjuist."/>
+                    <pic:cNvPicPr/>
+                  </pic:nvPicPr>
+                  <pic:blipFill>
+                    <a:blip r:embed="rId54">
+                      <a:extLst>
+                        <a:ext uri="{28A0092B-C50C-407E-A947-70E740481C1C}">
+                          <a14:useLocalDpi xmlns:a14="http://schemas.microsoft.com/office/drawing/2010/main" val="0"/>
+                        </a:ext>
+                      </a:extLst>
+                    </a:blip>
+                    <a:stretch>
+                      <a:fillRect/>
+                    </a:stretch>
+                  </pic:blipFill>
+                  <pic:spPr>
+                    <a:xfrm>
+                      <a:off x="0" y="0"/>
+                      <a:ext cx="2108200" cy="491490"/>
+                    </a:xfrm>
+                    <a:prstGeom prst="rect">
+                      <a:avLst/>
+                    </a:prstGeom>
+                    <a:ln>
+                      <a:solidFill>
+                        <a:schemeClr val="accent1"/>
+                      </a:solidFill>
+                    </a:ln>
+                  </pic:spPr>
+                </pic:pic>
+              </a:graphicData>
+            </a:graphic>
+            <wp14:sizeRelH relativeFrom="margin">
+              <wp14:pctWidth>0</wp14:pctWidth>
+            </wp14:sizeRelH>
+            <wp14:sizeRelV relativeFrom="margin">
+              <wp14:pctHeight>0</wp14:pctHeight>
+            </wp14:sizeRelV>
+          </wp:anchor>
+        </w:drawing>
+      </w:r>
+      <w:r>
+        <w:rPr>
+          <w:noProof/>
+        </w:rPr>
+        <w:drawing>
+          <wp:anchor distT="0" distB="0" distL="114300" distR="114300" simplePos="0" relativeHeight="251680768" behindDoc="1" locked="0" layoutInCell="1" allowOverlap="1" wp14:anchorId="59437869" wp14:editId="7B780953">
+            <wp:simplePos x="0" y="0"/>
+            <wp:positionH relativeFrom="margin">
+              <wp:align>left</wp:align>
+            </wp:positionH>
+            <wp:positionV relativeFrom="paragraph">
+              <wp:posOffset>370840</wp:posOffset>
+            </wp:positionV>
+            <wp:extent cx="3609975" cy="292100"/>
+            <wp:effectExtent l="19050" t="19050" r="28575" b="12700"/>
+            <wp:wrapTight wrapText="bothSides">
+              <wp:wrapPolygon edited="0">
+                <wp:start x="-114" y="-1409"/>
+                <wp:lineTo x="-114" y="21130"/>
+                <wp:lineTo x="21657" y="21130"/>
+                <wp:lineTo x="21657" y="-1409"/>
+                <wp:lineTo x="-114" y="-1409"/>
+              </wp:wrapPolygon>
+            </wp:wrapTight>
+            <wp:docPr id="738239711" name="Afbeelding 1"/>
+            <wp:cNvGraphicFramePr>
+              <a:graphicFrameLocks xmlns:a="http://schemas.openxmlformats.org/drawingml/2006/main" noChangeAspect="1"/>
+            </wp:cNvGraphicFramePr>
+            <a:graphic xmlns:a="http://schemas.openxmlformats.org/drawingml/2006/main">
+              <a:graphicData uri="http://schemas.openxmlformats.org/drawingml/2006/picture">
+                <pic:pic xmlns:pic="http://schemas.openxmlformats.org/drawingml/2006/picture">
+                  <pic:nvPicPr>
+                    <pic:cNvPr id="738239711" name=""/>
+                    <pic:cNvPicPr/>
+                  </pic:nvPicPr>
+                  <pic:blipFill>
+                    <a:blip r:embed="rId55" cstate="print">
+                      <a:extLst>
+                        <a:ext uri="{28A0092B-C50C-407E-A947-70E740481C1C}">
+                          <a14:useLocalDpi xmlns:a14="http://schemas.microsoft.com/office/drawing/2010/main" val="0"/>
+                        </a:ext>
+                      </a:extLst>
+                    </a:blip>
+                    <a:stretch>
+                      <a:fillRect/>
+                    </a:stretch>
+                  </pic:blipFill>
+                  <pic:spPr>
+                    <a:xfrm>
+                      <a:off x="0" y="0"/>
+                      <a:ext cx="3609975" cy="292100"/>
+                    </a:xfrm>
+                    <a:prstGeom prst="rect">
+                      <a:avLst/>
+                    </a:prstGeom>
+                    <a:ln>
+                      <a:solidFill>
+                        <a:schemeClr val="accent1"/>
+                      </a:solidFill>
+                    </a:ln>
+                  </pic:spPr>
+                </pic:pic>
+              </a:graphicData>
+            </a:graphic>
+            <wp14:sizeRelH relativeFrom="margin">
+              <wp14:pctWidth>0</wp14:pctWidth>
+            </wp14:sizeRelH>
+            <wp14:sizeRelV relativeFrom="margin">
+              <wp14:pctHeight>0</wp14:pctHeight>
+            </wp14:sizeRelV>
+          </wp:anchor>
+        </w:drawing>
+      </w:r>
+      <w:r>
+        <w:t>Now we can calculate CAPE!</w:t>
+      </w:r>
+      <w:r>
+        <w:br/>
+        <w:t xml:space="preserve">oh this is easy: </w:t>
+      </w:r>
+      <w:r>
+        <w:br/>
+      </w:r>
+      <w:r>
+        <w:br/>
+      </w:r>
+      <w:r>
+        <w:br/>
+        <w:t>Let’s hope this is accurate.</w:t>
+      </w:r>
+      <w:r>
+        <w:br/>
+        <w:t xml:space="preserve">Why not just use this one. </w:t>
+      </w:r>
+      <w:hyperlink r:id="rId56" w:history="1">
+        <w:r>
+          <w:rPr>
+            <w:rStyle w:val="Hyperlink"/>
+          </w:rPr>
+          <w:t>https://www.cosmo-model.org/content/model/cosmo/techReports/docs/techReport17.pdf</w:t>
+        </w:r>
+      </w:hyperlink>
+      <w:r>
+        <w:t xml:space="preserve"> </w:t>
+      </w:r>
+      <w:r>
+        <w:br/>
+        <w:t xml:space="preserve">More clearer. </w:t>
+      </w:r>
+      <w:r>
+        <w:br/>
+        <w:t>I mean it is kind of the same, but still.</w:t>
+      </w:r>
+    </w:p>
+    <w:p>
+      <w:r>
+        <w:t>Wait, do I used observed pressure or standard???</w:t>
+      </w:r>
+      <w:r>
+        <w:br/>
+        <w:t>I guess it is working, need to check with multiple skew-T’s.</w:t>
+      </w:r>
+    </w:p>
+    <w:p>
+      <w:r>
+        <w:t>Okay, so I have no observed data currently with high cape.</w:t>
+      </w:r>
+      <w:r>
+        <w:br/>
+        <w:t xml:space="preserve">My cape is a bit lower than </w:t>
+      </w:r>
+      <w:proofErr w:type="spellStart"/>
+      <w:r>
+        <w:t>MLcape</w:t>
+      </w:r>
+      <w:proofErr w:type="spellEnd"/>
+      <w:r>
+        <w:t>, but this could be because of the usages of observed pressure</w:t>
+      </w:r>
+    </w:p>
+    <w:p/>
+    <w:p/>
+    <w:p>
+      <w:pPr>
+        <w:pStyle w:val="Kop1"/>
+      </w:pPr>
+      <w:r>
+        <w:t>Thursday 13-3-2025</w:t>
+      </w:r>
+    </w:p>
+    <w:p>
+      <w:r>
+        <w:t>So, the cape is pretty wrong. It is way too few.</w:t>
+      </w:r>
+      <w:r>
+        <w:br/>
+        <w:t xml:space="preserve">When I do the I thing, it looks correct again. So, maybe I do need the </w:t>
+      </w:r>
+      <w:proofErr w:type="spellStart"/>
+      <w:r>
+        <w:t>i</w:t>
+      </w:r>
+      <w:proofErr w:type="spellEnd"/>
+      <w:r>
+        <w:t xml:space="preserve">. </w:t>
+      </w:r>
+      <w:r>
+        <w:br/>
+        <w:t>The EL is already way to low.</w:t>
+      </w:r>
+      <w:r>
+        <w:br/>
+        <w:t>Okay I changed the observed data to use the standard height, that looks perfect for the pressure bars and the isotherms. But bad for the dry and wet adiabatic, how are they so hard to get right??</w:t>
+      </w:r>
+      <w:r>
+        <w:br/>
+        <w:t>Okay I believe my pressure is wrong?</w:t>
+      </w:r>
+      <w:r>
+        <w:br/>
+        <w:t xml:space="preserve">I cannot do anything, </w:t>
+      </w:r>
+      <w:r>
+        <w:t>I stand no chance on fixing this.</w:t>
+      </w:r>
+    </w:p>
+    <w:p>
+      <w:pPr>
+        <w:pStyle w:val="Kop1"/>
+      </w:pPr>
+      <w:r>
+        <w:t>Friday 14-3-2025</w:t>
+      </w:r>
+    </w:p>
+    <w:p>
+      <w:r>
+        <w:t xml:space="preserve">I just compared with the results of </w:t>
+      </w:r>
+      <w:proofErr w:type="spellStart"/>
+      <w:r>
+        <w:t>metpy</w:t>
+      </w:r>
+      <w:proofErr w:type="spellEnd"/>
+      <w:r>
+        <w:t xml:space="preserve"> and indeed my values are awfully wrong. </w:t>
+      </w:r>
+      <w:r>
+        <w:br/>
+        <w:t>Constants are perfect, mix rate and stuff are perfect, so what is wrong?</w:t>
+      </w:r>
+    </w:p>
+    <w:p>
+      <w:r>
+        <w:t>There is just no way to test anything more.</w:t>
+      </w:r>
+      <w:r>
+        <w:br/>
+        <w:t>Wait what, I just did instead of only 5 different pressures divided them up in pressures of 1, and now the values seem pretty correct.</w:t>
+      </w:r>
+      <w:r>
+        <w:br/>
+        <w:t>It looks correct again.</w:t>
+      </w:r>
+      <w:r>
+        <w:br/>
+        <w:t>LCL and LFC seem a bit off though</w:t>
+      </w:r>
+      <w:r>
+        <w:t xml:space="preserve"> no they correct but the visual moist adiabatic is just wrong it seems. What I got now is good enough.</w:t>
+      </w:r>
+    </w:p>
+    <w:p/>
+    <w:p>
+      <w:pPr>
+        <w:pStyle w:val="Kop1"/>
+      </w:pPr>
+      <w:r>
+        <w:lastRenderedPageBreak/>
+        <w:t>Tuesday 18-3-2025</w:t>
+      </w:r>
+    </w:p>
+    <w:p>
+      <w:r>
+        <w:t xml:space="preserve">Started to read upon the simulating paper (what I want to do), found out they using </w:t>
+      </w:r>
+      <w:hyperlink r:id="rId57" w:history="1">
+        <w:r>
+          <w:rPr>
+            <w:rStyle w:val="Hyperlink"/>
+          </w:rPr>
+          <w:t>http://www.srderoode.nl/PPT/Roode_CGILS_Mar_Stony_Brook_2010.pdf</w:t>
+        </w:r>
+      </w:hyperlink>
+      <w:r>
+        <w:t xml:space="preserve"> DALES, a </w:t>
+      </w:r>
+      <w:proofErr w:type="spellStart"/>
+      <w:r>
+        <w:t>dutch</w:t>
+      </w:r>
+      <w:proofErr w:type="spellEnd"/>
+      <w:r>
+        <w:t xml:space="preserve"> weather model.</w:t>
+      </w:r>
+      <w:r>
+        <w:br/>
+      </w:r>
+      <w:hyperlink r:id="rId58" w:history="1">
+        <w:r>
+          <w:rPr>
+            <w:rStyle w:val="Hyperlink"/>
+          </w:rPr>
+          <w:t>https://github.com/dalesteam/dales</w:t>
+        </w:r>
+      </w:hyperlink>
+      <w:r>
+        <w:t xml:space="preserve"> </w:t>
+      </w:r>
+    </w:p>
+    <w:p/>
+    <w:p>
+      <w:pPr>
+        <w:pStyle w:val="Kop1"/>
+      </w:pPr>
+      <w:r>
+        <w:t>Saturday 22-3-2025</w:t>
+      </w:r>
+    </w:p>
+    <w:p>
+      <w:r>
+        <w:t xml:space="preserve">This paper is about simulating cirrus clouds </w:t>
+      </w:r>
+      <w:hyperlink r:id="rId59" w:history="1">
+        <w:r>
+          <w:rPr>
+            <w:rStyle w:val="Hyperlink"/>
+          </w:rPr>
+          <w:t>https://agupubs.onlinelibrary.wiley.com/doi/full/10.1029/2001JD000767</w:t>
+        </w:r>
+      </w:hyperlink>
+      <w:r>
+        <w:t xml:space="preserve"> </w:t>
+      </w:r>
+      <w:r>
+        <w:br/>
+      </w:r>
+      <w:r>
+        <w:t>Stam’s fluid solver</w:t>
+      </w:r>
+      <w:r>
+        <w:t xml:space="preserve"> for fluid motion?</w:t>
+      </w:r>
+    </w:p>
+    <w:p/>
+    <w:p>
+      <w:pPr>
+        <w:pStyle w:val="Kop1"/>
+      </w:pPr>
+      <w:r>
+        <w:t>Tuesday 25-3-2025</w:t>
+      </w:r>
+    </w:p>
+    <w:p>
+      <w:r>
+        <w:t>Trying to fix the looks again.</w:t>
+      </w:r>
+      <w:r>
+        <w:br/>
+        <w:t>Seems like the temps x pressure bars x isotherms x dry-</w:t>
+      </w:r>
+      <w:proofErr w:type="spellStart"/>
+      <w:r>
+        <w:t>adiabatics</w:t>
+      </w:r>
+      <w:proofErr w:type="spellEnd"/>
+      <w:r>
+        <w:t xml:space="preserve"> are perfect.</w:t>
+      </w:r>
+      <w:r>
+        <w:br/>
+        <w:t>But the wet-</w:t>
+      </w:r>
+      <w:proofErr w:type="spellStart"/>
+      <w:r>
+        <w:t>adiabatics</w:t>
+      </w:r>
+      <w:proofErr w:type="spellEnd"/>
+      <w:r>
+        <w:t xml:space="preserve"> are still off…</w:t>
+      </w:r>
+      <w:r>
+        <w:br/>
+      </w:r>
+      <w:proofErr w:type="spellStart"/>
+      <w:r>
+        <w:t>nvm</w:t>
+      </w:r>
+      <w:proofErr w:type="spellEnd"/>
+      <w:r>
+        <w:t xml:space="preserve">, found it, was not doing the increment of 1 yet on the debug. Okay that fixed the moist </w:t>
+      </w:r>
+      <w:proofErr w:type="spellStart"/>
+      <w:r>
+        <w:t>adiabatics</w:t>
+      </w:r>
+      <w:proofErr w:type="spellEnd"/>
+      <w:r>
+        <w:t>, now only the LCL stuff.</w:t>
+      </w:r>
+      <w:r>
+        <w:br/>
+        <w:t xml:space="preserve">Hmmm, my LCL calculator returns a different answer than all the other calculators. </w:t>
+      </w:r>
+      <w:r>
+        <w:br/>
+        <w:t>I don’t know what could be wrong though…</w:t>
+      </w:r>
+    </w:p>
+    <w:p/>
+    <w:p>
+      <w:pPr>
+        <w:pStyle w:val="Kop1"/>
+      </w:pPr>
+      <w:r>
+        <w:t>Saturday 29-3-2025</w:t>
+      </w:r>
+    </w:p>
+    <w:p>
+      <w:r>
+        <w:t>LCL debugging</w:t>
+      </w:r>
+      <w:r>
+        <w:t>.</w:t>
+      </w:r>
+    </w:p>
+    <w:p>
+      <w:r>
+        <w:t xml:space="preserve">Okay fixed mixing ratio by adding the </w:t>
+      </w:r>
+      <w:proofErr w:type="spellStart"/>
+      <w:r>
+        <w:t>MWratio</w:t>
+      </w:r>
+      <w:proofErr w:type="spellEnd"/>
+      <w:r>
+        <w:t xml:space="preserve"> (0.622)</w:t>
+      </w:r>
+      <w:r>
+        <w:br/>
+        <w:t xml:space="preserve">Still </w:t>
+      </w:r>
+      <w:proofErr w:type="spellStart"/>
+      <w:r>
+        <w:t>its</w:t>
+      </w:r>
+      <w:proofErr w:type="spellEnd"/>
+      <w:r>
+        <w:t xml:space="preserve"> just a tad bit offset.</w:t>
+      </w:r>
+    </w:p>
+    <w:p/>
+    <w:p>
+      <w:pPr>
+        <w:pStyle w:val="Kop1"/>
+      </w:pPr>
+      <w:r>
+        <w:t>Sunday 30-3-2025</w:t>
+      </w:r>
+    </w:p>
+    <w:p>
+      <w:r>
+        <w:t xml:space="preserve">It’s a bit of a mess </w:t>
+      </w:r>
+      <w:proofErr w:type="spellStart"/>
+      <w:r>
+        <w:t>atm</w:t>
+      </w:r>
+      <w:proofErr w:type="spellEnd"/>
+      <w:r>
+        <w:t xml:space="preserve"> since I am ‘fixing’ some formulas.</w:t>
+      </w:r>
+      <w:r>
+        <w:br/>
+        <w:t>I might have fixed it.</w:t>
+      </w:r>
+      <w:r>
+        <w:br/>
+        <w:t>The moist adiabatic at the LCL seems to be a bit off.</w:t>
+      </w:r>
+      <w:r>
+        <w:br/>
+      </w:r>
+      <w:proofErr w:type="spellStart"/>
+      <w:r>
+        <w:t>Its</w:t>
+      </w:r>
+      <w:proofErr w:type="spellEnd"/>
+      <w:r>
+        <w:t xml:space="preserve"> just plotted wrong due to idk what.</w:t>
+      </w:r>
+      <w:r>
+        <w:br/>
+        <w:t xml:space="preserve">Oh it may be the calculations because when I set the dew point much lower, the MLR becomes warmer? </w:t>
+      </w:r>
+      <w:r>
+        <w:br/>
+        <w:t>Okay it is because I use the LCL pressure as reference pressure.</w:t>
+      </w:r>
+    </w:p>
+    <w:p>
+      <w:r>
+        <w:lastRenderedPageBreak/>
+        <w:t xml:space="preserve">I may see the issue, </w:t>
+      </w:r>
+      <w:r>
+        <w:t xml:space="preserve">after a while, the difference between p and </w:t>
+      </w:r>
+      <w:proofErr w:type="spellStart"/>
+      <w:r>
+        <w:t>pref</w:t>
+      </w:r>
+      <w:proofErr w:type="spellEnd"/>
+      <w:r>
+        <w:t xml:space="preserve"> becomes like 300+ which breaks it of course. So how do I fix it?</w:t>
+      </w:r>
+      <w:r>
+        <w:br/>
+      </w:r>
+      <w:r>
+        <w:t>For now I will just fix it from the outside.</w:t>
+      </w:r>
+      <w:r>
+        <w:br/>
+        <w:t xml:space="preserve">I see that I have to do the same for </w:t>
+      </w:r>
+      <w:proofErr w:type="spellStart"/>
+      <w:r>
+        <w:t>CalculateCAPE</w:t>
+      </w:r>
+      <w:proofErr w:type="spellEnd"/>
+      <w:r>
+        <w:t xml:space="preserve">(). </w:t>
+      </w:r>
+      <w:r>
+        <w:br/>
+        <w:t xml:space="preserve">That was a wrong fix, I thought I needed to start at the LFC, but I needed to start at LCL of course. </w:t>
+      </w:r>
+      <w:r>
+        <w:br/>
+        <w:t>That’s why it was showing sometimes higher values when decreasing.</w:t>
+      </w:r>
+    </w:p>
+    <w:p>
+      <w:r>
+        <w:t>Okay Currently the calculation is a bit broken, not sure why but it has to do with the  []() {} thingy.</w:t>
+      </w:r>
+      <w:r>
+        <w:t xml:space="preserve"> </w:t>
+      </w:r>
+      <w:r>
+        <w:br/>
+        <w:t>(starting pressure should be 920, but its 900)</w:t>
+      </w:r>
+      <w:r>
+        <w:br/>
+        <w:t>Fixed it easily by not using standard pressure but just the observed.</w:t>
+      </w:r>
+      <w:r>
+        <w:br/>
+        <w:t>But now my cape is too much.</w:t>
+      </w:r>
+      <w:r>
+        <w:br/>
+        <w:t xml:space="preserve">420 instead of 362. </w:t>
+      </w:r>
+      <w:r>
+        <w:br/>
+        <w:t>My LCL and my EL are both just a bit higher which probably causes the difference, lets check another example. 1938 VS 1790</w:t>
+      </w:r>
+      <w:r>
+        <w:br/>
+        <w:t>LCL lower but LFC higher, hmmm.</w:t>
+      </w:r>
+      <w:r>
+        <w:br/>
+        <w:t xml:space="preserve">On </w:t>
+      </w:r>
+      <w:proofErr w:type="spellStart"/>
+      <w:r>
+        <w:t>Meteociel</w:t>
+      </w:r>
+      <w:proofErr w:type="spellEnd"/>
+      <w:r>
+        <w:t xml:space="preserve"> (sharpy) it has no LFC?</w:t>
+      </w:r>
+      <w:r>
+        <w:br/>
+        <w:t>Okay but the graph has like just a tab bit offset which I guess just is okay, the reason why could also be the use of the first data in the graph instead of ground data?</w:t>
+      </w:r>
+      <w:r>
+        <w:br/>
+        <w:t>But I guess it is good enough.</w:t>
+      </w:r>
+    </w:p>
+    <w:p>
+      <w:r>
+        <w:t>EL seems to have a wrong offset?</w:t>
+      </w:r>
+      <w:r>
+        <w:tab/>
+      </w:r>
+      <w:r>
+        <w:br/>
+        <w:t>Seems like the altitude is just wrong when using the converter?</w:t>
+      </w:r>
+      <w:r>
+        <w:br/>
+        <w:t>Yup, should just use the observed pressure.</w:t>
+      </w:r>
+    </w:p>
+    <w:p>
+      <w:r>
+        <w:t>Alrighty I think I am happy with this result and I can finally proceed.</w:t>
+      </w:r>
+      <w:r>
+        <w:rPr>
+          <w:noProof/>
+        </w:rPr>
+        <w:drawing>
+          <wp:inline distT="0" distB="0" distL="0" distR="0" wp14:anchorId="1C8B1D21" wp14:editId="60A637A3">
+            <wp:extent cx="5571719" cy="3238500"/>
+            <wp:effectExtent l="0" t="0" r="0" b="0"/>
+            <wp:docPr id="473358097" name="Afbeelding 1" descr="Afbeelding met tekst, schermopname, scherm, software&#10;&#10;Door AI gegenereerde inhoud is mogelijk onjuist."/>
+            <wp:cNvGraphicFramePr>
+              <a:graphicFrameLocks xmlns:a="http://schemas.openxmlformats.org/drawingml/2006/main" noChangeAspect="1"/>
+            </wp:cNvGraphicFramePr>
+            <a:graphic xmlns:a="http://schemas.openxmlformats.org/drawingml/2006/main">
+              <a:graphicData uri="http://schemas.openxmlformats.org/drawingml/2006/picture">
+                <pic:pic xmlns:pic="http://schemas.openxmlformats.org/drawingml/2006/picture">
+                  <pic:nvPicPr>
+                    <pic:cNvPr id="473358097" name="Afbeelding 1" descr="Afbeelding met tekst, schermopname, scherm, software&#10;&#10;Door AI gegenereerde inhoud is mogelijk onjuist."/>
+                    <pic:cNvPicPr/>
+                  </pic:nvPicPr>
+                  <pic:blipFill>
+                    <a:blip r:embed="rId60" cstate="print">
+                      <a:extLst>
+                        <a:ext uri="{28A0092B-C50C-407E-A947-70E740481C1C}">
+                          <a14:useLocalDpi xmlns:a14="http://schemas.microsoft.com/office/drawing/2010/main" val="0"/>
+                        </a:ext>
+                      </a:extLst>
+                    </a:blip>
+                    <a:stretch>
+                      <a:fillRect/>
+                    </a:stretch>
+                  </pic:blipFill>
+                  <pic:spPr>
+                    <a:xfrm>
+                      <a:off x="0" y="0"/>
+                      <a:ext cx="5579432" cy="3242983"/>
+                    </a:xfrm>
+                    <a:prstGeom prst="rect">
+                      <a:avLst/>
+                    </a:prstGeom>
+                  </pic:spPr>
+                </pic:pic>
+              </a:graphicData>
+            </a:graphic>
+          </wp:inline>
+        </w:drawing>
+      </w:r>
+    </w:p>
+    <w:p/>
+    <w:p/>
+    <w:p>
+      <w:pPr>
+        <w:pStyle w:val="Kop1"/>
+      </w:pPr>
+      <w:r>
+        <w:lastRenderedPageBreak/>
+        <w:t>Thursday 3-4-2025</w:t>
+      </w:r>
+    </w:p>
+    <w:p>
+      <w:r>
+        <w:t xml:space="preserve">I need the CCL, since this is not forced lift but lift by warmth. </w:t>
+      </w:r>
+      <w:r>
+        <w:br/>
+      </w:r>
+      <w:hyperlink r:id="rId61" w:history="1">
+        <w:r>
+          <w:rPr>
+            <w:rStyle w:val="Hyperlink"/>
+          </w:rPr>
+          <w:t>https://www.theweatherprediction.com/habyhints/160/</w:t>
+        </w:r>
+      </w:hyperlink>
+      <w:r>
+        <w:t xml:space="preserve"> </w:t>
+      </w:r>
+      <w:r>
+        <w:br/>
+        <w:t xml:space="preserve">I am going to make use of such a nice BVH. </w:t>
+      </w:r>
+    </w:p>
+    <w:p>
+      <w:pPr>
+        <w:pStyle w:val="Kop1"/>
+      </w:pPr>
+      <w:r>
+        <w:t>Saturday 5-3-2025</w:t>
+      </w:r>
+    </w:p>
+    <w:p>
+      <w:r>
+        <w:t xml:space="preserve">Okay I also need the CCL, so </w:t>
+      </w:r>
+      <w:proofErr w:type="spellStart"/>
+      <w:r>
+        <w:t>lets</w:t>
+      </w:r>
+      <w:proofErr w:type="spellEnd"/>
+      <w:r>
+        <w:t xml:space="preserve"> start making that, it will probably be very easy since it </w:t>
+      </w:r>
+      <w:proofErr w:type="spellStart"/>
+      <w:r>
+        <w:t>it</w:t>
+      </w:r>
+      <w:proofErr w:type="spellEnd"/>
+      <w:r>
+        <w:t xml:space="preserve"> just the following of the mixed ratio.</w:t>
+      </w:r>
+      <w:r>
+        <w:br/>
+      </w:r>
+      <w:r>
+        <w:drawing>
+          <wp:anchor distT="0" distB="0" distL="114300" distR="114300" simplePos="0" relativeHeight="251682816" behindDoc="1" locked="0" layoutInCell="1" allowOverlap="1" wp14:anchorId="66972515" wp14:editId="1B1EC9BF">
+            <wp:simplePos x="0" y="0"/>
+            <wp:positionH relativeFrom="column">
+              <wp:posOffset>-1270</wp:posOffset>
+            </wp:positionH>
+            <wp:positionV relativeFrom="paragraph">
+              <wp:posOffset>365760</wp:posOffset>
+            </wp:positionV>
+            <wp:extent cx="1812925" cy="1438275"/>
+            <wp:effectExtent l="0" t="0" r="0" b="9525"/>
+            <wp:wrapTight wrapText="bothSides">
+              <wp:wrapPolygon edited="0">
+                <wp:start x="0" y="0"/>
+                <wp:lineTo x="0" y="21457"/>
+                <wp:lineTo x="21335" y="21457"/>
+                <wp:lineTo x="21335" y="0"/>
+                <wp:lineTo x="0" y="0"/>
+              </wp:wrapPolygon>
+            </wp:wrapTight>
+            <wp:docPr id="169794599" name="Afbeelding 1" descr="Afbeelding met tekst, kaart, diagram&#10;&#10;Door AI gegenereerde inhoud is mogelijk onjuist."/>
+            <wp:cNvGraphicFramePr>
+              <a:graphicFrameLocks xmlns:a="http://schemas.openxmlformats.org/drawingml/2006/main" noChangeAspect="1"/>
+            </wp:cNvGraphicFramePr>
+            <a:graphic xmlns:a="http://schemas.openxmlformats.org/drawingml/2006/main">
+              <a:graphicData uri="http://schemas.openxmlformats.org/drawingml/2006/picture">
+                <pic:pic xmlns:pic="http://schemas.openxmlformats.org/drawingml/2006/picture">
+                  <pic:nvPicPr>
+                    <pic:cNvPr id="169794599" name="Afbeelding 1" descr="Afbeelding met tekst, kaart, diagram&#10;&#10;Door AI gegenereerde inhoud is mogelijk onjuist."/>
+                    <pic:cNvPicPr/>
+                  </pic:nvPicPr>
+                  <pic:blipFill>
+                    <a:blip r:embed="rId62" cstate="print">
+                      <a:extLst>
+                        <a:ext uri="{28A0092B-C50C-407E-A947-70E740481C1C}">
+                          <a14:useLocalDpi xmlns:a14="http://schemas.microsoft.com/office/drawing/2010/main" val="0"/>
+                        </a:ext>
+                      </a:extLst>
+                    </a:blip>
+                    <a:stretch>
+                      <a:fillRect/>
+                    </a:stretch>
+                  </pic:blipFill>
+                  <pic:spPr>
+                    <a:xfrm>
+                      <a:off x="0" y="0"/>
+                      <a:ext cx="1812925" cy="1438275"/>
+                    </a:xfrm>
+                    <a:prstGeom prst="rect">
+                      <a:avLst/>
+                    </a:prstGeom>
+                  </pic:spPr>
+                </pic:pic>
+              </a:graphicData>
+            </a:graphic>
+          </wp:anchor>
+        </w:drawing>
+      </w:r>
+      <w:r>
+        <w:t>I made a nice drawing so that I understand CCL vs LCL.</w:t>
+      </w:r>
+      <w:r>
+        <w:br/>
+      </w:r>
+      <w:r>
+        <w:t>Okay wait, for the Mixing ratio, I have to I think calculate the W for D0 and P0, and then fill in W and P to retrieve Dn.</w:t>
       </w:r>
     </w:p>
     <w:sectPr>

</xml_diff>

<commit_message>
CUDA + Environment + colors
Added some CUDA test files.
Added formulas to simulated the environment based on a paper.
Added some debugging colors.
Currently the simulation is so unstable it will after 2 frames jump to nan.
</commit_message>
<xml_diff>
--- a/SkewTSimDocumentation.docx
+++ b/SkewTSimDocumentation.docx
@@ -28,15 +28,7 @@
       </w:r>
       <w:r>
         <w:br/>
-        <w:t xml:space="preserve">This means much research has to </w:t>
-      </w:r>
-      <w:proofErr w:type="spellStart"/>
-      <w:r>
-        <w:t>ben</w:t>
-      </w:r>
-      <w:proofErr w:type="spellEnd"/>
-      <w:r>
-        <w:t xml:space="preserve"> done first.</w:t>
+        <w:t>This means much research has to ben done first.</w:t>
       </w:r>
     </w:p>
     <w:p>
@@ -167,7 +159,6 @@
       </w:r>
     </w:p>
     <w:p>
-      <w:proofErr w:type="spellStart"/>
       <w:r>
         <w:t>R</w:t>
       </w:r>
@@ -176,15 +167,7 @@
           <w:sz w:val="12"/>
           <w:szCs w:val="12"/>
         </w:rPr>
-        <w:t>specific</w:t>
-      </w:r>
-      <w:proofErr w:type="spellEnd"/>
-      <w:r>
-        <w:rPr>
-          <w:sz w:val="12"/>
-          <w:szCs w:val="12"/>
-        </w:rPr>
-        <w:t xml:space="preserve"> </w:t>
+        <w:t xml:space="preserve">specific </w:t>
       </w:r>
       <w:r>
         <w:rPr>
@@ -443,23 +426,7 @@
     </w:p>
     <w:p>
       <w:r>
-        <w:t>Our given values are: height (m), pressure (</w:t>
-      </w:r>
-      <w:proofErr w:type="spellStart"/>
-      <w:r>
-        <w:t>hPa</w:t>
-      </w:r>
-      <w:proofErr w:type="spellEnd"/>
-      <w:r>
-        <w:t xml:space="preserve">), temperature (C), wet bulb (C), Dew point (C), </w:t>
-      </w:r>
-      <w:proofErr w:type="spellStart"/>
-      <w:r>
-        <w:t>Humity</w:t>
-      </w:r>
-      <w:proofErr w:type="spellEnd"/>
-      <w:r>
-        <w:t xml:space="preserve"> (%), wind speed (km/h) and wind direction (degrees). </w:t>
+        <w:t xml:space="preserve">Our given values are: height (m), pressure (hPa), temperature (C), wet bulb (C), Dew point (C), Humity (%), wind speed (km/h) and wind direction (degrees). </w:t>
       </w:r>
     </w:p>
     <w:p/>
@@ -491,15 +458,7 @@
       </w:r>
       <w:r>
         <w:br/>
-        <w:t xml:space="preserve">10.000 rows of time, pressure, temp, humidity and </w:t>
-      </w:r>
-      <w:proofErr w:type="spellStart"/>
-      <w:r>
-        <w:t>ascentRate</w:t>
-      </w:r>
-      <w:proofErr w:type="spellEnd"/>
-      <w:r>
-        <w:t>:</w:t>
+        <w:t>10.000 rows of time, pressure, temp, humidity and ascentRate:</w:t>
       </w:r>
       <w:r>
         <w:br/>
@@ -565,23 +524,7 @@
       </w:r>
       <w:r>
         <w:br/>
-        <w:t xml:space="preserve">I just got the </w:t>
-      </w:r>
-      <w:proofErr w:type="spellStart"/>
-      <w:r>
-        <w:t>german</w:t>
-      </w:r>
-      <w:proofErr w:type="spellEnd"/>
-      <w:r>
-        <w:t xml:space="preserve"> raw </w:t>
-      </w:r>
-      <w:proofErr w:type="spellStart"/>
-      <w:r>
-        <w:t>radiosconde</w:t>
-      </w:r>
-      <w:proofErr w:type="spellEnd"/>
-      <w:r>
-        <w:t>, and it does not look good, it is way different than the one of KNMI.</w:t>
+        <w:t>I just got the german raw radiosconde, and it does not look good, it is way different than the one of KNMI.</w:t>
       </w:r>
     </w:p>
     <w:p>
@@ -600,35 +543,11 @@
         <w:br/>
       </w:r>
       <w:r>
-        <w:t xml:space="preserve">I found out the KNMI offers a file called </w:t>
-      </w:r>
-      <w:proofErr w:type="spellStart"/>
-      <w:r>
-        <w:t>synchronizedSoundingData</w:t>
-      </w:r>
-      <w:proofErr w:type="spellEnd"/>
-      <w:r>
-        <w:t xml:space="preserve">, this has the things I need. </w:t>
-      </w:r>
-      <w:r>
-        <w:br/>
-        <w:t xml:space="preserve">Sounding-ID, Time since idk, exact date and time, pressure in </w:t>
-      </w:r>
-      <w:proofErr w:type="spellStart"/>
-      <w:r>
-        <w:t>hPa</w:t>
-      </w:r>
-      <w:proofErr w:type="spellEnd"/>
-      <w:r>
-        <w:t xml:space="preserve">, temp, humid, </w:t>
-      </w:r>
-      <w:proofErr w:type="spellStart"/>
-      <w:r>
-        <w:t>windDir</w:t>
-      </w:r>
-      <w:proofErr w:type="spellEnd"/>
-      <w:r>
-        <w:t xml:space="preserve">, windspeed, height, </w:t>
+        <w:t xml:space="preserve">I found out the KNMI offers a file called synchronizedSoundingData, this has the things I need. </w:t>
+      </w:r>
+      <w:r>
+        <w:br/>
+        <w:t xml:space="preserve">Sounding-ID, Time since idk, exact date and time, pressure in hPa, temp, humid, windDir, windspeed, height, </w:t>
       </w:r>
       <w:r>
         <w:t>Lat- and Longitude, altitude. These are the main things I need.</w:t>
@@ -640,15 +559,7 @@
     </w:p>
     <w:p>
       <w:r>
-        <w:t xml:space="preserve">In the </w:t>
-      </w:r>
-      <w:proofErr w:type="spellStart"/>
-      <w:r>
-        <w:t>german</w:t>
-      </w:r>
-      <w:proofErr w:type="spellEnd"/>
-      <w:r>
-        <w:t xml:space="preserve"> files, I can use the </w:t>
+        <w:t xml:space="preserve">In the german files, I can use the </w:t>
       </w:r>
       <w:r>
         <w:t>Metadaten_Sekunde_Aero_03015.txt</w:t>
@@ -675,7 +586,7 @@
         </w:rPr>
         <w:lastRenderedPageBreak/>
         <w:drawing>
-          <wp:anchor distT="0" distB="0" distL="114300" distR="114300" simplePos="0" relativeHeight="251662336" behindDoc="1" locked="0" layoutInCell="1" allowOverlap="1" wp14:anchorId="1B50E1EB" wp14:editId="4498E52C">
+          <wp:anchor distT="0" distB="0" distL="114300" distR="114300" simplePos="0" relativeHeight="251662336" behindDoc="1" locked="0" layoutInCell="1" allowOverlap="1" wp14:anchorId="1B50E1EB" wp14:editId="1D085E25">
             <wp:simplePos x="0" y="0"/>
             <wp:positionH relativeFrom="column">
               <wp:posOffset>-361481</wp:posOffset>
@@ -754,7 +665,7 @@
           <w:noProof/>
         </w:rPr>
         <w:drawing>
-          <wp:anchor distT="0" distB="0" distL="114300" distR="114300" simplePos="0" relativeHeight="251663360" behindDoc="1" locked="0" layoutInCell="1" allowOverlap="1" wp14:anchorId="6BDF185A" wp14:editId="265FCF1A">
+          <wp:anchor distT="0" distB="0" distL="114300" distR="114300" simplePos="0" relativeHeight="251663360" behindDoc="1" locked="0" layoutInCell="1" allowOverlap="1" wp14:anchorId="6BDF185A" wp14:editId="23B2CA51">
             <wp:simplePos x="0" y="0"/>
             <wp:positionH relativeFrom="column">
               <wp:posOffset>1385918</wp:posOffset>
@@ -816,15 +727,7 @@
       </w:r>
       <w:r>
         <w:br/>
-        <w:t xml:space="preserve">And instead of using windspeed + </w:t>
-      </w:r>
-      <w:proofErr w:type="spellStart"/>
-      <w:r>
-        <w:t>windDir</w:t>
-      </w:r>
-      <w:proofErr w:type="spellEnd"/>
-      <w:r>
-        <w:t xml:space="preserve"> I could use north and east, but I won’t.</w:t>
+        <w:t>And instead of using windspeed + windDir I could use north and east, but I won’t.</w:t>
       </w:r>
     </w:p>
     <w:p>
@@ -833,26 +736,13 @@
       </w:r>
     </w:p>
     <w:p>
-      <w:proofErr w:type="spellStart"/>
-      <w:r>
-        <w:t>Lets</w:t>
-      </w:r>
-      <w:proofErr w:type="spellEnd"/>
-      <w:r>
-        <w:t xml:space="preserve"> make DWD work.</w:t>
-      </w:r>
-    </w:p>
-    <w:p>
-      <w:r>
-        <w:t xml:space="preserve">Alrighty, got it also working, it was way more complicated. </w:t>
-      </w:r>
-      <w:proofErr w:type="spellStart"/>
-      <w:r>
-        <w:t>Its</w:t>
-      </w:r>
-      <w:proofErr w:type="spellEnd"/>
-      <w:r>
-        <w:t xml:space="preserve"> is not that much slower luckily. But I do need a way to choose the date of these.</w:t>
+      <w:r>
+        <w:t>Lets make DWD work.</w:t>
+      </w:r>
+    </w:p>
+    <w:p>
+      <w:r>
+        <w:t>Alrighty, got it also working, it was way more complicated. Its is not that much slower luckily. But I do need a way to choose the date of these.</w:t>
       </w:r>
     </w:p>
     <w:p>
@@ -866,7 +756,7 @@
           <w:noProof/>
         </w:rPr>
         <w:drawing>
-          <wp:anchor distT="0" distB="0" distL="114300" distR="114300" simplePos="0" relativeHeight="251664384" behindDoc="1" locked="0" layoutInCell="1" allowOverlap="1" wp14:anchorId="1061808A" wp14:editId="2C327283">
+          <wp:anchor distT="0" distB="0" distL="114300" distR="114300" simplePos="0" relativeHeight="251664384" behindDoc="1" locked="0" layoutInCell="1" allowOverlap="1" wp14:anchorId="1061808A" wp14:editId="5A08EE82">
             <wp:simplePos x="0" y="0"/>
             <wp:positionH relativeFrom="page">
               <wp:align>left</wp:align>
@@ -929,13 +819,8 @@
           </wp:anchor>
         </w:drawing>
       </w:r>
-      <w:proofErr w:type="spellStart"/>
-      <w:r>
-        <w:t>Lets</w:t>
-      </w:r>
-      <w:proofErr w:type="spellEnd"/>
-      <w:r>
-        <w:t xml:space="preserve"> make it actually skewed.</w:t>
+      <w:r>
+        <w:t>Lets make it actually skewed.</w:t>
       </w:r>
     </w:p>
     <w:p>
@@ -955,16 +840,11 @@
         <w:br/>
         <w:t xml:space="preserve">I also need the dry and moist </w:t>
       </w:r>
-      <w:proofErr w:type="spellStart"/>
       <w:r>
         <w:t>adiabatic</w:t>
       </w:r>
       <w:r>
-        <w:t>s</w:t>
-      </w:r>
-      <w:proofErr w:type="spellEnd"/>
-      <w:r>
-        <w:t xml:space="preserve">. </w:t>
+        <w:t xml:space="preserve">s. </w:t>
       </w:r>
     </w:p>
     <w:p/>
@@ -992,7 +872,7 @@
           <w:noProof/>
         </w:rPr>
         <w:drawing>
-          <wp:anchor distT="0" distB="0" distL="114300" distR="114300" simplePos="0" relativeHeight="251666432" behindDoc="1" locked="0" layoutInCell="1" allowOverlap="1" wp14:anchorId="30EAEABE" wp14:editId="5AFCB82D">
+          <wp:anchor distT="0" distB="0" distL="114300" distR="114300" simplePos="0" relativeHeight="251666432" behindDoc="1" locked="0" layoutInCell="1" allowOverlap="1" wp14:anchorId="30EAEABE" wp14:editId="7670A222">
             <wp:simplePos x="0" y="0"/>
             <wp:positionH relativeFrom="column">
               <wp:posOffset>1936185</wp:posOffset>
@@ -1152,34 +1032,13 @@
         <w:t xml:space="preserve">Tw = g * ((1 + </w:t>
       </w:r>
       <w:r>
-        <w:t>(Hv * r) / (</w:t>
-      </w:r>
-      <w:proofErr w:type="spellStart"/>
-      <w:r>
-        <w:t>Rsd</w:t>
-      </w:r>
-      <w:proofErr w:type="spellEnd"/>
-      <w:r>
-        <w:t xml:space="preserve"> * T)</w:t>
+        <w:t>(Hv * r) / (Rsd * T)</w:t>
       </w:r>
       <w:r>
         <w:t>) / (</w:t>
       </w:r>
-      <w:proofErr w:type="spellStart"/>
-      <w:r>
-        <w:t>cpd</w:t>
-      </w:r>
-      <w:proofErr w:type="spellEnd"/>
-      <w:r>
-        <w:t xml:space="preserve"> + (Hv^2 * r) / </w:t>
-      </w:r>
-      <w:proofErr w:type="spellStart"/>
-      <w:r>
-        <w:t>Rsw</w:t>
-      </w:r>
-      <w:proofErr w:type="spellEnd"/>
-      <w:r>
-        <w:t xml:space="preserve"> * T^2</w:t>
+      <w:r>
+        <w:t>cpd + (Hv^2 * r) / Rsw * T^2</w:t>
       </w:r>
       <w:r>
         <w:t>))</w:t>
@@ -1209,15 +1068,7 @@
       </w:r>
       <w:r>
         <w:br/>
-        <w:t xml:space="preserve">I </w:t>
-      </w:r>
-      <w:proofErr w:type="spellStart"/>
-      <w:r>
-        <w:t>cant</w:t>
-      </w:r>
-      <w:proofErr w:type="spellEnd"/>
-      <w:r>
-        <w:t xml:space="preserve"> seem to get them right.</w:t>
+        <w:t>I cant seem to get them right.</w:t>
       </w:r>
       <w:r>
         <w:br/>
@@ -1293,13 +1144,8 @@
       </w:r>
       <w:r>
         <w:br/>
-        <w:t xml:space="preserve">dh = Cp * dT + a / ã * g  * </w:t>
-      </w:r>
-      <w:proofErr w:type="spellStart"/>
-      <w:r>
-        <w:t>dz</w:t>
-      </w:r>
-      <w:proofErr w:type="spellEnd"/>
+        <w:t>dh = Cp * dT + a / ã * g  * dz</w:t>
+      </w:r>
       <w:r>
         <w:br/>
         <w:t>ã =  (a1 + a2) / 2</w:t>
@@ -1314,31 +1160,16 @@
       </w:r>
       <w:r>
         <w:br/>
-        <w:t xml:space="preserve">0 = Cp * dT + a/ã * g * </w:t>
-      </w:r>
-      <w:proofErr w:type="spellStart"/>
-      <w:r>
-        <w:t>dz</w:t>
-      </w:r>
-      <w:proofErr w:type="spellEnd"/>
-      <w:r>
-        <w:br/>
-        <w:t xml:space="preserve">Cp * dT = -a/ã * g * </w:t>
-      </w:r>
-      <w:proofErr w:type="spellStart"/>
-      <w:r>
-        <w:t>dz</w:t>
-      </w:r>
-      <w:proofErr w:type="spellEnd"/>
-      <w:r>
-        <w:br/>
-        <w:t xml:space="preserve">dT = -a/ã * g /Cp * </w:t>
-      </w:r>
-      <w:proofErr w:type="spellStart"/>
-      <w:r>
-        <w:t>dz</w:t>
-      </w:r>
-      <w:proofErr w:type="spellEnd"/>
+        <w:t>0 = Cp * dT + a/ã * g * dz</w:t>
+      </w:r>
+      <w:r>
+        <w:br/>
+        <w:t>Cp * dT = -a/ã * g * dz</w:t>
+      </w:r>
+      <w:r>
+        <w:br/>
+        <w:t>dT = -a/ã * g /Cp * dz</w:t>
+      </w:r>
       <w:r>
         <w:br/>
         <w:t>Good enough</w:t>
@@ -1412,15 +1243,7 @@
       </w:r>
       <w:r>
         <w:br/>
-        <w:t xml:space="preserve">Okay also Cp – </w:t>
-      </w:r>
-      <w:proofErr w:type="spellStart"/>
-      <w:r>
-        <w:t>Cv</w:t>
-      </w:r>
-      <w:proofErr w:type="spellEnd"/>
-      <w:r>
-        <w:t xml:space="preserve"> = R;</w:t>
+        <w:t>Okay also Cp – Cv = R;</w:t>
       </w:r>
       <w:r>
         <w:br/>
@@ -1428,15 +1251,7 @@
       </w:r>
       <w:r>
         <w:br/>
-        <w:t xml:space="preserve">The author believes that we do not work in a constant pressure environment thus we use </w:t>
-      </w:r>
-      <w:proofErr w:type="spellStart"/>
-      <w:r>
-        <w:t>Cv</w:t>
-      </w:r>
-      <w:proofErr w:type="spellEnd"/>
-      <w:r>
-        <w:t>, because our volume is constant. (I think)</w:t>
+        <w:t>The author believes that we do not work in a constant pressure environment thus we use Cv, because our volume is constant. (I think)</w:t>
       </w:r>
       <w:r>
         <w:br/>
@@ -1470,15 +1285,7 @@
       </w:r>
       <w:r>
         <w:br/>
-        <w:t xml:space="preserve">I found out why. So, they are called also log-p diagrams, this means that the distance between 1000 and 500 </w:t>
-      </w:r>
-      <w:proofErr w:type="spellStart"/>
-      <w:r>
-        <w:t>hPa</w:t>
-      </w:r>
-      <w:proofErr w:type="spellEnd"/>
-      <w:r>
-        <w:t xml:space="preserve"> is the same as 500 and 250. </w:t>
+        <w:t xml:space="preserve">I found out why. So, they are called also log-p diagrams, this means that the distance between 1000 and 500 hPa is the same as 500 and 250. </w:t>
       </w:r>
       <w:r>
         <w:br/>
@@ -1512,15 +1319,7 @@
         </w:r>
       </w:hyperlink>
       <w:r>
-        <w:t xml:space="preserve"> This is exactly what I want to do, but it is not open source unfortunately. </w:t>
-      </w:r>
-      <w:proofErr w:type="spellStart"/>
-      <w:r>
-        <w:t>Nvm</w:t>
-      </w:r>
-      <w:proofErr w:type="spellEnd"/>
-      <w:r>
-        <w:t xml:space="preserve">, got it: </w:t>
+        <w:t xml:space="preserve"> This is exactly what I want to do, but it is not open source unfortunately. Nvm, got it: </w:t>
       </w:r>
       <w:hyperlink r:id="rId25" w:history="1">
         <w:r>
@@ -1584,15 +1383,7 @@
     </w:p>
     <w:p>
       <w:r>
-        <w:t xml:space="preserve">Seems to not fully work, I tried using it on a dry </w:t>
-      </w:r>
-      <w:proofErr w:type="spellStart"/>
-      <w:r>
-        <w:t>adiabatics</w:t>
-      </w:r>
-      <w:proofErr w:type="spellEnd"/>
-      <w:r>
-        <w:t xml:space="preserve">, but they curved okay but bended to the right. </w:t>
+        <w:t xml:space="preserve">Seems to not fully work, I tried using it on a dry adiabatics, but they curved okay but bended to the right. </w:t>
       </w:r>
       <w:r>
         <w:br/>
@@ -1616,28 +1407,12 @@
         <w:t>Okay, s</w:t>
       </w:r>
       <w:r>
-        <w:t xml:space="preserve">o I got the height I think working, so the pressure height now scales correctly, I wanted to use this with the dry adiabatic, yet it seems that the curvature is </w:t>
-      </w:r>
-      <w:proofErr w:type="spellStart"/>
-      <w:r>
-        <w:t>sooo</w:t>
-      </w:r>
-      <w:proofErr w:type="spellEnd"/>
-      <w:r>
-        <w:t xml:space="preserve"> small that I am still confused. </w:t>
-      </w:r>
-    </w:p>
-    <w:p>
-      <w:r>
-        <w:t xml:space="preserve">So, what do we do? In like 48 we did not move a </w:t>
-      </w:r>
-      <w:proofErr w:type="spellStart"/>
-      <w:r>
-        <w:t>centimeter</w:t>
-      </w:r>
-      <w:proofErr w:type="spellEnd"/>
-      <w:r>
-        <w:t>.</w:t>
+        <w:t xml:space="preserve">o I got the height I think working, so the pressure height now scales correctly, I wanted to use this with the dry adiabatic, yet it seems that the curvature is sooo small that I am still confused. </w:t>
+      </w:r>
+    </w:p>
+    <w:p>
+      <w:r>
+        <w:t>So, what do we do? In like 48 we did not move a centimeter.</w:t>
       </w:r>
       <w:r>
         <w:br/>
@@ -1652,7 +1427,7 @@
           <w:noProof/>
         </w:rPr>
         <w:drawing>
-          <wp:anchor distT="0" distB="0" distL="114300" distR="114300" simplePos="0" relativeHeight="251667456" behindDoc="1" locked="0" layoutInCell="1" allowOverlap="1" wp14:anchorId="06503D00" wp14:editId="4A05C8FF">
+          <wp:anchor distT="0" distB="0" distL="114300" distR="114300" simplePos="0" relativeHeight="251667456" behindDoc="1" locked="0" layoutInCell="1" allowOverlap="1" wp14:anchorId="06503D00" wp14:editId="57371014">
             <wp:simplePos x="0" y="0"/>
             <wp:positionH relativeFrom="page">
               <wp:align>left</wp:align>
@@ -1747,15 +1522,7 @@
         <w:br/>
       </w:r>
       <w:r>
-        <w:t xml:space="preserve">The moist </w:t>
-      </w:r>
-      <w:proofErr w:type="spellStart"/>
-      <w:r>
-        <w:t>adiabatics</w:t>
-      </w:r>
-      <w:proofErr w:type="spellEnd"/>
-      <w:r>
-        <w:t>. I tried some formulas, but they did not work. So, I took a look at the one the other codebase uses:</w:t>
+        <w:t>The moist adiabatics. I tried some formulas, but they did not work. So, I took a look at the one the other codebase uses:</w:t>
       </w:r>
       <w:r>
         <w:br/>
@@ -1834,15 +1601,7 @@
     <w:p>
       <w:r>
         <w:lastRenderedPageBreak/>
-        <w:t xml:space="preserve">Uhm, yeah, so I think I see nothing wrong, but so many ways to calculate </w:t>
-      </w:r>
-      <w:proofErr w:type="spellStart"/>
-      <w:r>
-        <w:t>rs</w:t>
-      </w:r>
-      <w:proofErr w:type="spellEnd"/>
-      <w:r>
-        <w:t xml:space="preserve">. Jeez. </w:t>
+        <w:t xml:space="preserve">Uhm, yeah, so I think I see nothing wrong, but so many ways to calculate rs. Jeez. </w:t>
       </w:r>
       <w:r>
         <w:br/>
@@ -1866,27 +1625,11 @@
       </w:r>
       <w:r>
         <w:br/>
-        <w:t xml:space="preserve">Okay that was because I was using the wrong </w:t>
-      </w:r>
-      <w:proofErr w:type="spellStart"/>
-      <w:r>
-        <w:t>ws</w:t>
-      </w:r>
-      <w:proofErr w:type="spellEnd"/>
-      <w:r>
-        <w:t xml:space="preserve"> formula?</w:t>
-      </w:r>
-      <w:r>
-        <w:br/>
-        <w:t xml:space="preserve">Still the plotting is not correct. They are bended way </w:t>
-      </w:r>
-      <w:proofErr w:type="spellStart"/>
-      <w:r>
-        <w:t>to</w:t>
-      </w:r>
-      <w:proofErr w:type="spellEnd"/>
-      <w:r>
-        <w:t xml:space="preserve"> much to the right.</w:t>
+        <w:t>Okay that was because I was using the wrong ws formula?</w:t>
+      </w:r>
+      <w:r>
+        <w:br/>
+        <w:t>Still the plotting is not correct. They are bended way to much to the right.</w:t>
       </w:r>
       <w:r>
         <w:br/>
@@ -1906,28 +1649,12 @@
     </w:p>
     <w:p>
       <w:r>
-        <w:t xml:space="preserve">I feel like I am at the same problem at where I was with the dry </w:t>
-      </w:r>
-      <w:proofErr w:type="spellStart"/>
-      <w:r>
-        <w:t>adiabatics</w:t>
-      </w:r>
-      <w:proofErr w:type="spellEnd"/>
-      <w:r>
-        <w:t>. Getting the correct change in temps but plotting it seems weird. I believe I have to reconstruct my function, but how.</w:t>
-      </w:r>
-    </w:p>
-    <w:p>
-      <w:r>
-        <w:t xml:space="preserve">Okay I implemented the code from that pdf, but </w:t>
-      </w:r>
-      <w:proofErr w:type="spellStart"/>
-      <w:r>
-        <w:t>its</w:t>
-      </w:r>
-      <w:proofErr w:type="spellEnd"/>
-      <w:r>
-        <w:t xml:space="preserve"> weird…</w:t>
+        <w:t>I feel like I am at the same problem at where I was with the dry adiabatics. Getting the correct change in temps but plotting it seems weird. I believe I have to reconstruct my function, but how.</w:t>
+      </w:r>
+    </w:p>
+    <w:p>
+      <w:r>
+        <w:t>Okay I implemented the code from that pdf, but its weird…</w:t>
       </w:r>
     </w:p>
     <w:p>
@@ -2022,27 +1749,11 @@
       </w:r>
       <w:r>
         <w:br/>
-        <w:t xml:space="preserve">I think I need to give again a look at the </w:t>
-      </w:r>
-      <w:proofErr w:type="spellStart"/>
-      <w:r>
-        <w:t>py</w:t>
-      </w:r>
-      <w:proofErr w:type="spellEnd"/>
-      <w:r>
-        <w:t xml:space="preserve"> code. </w:t>
-      </w:r>
-      <w:r>
-        <w:br/>
-        <w:t xml:space="preserve">Btw, good </w:t>
-      </w:r>
-      <w:proofErr w:type="spellStart"/>
-      <w:r>
-        <w:t>yt</w:t>
-      </w:r>
-      <w:proofErr w:type="spellEnd"/>
-      <w:r>
-        <w:t xml:space="preserve"> video: </w:t>
+        <w:t xml:space="preserve">I think I need to give again a look at the py code. </w:t>
+      </w:r>
+      <w:r>
+        <w:br/>
+        <w:t xml:space="preserve">Btw, good yt video: </w:t>
       </w:r>
       <w:hyperlink r:id="rId36" w:history="1">
         <w:r>
@@ -2057,23 +1768,7 @@
       </w:r>
       <w:r>
         <w:br/>
-        <w:t xml:space="preserve">I may see the problem, what I have been doing is checking temperature change between 1000 </w:t>
-      </w:r>
-      <w:proofErr w:type="spellStart"/>
-      <w:r>
-        <w:t>hPa</w:t>
-      </w:r>
-      <w:proofErr w:type="spellEnd"/>
-      <w:r>
-        <w:t xml:space="preserve"> and 600 </w:t>
-      </w:r>
-      <w:proofErr w:type="spellStart"/>
-      <w:r>
-        <w:t>hPa</w:t>
-      </w:r>
-      <w:proofErr w:type="spellEnd"/>
-      <w:r>
-        <w:t xml:space="preserve">, but I should take small steps: 600 and 605 and 605 and 610 etc. </w:t>
+        <w:t xml:space="preserve">I may see the problem, what I have been doing is checking temperature change between 1000 hPa and 600 hPa, but I should take small steps: 600 and 605 and 605 and 610 etc. </w:t>
       </w:r>
     </w:p>
     <w:p>
@@ -2128,15 +1823,7 @@
       </w:r>
       <w:r>
         <w:br/>
-        <w:t xml:space="preserve">I think </w:t>
-      </w:r>
-      <w:proofErr w:type="spellStart"/>
-      <w:r>
-        <w:t>its</w:t>
-      </w:r>
-      <w:proofErr w:type="spellEnd"/>
-      <w:r>
-        <w:t xml:space="preserve"> good enough:</w:t>
+        <w:t>I think its good enough:</w:t>
       </w:r>
     </w:p>
     <w:p>
@@ -2146,7 +1833,7 @@
         </w:rPr>
         <w:lastRenderedPageBreak/>
         <w:drawing>
-          <wp:anchor distT="0" distB="0" distL="114300" distR="114300" simplePos="0" relativeHeight="251669504" behindDoc="1" locked="0" layoutInCell="1" allowOverlap="1" wp14:anchorId="5FB435B6" wp14:editId="710E3B4C">
+          <wp:anchor distT="0" distB="0" distL="114300" distR="114300" simplePos="0" relativeHeight="251669504" behindDoc="1" locked="0" layoutInCell="1" allowOverlap="1" wp14:anchorId="5FB435B6" wp14:editId="2A74A051">
             <wp:simplePos x="0" y="0"/>
             <wp:positionH relativeFrom="page">
               <wp:align>left</wp:align>
@@ -2214,28 +1901,12 @@
       </w:r>
       <w:r>
         <w:br/>
-        <w:t xml:space="preserve">So the first few </w:t>
-      </w:r>
-      <w:proofErr w:type="spellStart"/>
-      <w:r>
-        <w:t>hPa</w:t>
-      </w:r>
-      <w:proofErr w:type="spellEnd"/>
-      <w:r>
-        <w:t xml:space="preserve"> is direct on point, but the higher the worse. </w:t>
-      </w:r>
-    </w:p>
-    <w:p>
-      <w:r>
-        <w:t xml:space="preserve">I am going to make this a </w:t>
-      </w:r>
-      <w:proofErr w:type="spellStart"/>
-      <w:r>
-        <w:t>github</w:t>
-      </w:r>
-      <w:proofErr w:type="spellEnd"/>
-      <w:r>
-        <w:t xml:space="preserve"> project since I see a future in this.</w:t>
+        <w:t xml:space="preserve">So the first few hPa is direct on point, but the higher the worse. </w:t>
+      </w:r>
+    </w:p>
+    <w:p>
+      <w:r>
+        <w:t>I am going to make this a github project since I see a future in this.</w:t>
       </w:r>
     </w:p>
     <w:p/>
@@ -2265,14 +1936,7 @@
       </w:r>
       <w:r>
         <w:br/>
-      </w:r>
-      <w:proofErr w:type="spellStart"/>
-      <w:r>
-        <w:t>Lets</w:t>
-      </w:r>
-      <w:proofErr w:type="spellEnd"/>
-      <w:r>
-        <w:t xml:space="preserve"> calculate the LCL, EL and more.</w:t>
+        <w:t>Lets calculate the LCL, EL and more.</w:t>
       </w:r>
     </w:p>
     <w:p>
@@ -2371,29 +2035,8 @@
       </w:r>
       <w:r>
         <w:br/>
-        <w:t xml:space="preserve">What is </w:t>
-      </w:r>
-      <w:proofErr w:type="spellStart"/>
-      <w:r>
-        <w:t>Cva</w:t>
-      </w:r>
-      <w:proofErr w:type="spellEnd"/>
-      <w:r>
-        <w:t xml:space="preserve">? Is that not just </w:t>
-      </w:r>
-      <w:proofErr w:type="spellStart"/>
-      <w:r>
-        <w:t>Cpd</w:t>
-      </w:r>
-      <w:proofErr w:type="spellEnd"/>
-      <w:r>
-        <w:t xml:space="preserve"> and </w:t>
-      </w:r>
-      <w:proofErr w:type="spellStart"/>
-      <w:r>
-        <w:t>Cpv</w:t>
-      </w:r>
-      <w:proofErr w:type="spellEnd"/>
+        <w:t>What is Cva? Is that not just Cpd and Cpv</w:t>
+      </w:r>
       <w:r>
         <w:br/>
         <w:t>but why are the values different?</w:t>
@@ -2404,47 +2047,16 @@
       </w:r>
       <w:r>
         <w:tab/>
-        <w:t xml:space="preserve">2.2, and as example it is in between: 2.37, confusing. </w:t>
-      </w:r>
-      <w:proofErr w:type="spellStart"/>
-      <w:r>
-        <w:t>Lets</w:t>
-      </w:r>
-      <w:proofErr w:type="spellEnd"/>
-      <w:r>
-        <w:t xml:space="preserve"> use the 2.2 for now.</w:t>
-      </w:r>
-      <w:r>
-        <w:br/>
-      </w:r>
-      <w:proofErr w:type="spellStart"/>
-      <w:r>
-        <w:t>oeh</w:t>
-      </w:r>
-      <w:proofErr w:type="spellEnd"/>
-      <w:r>
-        <w:t xml:space="preserve">! I could use </w:t>
-      </w:r>
-      <w:proofErr w:type="spellStart"/>
-      <w:r>
-        <w:t>laberts</w:t>
-      </w:r>
-      <w:proofErr w:type="spellEnd"/>
-      <w:r>
-        <w:t xml:space="preserve"> function of boost.</w:t>
-      </w:r>
-    </w:p>
-    <w:p>
-      <w:r>
-        <w:t xml:space="preserve">First test, went okay. Values are wrong, but I think </w:t>
-      </w:r>
-      <w:proofErr w:type="spellStart"/>
-      <w:r>
-        <w:t>its</w:t>
-      </w:r>
-      <w:proofErr w:type="spellEnd"/>
-      <w:r>
-        <w:t xml:space="preserve"> pretty easy solvable.</w:t>
+        <w:t>2.2, and as example it is in between: 2.37, confusing. Lets use the 2.2 for now.</w:t>
+      </w:r>
+      <w:r>
+        <w:br/>
+        <w:t>oeh! I could use laberts function of boost.</w:t>
+      </w:r>
+    </w:p>
+    <w:p>
+      <w:r>
+        <w:t>First test, went okay. Values are wrong, but I think its pretty easy solvable.</w:t>
       </w:r>
     </w:p>
     <w:p>
@@ -2474,7 +2086,7 @@
           <w:noProof/>
         </w:rPr>
         <w:drawing>
-          <wp:anchor distT="0" distB="0" distL="114300" distR="114300" simplePos="0" relativeHeight="251673600" behindDoc="1" locked="0" layoutInCell="1" allowOverlap="1" wp14:anchorId="301D5EFD" wp14:editId="65906F64">
+          <wp:anchor distT="0" distB="0" distL="114300" distR="114300" simplePos="0" relativeHeight="251673600" behindDoc="1" locked="0" layoutInCell="1" allowOverlap="1" wp14:anchorId="301D5EFD" wp14:editId="7CBE4547">
             <wp:simplePos x="0" y="0"/>
             <wp:positionH relativeFrom="column">
               <wp:posOffset>3367405</wp:posOffset>
@@ -2610,7 +2222,7 @@
           <w:noProof/>
         </w:rPr>
         <w:drawing>
-          <wp:anchor distT="0" distB="0" distL="114300" distR="114300" simplePos="0" relativeHeight="251671552" behindDoc="1" locked="0" layoutInCell="1" allowOverlap="1" wp14:anchorId="3B1247BB" wp14:editId="426631C7">
+          <wp:anchor distT="0" distB="0" distL="114300" distR="114300" simplePos="0" relativeHeight="251671552" behindDoc="1" locked="0" layoutInCell="1" allowOverlap="1" wp14:anchorId="3B1247BB" wp14:editId="49813440">
             <wp:simplePos x="0" y="0"/>
             <wp:positionH relativeFrom="margin">
               <wp:posOffset>-819150</wp:posOffset>
@@ -2827,23 +2439,13 @@
     </w:p>
     <w:p/>
     <w:p>
-      <w:proofErr w:type="spellStart"/>
-      <w:r>
-        <w:t>Lets</w:t>
-      </w:r>
-      <w:proofErr w:type="spellEnd"/>
-      <w:r>
-        <w:t xml:space="preserve"> just do what I said. Weird how I can just not find a formula for EL.</w:t>
-      </w:r>
-    </w:p>
-    <w:p>
-      <w:proofErr w:type="spellStart"/>
-      <w:r>
-        <w:t>MetPy</w:t>
-      </w:r>
-      <w:proofErr w:type="spellEnd"/>
-      <w:r>
-        <w:t>: “</w:t>
+      <w:r>
+        <w:t>Lets just do what I said. Weird how I can just not find a formula for EL.</w:t>
+      </w:r>
+    </w:p>
+    <w:p>
+      <w:r>
+        <w:t>MetPy: “</w:t>
       </w:r>
       <w:r>
         <w:t>This works by finding the last intersection of the ideal parcel path and the measured environmental temperature. If there is one or fewer intersections, there is no equilibrium level.</w:t>
@@ -2866,15 +2468,7 @@
       </w:r>
       <w:r>
         <w:br/>
-        <w:t xml:space="preserve">Ah I see, at the return I divided by Pa instead of </w:t>
-      </w:r>
-      <w:proofErr w:type="spellStart"/>
-      <w:r>
-        <w:t>hPa</w:t>
-      </w:r>
-      <w:proofErr w:type="spellEnd"/>
-      <w:r>
-        <w:t>.</w:t>
+        <w:t>Ah I see, at the return I divided by Pa instead of hPa.</w:t>
       </w:r>
     </w:p>
     <w:p>
@@ -2900,27 +2494,11 @@
       </w:r>
       <w:r>
         <w:br/>
-        <w:t xml:space="preserve">It may could be because the values start at </w:t>
-      </w:r>
-      <w:proofErr w:type="spellStart"/>
-      <w:r>
-        <w:t>hPa</w:t>
-      </w:r>
-      <w:proofErr w:type="spellEnd"/>
-      <w:r>
-        <w:t xml:space="preserve"> of 993 instead of above 1000</w:t>
-      </w:r>
-      <w:r>
-        <w:br/>
-        <w:t xml:space="preserve">And the fact that I use observed pressure data changes the </w:t>
-      </w:r>
-      <w:proofErr w:type="spellStart"/>
-      <w:r>
-        <w:t>adiabatics</w:t>
-      </w:r>
-      <w:proofErr w:type="spellEnd"/>
-      <w:r>
-        <w:t>. Yes I believe this is the main case.</w:t>
+        <w:t>It may could be because the values start at hPa of 993 instead of above 1000</w:t>
+      </w:r>
+      <w:r>
+        <w:br/>
+        <w:t>And the fact that I use observed pressure data changes the adiabatics. Yes I believe this is the main case.</w:t>
       </w:r>
       <w:r>
         <w:br/>
@@ -2944,15 +2522,7 @@
         <w:br/>
       </w:r>
       <w:r>
-        <w:t xml:space="preserve">It looks alright but at some places it is still wrong, </w:t>
-      </w:r>
-      <w:proofErr w:type="spellStart"/>
-      <w:r>
-        <w:t>its</w:t>
-      </w:r>
-      <w:proofErr w:type="spellEnd"/>
-      <w:r>
-        <w:t xml:space="preserve"> weird…</w:t>
+        <w:t>It looks alright but at some places it is still wrong, its weird…</w:t>
       </w:r>
       <w:r>
         <w:t xml:space="preserve"> </w:t>
@@ -3118,13 +2688,8 @@
     <w:p/>
     <w:p/>
     <w:p>
-      <w:proofErr w:type="spellStart"/>
-      <w:r>
-        <w:t>Lets</w:t>
-      </w:r>
-      <w:proofErr w:type="spellEnd"/>
-      <w:r>
-        <w:t xml:space="preserve"> compare some values to see if the problem is with our calculations or our plotting. </w:t>
+      <w:r>
+        <w:t xml:space="preserve">Lets compare some values to see if the problem is with our calculations or our plotting. </w:t>
       </w:r>
       <w:r>
         <w:br/>
@@ -3132,15 +2697,7 @@
       </w:r>
       <w:r>
         <w:br/>
-        <w:t xml:space="preserve">But my constants are exactly the same as for example </w:t>
-      </w:r>
-      <w:proofErr w:type="spellStart"/>
-      <w:r>
-        <w:t>metPy</w:t>
-      </w:r>
-      <w:proofErr w:type="spellEnd"/>
-      <w:r>
-        <w:t xml:space="preserve"> uses. </w:t>
+        <w:t xml:space="preserve">But my constants are exactly the same as for example metPy uses. </w:t>
       </w:r>
       <w:r>
         <w:br/>
@@ -3148,68 +2705,28 @@
       </w:r>
       <w:r>
         <w:br/>
-        <w:t xml:space="preserve">Found an issue, I was calculating the vapor pressure using 611 instead of 6.11 (triple point in </w:t>
-      </w:r>
-      <w:proofErr w:type="spellStart"/>
-      <w:r>
-        <w:t>hPa</w:t>
-      </w:r>
-      <w:proofErr w:type="spellEnd"/>
-      <w:r>
-        <w:t>)</w:t>
-      </w:r>
-    </w:p>
-    <w:p>
-      <w:r>
-        <w:t xml:space="preserve">Currently my values are very close to the ones of </w:t>
-      </w:r>
-      <w:proofErr w:type="spellStart"/>
-      <w:r>
-        <w:t>metPy</w:t>
-      </w:r>
-      <w:proofErr w:type="spellEnd"/>
-      <w:r>
-        <w:t>, but still off.</w:t>
-      </w:r>
-    </w:p>
-    <w:p>
-      <w:r>
-        <w:t xml:space="preserve">Huh, I get a weird offset of </w:t>
-      </w:r>
-      <w:proofErr w:type="spellStart"/>
-      <w:r>
-        <w:t>value,it</w:t>
-      </w:r>
-      <w:proofErr w:type="spellEnd"/>
-      <w:r>
-        <w:t xml:space="preserve"> should be </w:t>
+        <w:t>Found an issue, I was calculating the vapor pressure using 611 instead of 6.11 (triple point in hPa)</w:t>
+      </w:r>
+    </w:p>
+    <w:p>
+      <w:r>
+        <w:t>Currently my values are very close to the ones of metPy, but still off.</w:t>
+      </w:r>
+    </w:p>
+    <w:p>
+      <w:r>
+        <w:t xml:space="preserve">Huh, I get a weird offset of value,it should be </w:t>
       </w:r>
       <w:r>
         <w:t xml:space="preserve">20.7079, but I get 20.709, small difference but still. </w:t>
       </w:r>
       <w:r>
         <w:br/>
-        <w:t xml:space="preserve">Now the temps are off again… </w:t>
-      </w:r>
-      <w:proofErr w:type="spellStart"/>
-      <w:r>
-        <w:t>nvm</w:t>
-      </w:r>
-      <w:proofErr w:type="spellEnd"/>
-      <w:r>
-        <w:t xml:space="preserve"> its closer again.</w:t>
-      </w:r>
-      <w:r>
-        <w:br/>
-        <w:t xml:space="preserve">My </w:t>
-      </w:r>
-      <w:proofErr w:type="spellStart"/>
-      <w:r>
-        <w:t>adiabatics</w:t>
-      </w:r>
-      <w:proofErr w:type="spellEnd"/>
-      <w:r>
-        <w:t xml:space="preserve"> are plotted around 0.3 temp to cold. </w:t>
+        <w:t>Now the temps are off again… nvm its closer again.</w:t>
+      </w:r>
+      <w:r>
+        <w:br/>
+        <w:t xml:space="preserve">My adiabatics are plotted around 0.3 temp to cold. </w:t>
       </w:r>
     </w:p>
     <w:p>
@@ -3219,15 +2736,7 @@
     </w:p>
     <w:p>
       <w:r>
-        <w:t xml:space="preserve">Using the height at standard pressure, the height at 1000 </w:t>
-      </w:r>
-      <w:proofErr w:type="spellStart"/>
-      <w:r>
-        <w:t>hPa</w:t>
-      </w:r>
-      <w:proofErr w:type="spellEnd"/>
-      <w:r>
-        <w:t xml:space="preserve"> (bottom line in skew-T) should be </w:t>
+        <w:t xml:space="preserve">Using the height at standard pressure, the height at 1000 hPa (bottom line in skew-T) should be </w:t>
       </w:r>
       <w:r>
         <w:t>89.7071991</w:t>
@@ -3238,27 +2747,14 @@
       </w:r>
       <w:r>
         <w:br/>
-        <w:t xml:space="preserve">It looks like in the skew-T they plant the ground temp at 1000 </w:t>
-      </w:r>
-      <w:proofErr w:type="spellStart"/>
-      <w:r>
-        <w:t>hPa</w:t>
-      </w:r>
-      <w:proofErr w:type="spellEnd"/>
+        <w:t>It looks like in the skew-T they plant the ground temp at 1000 hPa</w:t>
+      </w:r>
       <w:r>
         <w:t>.</w:t>
       </w:r>
       <w:r>
         <w:br/>
-        <w:t xml:space="preserve">what I should do is grab the ground temp, add it to the list and make it 1000 </w:t>
-      </w:r>
-      <w:proofErr w:type="spellStart"/>
-      <w:r>
-        <w:t>hPa</w:t>
-      </w:r>
-      <w:proofErr w:type="spellEnd"/>
-      <w:r>
-        <w:t xml:space="preserve"> (bottom)</w:t>
+        <w:t>what I should do is grab the ground temp, add it to the list and make it 1000 hPa (bottom)</w:t>
       </w:r>
       <w:r>
         <w:br/>
@@ -3280,15 +2776,7 @@
     </w:p>
     <w:p>
       <w:r>
-        <w:t xml:space="preserve">Now the EL seem to be the same as the one on </w:t>
-      </w:r>
-      <w:proofErr w:type="spellStart"/>
-      <w:r>
-        <w:t>meteologix</w:t>
-      </w:r>
-      <w:proofErr w:type="spellEnd"/>
-      <w:r>
-        <w:t>, nice. Now just offset the temps.</w:t>
+        <w:t>Now the EL seem to be the same as the one on meteologix, nice. Now just offset the temps.</w:t>
       </w:r>
       <w:r>
         <w:br/>
@@ -3311,7 +2799,7 @@
         </w:rPr>
         <w:lastRenderedPageBreak/>
         <w:drawing>
-          <wp:anchor distT="0" distB="0" distL="114300" distR="114300" simplePos="0" relativeHeight="251678720" behindDoc="1" locked="0" layoutInCell="1" allowOverlap="1" wp14:anchorId="5A7E72E5" wp14:editId="00EA9517">
+          <wp:anchor distT="0" distB="0" distL="114300" distR="114300" simplePos="0" relativeHeight="251678720" behindDoc="1" locked="0" layoutInCell="1" allowOverlap="1" wp14:anchorId="5A7E72E5" wp14:editId="65FA2C45">
             <wp:simplePos x="0" y="0"/>
             <wp:positionH relativeFrom="column">
               <wp:posOffset>3665855</wp:posOffset>
@@ -3439,23 +2927,7 @@
     </w:p>
     <w:p>
       <w:r>
-        <w:t xml:space="preserve">I am a bit confused on how it still is wrong. The temp difference I got from my calculations (comparing) was only like 1 degree. So it must be the plotting. The temps probably have to be plotted somehow else? No </w:t>
-      </w:r>
-      <w:proofErr w:type="spellStart"/>
-      <w:r>
-        <w:t>its</w:t>
-      </w:r>
-      <w:proofErr w:type="spellEnd"/>
-      <w:r>
-        <w:t xml:space="preserve"> probably the </w:t>
-      </w:r>
-      <w:proofErr w:type="spellStart"/>
-      <w:r>
-        <w:t>adiabatics</w:t>
-      </w:r>
-      <w:proofErr w:type="spellEnd"/>
-      <w:r>
-        <w:t xml:space="preserve"> that are wrong. But also temps differ?</w:t>
+        <w:t>I am a bit confused on how it still is wrong. The temp difference I got from my calculations (comparing) was only like 1 degree. So it must be the plotting. The temps probably have to be plotted somehow else? No its probably the adiabatics that are wrong. But also temps differ?</w:t>
       </w:r>
     </w:p>
     <w:p>
@@ -3464,15 +2936,7 @@
       </w:r>
       <w:r>
         <w:br/>
-        <w:t xml:space="preserve">The second thing is that the </w:t>
-      </w:r>
-      <w:proofErr w:type="spellStart"/>
-      <w:r>
-        <w:t>adiabatics</w:t>
-      </w:r>
-      <w:proofErr w:type="spellEnd"/>
-      <w:r>
-        <w:t xml:space="preserve"> don’t correctly follow.</w:t>
+        <w:t>The second thing is that the adiabatics don’t correctly follow.</w:t>
       </w:r>
     </w:p>
     <w:p>
@@ -3481,15 +2945,7 @@
       </w:r>
       <w:r>
         <w:br/>
-        <w:t xml:space="preserve">First I want to set the pressure to height to use 0 instead of </w:t>
-      </w:r>
-      <w:proofErr w:type="spellStart"/>
-      <w:r>
-        <w:t>i</w:t>
-      </w:r>
-      <w:proofErr w:type="spellEnd"/>
-      <w:r>
-        <w:t>.</w:t>
+        <w:t>First I want to set the pressure to height to use 0 instead of i.</w:t>
       </w:r>
       <w:r>
         <w:br/>
@@ -3497,15 +2953,7 @@
       </w:r>
       <w:r>
         <w:br/>
-        <w:t xml:space="preserve">Then I need to debug my values of moist lapse rate vs dry lapse rate at like 0 degrees and 700 </w:t>
-      </w:r>
-      <w:proofErr w:type="spellStart"/>
-      <w:r>
-        <w:t>hPa</w:t>
-      </w:r>
-      <w:proofErr w:type="spellEnd"/>
-      <w:r>
-        <w:t>.</w:t>
+        <w:t>Then I need to debug my values of moist lapse rate vs dry lapse rate at like 0 degrees and 700 hPa.</w:t>
       </w:r>
       <w:r>
         <w:br/>
@@ -3538,7 +2986,7 @@
           <w:noProof/>
         </w:rPr>
         <w:drawing>
-          <wp:anchor distT="0" distB="0" distL="114300" distR="114300" simplePos="0" relativeHeight="251679744" behindDoc="1" locked="0" layoutInCell="1" allowOverlap="1" wp14:anchorId="31CDDE59" wp14:editId="470AB5BB">
+          <wp:anchor distT="0" distB="0" distL="114300" distR="114300" simplePos="0" relativeHeight="251679744" behindDoc="1" locked="0" layoutInCell="1" allowOverlap="1" wp14:anchorId="31CDDE59" wp14:editId="20E0AA83">
             <wp:simplePos x="0" y="0"/>
             <wp:positionH relativeFrom="page">
               <wp:align>left</wp:align>
@@ -3608,28 +3056,12 @@
       </w:r>
       <w:r>
         <w:br/>
-        <w:t xml:space="preserve">The higher the moist lapse rate goes, the smaller the decrease, sure. But the change on a skew-T is much larger, it curves way </w:t>
-      </w:r>
-      <w:proofErr w:type="spellStart"/>
-      <w:r>
-        <w:t>to</w:t>
-      </w:r>
-      <w:proofErr w:type="spellEnd"/>
-      <w:r>
-        <w:t xml:space="preserve"> much to the right.</w:t>
-      </w:r>
-    </w:p>
-    <w:p>
-      <w:r>
-        <w:t xml:space="preserve">On </w:t>
-      </w:r>
-      <w:proofErr w:type="spellStart"/>
-      <w:r>
-        <w:t>metPy</w:t>
-      </w:r>
-      <w:proofErr w:type="spellEnd"/>
-      <w:r>
-        <w:t xml:space="preserve">, the MLR in the higher elevation does not curve back. </w:t>
+        <w:t>The higher the moist lapse rate goes, the smaller the decrease, sure. But the change on a skew-T is much larger, it curves way to much to the right.</w:t>
+      </w:r>
+    </w:p>
+    <w:p>
+      <w:r>
+        <w:t xml:space="preserve">On metPy, the MLR in the higher elevation does not curve back. </w:t>
       </w:r>
     </w:p>
     <w:p>
@@ -3655,15 +3087,7 @@
     </w:p>
     <w:p>
       <w:r>
-        <w:t xml:space="preserve">Alright skew-T is </w:t>
-      </w:r>
-      <w:proofErr w:type="spellStart"/>
-      <w:r>
-        <w:t>scaleable</w:t>
-      </w:r>
-      <w:proofErr w:type="spellEnd"/>
-      <w:r>
-        <w:t>, now I need to add a log value so I can check how that works.</w:t>
+        <w:t>Alright skew-T is scaleable, now I need to add a log value so I can check how that works.</w:t>
       </w:r>
     </w:p>
     <w:p>
@@ -3672,37 +3096,15 @@
       </w:r>
       <w:r>
         <w:br/>
-        <w:t xml:space="preserve">I feel like my </w:t>
-      </w:r>
-      <w:proofErr w:type="spellStart"/>
-      <w:r>
-        <w:t>RHl</w:t>
-      </w:r>
-      <w:proofErr w:type="spellEnd"/>
-      <w:r>
-        <w:t xml:space="preserve"> calculator is broken.|</w:t>
-      </w:r>
-      <w:r>
-        <w:br/>
-      </w:r>
-      <w:proofErr w:type="spellStart"/>
-      <w:r>
-        <w:t>ohhh</w:t>
-      </w:r>
-      <w:proofErr w:type="spellEnd"/>
-      <w:r>
-        <w:t>, I did not update them to Celsius.</w:t>
-      </w:r>
-      <w:r>
-        <w:br/>
-      </w:r>
-      <w:proofErr w:type="spellStart"/>
-      <w:r>
-        <w:t>Lets</w:t>
-      </w:r>
-      <w:proofErr w:type="spellEnd"/>
-      <w:r>
-        <w:t xml:space="preserve"> calculate the LFC  (level of free convection)</w:t>
+        <w:t>I feel like my RHl calculator is broken.|</w:t>
+      </w:r>
+      <w:r>
+        <w:br/>
+        <w:t>ohhh, I did not update them to Celsius.</w:t>
+      </w:r>
+      <w:r>
+        <w:br/>
+        <w:t>Lets calculate the LFC  (level of free convection)</w:t>
       </w:r>
       <w:r>
         <w:br/>
@@ -3716,27 +3118,11 @@
         <w:t>temperature. If this intersection occurs below the LCL, the LFC is determined to be the same as the LCL</w:t>
       </w:r>
       <w:r>
-        <w:t>” -</w:t>
-      </w:r>
-      <w:proofErr w:type="spellStart"/>
-      <w:r>
-        <w:t>metPy</w:t>
-      </w:r>
-      <w:proofErr w:type="spellEnd"/>
-      <w:r>
-        <w:t>.</w:t>
-      </w:r>
-      <w:r>
-        <w:br/>
-        <w:t xml:space="preserve">We will take the same approach, which is essentially the same as the one of EL, but this time we will only look at the first intersection. If we only get </w:t>
-      </w:r>
-      <w:proofErr w:type="spellStart"/>
-      <w:r>
-        <w:t>a</w:t>
-      </w:r>
-      <w:proofErr w:type="spellEnd"/>
-      <w:r>
-        <w:t xml:space="preserve"> intersection going inside, we will put the LFC at the LCL.</w:t>
+        <w:t>” -metPy.</w:t>
+      </w:r>
+      <w:r>
+        <w:br/>
+        <w:t>We will take the same approach, which is essentially the same as the one of EL, but this time we will only look at the first intersection. If we only get a intersection going inside, we will put the LFC at the LCL.</w:t>
       </w:r>
     </w:p>
     <w:p>
@@ -3818,7 +3204,7 @@
           <w:noProof/>
         </w:rPr>
         <w:drawing>
-          <wp:anchor distT="0" distB="0" distL="114300" distR="114300" simplePos="0" relativeHeight="251680768" behindDoc="1" locked="0" layoutInCell="1" allowOverlap="1" wp14:anchorId="59437869" wp14:editId="7B780953">
+          <wp:anchor distT="0" distB="0" distL="114300" distR="114300" simplePos="0" relativeHeight="251680768" behindDoc="1" locked="0" layoutInCell="1" allowOverlap="1" wp14:anchorId="59437869" wp14:editId="1E5E4097">
             <wp:simplePos x="0" y="0"/>
             <wp:positionH relativeFrom="margin">
               <wp:align>left</wp:align>
@@ -3942,15 +3328,7 @@
       </w:r>
       <w:r>
         <w:br/>
-        <w:t xml:space="preserve">My cape is a bit lower than </w:t>
-      </w:r>
-      <w:proofErr w:type="spellStart"/>
-      <w:r>
-        <w:t>MLcape</w:t>
-      </w:r>
-      <w:proofErr w:type="spellEnd"/>
-      <w:r>
-        <w:t>, but this could be because of the usages of observed pressure</w:t>
+        <w:t>My cape is a bit lower than MLcape, but this could be because of the usages of observed pressure</w:t>
       </w:r>
     </w:p>
     <w:p/>
@@ -3969,15 +3347,7 @@
       </w:r>
       <w:r>
         <w:br/>
-        <w:t xml:space="preserve">When I do the I thing, it looks correct again. So, maybe I do need the </w:t>
-      </w:r>
-      <w:proofErr w:type="spellStart"/>
-      <w:r>
-        <w:t>i</w:t>
-      </w:r>
-      <w:proofErr w:type="spellEnd"/>
-      <w:r>
-        <w:t xml:space="preserve">. </w:t>
+        <w:t xml:space="preserve">When I do the I thing, it looks correct again. So, maybe I do need the i. </w:t>
       </w:r>
       <w:r>
         <w:br/>
@@ -4009,15 +3379,7 @@
     </w:p>
     <w:p>
       <w:r>
-        <w:t xml:space="preserve">I just compared with the results of </w:t>
-      </w:r>
-      <w:proofErr w:type="spellStart"/>
-      <w:r>
-        <w:t>metpy</w:t>
-      </w:r>
-      <w:proofErr w:type="spellEnd"/>
-      <w:r>
-        <w:t xml:space="preserve"> and indeed my values are awfully wrong. </w:t>
+        <w:t xml:space="preserve">I just compared with the results of metpy and indeed my values are awfully wrong. </w:t>
       </w:r>
       <w:r>
         <w:br/>
@@ -4067,15 +3429,7 @@
         </w:r>
       </w:hyperlink>
       <w:r>
-        <w:t xml:space="preserve"> DALES, a </w:t>
-      </w:r>
-      <w:proofErr w:type="spellStart"/>
-      <w:r>
-        <w:t>dutch</w:t>
-      </w:r>
-      <w:proofErr w:type="spellEnd"/>
-      <w:r>
-        <w:t xml:space="preserve"> weather model.</w:t>
+        <w:t xml:space="preserve"> DALES, a dutch weather model.</w:t>
       </w:r>
       <w:r>
         <w:br/>
@@ -4141,46 +3495,15 @@
       </w:r>
       <w:r>
         <w:br/>
-        <w:t>Seems like the temps x pressure bars x isotherms x dry-</w:t>
-      </w:r>
-      <w:proofErr w:type="spellStart"/>
-      <w:r>
-        <w:t>adiabatics</w:t>
-      </w:r>
-      <w:proofErr w:type="spellEnd"/>
-      <w:r>
-        <w:t xml:space="preserve"> are perfect.</w:t>
-      </w:r>
-      <w:r>
-        <w:br/>
-        <w:t>But the wet-</w:t>
-      </w:r>
-      <w:proofErr w:type="spellStart"/>
-      <w:r>
-        <w:t>adiabatics</w:t>
-      </w:r>
-      <w:proofErr w:type="spellEnd"/>
-      <w:r>
-        <w:t xml:space="preserve"> are still off…</w:t>
-      </w:r>
-      <w:r>
-        <w:br/>
-      </w:r>
-      <w:proofErr w:type="spellStart"/>
-      <w:r>
-        <w:t>nvm</w:t>
-      </w:r>
-      <w:proofErr w:type="spellEnd"/>
-      <w:r>
-        <w:t xml:space="preserve">, found it, was not doing the increment of 1 yet on the debug. Okay that fixed the moist </w:t>
-      </w:r>
-      <w:proofErr w:type="spellStart"/>
-      <w:r>
-        <w:t>adiabatics</w:t>
-      </w:r>
-      <w:proofErr w:type="spellEnd"/>
-      <w:r>
-        <w:t>, now only the LCL stuff.</w:t>
+        <w:t>Seems like the temps x pressure bars x isotherms x dry-adiabatics are perfect.</w:t>
+      </w:r>
+      <w:r>
+        <w:br/>
+        <w:t>But the wet-adiabatics are still off…</w:t>
+      </w:r>
+      <w:r>
+        <w:br/>
+        <w:t>nvm, found it, was not doing the increment of 1 yet on the debug. Okay that fixed the moist adiabatics, now only the LCL stuff.</w:t>
       </w:r>
       <w:r>
         <w:br/>
@@ -4210,27 +3533,11 @@
     </w:p>
     <w:p>
       <w:r>
-        <w:t xml:space="preserve">Okay fixed mixing ratio by adding the </w:t>
-      </w:r>
-      <w:proofErr w:type="spellStart"/>
-      <w:r>
-        <w:t>MWratio</w:t>
-      </w:r>
-      <w:proofErr w:type="spellEnd"/>
-      <w:r>
-        <w:t xml:space="preserve"> (0.622)</w:t>
-      </w:r>
-      <w:r>
-        <w:br/>
-        <w:t xml:space="preserve">Still </w:t>
-      </w:r>
-      <w:proofErr w:type="spellStart"/>
-      <w:r>
-        <w:t>its</w:t>
-      </w:r>
-      <w:proofErr w:type="spellEnd"/>
-      <w:r>
-        <w:t xml:space="preserve"> just a tad bit offset.</w:t>
+        <w:t>Okay fixed mixing ratio by adding the MWratio (0.622)</w:t>
+      </w:r>
+      <w:r>
+        <w:br/>
+        <w:t>Still its just a tad bit offset.</w:t>
       </w:r>
     </w:p>
     <w:p/>
@@ -4244,15 +3551,7 @@
     </w:p>
     <w:p>
       <w:r>
-        <w:t xml:space="preserve">It’s a bit of a mess </w:t>
-      </w:r>
-      <w:proofErr w:type="spellStart"/>
-      <w:r>
-        <w:t>atm</w:t>
-      </w:r>
-      <w:proofErr w:type="spellEnd"/>
-      <w:r>
-        <w:t xml:space="preserve"> since I am ‘fixing’ some formulas.</w:t>
+        <w:t>It’s a bit of a mess atm since I am ‘fixing’ some formulas.</w:t>
       </w:r>
       <w:r>
         <w:br/>
@@ -4264,14 +3563,7 @@
       </w:r>
       <w:r>
         <w:br/>
-      </w:r>
-      <w:proofErr w:type="spellStart"/>
-      <w:r>
-        <w:t>Its</w:t>
-      </w:r>
-      <w:proofErr w:type="spellEnd"/>
-      <w:r>
-        <w:t xml:space="preserve"> just plotted wrong due to idk what.</w:t>
+        <w:t>Its just plotted wrong due to idk what.</w:t>
       </w:r>
       <w:r>
         <w:br/>
@@ -4288,15 +3580,7 @@
         <w:t xml:space="preserve">I may see the issue, </w:t>
       </w:r>
       <w:r>
-        <w:t xml:space="preserve">after a while, the difference between p and </w:t>
-      </w:r>
-      <w:proofErr w:type="spellStart"/>
-      <w:r>
-        <w:t>pref</w:t>
-      </w:r>
-      <w:proofErr w:type="spellEnd"/>
-      <w:r>
-        <w:t xml:space="preserve"> becomes like 300+ which breaks it of course. So how do I fix it?</w:t>
+        <w:t>after a while, the difference between p and pref becomes like 300+ which breaks it of course. So how do I fix it?</w:t>
       </w:r>
       <w:r>
         <w:br/>
@@ -4306,15 +3590,7 @@
       </w:r>
       <w:r>
         <w:br/>
-        <w:t xml:space="preserve">I see that I have to do the same for </w:t>
-      </w:r>
-      <w:proofErr w:type="spellStart"/>
-      <w:r>
-        <w:t>CalculateCAPE</w:t>
-      </w:r>
-      <w:proofErr w:type="spellEnd"/>
-      <w:r>
-        <w:t xml:space="preserve">(). </w:t>
+        <w:t xml:space="preserve">I see that I have to do the same for CalculateCAPE(). </w:t>
       </w:r>
       <w:r>
         <w:br/>
@@ -4358,15 +3634,7 @@
       </w:r>
       <w:r>
         <w:br/>
-        <w:t xml:space="preserve">On </w:t>
-      </w:r>
-      <w:proofErr w:type="spellStart"/>
-      <w:r>
-        <w:t>Meteociel</w:t>
-      </w:r>
-      <w:proofErr w:type="spellEnd"/>
-      <w:r>
-        <w:t xml:space="preserve"> (sharpy) it has no LFC?</w:t>
+        <w:t>On Meteociel (sharpy) it has no LFC?</w:t>
       </w:r>
       <w:r>
         <w:br/>
@@ -4483,33 +3751,26 @@
         <w:pStyle w:val="Kop1"/>
       </w:pPr>
       <w:r>
-        <w:t>Saturday 5-3-2025</w:t>
-      </w:r>
-    </w:p>
-    <w:p>
-      <w:r>
-        <w:t xml:space="preserve">Okay I also need the CCL, so </w:t>
-      </w:r>
-      <w:proofErr w:type="spellStart"/>
-      <w:r>
-        <w:t>lets</w:t>
-      </w:r>
-      <w:proofErr w:type="spellEnd"/>
-      <w:r>
-        <w:t xml:space="preserve"> start making that, it will probably be very easy since it </w:t>
-      </w:r>
-      <w:proofErr w:type="spellStart"/>
-      <w:r>
-        <w:t>it</w:t>
-      </w:r>
-      <w:proofErr w:type="spellEnd"/>
-      <w:r>
-        <w:t xml:space="preserve"> just the following of the mixed ratio.</w:t>
-      </w:r>
-      <w:r>
-        <w:br/>
-      </w:r>
-      <w:r>
+        <w:t>Saturday 5-</w:t>
+      </w:r>
+      <w:r>
+        <w:t>4</w:t>
+      </w:r>
+      <w:r>
+        <w:t>-2025</w:t>
+      </w:r>
+    </w:p>
+    <w:p>
+      <w:r>
+        <w:t>Okay I also need the CCL, so lets start making that, it will probably be very easy since it it just the following of the mixed ratio.</w:t>
+      </w:r>
+      <w:r>
+        <w:br/>
+      </w:r>
+      <w:r>
+        <w:rPr>
+          <w:noProof/>
+        </w:rPr>
         <w:drawing>
           <wp:anchor distT="0" distB="0" distL="114300" distR="114300" simplePos="0" relativeHeight="251682816" behindDoc="1" locked="0" layoutInCell="1" allowOverlap="1" wp14:anchorId="66972515" wp14:editId="1B1EC9BF">
             <wp:simplePos x="0" y="0"/>
@@ -4578,6 +3839,2228 @@
         <w:t>Okay wait, for the Mixing ratio, I have to I think calculate the W for D0 and P0, and then fill in W and P to retrieve Dn.</w:t>
       </w:r>
     </w:p>
+    <w:p>
+      <w:r>
+        <w:t>Added the CCL and made a nice display for it.</w:t>
+      </w:r>
+      <w:r>
+        <w:br/>
+        <w:t>Pushed changes finally.</w:t>
+      </w:r>
+    </w:p>
+    <w:p/>
+    <w:p/>
+    <w:p>
+      <w:pPr>
+        <w:pStyle w:val="Kop1"/>
+      </w:pPr>
+      <w:r>
+        <w:t>Sunday 6-4-2025</w:t>
+      </w:r>
+    </w:p>
+    <w:p>
+      <w:r>
+        <w:t>Now the interesting part. I need to plan for the next part.</w:t>
+      </w:r>
+      <w:r>
+        <w:br/>
+        <w:t>The simulating part.</w:t>
+      </w:r>
+      <w:r>
+        <w:br/>
+        <w:t>Here is what the paper about simulating clouds based of skew-T did:</w:t>
+      </w:r>
+      <w:r>
+        <w:br/>
+        <w:t>They have an area of particles.</w:t>
+      </w:r>
+      <w:r>
+        <w:br/>
+        <w:t xml:space="preserve">These particles already </w:t>
+      </w:r>
+      <w:r>
+        <w:t xml:space="preserve">have their Convective temperature, CCL and EL, meaning they know there environment, they just have to follow it up with the wind. </w:t>
+      </w:r>
+      <w:r>
+        <w:br/>
+        <w:t>Seems very easy, but this lacks many things:</w:t>
+      </w:r>
+      <w:r>
+        <w:br/>
+        <w:t>All particles have the same environment, the environment does not change and it only accounts for winds in the x and z direction (y being up). Meaning wind can not force particles up thus no fronts can.</w:t>
+      </w:r>
+      <w:r>
+        <w:t xml:space="preserve"> Also they have dissipating in their future work while I want to have this, because I want to spit out particles on the go and not stick with a certain amount.</w:t>
+      </w:r>
+    </w:p>
+    <w:p>
+      <w:r>
+        <w:t>What I could do is for example have an heatmap, when on parts of this map the temperature is above the convective temperature, it will create particles, but don’t the particles already need to be rising, like even before the CCL could be reached, the particles should still be trying. This is important if I want the wind to effect the particles in the height factor.</w:t>
+      </w:r>
+      <w:r>
+        <w:br/>
+      </w:r>
+    </w:p>
+    <w:p>
+      <w:r>
+        <w:t xml:space="preserve">I did some thinking about the environment, this needs to change accordingly thus I need to have it. In the paper everything was the same environment, so you could say that it was 1D, but now I need it in 3D. </w:t>
+      </w:r>
+      <w:r>
+        <w:br/>
+        <w:t>I did calculations and if I want a 1024 by 1024 grid with an height of 256 filled with 4 bytes (temp, dew, wind dir, extra) it will be like 1 GB, which is too much.</w:t>
+      </w:r>
+      <w:r>
+        <w:br/>
+        <w:t xml:space="preserve">I also want to use 2 bytes for temp dew and wind, meaning 6 bytes. (rounded to 8?) </w:t>
+      </w:r>
+      <w:r>
+        <w:br/>
+        <w:t>Oeh, I can use 4 and 5 bits from temp and dew to get 9 bits for wind. Having still 4 bytes.</w:t>
+      </w:r>
+      <w:r>
+        <w:br/>
+        <w:t>I asked ChatGPT about it and it recommended many different ways to improve.</w:t>
+      </w:r>
+    </w:p>
+    <w:p>
+      <w:r>
+        <w:lastRenderedPageBreak/>
+        <w:t>Savings:</w:t>
+      </w:r>
+    </w:p>
+    <w:p>
+      <w:pPr>
+        <w:pStyle w:val="Lijstalinea"/>
+        <w:numPr>
+          <w:ilvl w:val="0"/>
+          <w:numId w:val="2"/>
+        </w:numPr>
+      </w:pPr>
+      <w:r>
+        <w:t>Less skew-T’s at environments that are boring</w:t>
+      </w:r>
+    </w:p>
+    <w:p>
+      <w:pPr>
+        <w:pStyle w:val="Lijstalinea"/>
+        <w:numPr>
+          <w:ilvl w:val="0"/>
+          <w:numId w:val="2"/>
+        </w:numPr>
+      </w:pPr>
+      <w:r>
+        <w:t>Packing using Zstd or LZ4 libraries, improvement of 2-4 times?</w:t>
+      </w:r>
+    </w:p>
+    <w:p>
+      <w:pPr>
+        <w:pStyle w:val="Lijstalinea"/>
+        <w:numPr>
+          <w:ilvl w:val="0"/>
+          <w:numId w:val="2"/>
+        </w:numPr>
+      </w:pPr>
+      <w:r>
+        <w:t xml:space="preserve">Use skew-T precision of 64 instead of 256. </w:t>
+      </w:r>
+      <w:r>
+        <w:t xml:space="preserve"> </w:t>
+      </w:r>
+    </w:p>
+    <w:p>
+      <w:pPr>
+        <w:pStyle w:val="Lijstalinea"/>
+        <w:numPr>
+          <w:ilvl w:val="0"/>
+          <w:numId w:val="2"/>
+        </w:numPr>
+      </w:pPr>
+      <w:r>
+        <w:t>Up to 1 GB to the GPU for performance (not really a saving)</w:t>
+      </w:r>
+    </w:p>
+    <w:p>
+      <w:r>
+        <w:t>I need to think more, since I forgot about the 3D aspect of wind, this I need if I want forcing to exist. Thus I need to increase the size to 8 bytes instead of 4.</w:t>
+      </w:r>
+      <w:r>
+        <w:br/>
+        <w:t>2 for temp, 2 for dew, 4 for wind direction, which will be 10 for X 10 for Y and 10 for Z and 2 bits spare.</w:t>
+      </w:r>
+    </w:p>
+    <w:p>
+      <w:r>
+        <w:t>But I think this would be optimized enough for a normal map, I don’t need to go too big.</w:t>
+      </w:r>
+      <w:r>
+        <w:br/>
+        <w:t>Also I think the packing will not be helpful since this would very much decrease performance.</w:t>
+      </w:r>
+      <w:r>
+        <w:br/>
+        <w:t>NVIDIA blog about compression API, I could really use this:</w:t>
+      </w:r>
+      <w:r>
+        <w:br/>
+      </w:r>
+      <w:hyperlink r:id="rId63" w:history="1">
+        <w:r>
+          <w:rPr>
+            <w:rStyle w:val="Hyperlink"/>
+          </w:rPr>
+          <w:t>https://developer.nvidia.com/blog/accelerating-lossless-gpu-compression-with-new-flexible-interfaces-in-nvidia-nvcomp/</w:t>
+        </w:r>
+      </w:hyperlink>
+      <w:r>
+        <w:t xml:space="preserve"> </w:t>
+      </w:r>
+    </w:p>
+    <w:p>
+      <w:r>
+        <w:t>Yeah okay I can use this.</w:t>
+      </w:r>
+      <w:r>
+        <w:br/>
+        <w:t>Oh no… setting it up is so bad, I installed everything but now what, I believe I have to link libraries (bad memories)</w:t>
+      </w:r>
+      <w:r>
+        <w:br/>
+      </w:r>
+      <w:hyperlink r:id="rId64" w:history="1">
+        <w:r>
+          <w:rPr>
+            <w:rStyle w:val="Hyperlink"/>
+          </w:rPr>
+          <w:t>https://docs.nvidia.com/cuda/cuda-installation-guide-microsoft-windows/index.html</w:t>
+        </w:r>
+      </w:hyperlink>
+      <w:r>
+        <w:t xml:space="preserve"> Maybe this helps with the startup</w:t>
+      </w:r>
+    </w:p>
+    <w:p>
+      <w:pPr>
+        <w:pStyle w:val="Kop1"/>
+      </w:pPr>
+      <w:r>
+        <w:t>Wednesday 9-4-2025</w:t>
+      </w:r>
+    </w:p>
+    <w:p>
+      <w:pPr>
+        <w:rPr>
+          <w:noProof/>
+        </w:rPr>
+      </w:pPr>
+      <w:r>
+        <w:rPr>
+          <w:noProof/>
+        </w:rPr>
+        <w:drawing>
+          <wp:anchor distT="0" distB="0" distL="114300" distR="114300" simplePos="0" relativeHeight="251683840" behindDoc="1" locked="0" layoutInCell="1" allowOverlap="1" wp14:anchorId="0AE3D410" wp14:editId="6CCBEFDF">
+            <wp:simplePos x="0" y="0"/>
+            <wp:positionH relativeFrom="page">
+              <wp:align>left</wp:align>
+            </wp:positionH>
+            <wp:positionV relativeFrom="paragraph">
+              <wp:posOffset>958850</wp:posOffset>
+            </wp:positionV>
+            <wp:extent cx="2387600" cy="1374140"/>
+            <wp:effectExtent l="0" t="0" r="0" b="0"/>
+            <wp:wrapTight wrapText="bothSides">
+              <wp:wrapPolygon edited="0">
+                <wp:start x="0" y="0"/>
+                <wp:lineTo x="0" y="21261"/>
+                <wp:lineTo x="21370" y="21261"/>
+                <wp:lineTo x="21370" y="0"/>
+                <wp:lineTo x="0" y="0"/>
+              </wp:wrapPolygon>
+            </wp:wrapTight>
+            <wp:docPr id="1762278851" name="Afbeelding 1" descr="Afbeelding met tekst, schermopname, Lettertype&#10;&#10;Door AI gegenereerde inhoud is mogelijk onjuist."/>
+            <wp:cNvGraphicFramePr>
+              <a:graphicFrameLocks xmlns:a="http://schemas.openxmlformats.org/drawingml/2006/main" noChangeAspect="1"/>
+            </wp:cNvGraphicFramePr>
+            <a:graphic xmlns:a="http://schemas.openxmlformats.org/drawingml/2006/main">
+              <a:graphicData uri="http://schemas.openxmlformats.org/drawingml/2006/picture">
+                <pic:pic xmlns:pic="http://schemas.openxmlformats.org/drawingml/2006/picture">
+                  <pic:nvPicPr>
+                    <pic:cNvPr id="1762278851" name="Afbeelding 1" descr="Afbeelding met tekst, schermopname, Lettertype&#10;&#10;Door AI gegenereerde inhoud is mogelijk onjuist."/>
+                    <pic:cNvPicPr/>
+                  </pic:nvPicPr>
+                  <pic:blipFill>
+                    <a:blip r:embed="rId65" cstate="print">
+                      <a:extLst>
+                        <a:ext uri="{28A0092B-C50C-407E-A947-70E740481C1C}">
+                          <a14:useLocalDpi xmlns:a14="http://schemas.microsoft.com/office/drawing/2010/main" val="0"/>
+                        </a:ext>
+                      </a:extLst>
+                    </a:blip>
+                    <a:stretch>
+                      <a:fillRect/>
+                    </a:stretch>
+                  </pic:blipFill>
+                  <pic:spPr>
+                    <a:xfrm>
+                      <a:off x="0" y="0"/>
+                      <a:ext cx="2387600" cy="1374140"/>
+                    </a:xfrm>
+                    <a:prstGeom prst="rect">
+                      <a:avLst/>
+                    </a:prstGeom>
+                  </pic:spPr>
+                </pic:pic>
+              </a:graphicData>
+            </a:graphic>
+          </wp:anchor>
+        </w:drawing>
+      </w:r>
+      <w:r>
+        <w:t>I am basically creating a weather model.</w:t>
+      </w:r>
+      <w:r>
+        <w:br/>
+      </w:r>
+      <w:r>
+        <w:t>Okay I successfully set up CUDA.</w:t>
+      </w:r>
+      <w:r>
+        <w:br/>
+        <w:t>Now I can store data, and forget about it, then later receive it again.</w:t>
+      </w:r>
+      <w:r>
+        <w:br/>
+        <w:t>Oh wait for CUDA to work with kernels, I need to connect the project to CUDA.</w:t>
+      </w:r>
+      <w:r>
+        <w:br/>
+        <w:t>I did this and now I can change the data in the GPU using kernels</w:t>
+      </w:r>
+      <w:r>
+        <w:rPr>
+          <w:noProof/>
+        </w:rPr>
+        <w:t>:</w:t>
+      </w:r>
+    </w:p>
+    <w:p>
+      <w:r>
+        <w:rPr>
+          <w:noProof/>
+        </w:rPr>
+        <w:t>Now that we know that it works, I can plan around it.</w:t>
+      </w:r>
+      <w:r>
+        <w:rPr>
+          <w:noProof/>
+        </w:rPr>
+        <w:br/>
+      </w:r>
+    </w:p>
+    <w:p/>
+    <w:p/>
+    <w:p/>
+    <w:p>
+      <w:pPr>
+        <w:pStyle w:val="Kop1"/>
+      </w:pPr>
+      <w:r>
+        <w:t>Thursday 10-4-2025</w:t>
+      </w:r>
+    </w:p>
+    <w:p>
+      <w:r>
+        <w:t>I read a bit about CUDA vs Compute Shader, and I must say that it does not differ that much. So I am questioning if I should proceed with CUDA, since in the end I need to draw my particles.</w:t>
+      </w:r>
+    </w:p>
+    <w:p>
+      <w:r>
+        <w:t xml:space="preserve">Okay, I did some research, and it appears that I can get the same gpu data in OpenGL by just a simple function, this way I can still do the heavy calculations using CUDA and after that render using OpenGL, brilliant! </w:t>
+      </w:r>
+      <w:r>
+        <w:t xml:space="preserve"> (</w:t>
+      </w:r>
+      <w:r>
+        <w:t>cudaGraphicsGLRegisterBuffer</w:t>
+      </w:r>
+      <w:r>
+        <w:t>)</w:t>
+      </w:r>
+    </w:p>
+    <w:p/>
+    <w:p>
+      <w:pPr>
+        <w:pStyle w:val="Kop1"/>
+      </w:pPr>
+      <w:r>
+        <w:lastRenderedPageBreak/>
+        <w:t>Friday 11-4-2025</w:t>
+      </w:r>
+    </w:p>
+    <w:p>
+      <w:r>
+        <w:t>So, we have an idea how we want to use the GPU, we got some (little) memory optimizations.</w:t>
+      </w:r>
+      <w:r>
+        <w:br/>
+        <w:t>We know our bounds, which probably will be having a map of max 256 x 256. We can of course optimize this way better.</w:t>
+      </w:r>
+      <w:r>
+        <w:br/>
+        <w:t>This would mean around a 1x1 resolution for only the Netherlands. Pretty darn good I must say.</w:t>
+      </w:r>
+      <w:r>
+        <w:br/>
+        <w:t>But how are we going to structure this?</w:t>
+      </w:r>
+      <w:r>
+        <w:br/>
+      </w:r>
+      <w:hyperlink r:id="rId66" w:history="1">
+        <w:r>
+          <w:rPr>
+            <w:rStyle w:val="Hyperlink"/>
+          </w:rPr>
+          <w:t>https://docs.nvidia.com/cuda/cuda-c-programming-guide/index.html</w:t>
+        </w:r>
+      </w:hyperlink>
+      <w:r>
+        <w:t xml:space="preserve"> </w:t>
+      </w:r>
+      <w:r>
+        <w:br/>
+        <w:t>Okay, s</w:t>
+      </w:r>
+      <w:r>
+        <w:t>o its normal to create like a million threads on the GPU, that’s kind of funny to me since I always thought that 16 was insanely high being used to only CPU.</w:t>
+      </w:r>
+    </w:p>
+    <w:p>
+      <w:r>
+        <w:t xml:space="preserve">I was thinking about the release of the particles, what I will do is start with releasing just a few particles per area, than if one particle breaks through, it indicates that that area is interesting and we push many particles, like 10 or maybe 100 particles per second. </w:t>
+      </w:r>
+      <w:r>
+        <w:br/>
+        <w:t>I also thought that if we add particles, we need to add them to the GPU, but this is not cost efficient, so what we will do is save up particles and send them over in chunk, for example every 0.1 seconds, because we don’t really care about that delay since it won’t affect the simulation.</w:t>
+      </w:r>
+    </w:p>
+    <w:p>
+      <w:r>
+        <w:t>I forgot about wind speed…</w:t>
+      </w:r>
+      <w:r>
+        <w:br/>
+        <w:t>So I need to rearrange. After some thinking I have a new plan:</w:t>
+      </w:r>
+      <w:r>
+        <w:br/>
+      </w:r>
+    </w:p>
+    <w:tbl>
+      <w:tblPr>
+        <w:tblStyle w:val="Tabelraster"/>
+        <w:tblW w:w="9209" w:type="dxa"/>
+        <w:tblLook w:val="04A0" w:firstRow="1" w:lastRow="0" w:firstColumn="1" w:lastColumn="0" w:noHBand="0" w:noVBand="1"/>
+      </w:tblPr>
+      <w:tblGrid>
+        <w:gridCol w:w="2321"/>
+        <w:gridCol w:w="2239"/>
+        <w:gridCol w:w="2444"/>
+        <w:gridCol w:w="2205"/>
+      </w:tblGrid>
+      <w:tr>
+        <w:trPr>
+          <w:trHeight w:val="535"/>
+        </w:trPr>
+        <w:tc>
+          <w:tcPr>
+            <w:tcW w:w="2321" w:type="dxa"/>
+          </w:tcPr>
+          <w:p>
+            <w:pPr>
+              <w:jc w:val="center"/>
+              <w:rPr>
+                <w:sz w:val="32"/>
+                <w:szCs w:val="32"/>
+              </w:rPr>
+            </w:pPr>
+            <w:r>
+              <w:rPr>
+                <w:sz w:val="32"/>
+                <w:szCs w:val="32"/>
+              </w:rPr>
+              <w:t>Type</w:t>
+            </w:r>
+          </w:p>
+        </w:tc>
+        <w:tc>
+          <w:tcPr>
+            <w:tcW w:w="2239" w:type="dxa"/>
+          </w:tcPr>
+          <w:p>
+            <w:pPr>
+              <w:jc w:val="center"/>
+              <w:rPr>
+                <w:sz w:val="32"/>
+                <w:szCs w:val="32"/>
+              </w:rPr>
+            </w:pPr>
+            <w:r>
+              <w:rPr>
+                <w:sz w:val="32"/>
+                <w:szCs w:val="32"/>
+              </w:rPr>
+              <w:t>Size (in bits)</w:t>
+            </w:r>
+          </w:p>
+        </w:tc>
+        <w:tc>
+          <w:tcPr>
+            <w:tcW w:w="2444" w:type="dxa"/>
+          </w:tcPr>
+          <w:p>
+            <w:pPr>
+              <w:jc w:val="center"/>
+              <w:rPr>
+                <w:sz w:val="32"/>
+                <w:szCs w:val="32"/>
+              </w:rPr>
+            </w:pPr>
+            <w:r>
+              <w:rPr>
+                <w:sz w:val="32"/>
+                <w:szCs w:val="32"/>
+              </w:rPr>
+              <w:t>Precision</w:t>
+            </w:r>
+          </w:p>
+        </w:tc>
+        <w:tc>
+          <w:tcPr>
+            <w:tcW w:w="2205" w:type="dxa"/>
+          </w:tcPr>
+          <w:p>
+            <w:pPr>
+              <w:jc w:val="center"/>
+              <w:rPr>
+                <w:sz w:val="32"/>
+                <w:szCs w:val="32"/>
+              </w:rPr>
+            </w:pPr>
+            <w:r>
+              <w:rPr>
+                <w:sz w:val="32"/>
+                <w:szCs w:val="32"/>
+              </w:rPr>
+              <w:t>Use Precision</w:t>
+            </w:r>
+          </w:p>
+        </w:tc>
+      </w:tr>
+      <w:tr>
+        <w:trPr>
+          <w:trHeight w:val="535"/>
+        </w:trPr>
+        <w:tc>
+          <w:tcPr>
+            <w:tcW w:w="2321" w:type="dxa"/>
+          </w:tcPr>
+          <w:p>
+            <w:pPr>
+              <w:jc w:val="center"/>
+              <w:rPr>
+                <w:sz w:val="32"/>
+                <w:szCs w:val="32"/>
+              </w:rPr>
+            </w:pPr>
+            <w:r>
+              <w:rPr>
+                <w:sz w:val="32"/>
+                <w:szCs w:val="32"/>
+              </w:rPr>
+              <w:t>Temp</w:t>
+            </w:r>
+          </w:p>
+        </w:tc>
+        <w:tc>
+          <w:tcPr>
+            <w:tcW w:w="2239" w:type="dxa"/>
+          </w:tcPr>
+          <w:p>
+            <w:pPr>
+              <w:jc w:val="center"/>
+              <w:rPr>
+                <w:sz w:val="32"/>
+                <w:szCs w:val="32"/>
+              </w:rPr>
+            </w:pPr>
+            <w:r>
+              <w:rPr>
+                <w:sz w:val="32"/>
+                <w:szCs w:val="32"/>
+              </w:rPr>
+              <w:t>14</w:t>
+            </w:r>
+          </w:p>
+        </w:tc>
+        <w:tc>
+          <w:tcPr>
+            <w:tcW w:w="2444" w:type="dxa"/>
+          </w:tcPr>
+          <w:p>
+            <w:pPr>
+              <w:jc w:val="center"/>
+              <w:rPr>
+                <w:sz w:val="32"/>
+                <w:szCs w:val="32"/>
+              </w:rPr>
+            </w:pPr>
+            <w:r>
+              <w:rPr>
+                <w:sz w:val="32"/>
+                <w:szCs w:val="32"/>
+              </w:rPr>
+              <w:t xml:space="preserve">1 to </w:t>
+            </w:r>
+            <w:r>
+              <w:rPr>
+                <w:sz w:val="32"/>
+                <w:szCs w:val="32"/>
+              </w:rPr>
+              <w:t>0,00006</w:t>
+            </w:r>
+          </w:p>
+        </w:tc>
+        <w:tc>
+          <w:tcPr>
+            <w:tcW w:w="2205" w:type="dxa"/>
+          </w:tcPr>
+          <w:p>
+            <w:pPr>
+              <w:jc w:val="center"/>
+              <w:rPr>
+                <w:sz w:val="32"/>
+                <w:szCs w:val="32"/>
+              </w:rPr>
+            </w:pPr>
+            <w:r>
+              <w:rPr>
+                <w:sz w:val="32"/>
+                <w:szCs w:val="32"/>
+              </w:rPr>
+              <w:t>200 to 0,012</w:t>
+            </w:r>
+          </w:p>
+        </w:tc>
+      </w:tr>
+      <w:tr>
+        <w:trPr>
+          <w:trHeight w:val="535"/>
+        </w:trPr>
+        <w:tc>
+          <w:tcPr>
+            <w:tcW w:w="2321" w:type="dxa"/>
+          </w:tcPr>
+          <w:p>
+            <w:pPr>
+              <w:jc w:val="center"/>
+              <w:rPr>
+                <w:sz w:val="32"/>
+                <w:szCs w:val="32"/>
+              </w:rPr>
+            </w:pPr>
+            <w:r>
+              <w:rPr>
+                <w:sz w:val="32"/>
+                <w:szCs w:val="32"/>
+              </w:rPr>
+              <w:t>Dew</w:t>
+            </w:r>
+          </w:p>
+        </w:tc>
+        <w:tc>
+          <w:tcPr>
+            <w:tcW w:w="2239" w:type="dxa"/>
+          </w:tcPr>
+          <w:p>
+            <w:pPr>
+              <w:jc w:val="center"/>
+              <w:rPr>
+                <w:sz w:val="32"/>
+                <w:szCs w:val="32"/>
+              </w:rPr>
+            </w:pPr>
+            <w:r>
+              <w:rPr>
+                <w:sz w:val="32"/>
+                <w:szCs w:val="32"/>
+              </w:rPr>
+              <w:t>14</w:t>
+            </w:r>
+          </w:p>
+        </w:tc>
+        <w:tc>
+          <w:tcPr>
+            <w:tcW w:w="2444" w:type="dxa"/>
+          </w:tcPr>
+          <w:p>
+            <w:pPr>
+              <w:jc w:val="center"/>
+              <w:rPr>
+                <w:sz w:val="32"/>
+                <w:szCs w:val="32"/>
+              </w:rPr>
+            </w:pPr>
+            <w:r>
+              <w:rPr>
+                <w:sz w:val="32"/>
+                <w:szCs w:val="32"/>
+              </w:rPr>
+              <w:t>1 to 0,00006</w:t>
+            </w:r>
+          </w:p>
+        </w:tc>
+        <w:tc>
+          <w:tcPr>
+            <w:tcW w:w="2205" w:type="dxa"/>
+          </w:tcPr>
+          <w:p>
+            <w:pPr>
+              <w:jc w:val="center"/>
+              <w:rPr>
+                <w:sz w:val="32"/>
+                <w:szCs w:val="32"/>
+              </w:rPr>
+            </w:pPr>
+            <w:r>
+              <w:rPr>
+                <w:sz w:val="32"/>
+                <w:szCs w:val="32"/>
+              </w:rPr>
+              <w:t>200 to 0,012</w:t>
+            </w:r>
+          </w:p>
+        </w:tc>
+      </w:tr>
+      <w:tr>
+        <w:trPr>
+          <w:trHeight w:val="516"/>
+        </w:trPr>
+        <w:tc>
+          <w:tcPr>
+            <w:tcW w:w="2321" w:type="dxa"/>
+          </w:tcPr>
+          <w:p>
+            <w:pPr>
+              <w:jc w:val="center"/>
+              <w:rPr>
+                <w:sz w:val="32"/>
+                <w:szCs w:val="32"/>
+              </w:rPr>
+            </w:pPr>
+            <w:r>
+              <w:rPr>
+                <w:sz w:val="32"/>
+                <w:szCs w:val="32"/>
+              </w:rPr>
+              <w:t>Wind X</w:t>
+            </w:r>
+          </w:p>
+        </w:tc>
+        <w:tc>
+          <w:tcPr>
+            <w:tcW w:w="2239" w:type="dxa"/>
+          </w:tcPr>
+          <w:p>
+            <w:pPr>
+              <w:jc w:val="center"/>
+              <w:rPr>
+                <w:sz w:val="32"/>
+                <w:szCs w:val="32"/>
+              </w:rPr>
+            </w:pPr>
+            <w:r>
+              <w:rPr>
+                <w:sz w:val="32"/>
+                <w:szCs w:val="32"/>
+              </w:rPr>
+              <w:t>8</w:t>
+            </w:r>
+          </w:p>
+        </w:tc>
+        <w:tc>
+          <w:tcPr>
+            <w:tcW w:w="2444" w:type="dxa"/>
+          </w:tcPr>
+          <w:p>
+            <w:pPr>
+              <w:jc w:val="center"/>
+              <w:rPr>
+                <w:sz w:val="32"/>
+                <w:szCs w:val="32"/>
+              </w:rPr>
+            </w:pPr>
+            <w:r>
+              <w:rPr>
+                <w:sz w:val="32"/>
+                <w:szCs w:val="32"/>
+              </w:rPr>
+              <w:t>1 to 0,004</w:t>
+            </w:r>
+          </w:p>
+        </w:tc>
+        <w:tc>
+          <w:tcPr>
+            <w:tcW w:w="2205" w:type="dxa"/>
+          </w:tcPr>
+          <w:p>
+            <w:pPr>
+              <w:jc w:val="center"/>
+              <w:rPr>
+                <w:sz w:val="32"/>
+                <w:szCs w:val="32"/>
+              </w:rPr>
+            </w:pPr>
+            <w:r>
+              <w:rPr>
+                <w:sz w:val="32"/>
+                <w:szCs w:val="32"/>
+              </w:rPr>
+              <w:t>1 to 0,004</w:t>
+            </w:r>
+          </w:p>
+        </w:tc>
+      </w:tr>
+      <w:tr>
+        <w:trPr>
+          <w:trHeight w:val="535"/>
+        </w:trPr>
+        <w:tc>
+          <w:tcPr>
+            <w:tcW w:w="2321" w:type="dxa"/>
+          </w:tcPr>
+          <w:p>
+            <w:pPr>
+              <w:jc w:val="center"/>
+              <w:rPr>
+                <w:sz w:val="32"/>
+                <w:szCs w:val="32"/>
+              </w:rPr>
+            </w:pPr>
+            <w:r>
+              <w:rPr>
+                <w:sz w:val="32"/>
+                <w:szCs w:val="32"/>
+              </w:rPr>
+              <w:t>Wind Y</w:t>
+            </w:r>
+          </w:p>
+        </w:tc>
+        <w:tc>
+          <w:tcPr>
+            <w:tcW w:w="2239" w:type="dxa"/>
+          </w:tcPr>
+          <w:p>
+            <w:pPr>
+              <w:jc w:val="center"/>
+              <w:rPr>
+                <w:sz w:val="32"/>
+                <w:szCs w:val="32"/>
+              </w:rPr>
+            </w:pPr>
+            <w:r>
+              <w:rPr>
+                <w:sz w:val="32"/>
+                <w:szCs w:val="32"/>
+              </w:rPr>
+              <w:t>8</w:t>
+            </w:r>
+          </w:p>
+        </w:tc>
+        <w:tc>
+          <w:tcPr>
+            <w:tcW w:w="2444" w:type="dxa"/>
+          </w:tcPr>
+          <w:p>
+            <w:pPr>
+              <w:jc w:val="center"/>
+              <w:rPr>
+                <w:sz w:val="32"/>
+                <w:szCs w:val="32"/>
+              </w:rPr>
+            </w:pPr>
+            <w:r>
+              <w:rPr>
+                <w:sz w:val="32"/>
+                <w:szCs w:val="32"/>
+              </w:rPr>
+              <w:t>1 to 0,004</w:t>
+            </w:r>
+          </w:p>
+        </w:tc>
+        <w:tc>
+          <w:tcPr>
+            <w:tcW w:w="2205" w:type="dxa"/>
+          </w:tcPr>
+          <w:p>
+            <w:pPr>
+              <w:jc w:val="center"/>
+              <w:rPr>
+                <w:sz w:val="32"/>
+                <w:szCs w:val="32"/>
+              </w:rPr>
+            </w:pPr>
+            <w:r>
+              <w:rPr>
+                <w:sz w:val="32"/>
+                <w:szCs w:val="32"/>
+              </w:rPr>
+              <w:t>1 to 0,004</w:t>
+            </w:r>
+          </w:p>
+        </w:tc>
+      </w:tr>
+      <w:tr>
+        <w:trPr>
+          <w:trHeight w:val="535"/>
+        </w:trPr>
+        <w:tc>
+          <w:tcPr>
+            <w:tcW w:w="2321" w:type="dxa"/>
+          </w:tcPr>
+          <w:p>
+            <w:pPr>
+              <w:jc w:val="center"/>
+              <w:rPr>
+                <w:sz w:val="32"/>
+                <w:szCs w:val="32"/>
+              </w:rPr>
+            </w:pPr>
+            <w:r>
+              <w:rPr>
+                <w:sz w:val="32"/>
+                <w:szCs w:val="32"/>
+              </w:rPr>
+              <w:t>Wind Z</w:t>
+            </w:r>
+          </w:p>
+        </w:tc>
+        <w:tc>
+          <w:tcPr>
+            <w:tcW w:w="2239" w:type="dxa"/>
+          </w:tcPr>
+          <w:p>
+            <w:pPr>
+              <w:jc w:val="center"/>
+              <w:rPr>
+                <w:sz w:val="32"/>
+                <w:szCs w:val="32"/>
+              </w:rPr>
+            </w:pPr>
+            <w:r>
+              <w:rPr>
+                <w:sz w:val="32"/>
+                <w:szCs w:val="32"/>
+              </w:rPr>
+              <w:t>8</w:t>
+            </w:r>
+          </w:p>
+        </w:tc>
+        <w:tc>
+          <w:tcPr>
+            <w:tcW w:w="2444" w:type="dxa"/>
+          </w:tcPr>
+          <w:p>
+            <w:pPr>
+              <w:jc w:val="center"/>
+              <w:rPr>
+                <w:sz w:val="32"/>
+                <w:szCs w:val="32"/>
+              </w:rPr>
+            </w:pPr>
+            <w:r>
+              <w:rPr>
+                <w:sz w:val="32"/>
+                <w:szCs w:val="32"/>
+              </w:rPr>
+              <w:t>1 to 0,004</w:t>
+            </w:r>
+          </w:p>
+        </w:tc>
+        <w:tc>
+          <w:tcPr>
+            <w:tcW w:w="2205" w:type="dxa"/>
+          </w:tcPr>
+          <w:p>
+            <w:pPr>
+              <w:jc w:val="center"/>
+              <w:rPr>
+                <w:sz w:val="32"/>
+                <w:szCs w:val="32"/>
+              </w:rPr>
+            </w:pPr>
+            <w:r>
+              <w:rPr>
+                <w:sz w:val="32"/>
+                <w:szCs w:val="32"/>
+              </w:rPr>
+              <w:t>1 to 0,004</w:t>
+            </w:r>
+          </w:p>
+        </w:tc>
+      </w:tr>
+      <w:tr>
+        <w:trPr>
+          <w:trHeight w:val="535"/>
+        </w:trPr>
+        <w:tc>
+          <w:tcPr>
+            <w:tcW w:w="2321" w:type="dxa"/>
+          </w:tcPr>
+          <w:p>
+            <w:pPr>
+              <w:jc w:val="center"/>
+              <w:rPr>
+                <w:sz w:val="32"/>
+                <w:szCs w:val="32"/>
+              </w:rPr>
+            </w:pPr>
+            <w:r>
+              <w:rPr>
+                <w:sz w:val="32"/>
+                <w:szCs w:val="32"/>
+              </w:rPr>
+              <w:t>Wind Speed</w:t>
+            </w:r>
+          </w:p>
+        </w:tc>
+        <w:tc>
+          <w:tcPr>
+            <w:tcW w:w="2239" w:type="dxa"/>
+          </w:tcPr>
+          <w:p>
+            <w:pPr>
+              <w:jc w:val="center"/>
+              <w:rPr>
+                <w:sz w:val="32"/>
+                <w:szCs w:val="32"/>
+              </w:rPr>
+            </w:pPr>
+            <w:r>
+              <w:rPr>
+                <w:sz w:val="32"/>
+                <w:szCs w:val="32"/>
+              </w:rPr>
+              <w:t>12</w:t>
+            </w:r>
+          </w:p>
+        </w:tc>
+        <w:tc>
+          <w:tcPr>
+            <w:tcW w:w="2444" w:type="dxa"/>
+          </w:tcPr>
+          <w:p>
+            <w:pPr>
+              <w:jc w:val="center"/>
+              <w:rPr>
+                <w:sz w:val="32"/>
+                <w:szCs w:val="32"/>
+              </w:rPr>
+            </w:pPr>
+            <w:r>
+              <w:rPr>
+                <w:sz w:val="32"/>
+                <w:szCs w:val="32"/>
+              </w:rPr>
+              <w:t>1 to 0,00025</w:t>
+            </w:r>
+          </w:p>
+        </w:tc>
+        <w:tc>
+          <w:tcPr>
+            <w:tcW w:w="2205" w:type="dxa"/>
+          </w:tcPr>
+          <w:p>
+            <w:pPr>
+              <w:jc w:val="center"/>
+              <w:rPr>
+                <w:sz w:val="32"/>
+                <w:szCs w:val="32"/>
+              </w:rPr>
+            </w:pPr>
+            <w:r>
+              <w:rPr>
+                <w:sz w:val="32"/>
+                <w:szCs w:val="32"/>
+              </w:rPr>
+              <w:t>100 to 0,025</w:t>
+            </w:r>
+          </w:p>
+        </w:tc>
+      </w:tr>
+    </w:tbl>
+    <w:p/>
+    <w:p>
+      <w:r>
+        <w:t>I kind of like the way packing it using a struct but only with a uint64_t.</w:t>
+      </w:r>
+      <w:r>
+        <w:br/>
+        <w:t>But in the struct I can still have functions which are declared out of the struct, meaning they will not increase the size of the struct, so my structure will be:</w:t>
+      </w:r>
+      <w:r>
+        <w:br/>
+        <w:t>struct WeatherData</w:t>
+      </w:r>
+      <w:r>
+        <w:br/>
+        <w:t>{</w:t>
+      </w:r>
+      <w:r>
+        <w:br/>
+      </w:r>
+      <w:r>
+        <w:tab/>
+        <w:t>Uint64_t packedData;</w:t>
+      </w:r>
+      <w:r>
+        <w:br/>
+      </w:r>
+      <w:r>
+        <w:tab/>
+        <w:t>//Other functions:</w:t>
+      </w:r>
+      <w:r>
+        <w:br/>
+      </w:r>
+      <w:r>
+        <w:tab/>
+        <w:t>…</w:t>
+      </w:r>
+      <w:r>
+        <w:br/>
+        <w:t>}</w:t>
+      </w:r>
+      <w:r>
+        <w:br/>
+        <w:t>WeatherData map[256 * 256 * 64];</w:t>
+      </w:r>
+    </w:p>
+    <w:p>
+      <w:r>
+        <w:lastRenderedPageBreak/>
+        <w:t>I think I understand kernels and stuff well enough that I might be ready for some coding, but before that, I need to make a plan for a nice structure, I need to have my code nicely divided so its visibly nice.</w:t>
+      </w:r>
+    </w:p>
+    <w:p>
+      <w:r>
+        <w:t>So we have cpp files and Cu files. I rather have the data stored inside a cpp file, but I don’t think this matters that much and it will not be helpful to the performance?</w:t>
+      </w:r>
+      <w:r>
+        <w:br/>
+        <w:t xml:space="preserve">It does not really matter. </w:t>
+      </w:r>
+    </w:p>
+    <w:p>
+      <w:r>
+        <w:t>We need:</w:t>
+      </w:r>
+      <w:r>
+        <w:br/>
+        <w:t>- A lot of kernel functions/functionality</w:t>
+      </w:r>
+      <w:r>
+        <w:br/>
+        <w:t xml:space="preserve">- Our </w:t>
+      </w:r>
+      <w:r>
+        <w:t>environment</w:t>
+      </w:r>
+      <w:r>
+        <w:t xml:space="preserve"> data array</w:t>
+      </w:r>
+      <w:r>
+        <w:br/>
+        <w:t xml:space="preserve">- </w:t>
+      </w:r>
+      <w:r>
+        <w:t>Particles that will be saved up and send to the GPU</w:t>
+      </w:r>
+      <w:r>
+        <w:br/>
+        <w:t>- Particle emitters. (ground data)</w:t>
+      </w:r>
+      <w:r>
+        <w:br/>
+        <w:t>- Set-up of the environment.</w:t>
+      </w:r>
+    </w:p>
+    <w:p>
+      <w:r>
+        <w:rPr>
+          <w:noProof/>
+        </w:rPr>
+        <w:drawing>
+          <wp:anchor distT="0" distB="0" distL="114300" distR="114300" simplePos="0" relativeHeight="251684864" behindDoc="1" locked="0" layoutInCell="1" allowOverlap="1" wp14:anchorId="2F46546C" wp14:editId="42F272F6">
+            <wp:simplePos x="0" y="0"/>
+            <wp:positionH relativeFrom="margin">
+              <wp:align>center</wp:align>
+            </wp:positionH>
+            <wp:positionV relativeFrom="paragraph">
+              <wp:posOffset>739775</wp:posOffset>
+            </wp:positionV>
+            <wp:extent cx="5760720" cy="1539875"/>
+            <wp:effectExtent l="0" t="0" r="0" b="3175"/>
+            <wp:wrapTight wrapText="bothSides">
+              <wp:wrapPolygon edited="0">
+                <wp:start x="0" y="0"/>
+                <wp:lineTo x="0" y="21377"/>
+                <wp:lineTo x="21500" y="21377"/>
+                <wp:lineTo x="21500" y="0"/>
+                <wp:lineTo x="0" y="0"/>
+              </wp:wrapPolygon>
+            </wp:wrapTight>
+            <wp:docPr id="1742832231" name="Afbeelding 1" descr="Afbeelding met diagram, Kinderkunst, origami&#10;&#10;Door AI gegenereerde inhoud is mogelijk onjuist."/>
+            <wp:cNvGraphicFramePr>
+              <a:graphicFrameLocks xmlns:a="http://schemas.openxmlformats.org/drawingml/2006/main" noChangeAspect="1"/>
+            </wp:cNvGraphicFramePr>
+            <a:graphic xmlns:a="http://schemas.openxmlformats.org/drawingml/2006/main">
+              <a:graphicData uri="http://schemas.openxmlformats.org/drawingml/2006/picture">
+                <pic:pic xmlns:pic="http://schemas.openxmlformats.org/drawingml/2006/picture">
+                  <pic:nvPicPr>
+                    <pic:cNvPr id="1742832231" name="Afbeelding 1" descr="Afbeelding met diagram, Kinderkunst, origami&#10;&#10;Door AI gegenereerde inhoud is mogelijk onjuist."/>
+                    <pic:cNvPicPr/>
+                  </pic:nvPicPr>
+                  <pic:blipFill>
+                    <a:blip r:embed="rId67">
+                      <a:extLst>
+                        <a:ext uri="{28A0092B-C50C-407E-A947-70E740481C1C}">
+                          <a14:useLocalDpi xmlns:a14="http://schemas.microsoft.com/office/drawing/2010/main" val="0"/>
+                        </a:ext>
+                      </a:extLst>
+                    </a:blip>
+                    <a:stretch>
+                      <a:fillRect/>
+                    </a:stretch>
+                  </pic:blipFill>
+                  <pic:spPr>
+                    <a:xfrm>
+                      <a:off x="0" y="0"/>
+                      <a:ext cx="5760720" cy="1539875"/>
+                    </a:xfrm>
+                    <a:prstGeom prst="rect">
+                      <a:avLst/>
+                    </a:prstGeom>
+                  </pic:spPr>
+                </pic:pic>
+              </a:graphicData>
+            </a:graphic>
+          </wp:anchor>
+        </w:drawing>
+      </w:r>
+      <w:r>
+        <w:t xml:space="preserve">Our environment has to be changed due to wind and particles, this I don’t know yet how to do. </w:t>
+      </w:r>
+      <w:r>
+        <w:br/>
+        <w:t>Also I base the environment based on 1 skew-T, so or I keep this skew-T for the whole map, or I apply for example some variation in pressure, not yet. What I will do is add for example Perlin noise to initiate ground temp. (so not everything starts off with the same temp)</w:t>
+      </w:r>
+    </w:p>
+    <w:p>
+      <w:r>
+        <w:t>Here are the steps of the process</w:t>
+      </w:r>
+      <w:r>
+        <w:t>:</w:t>
+      </w:r>
+      <w:r>
+        <w:br/>
+        <w:t xml:space="preserve">1. </w:t>
+      </w:r>
+      <w:r>
+        <w:br/>
+        <w:t xml:space="preserve">First we download the skew-T, maybe in the future you can create your own. </w:t>
+      </w:r>
+    </w:p>
+    <w:p>
+      <w:r>
+        <w:t>2.</w:t>
+      </w:r>
+      <w:r>
+        <w:br/>
+        <w:t>Now we populate the environment, for now I will duplicate the downloaded environment everywhere (of course decreased resolution) Also the ground temp will be randomized.</w:t>
+      </w:r>
+    </w:p>
+    <w:p>
+      <w:r>
+        <w:t xml:space="preserve">3. </w:t>
+      </w:r>
+      <w:r>
+        <w:br/>
+        <w:t>Due to solar heating, the ground gets warmed up and the environment changes.</w:t>
+      </w:r>
+      <w:r>
+        <w:br/>
+        <w:t>In the meantime, around all the map some particles will get send up.</w:t>
+      </w:r>
+    </w:p>
+    <w:p>
+      <w:r>
+        <w:t>4.</w:t>
+      </w:r>
+      <w:r>
+        <w:br/>
+        <w:t>After a while particles pushed through the LCL or CCL and our first clouds come to exist.</w:t>
+      </w:r>
+    </w:p>
+    <w:p>
+      <w:r>
+        <w:t>Okay the wind calculations could be pretty big considering all the changes it could have.</w:t>
+      </w:r>
+      <w:r>
+        <w:br/>
+        <w:t>Hmm still researching wind calculations.</w:t>
+      </w:r>
+    </w:p>
+    <w:p>
+      <w:hyperlink r:id="rId68" w:history="1">
+        <w:r>
+          <w:rPr>
+            <w:rStyle w:val="Hyperlink"/>
+          </w:rPr>
+          <w:t>https://computationalsciences.org/publications/amador-herrera-2021-weatherscapes/amador-herrera-2021-weatherscapes.pdf</w:t>
+        </w:r>
+      </w:hyperlink>
+      <w:r>
+        <w:t xml:space="preserve"> </w:t>
+      </w:r>
+      <w:r>
+        <w:t>How they did the simulation of their 3D environment. So I am mainly interested in the changes in environment part</w:t>
+      </w:r>
+    </w:p>
+    <w:p/>
+    <w:p>
+      <w:pPr>
+        <w:pStyle w:val="Kop1"/>
+      </w:pPr>
+      <w:r>
+        <w:lastRenderedPageBreak/>
+        <w:t>Sunday 13-4-2025</w:t>
+      </w:r>
+    </w:p>
+    <w:p>
+      <w:r>
+        <w:t>Reading this paper, I realize I am no where near done.</w:t>
+      </w:r>
+      <w:r>
+        <w:br/>
+        <w:t>For example the ground should have more variables than just the temp. They use a simple calculation to calculate their environment, which is way different by creating one of using one.</w:t>
+      </w:r>
+      <w:r>
+        <w:br/>
+        <w:t>Okay this paper seems to be gold for the point where I am at.</w:t>
+      </w:r>
+      <w:r>
+        <w:br/>
+        <w:t>I need to rethink this whole process.</w:t>
+      </w:r>
+    </w:p>
+    <w:p/>
+    <w:p>
+      <w:pPr>
+        <w:pStyle w:val="Kop1"/>
+      </w:pPr>
+      <w:r>
+        <w:t>Tuesday 22-4-2025</w:t>
+      </w:r>
+    </w:p>
+    <w:p>
+      <w:r>
+        <w:t>Still reading papers, found an older one, from the same franchise or something?</w:t>
+      </w:r>
+      <w:r>
+        <w:br/>
+      </w:r>
+      <w:hyperlink r:id="rId69" w:history="1">
+        <w:r>
+          <w:rPr>
+            <w:rStyle w:val="Hyperlink"/>
+          </w:rPr>
+          <w:t>https://computationalsciences.org/publications/haedrich-2020-stormscapes/haedrich-2020-stormscapes.pdf</w:t>
+        </w:r>
+      </w:hyperlink>
+      <w:r>
+        <w:t xml:space="preserve"> </w:t>
+      </w:r>
+      <w:r>
+        <w:br/>
+        <w:t>Okay, what I learned in this paper, is that they only use a grid field, in this grid everything is stored.</w:t>
+      </w:r>
+    </w:p>
+    <w:p>
+      <w:r>
+        <w:t>Okay they store this in their voxels/grid:</w:t>
+      </w:r>
+      <w:r>
+        <w:br/>
+      </w:r>
+    </w:p>
+    <w:tbl>
+      <w:tblPr>
+        <w:tblStyle w:val="Tabelraster"/>
+        <w:tblW w:w="8938" w:type="dxa"/>
+        <w:tblLook w:val="04A0" w:firstRow="1" w:lastRow="0" w:firstColumn="1" w:lastColumn="0" w:noHBand="0" w:noVBand="1"/>
+      </w:tblPr>
+      <w:tblGrid>
+        <w:gridCol w:w="4469"/>
+        <w:gridCol w:w="4469"/>
+      </w:tblGrid>
+      <w:tr>
+        <w:trPr>
+          <w:trHeight w:val="311"/>
+        </w:trPr>
+        <w:tc>
+          <w:tcPr>
+            <w:tcW w:w="4469" w:type="dxa"/>
+          </w:tcPr>
+          <w:p>
+            <w:r>
+              <w:t>Variable</w:t>
+            </w:r>
+          </w:p>
+        </w:tc>
+        <w:tc>
+          <w:tcPr>
+            <w:tcW w:w="4469" w:type="dxa"/>
+          </w:tcPr>
+          <w:p>
+            <w:r>
+              <w:t>Description</w:t>
+            </w:r>
+          </w:p>
+        </w:tc>
+      </w:tr>
+      <w:tr>
+        <w:trPr>
+          <w:trHeight w:val="311"/>
+        </w:trPr>
+        <w:tc>
+          <w:tcPr>
+            <w:tcW w:w="4469" w:type="dxa"/>
+          </w:tcPr>
+          <w:p>
+            <w:r>
+              <w:t>q</w:t>
+            </w:r>
+            <w:r>
+              <w:rPr>
+                <w:sz w:val="18"/>
+                <w:szCs w:val="18"/>
+              </w:rPr>
+              <w:t>v</w:t>
+            </w:r>
+          </w:p>
+        </w:tc>
+        <w:tc>
+          <w:tcPr>
+            <w:tcW w:w="4469" w:type="dxa"/>
+          </w:tcPr>
+          <w:p>
+            <w:r>
+              <w:t>Mixing ratio of water vapor</w:t>
+            </w:r>
+          </w:p>
+        </w:tc>
+      </w:tr>
+      <w:tr>
+        <w:trPr>
+          <w:trHeight w:val="311"/>
+        </w:trPr>
+        <w:tc>
+          <w:tcPr>
+            <w:tcW w:w="4469" w:type="dxa"/>
+          </w:tcPr>
+          <w:p>
+            <w:r>
+              <w:t>q</w:t>
+            </w:r>
+            <w:r>
+              <w:rPr>
+                <w:sz w:val="18"/>
+                <w:szCs w:val="18"/>
+              </w:rPr>
+              <w:t>w</w:t>
+            </w:r>
+          </w:p>
+        </w:tc>
+        <w:tc>
+          <w:tcPr>
+            <w:tcW w:w="4469" w:type="dxa"/>
+          </w:tcPr>
+          <w:p>
+            <w:r>
+              <w:t>Mixing ratio of liquid water (clouds)</w:t>
+            </w:r>
+          </w:p>
+        </w:tc>
+      </w:tr>
+      <w:tr>
+        <w:trPr>
+          <w:trHeight w:val="300"/>
+        </w:trPr>
+        <w:tc>
+          <w:tcPr>
+            <w:tcW w:w="4469" w:type="dxa"/>
+          </w:tcPr>
+          <w:p>
+            <w:r>
+              <w:t>q</w:t>
+            </w:r>
+            <w:r>
+              <w:rPr>
+                <w:sz w:val="18"/>
+                <w:szCs w:val="18"/>
+              </w:rPr>
+              <w:t>c</w:t>
+            </w:r>
+          </w:p>
+        </w:tc>
+        <w:tc>
+          <w:tcPr>
+            <w:tcW w:w="4469" w:type="dxa"/>
+          </w:tcPr>
+          <w:p>
+            <w:r>
+              <w:t>Mixing ratio of ice (clouds)</w:t>
+            </w:r>
+          </w:p>
+        </w:tc>
+      </w:tr>
+      <w:tr>
+        <w:trPr>
+          <w:trHeight w:val="311"/>
+        </w:trPr>
+        <w:tc>
+          <w:tcPr>
+            <w:tcW w:w="4469" w:type="dxa"/>
+          </w:tcPr>
+          <w:p>
+            <w:r>
+              <w:t>q</w:t>
+            </w:r>
+            <w:r>
+              <w:rPr>
+                <w:sz w:val="18"/>
+                <w:szCs w:val="18"/>
+              </w:rPr>
+              <w:t>r</w:t>
+            </w:r>
+          </w:p>
+        </w:tc>
+        <w:tc>
+          <w:tcPr>
+            <w:tcW w:w="4469" w:type="dxa"/>
+          </w:tcPr>
+          <w:p>
+            <w:r>
+              <w:t>Mixing ratio of rain</w:t>
+            </w:r>
+          </w:p>
+        </w:tc>
+      </w:tr>
+      <w:tr>
+        <w:trPr>
+          <w:trHeight w:val="311"/>
+        </w:trPr>
+        <w:tc>
+          <w:tcPr>
+            <w:tcW w:w="4469" w:type="dxa"/>
+          </w:tcPr>
+          <w:p>
+            <w:r>
+              <w:t>q</w:t>
+            </w:r>
+            <w:r>
+              <w:rPr>
+                <w:sz w:val="18"/>
+                <w:szCs w:val="18"/>
+              </w:rPr>
+              <w:t>s</w:t>
+            </w:r>
+          </w:p>
+        </w:tc>
+        <w:tc>
+          <w:tcPr>
+            <w:tcW w:w="4469" w:type="dxa"/>
+          </w:tcPr>
+          <w:p>
+            <w:r>
+              <w:t>Mixing ratio of snow</w:t>
+            </w:r>
+          </w:p>
+        </w:tc>
+      </w:tr>
+      <w:tr>
+        <w:trPr>
+          <w:trHeight w:val="311"/>
+        </w:trPr>
+        <w:tc>
+          <w:tcPr>
+            <w:tcW w:w="4469" w:type="dxa"/>
+          </w:tcPr>
+          <w:p>
+            <w:r>
+              <w:t>q</w:t>
+            </w:r>
+            <w:r>
+              <w:rPr>
+                <w:sz w:val="18"/>
+                <w:szCs w:val="18"/>
+              </w:rPr>
+              <w:t>i</w:t>
+            </w:r>
+          </w:p>
+        </w:tc>
+        <w:tc>
+          <w:tcPr>
+            <w:tcW w:w="4469" w:type="dxa"/>
+          </w:tcPr>
+          <w:p>
+            <w:r>
+              <w:t>Mixing ratio of ice (precip)</w:t>
+            </w:r>
+          </w:p>
+        </w:tc>
+      </w:tr>
+      <w:tr>
+        <w:trPr>
+          <w:trHeight w:val="311"/>
+        </w:trPr>
+        <w:tc>
+          <w:tcPr>
+            <w:tcW w:w="4469" w:type="dxa"/>
+          </w:tcPr>
+          <w:p>
+            <w:pPr>
+              <w:rPr>
+                <w:lang w:val="nl-NL"/>
+              </w:rPr>
+            </w:pPr>
+            <w:r>
+              <w:rPr>
+                <w:lang w:val="nl-NL"/>
+              </w:rPr>
+              <w:t>θ</w:t>
+            </w:r>
+          </w:p>
+        </w:tc>
+        <w:tc>
+          <w:tcPr>
+            <w:tcW w:w="4469" w:type="dxa"/>
+          </w:tcPr>
+          <w:p>
+            <w:r>
+              <w:t>Potential temperature</w:t>
+            </w:r>
+          </w:p>
+        </w:tc>
+      </w:tr>
+      <w:tr>
+        <w:trPr>
+          <w:trHeight w:val="311"/>
+        </w:trPr>
+        <w:tc>
+          <w:tcPr>
+            <w:tcW w:w="4469" w:type="dxa"/>
+          </w:tcPr>
+          <w:p>
+            <w:pPr>
+              <w:rPr>
+                <w:b/>
+                <w:bCs/>
+                <w:i/>
+                <w:iCs/>
+              </w:rPr>
+            </w:pPr>
+            <w:r>
+              <w:rPr>
+                <w:b/>
+                <w:bCs/>
+                <w:i/>
+                <w:iCs/>
+              </w:rPr>
+              <w:t>u</w:t>
+            </w:r>
+          </w:p>
+        </w:tc>
+        <w:tc>
+          <w:tcPr>
+            <w:tcW w:w="4469" w:type="dxa"/>
+          </w:tcPr>
+          <w:p>
+            <w:r>
+              <w:t>3D velocity field</w:t>
+            </w:r>
+          </w:p>
+        </w:tc>
+      </w:tr>
+    </w:tbl>
+    <w:p/>
+    <w:p>
+      <w:r>
+        <w:t>For now I will just store the full amount, so like 4 bytes per variable (vec3 for V-field)</w:t>
+      </w:r>
+      <w:r>
+        <w:br/>
+        <w:t>Meaning that one voxel will be 40 bytes, I may could subtract one byte out of mixing ratios and others so it will be 32. But we will see.</w:t>
+      </w:r>
+    </w:p>
+    <w:p>
+      <w:hyperlink r:id="rId70" w:history="1">
+        <w:r>
+          <w:rPr>
+            <w:rStyle w:val="Hyperlink"/>
+          </w:rPr>
+          <w:t>https://www.youtube.com/watch?v=iKAVRgIrUOU</w:t>
+        </w:r>
+      </w:hyperlink>
+      <w:r>
+        <w:t xml:space="preserve"> How to create a grid based fluid sim. </w:t>
+      </w:r>
+      <w:r>
+        <w:br/>
+        <w:t>Nice video, and I think this all creates enough information to (again) make a plan.</w:t>
+      </w:r>
+    </w:p>
+    <w:p>
+      <w:r>
+        <w:t>So, as said before, they initialize their environment temp by using a linear lapse rate function.</w:t>
+      </w:r>
+      <w:r>
+        <w:br/>
+        <w:t xml:space="preserve">Than for this they calculate the corresponding pressure. </w:t>
+      </w:r>
+      <w:r>
+        <w:br/>
+        <w:t>But we don’t want this, we can get the temp (if we need it) using the potential temperature, but we do need pressure.</w:t>
+      </w:r>
+      <w:r>
+        <w:br/>
+        <w:t>Something is missing, but what</w:t>
+      </w:r>
+      <w:r>
+        <w:t xml:space="preserve">, okay I will just calculate pressure using </w:t>
+      </w:r>
+      <w:hyperlink r:id="rId71" w:history="1">
+        <w:r>
+          <w:rPr>
+            <w:rStyle w:val="Hyperlink"/>
+          </w:rPr>
+          <w:t>Air Pressure at Altitude Calculator</w:t>
+        </w:r>
+      </w:hyperlink>
+      <w:r>
+        <w:t xml:space="preserve"> formulas also used in this calculator, so standard environmental pressures. </w:t>
+      </w:r>
+      <w:r>
+        <w:br/>
+        <w:t xml:space="preserve">Meaning I don’t have to save pressure or temp. </w:t>
+      </w:r>
+      <w:r>
+        <w:br/>
+        <w:t>We do however probably just set a static ground pressure, (pressure at sea level) since this does not change dramatically during the day, later we can make this dynamic if we want systems moving through. So, even though we don’t need it, I will store Pg in the ground grid.</w:t>
+      </w:r>
+    </w:p>
+    <w:p>
+      <w:r>
+        <w:rPr>
+          <w:noProof/>
+          <w:lang w:val="nl-NL"/>
+        </w:rPr>
+        <w:lastRenderedPageBreak/>
+        <w:drawing>
+          <wp:anchor distT="0" distB="0" distL="114300" distR="114300" simplePos="0" relativeHeight="251685888" behindDoc="1" locked="0" layoutInCell="1" allowOverlap="1" wp14:anchorId="5BDEAEF1" wp14:editId="792639DA">
+            <wp:simplePos x="0" y="0"/>
+            <wp:positionH relativeFrom="page">
+              <wp:align>left</wp:align>
+            </wp:positionH>
+            <wp:positionV relativeFrom="paragraph">
+              <wp:posOffset>0</wp:posOffset>
+            </wp:positionV>
+            <wp:extent cx="4819650" cy="1735455"/>
+            <wp:effectExtent l="0" t="0" r="0" b="0"/>
+            <wp:wrapTight wrapText="bothSides">
+              <wp:wrapPolygon edited="0">
+                <wp:start x="0" y="0"/>
+                <wp:lineTo x="0" y="21339"/>
+                <wp:lineTo x="21515" y="21339"/>
+                <wp:lineTo x="21515" y="0"/>
+                <wp:lineTo x="0" y="0"/>
+              </wp:wrapPolygon>
+            </wp:wrapTight>
+            <wp:docPr id="1721504208" name="Afbeelding 2" descr="Afbeelding met tekst, schermopname, Lettertype, lijn&#10;&#10;Door AI gegenereerde inhoud is mogelijk onjuist."/>
+            <wp:cNvGraphicFramePr>
+              <a:graphicFrameLocks xmlns:a="http://schemas.openxmlformats.org/drawingml/2006/main" noChangeAspect="1"/>
+            </wp:cNvGraphicFramePr>
+            <a:graphic xmlns:a="http://schemas.openxmlformats.org/drawingml/2006/main">
+              <a:graphicData uri="http://schemas.openxmlformats.org/drawingml/2006/picture">
+                <pic:pic xmlns:pic="http://schemas.openxmlformats.org/drawingml/2006/picture">
+                  <pic:nvPicPr>
+                    <pic:cNvPr id="1721504208" name="Afbeelding 2" descr="Afbeelding met tekst, schermopname, Lettertype, lijn&#10;&#10;Door AI gegenereerde inhoud is mogelijk onjuist."/>
+                    <pic:cNvPicPr>
+                      <a:picLocks noChangeAspect="1" noChangeArrowheads="1"/>
+                    </pic:cNvPicPr>
+                  </pic:nvPicPr>
+                  <pic:blipFill>
+                    <a:blip r:embed="rId72" cstate="print">
+                      <a:extLst>
+                        <a:ext uri="{28A0092B-C50C-407E-A947-70E740481C1C}">
+                          <a14:useLocalDpi xmlns:a14="http://schemas.microsoft.com/office/drawing/2010/main" val="0"/>
+                        </a:ext>
+                      </a:extLst>
+                    </a:blip>
+                    <a:srcRect/>
+                    <a:stretch>
+                      <a:fillRect/>
+                    </a:stretch>
+                  </pic:blipFill>
+                  <pic:spPr bwMode="auto">
+                    <a:xfrm>
+                      <a:off x="0" y="0"/>
+                      <a:ext cx="4819650" cy="1735455"/>
+                    </a:xfrm>
+                    <a:prstGeom prst="rect">
+                      <a:avLst/>
+                    </a:prstGeom>
+                    <a:noFill/>
+                    <a:ln>
+                      <a:noFill/>
+                    </a:ln>
+                  </pic:spPr>
+                </pic:pic>
+              </a:graphicData>
+            </a:graphic>
+          </wp:anchor>
+        </w:drawing>
+      </w:r>
+      <w:r>
+        <w:t>I made a graphic for the storage of the voxel grid.</w:t>
+      </w:r>
+    </w:p>
+    <w:p>
+      <w:r>
+        <w:tab/>
+      </w:r>
+      <w:r>
+        <w:t xml:space="preserve">This will (I believe) be the final product of storage containment. </w:t>
+      </w:r>
+      <w:r>
+        <w:br/>
+        <w:t>I guess now I need to make the plan of coding</w:t>
+      </w:r>
+    </w:p>
+    <w:p/>
+    <w:p/>
+    <w:p>
+      <w:pPr>
+        <w:pStyle w:val="Kop1"/>
+      </w:pPr>
+      <w:r>
+        <w:t>Wednesday 23-04-2025</w:t>
+      </w:r>
+    </w:p>
+    <w:p>
+      <w:r>
+        <w:t xml:space="preserve">So, we will basically copy most of the work from the paper, but we code it all on our own of course. </w:t>
+      </w:r>
+      <w:r>
+        <w:br/>
+        <w:t xml:space="preserve">This means I will have different parts of code, for example radiation from the sun, atmospheric values, heat transfer and so on. </w:t>
+      </w:r>
+      <w:r>
+        <w:br/>
+        <w:t>I need to know which part goes into the Cu files and which in the cpp.</w:t>
+      </w:r>
+      <w:r>
+        <w:t xml:space="preserve"> </w:t>
+      </w:r>
+    </w:p>
+    <w:p>
+      <w:r>
+        <w:t>I guess I will start with coding on the CPU, and then have a 64x64 grid of fluid dynamics. And later expanding to 3D.</w:t>
+      </w:r>
+    </w:p>
+    <w:p>
+      <w:r>
+        <w:t>My class of formulas is pretty big, idk if I should separate it in other classes, but they are all pretty static, so I will keep it this way.</w:t>
+      </w:r>
+    </w:p>
+    <w:p>
+      <w:r>
+        <w:t>I want to have an environment class which stores the environment (3D grid), maybe another class for the ground? But for now I will keep them together.</w:t>
+      </w:r>
+      <w:r>
+        <w:br/>
+        <w:t xml:space="preserve">Probably also a class specifically for the fluid dynamics. </w:t>
+      </w:r>
+    </w:p>
+    <w:p>
+      <w:r>
+        <w:t>Than we just need something to draw. Of course I want to not already make big shaders and stuff, but a debug drawer would be nice.</w:t>
+      </w:r>
+      <w:r>
+        <w:t xml:space="preserve"> (nvm, got one already)</w:t>
+      </w:r>
+    </w:p>
+    <w:p>
+      <w:r>
+        <w:t>Let me prepare the files and code.</w:t>
+      </w:r>
+    </w:p>
+    <w:p>
+      <w:r>
+        <w:t>Also, all the formulas and stuff probably could go into the engine.</w:t>
+      </w:r>
+    </w:p>
+    <w:p>
+      <w:r>
+        <w:t xml:space="preserve">Changing some structure, removing the use of vectors and changing them to arrays. </w:t>
+      </w:r>
+      <w:r>
+        <w:br/>
+        <w:t xml:space="preserve">So we first had an Array of our Struct, but I change it to a Struct with Arrays, and I make them unique pointers. </w:t>
+      </w:r>
+      <w:r>
+        <w:br/>
+        <w:t>This helps passing values to functions, but also in speed.</w:t>
+      </w:r>
+    </w:p>
+    <w:p>
+      <w:r>
+        <w:t>Okay for adding the data from the file, it works a bit different since we are using an array. I still want to proceed with the array, so we have to manually resize the array if it is too small and trim it when its done.</w:t>
+      </w:r>
+      <w:r>
+        <w:t xml:space="preserve"> Nvm, I just made them vectors and copied that data into the arrays.</w:t>
+      </w:r>
+    </w:p>
+    <w:p>
+      <w:r>
+        <w:t>Its now all fixed, yet, not prepared.</w:t>
+      </w:r>
+    </w:p>
+    <w:p>
+      <w:r>
+        <w:t>Okay I added the environment class, I want to start with adding the fluid simulator in 2D.</w:t>
+      </w:r>
+      <w:r>
+        <w:br/>
+        <w:t>Yet I already need variables like buoyancy and pressure, so, to do this, I have to add many other formulas. Which will be fun for the next time.</w:t>
+      </w:r>
+    </w:p>
+    <w:p/>
+    <w:p>
+      <w:pPr>
+        <w:pStyle w:val="Kop1"/>
+      </w:pPr>
+      <w:r>
+        <w:lastRenderedPageBreak/>
+        <w:t>Thursday 24-04-2025</w:t>
+      </w:r>
+    </w:p>
+    <w:p>
+      <w:r>
+        <w:t>Alright, adding much code now, but getting confused every second. ChatGPT helps explaining difficult parts though.</w:t>
+      </w:r>
+    </w:p>
+    <w:p>
+      <w:r>
+        <w:t>Okay that’s it, I am changing half library, this one is not useable.</w:t>
+      </w:r>
+    </w:p>
+    <w:p>
+      <w:r>
+        <w:t xml:space="preserve">Its going really well, currently adding the code for the microphysics. It’s a lot of writing, but its satisfying. </w:t>
+      </w:r>
+    </w:p>
+    <w:p/>
+    <w:p>
+      <w:pPr>
+        <w:pStyle w:val="Kop1"/>
+      </w:pPr>
+      <w:r>
+        <w:t>Friday 25-04-2025</w:t>
+      </w:r>
+    </w:p>
+    <w:p>
+      <w:r>
+        <w:t>The paper does not mention anything about using the falling velocities, so what I will do is     back-tracing. This hopefully applies the falling velocity correctly.</w:t>
+      </w:r>
+    </w:p>
+    <w:p>
+      <w:r>
+        <w:t>Okay, so I guess I can update the falling velocity in the advect part of updating the water content, and not in the microphysics.</w:t>
+      </w:r>
+    </w:p>
+    <w:p>
+      <w:r>
+        <w:t>I may don’t have to back-trace, I can just calculate the falling velocity and apply it the same way as wind velocity.</w:t>
+      </w:r>
+    </w:p>
+    <w:p>
+      <w:r>
+        <w:t xml:space="preserve">Missing some of the values from the microphysics, but I believe they are easy. </w:t>
+      </w:r>
+    </w:p>
+    <w:p>
+      <w:r>
+        <w:t>Added them.</w:t>
+      </w:r>
+    </w:p>
+    <w:p>
+      <w:pPr>
+        <w:pStyle w:val="Kop1"/>
+      </w:pPr>
+      <w:r>
+        <w:t>Saturday 26-4-2025</w:t>
+      </w:r>
+    </w:p>
+    <w:p>
+      <w:r>
+        <w:t>Now I need to compute the heat transfer, and I may be searching if there is anything left to do for our first test (there is a lot to do)</w:t>
+      </w:r>
+    </w:p>
+    <w:p>
+      <w:r>
+        <w:t xml:space="preserve">First thing is boundary issues, I did not yet implement that. </w:t>
+      </w:r>
+    </w:p>
+    <w:p>
+      <w:r>
+        <w:t>Okay the simulation quickly converts everything to nan, but the performance is better than I thought. I guess I or first will start creating a nice debug view or initialize correctly.</w:t>
+      </w:r>
+    </w:p>
+    <w:p/>
+    <w:p>
+      <w:pPr>
+        <w:pStyle w:val="Kop1"/>
+      </w:pPr>
+      <w:r>
+        <w:t>Sunday 30-4-2025</w:t>
+      </w:r>
+    </w:p>
+    <w:p>
+      <w:r>
+        <w:drawing>
+          <wp:anchor distT="0" distB="0" distL="114300" distR="114300" simplePos="0" relativeHeight="251686912" behindDoc="1" locked="0" layoutInCell="1" allowOverlap="1" wp14:anchorId="3904F5B1" wp14:editId="2AED1519">
+            <wp:simplePos x="0" y="0"/>
+            <wp:positionH relativeFrom="margin">
+              <wp:posOffset>-184150</wp:posOffset>
+            </wp:positionH>
+            <wp:positionV relativeFrom="paragraph">
+              <wp:posOffset>437515</wp:posOffset>
+            </wp:positionV>
+            <wp:extent cx="1593215" cy="1432560"/>
+            <wp:effectExtent l="0" t="0" r="6985" b="0"/>
+            <wp:wrapTight wrapText="bothSides">
+              <wp:wrapPolygon edited="0">
+                <wp:start x="0" y="0"/>
+                <wp:lineTo x="0" y="21255"/>
+                <wp:lineTo x="21436" y="21255"/>
+                <wp:lineTo x="21436" y="0"/>
+                <wp:lineTo x="0" y="0"/>
+              </wp:wrapPolygon>
+            </wp:wrapTight>
+            <wp:docPr id="980551291" name="Afbeelding 1"/>
+            <wp:cNvGraphicFramePr>
+              <a:graphicFrameLocks xmlns:a="http://schemas.openxmlformats.org/drawingml/2006/main" noChangeAspect="1"/>
+            </wp:cNvGraphicFramePr>
+            <a:graphic xmlns:a="http://schemas.openxmlformats.org/drawingml/2006/main">
+              <a:graphicData uri="http://schemas.openxmlformats.org/drawingml/2006/picture">
+                <pic:pic xmlns:pic="http://schemas.openxmlformats.org/drawingml/2006/picture">
+                  <pic:nvPicPr>
+                    <pic:cNvPr id="980551291" name=""/>
+                    <pic:cNvPicPr/>
+                  </pic:nvPicPr>
+                  <pic:blipFill>
+                    <a:blip r:embed="rId73" cstate="print">
+                      <a:extLst>
+                        <a:ext uri="{28A0092B-C50C-407E-A947-70E740481C1C}">
+                          <a14:useLocalDpi xmlns:a14="http://schemas.microsoft.com/office/drawing/2010/main" val="0"/>
+                        </a:ext>
+                      </a:extLst>
+                    </a:blip>
+                    <a:stretch>
+                      <a:fillRect/>
+                    </a:stretch>
+                  </pic:blipFill>
+                  <pic:spPr>
+                    <a:xfrm>
+                      <a:off x="0" y="0"/>
+                      <a:ext cx="1593215" cy="1432560"/>
+                    </a:xfrm>
+                    <a:prstGeom prst="rect">
+                      <a:avLst/>
+                    </a:prstGeom>
+                  </pic:spPr>
+                </pic:pic>
+              </a:graphicData>
+            </a:graphic>
+            <wp14:sizeRelH relativeFrom="margin">
+              <wp14:pctWidth>0</wp14:pctWidth>
+            </wp14:sizeRelH>
+            <wp14:sizeRelV relativeFrom="margin">
+              <wp14:pctHeight>0</wp14:pctHeight>
+            </wp14:sizeRelV>
+          </wp:anchor>
+        </w:drawing>
+      </w:r>
+      <w:r>
+        <w:t>I want to add a filled square to the debug renderer.</w:t>
+      </w:r>
+      <w:r>
+        <w:br/>
+        <w:t>I think I can just reuse the vao and vbo of the line drawer. Hmm, not really</w:t>
+      </w:r>
+      <w:r>
+        <w:br/>
+        <w:t>Would you look at that, its beautifull!</w:t>
+      </w:r>
+      <w:r>
+        <w:br/>
+        <w:t>Had a little problem, but after a small renderdoc session I found out that I need to call attribute pointer for every vao/vbo.</w:t>
+      </w:r>
+    </w:p>
+    <w:p>
+      <w:r>
+        <w:t>Now I want to make an function to create color schemes, so you pass in some colors and it will vary between them based on numbers put in.</w:t>
+      </w:r>
+      <w:r>
+        <w:br/>
+      </w:r>
+    </w:p>
+    <w:p/>
+    <w:p>
+      <w:r>
+        <w:lastRenderedPageBreak/>
+        <w:drawing>
+          <wp:anchor distT="0" distB="0" distL="114300" distR="114300" simplePos="0" relativeHeight="251687936" behindDoc="1" locked="0" layoutInCell="1" allowOverlap="1" wp14:anchorId="46D6F2FA" wp14:editId="4C0BE25A">
+            <wp:simplePos x="0" y="0"/>
+            <wp:positionH relativeFrom="page">
+              <wp:align>left</wp:align>
+            </wp:positionH>
+            <wp:positionV relativeFrom="paragraph">
+              <wp:posOffset>0</wp:posOffset>
+            </wp:positionV>
+            <wp:extent cx="3035300" cy="1665605"/>
+            <wp:effectExtent l="0" t="0" r="0" b="0"/>
+            <wp:wrapTight wrapText="bothSides">
+              <wp:wrapPolygon edited="0">
+                <wp:start x="0" y="0"/>
+                <wp:lineTo x="0" y="21246"/>
+                <wp:lineTo x="21419" y="21246"/>
+                <wp:lineTo x="21419" y="0"/>
+                <wp:lineTo x="0" y="0"/>
+              </wp:wrapPolygon>
+            </wp:wrapTight>
+            <wp:docPr id="1339207387" name="Afbeelding 1"/>
+            <wp:cNvGraphicFramePr>
+              <a:graphicFrameLocks xmlns:a="http://schemas.openxmlformats.org/drawingml/2006/main" noChangeAspect="1"/>
+            </wp:cNvGraphicFramePr>
+            <a:graphic xmlns:a="http://schemas.openxmlformats.org/drawingml/2006/main">
+              <a:graphicData uri="http://schemas.openxmlformats.org/drawingml/2006/picture">
+                <pic:pic xmlns:pic="http://schemas.openxmlformats.org/drawingml/2006/picture">
+                  <pic:nvPicPr>
+                    <pic:cNvPr id="1339207387" name=""/>
+                    <pic:cNvPicPr/>
+                  </pic:nvPicPr>
+                  <pic:blipFill>
+                    <a:blip r:embed="rId74" cstate="print">
+                      <a:extLst>
+                        <a:ext uri="{28A0092B-C50C-407E-A947-70E740481C1C}">
+                          <a14:useLocalDpi xmlns:a14="http://schemas.microsoft.com/office/drawing/2010/main" val="0"/>
+                        </a:ext>
+                      </a:extLst>
+                    </a:blip>
+                    <a:stretch>
+                      <a:fillRect/>
+                    </a:stretch>
+                  </pic:blipFill>
+                  <pic:spPr>
+                    <a:xfrm>
+                      <a:off x="0" y="0"/>
+                      <a:ext cx="3035300" cy="1665605"/>
+                    </a:xfrm>
+                    <a:prstGeom prst="rect">
+                      <a:avLst/>
+                    </a:prstGeom>
+                  </pic:spPr>
+                </pic:pic>
+              </a:graphicData>
+            </a:graphic>
+            <wp14:sizeRelH relativeFrom="margin">
+              <wp14:pctWidth>0</wp14:pctWidth>
+            </wp14:sizeRelH>
+            <wp14:sizeRelV relativeFrom="margin">
+              <wp14:pctHeight>0</wp14:pctHeight>
+            </wp14:sizeRelV>
+          </wp:anchor>
+        </w:drawing>
+      </w:r>
+      <w:r>
+        <w:t>Like this.</w:t>
+      </w:r>
+      <w:r>
+        <w:br/>
+        <w:t>API needs to be very easy to use though.</w:t>
+      </w:r>
+      <w:r>
+        <w:br/>
+        <w:t>Probably going to store color schemes in a map.</w:t>
+      </w:r>
+      <w:r>
+        <w:br/>
+        <w:t>It stores a color with a number. So:</w:t>
+      </w:r>
+      <w:r>
+        <w:br/>
+      </w:r>
+      <w:r>
+        <w:t>std::unordered_map&lt;const char*, std::pair&lt;int, glm::vec3&gt;&gt; colorSchemes;</w:t>
+      </w:r>
+      <w:r>
+        <w:br/>
+        <w:t xml:space="preserve">And you can easily retrieve any scheme. </w:t>
+      </w:r>
+      <w:r>
+        <w:br/>
+        <w:t>For now I won’t store anything, so to retrieve a color it will always calculate.</w:t>
+      </w:r>
+      <w:r>
+        <w:br/>
+        <w:t>Should I create a new file for this? Do I want to add other things related to this in that file?</w:t>
+      </w:r>
+    </w:p>
+    <w:p>
+      <w:r>
+        <w:t>Yeah, just going to create a color file.</w:t>
+      </w:r>
+      <w:r>
+        <w:br/>
+        <w:t>Oh wait, it should not be a pair, but also an unordered map? Or vector?</w:t>
+      </w:r>
+      <w:r>
+        <w:br/>
+        <w:t>Also I should probably use string instead of const char*</w:t>
+      </w:r>
+    </w:p>
+    <w:p>
+      <w:r>
+        <w:t>I asked ChatGPT for the performance and how to efficiently order and find numbers.</w:t>
+      </w:r>
+      <w:r>
+        <w:br/>
+        <w:t xml:space="preserve">On load (first time I try to grab a number after inserting the last number) I will use std::sort to sort numbers from low to high, and use std::lower_bound to retrieve the iterator that’s just above. </w:t>
+      </w:r>
+    </w:p>
     <w:sectPr>
       <w:pgSz w:w="11906" w:h="16838"/>
       <w:pgMar w:top="1417" w:right="1417" w:bottom="1417" w:left="1417" w:header="708" w:footer="708" w:gutter="0"/>
@@ -4591,6 +6074,118 @@
 <file path=word/numbering.xml><?xml version="1.0" encoding="utf-8"?>
 <w:numbering xmlns:wpc="http://schemas.microsoft.com/office/word/2010/wordprocessingCanvas" xmlns:cx="http://schemas.microsoft.com/office/drawing/2014/chartex" xmlns:cx1="http://schemas.microsoft.com/office/drawing/2015/9/8/chartex" xmlns:cx2="http://schemas.microsoft.com/office/drawing/2015/10/21/chartex" xmlns:cx3="http://schemas.microsoft.com/office/drawing/2016/5/9/chartex" xmlns:cx4="http://schemas.microsoft.com/office/drawing/2016/5/10/chartex" xmlns:cx5="http://schemas.microsoft.com/office/drawing/2016/5/11/chartex" xmlns:cx6="http://schemas.microsoft.com/office/drawing/2016/5/12/chartex" xmlns:cx7="http://schemas.microsoft.com/office/drawing/2016/5/13/chartex" xmlns:cx8="http://schemas.microsoft.com/office/drawing/2016/5/14/chartex" xmlns:mc="http://schemas.openxmlformats.org/markup-compatibility/2006" xmlns:aink="http://schemas.microsoft.com/office/drawing/2016/ink" xmlns:am3d="http://schemas.microsoft.com/office/drawing/2017/model3d" xmlns:o="urn:schemas-microsoft-com:office:office" xmlns:oel="http://schemas.microsoft.com/office/2019/extlst" xmlns:r="http://schemas.openxmlformats.org/officeDocument/2006/relationships" xmlns:m="http://schemas.openxmlformats.org/officeDocument/2006/math" xmlns:v="urn:schemas-microsoft-com:vml" xmlns:wp14="http://schemas.microsoft.com/office/word/2010/wordprocessingDrawing" xmlns:wp="http://schemas.openxmlformats.org/drawingml/2006/wordprocessingDrawing" xmlns:w10="urn:schemas-microsoft-com:office:word" xmlns:w="http://schemas.openxmlformats.org/wordprocessingml/2006/main" xmlns:w14="http://schemas.microsoft.com/office/word/2010/wordml" xmlns:w15="http://schemas.microsoft.com/office/word/2012/wordml" xmlns:w16cex="http://schemas.microsoft.com/office/word/2018/wordml/cex" xmlns:w16cid="http://schemas.microsoft.com/office/word/2016/wordml/cid" xmlns:w16="http://schemas.microsoft.com/office/word/2018/wordml" xmlns:w16du="http://schemas.microsoft.com/office/word/2023/wordml/word16du" xmlns:w16sdtdh="http://schemas.microsoft.com/office/word/2020/wordml/sdtdatahash" xmlns:w16sdtfl="http://schemas.microsoft.com/office/word/2024/wordml/sdtformatlock" xmlns:w16se="http://schemas.microsoft.com/office/word/2015/wordml/symex" xmlns:wpg="http://schemas.microsoft.com/office/word/2010/wordprocessingGroup" xmlns:wpi="http://schemas.microsoft.com/office/word/2010/wordprocessingInk" xmlns:wne="http://schemas.microsoft.com/office/word/2006/wordml" xmlns:wps="http://schemas.microsoft.com/office/word/2010/wordprocessingShape" mc:Ignorable="w14 w15 w16se w16cid w16 w16cex w16sdtdh w16sdtfl w16du wp14">
   <w:abstractNum w:abstractNumId="0" w15:restartNumberingAfterBreak="0">
+    <w:nsid w:val="26332009"/>
+    <w:multiLevelType w:val="hybridMultilevel"/>
+    <w:tmpl w:val="76FC1788"/>
+    <w:lvl w:ilvl="0" w:tplc="8766CFB8">
+      <w:numFmt w:val="bullet"/>
+      <w:lvlText w:val="-"/>
+      <w:lvlJc w:val="left"/>
+      <w:pPr>
+        <w:ind w:left="720" w:hanging="360"/>
+      </w:pPr>
+      <w:rPr>
+        <w:rFonts w:ascii="Aptos" w:eastAsiaTheme="minorHAnsi" w:hAnsi="Aptos" w:cstheme="minorBidi" w:hint="default"/>
+      </w:rPr>
+    </w:lvl>
+    <w:lvl w:ilvl="1" w:tplc="04130003" w:tentative="1">
+      <w:start w:val="1"/>
+      <w:numFmt w:val="bullet"/>
+      <w:lvlText w:val="o"/>
+      <w:lvlJc w:val="left"/>
+      <w:pPr>
+        <w:ind w:left="1440" w:hanging="360"/>
+      </w:pPr>
+      <w:rPr>
+        <w:rFonts w:ascii="Courier New" w:hAnsi="Courier New" w:cs="Courier New" w:hint="default"/>
+      </w:rPr>
+    </w:lvl>
+    <w:lvl w:ilvl="2" w:tplc="04130005" w:tentative="1">
+      <w:start w:val="1"/>
+      <w:numFmt w:val="bullet"/>
+      <w:lvlText w:val=""/>
+      <w:lvlJc w:val="left"/>
+      <w:pPr>
+        <w:ind w:left="2160" w:hanging="360"/>
+      </w:pPr>
+      <w:rPr>
+        <w:rFonts w:ascii="Wingdings" w:hAnsi="Wingdings" w:hint="default"/>
+      </w:rPr>
+    </w:lvl>
+    <w:lvl w:ilvl="3" w:tplc="04130001" w:tentative="1">
+      <w:start w:val="1"/>
+      <w:numFmt w:val="bullet"/>
+      <w:lvlText w:val=""/>
+      <w:lvlJc w:val="left"/>
+      <w:pPr>
+        <w:ind w:left="2880" w:hanging="360"/>
+      </w:pPr>
+      <w:rPr>
+        <w:rFonts w:ascii="Symbol" w:hAnsi="Symbol" w:hint="default"/>
+      </w:rPr>
+    </w:lvl>
+    <w:lvl w:ilvl="4" w:tplc="04130003" w:tentative="1">
+      <w:start w:val="1"/>
+      <w:numFmt w:val="bullet"/>
+      <w:lvlText w:val="o"/>
+      <w:lvlJc w:val="left"/>
+      <w:pPr>
+        <w:ind w:left="3600" w:hanging="360"/>
+      </w:pPr>
+      <w:rPr>
+        <w:rFonts w:ascii="Courier New" w:hAnsi="Courier New" w:cs="Courier New" w:hint="default"/>
+      </w:rPr>
+    </w:lvl>
+    <w:lvl w:ilvl="5" w:tplc="04130005" w:tentative="1">
+      <w:start w:val="1"/>
+      <w:numFmt w:val="bullet"/>
+      <w:lvlText w:val=""/>
+      <w:lvlJc w:val="left"/>
+      <w:pPr>
+        <w:ind w:left="4320" w:hanging="360"/>
+      </w:pPr>
+      <w:rPr>
+        <w:rFonts w:ascii="Wingdings" w:hAnsi="Wingdings" w:hint="default"/>
+      </w:rPr>
+    </w:lvl>
+    <w:lvl w:ilvl="6" w:tplc="04130001" w:tentative="1">
+      <w:start w:val="1"/>
+      <w:numFmt w:val="bullet"/>
+      <w:lvlText w:val=""/>
+      <w:lvlJc w:val="left"/>
+      <w:pPr>
+        <w:ind w:left="5040" w:hanging="360"/>
+      </w:pPr>
+      <w:rPr>
+        <w:rFonts w:ascii="Symbol" w:hAnsi="Symbol" w:hint="default"/>
+      </w:rPr>
+    </w:lvl>
+    <w:lvl w:ilvl="7" w:tplc="04130003" w:tentative="1">
+      <w:start w:val="1"/>
+      <w:numFmt w:val="bullet"/>
+      <w:lvlText w:val="o"/>
+      <w:lvlJc w:val="left"/>
+      <w:pPr>
+        <w:ind w:left="5760" w:hanging="360"/>
+      </w:pPr>
+      <w:rPr>
+        <w:rFonts w:ascii="Courier New" w:hAnsi="Courier New" w:cs="Courier New" w:hint="default"/>
+      </w:rPr>
+    </w:lvl>
+    <w:lvl w:ilvl="8" w:tplc="04130005" w:tentative="1">
+      <w:start w:val="1"/>
+      <w:numFmt w:val="bullet"/>
+      <w:lvlText w:val=""/>
+      <w:lvlJc w:val="left"/>
+      <w:pPr>
+        <w:ind w:left="6480" w:hanging="360"/>
+      </w:pPr>
+      <w:rPr>
+        <w:rFonts w:ascii="Wingdings" w:hAnsi="Wingdings" w:hint="default"/>
+      </w:rPr>
+    </w:lvl>
+  </w:abstractNum>
+  <w:abstractNum w:abstractNumId="1" w15:restartNumberingAfterBreak="0">
     <w:nsid w:val="73BD5A79"/>
     <w:multiLevelType w:val="multilevel"/>
     <w:tmpl w:val="175EE0E6"/>
@@ -4740,6 +6335,9 @@
     </w:lvl>
   </w:abstractNum>
   <w:num w:numId="1" w16cid:durableId="941038383">
+    <w:abstractNumId w:val="1"/>
+  </w:num>
+  <w:num w:numId="2" w16cid:durableId="835001774">
     <w:abstractNumId w:val="0"/>
   </w:num>
 </w:numbering>
@@ -5350,7 +6948,6 @@
   <w:style w:type="character" w:default="1" w:styleId="Standaardalinea-lettertype">
     <w:name w:val="Default Paragraph Font"/>
     <w:uiPriority w:val="1"/>
-    <w:semiHidden/>
     <w:unhideWhenUsed/>
   </w:style>
   <w:style w:type="table" w:default="1" w:styleId="Standaardtabel">
@@ -5711,6 +7308,38 @@
       <w:u w:val="single"/>
     </w:rPr>
   </w:style>
+  <w:style w:type="table" w:styleId="Tabelraster">
+    <w:name w:val="Table Grid"/>
+    <w:basedOn w:val="Standaardtabel"/>
+    <w:uiPriority w:val="39"/>
+    <w:rsid w:val="003E2681"/>
+    <w:pPr>
+      <w:spacing w:after="0" w:line="240" w:lineRule="auto"/>
+    </w:pPr>
+    <w:tblPr>
+      <w:tblBorders>
+        <w:top w:val="single" w:sz="4" w:space="0" w:color="auto"/>
+        <w:left w:val="single" w:sz="4" w:space="0" w:color="auto"/>
+        <w:bottom w:val="single" w:sz="4" w:space="0" w:color="auto"/>
+        <w:right w:val="single" w:sz="4" w:space="0" w:color="auto"/>
+        <w:insideH w:val="single" w:sz="4" w:space="0" w:color="auto"/>
+        <w:insideV w:val="single" w:sz="4" w:space="0" w:color="auto"/>
+      </w:tblBorders>
+    </w:tblPr>
+  </w:style>
+  <w:style w:type="paragraph" w:styleId="Normaalweb">
+    <w:name w:val="Normal (Web)"/>
+    <w:basedOn w:val="Standaard"/>
+    <w:uiPriority w:val="99"/>
+    <w:semiHidden/>
+    <w:unhideWhenUsed/>
+    <w:rsid w:val="00831442"/>
+    <w:rPr>
+      <w:rFonts w:ascii="Times New Roman" w:hAnsi="Times New Roman" w:cs="Times New Roman"/>
+      <w:sz w:val="24"/>
+      <w:szCs w:val="24"/>
+    </w:rPr>
+  </w:style>
 </w:styles>
 </file>
 

</xml_diff>

<commit_message>
Working, added a lot.
Added more functions to environment.cpp, and fixed many bugs/wrong code.
Added initializer for the environment
2D simulation now works, but very unstable. (no pressure project)
</commit_message>
<xml_diff>
--- a/SkewTSimDocumentation.docx
+++ b/SkewTSimDocumentation.docx
@@ -28,7 +28,15 @@
       </w:r>
       <w:r>
         <w:br/>
-        <w:t>This means much research has to ben done first.</w:t>
+        <w:t xml:space="preserve">This means much research has to </w:t>
+      </w:r>
+      <w:proofErr w:type="spellStart"/>
+      <w:r>
+        <w:t>ben</w:t>
+      </w:r>
+      <w:proofErr w:type="spellEnd"/>
+      <w:r>
+        <w:t xml:space="preserve"> done first.</w:t>
       </w:r>
     </w:p>
     <w:p>
@@ -159,6 +167,7 @@
       </w:r>
     </w:p>
     <w:p>
+      <w:proofErr w:type="spellStart"/>
       <w:r>
         <w:t>R</w:t>
       </w:r>
@@ -167,7 +176,15 @@
           <w:sz w:val="12"/>
           <w:szCs w:val="12"/>
         </w:rPr>
-        <w:t xml:space="preserve">specific </w:t>
+        <w:t>specific</w:t>
+      </w:r>
+      <w:proofErr w:type="spellEnd"/>
+      <w:r>
+        <w:rPr>
+          <w:sz w:val="12"/>
+          <w:szCs w:val="12"/>
+        </w:rPr>
+        <w:t xml:space="preserve"> </w:t>
       </w:r>
       <w:r>
         <w:rPr>
@@ -426,7 +443,23 @@
     </w:p>
     <w:p>
       <w:r>
-        <w:t xml:space="preserve">Our given values are: height (m), pressure (hPa), temperature (C), wet bulb (C), Dew point (C), Humity (%), wind speed (km/h) and wind direction (degrees). </w:t>
+        <w:t>Our given values are: height (m), pressure (</w:t>
+      </w:r>
+      <w:proofErr w:type="spellStart"/>
+      <w:r>
+        <w:t>hPa</w:t>
+      </w:r>
+      <w:proofErr w:type="spellEnd"/>
+      <w:r>
+        <w:t xml:space="preserve">), temperature (C), wet bulb (C), Dew point (C), </w:t>
+      </w:r>
+      <w:proofErr w:type="spellStart"/>
+      <w:r>
+        <w:t>Humity</w:t>
+      </w:r>
+      <w:proofErr w:type="spellEnd"/>
+      <w:r>
+        <w:t xml:space="preserve"> (%), wind speed (km/h) and wind direction (degrees). </w:t>
       </w:r>
     </w:p>
     <w:p/>
@@ -458,7 +491,15 @@
       </w:r>
       <w:r>
         <w:br/>
-        <w:t>10.000 rows of time, pressure, temp, humidity and ascentRate:</w:t>
+        <w:t xml:space="preserve">10.000 rows of time, pressure, temp, humidity and </w:t>
+      </w:r>
+      <w:proofErr w:type="spellStart"/>
+      <w:r>
+        <w:t>ascentRate</w:t>
+      </w:r>
+      <w:proofErr w:type="spellEnd"/>
+      <w:r>
+        <w:t>:</w:t>
       </w:r>
       <w:r>
         <w:br/>
@@ -524,7 +565,23 @@
       </w:r>
       <w:r>
         <w:br/>
-        <w:t>I just got the german raw radiosconde, and it does not look good, it is way different than the one of KNMI.</w:t>
+        <w:t xml:space="preserve">I just got the </w:t>
+      </w:r>
+      <w:proofErr w:type="spellStart"/>
+      <w:r>
+        <w:t>german</w:t>
+      </w:r>
+      <w:proofErr w:type="spellEnd"/>
+      <w:r>
+        <w:t xml:space="preserve"> raw </w:t>
+      </w:r>
+      <w:proofErr w:type="spellStart"/>
+      <w:r>
+        <w:t>radiosconde</w:t>
+      </w:r>
+      <w:proofErr w:type="spellEnd"/>
+      <w:r>
+        <w:t>, and it does not look good, it is way different than the one of KNMI.</w:t>
       </w:r>
     </w:p>
     <w:p>
@@ -543,11 +600,35 @@
         <w:br/>
       </w:r>
       <w:r>
-        <w:t xml:space="preserve">I found out the KNMI offers a file called synchronizedSoundingData, this has the things I need. </w:t>
-      </w:r>
-      <w:r>
-        <w:br/>
-        <w:t xml:space="preserve">Sounding-ID, Time since idk, exact date and time, pressure in hPa, temp, humid, windDir, windspeed, height, </w:t>
+        <w:t xml:space="preserve">I found out the KNMI offers a file called </w:t>
+      </w:r>
+      <w:proofErr w:type="spellStart"/>
+      <w:r>
+        <w:t>synchronizedSoundingData</w:t>
+      </w:r>
+      <w:proofErr w:type="spellEnd"/>
+      <w:r>
+        <w:t xml:space="preserve">, this has the things I need. </w:t>
+      </w:r>
+      <w:r>
+        <w:br/>
+        <w:t xml:space="preserve">Sounding-ID, Time since idk, exact date and time, pressure in </w:t>
+      </w:r>
+      <w:proofErr w:type="spellStart"/>
+      <w:r>
+        <w:t>hPa</w:t>
+      </w:r>
+      <w:proofErr w:type="spellEnd"/>
+      <w:r>
+        <w:t xml:space="preserve">, temp, humid, </w:t>
+      </w:r>
+      <w:proofErr w:type="spellStart"/>
+      <w:r>
+        <w:t>windDir</w:t>
+      </w:r>
+      <w:proofErr w:type="spellEnd"/>
+      <w:r>
+        <w:t xml:space="preserve">, windspeed, height, </w:t>
       </w:r>
       <w:r>
         <w:t>Lat- and Longitude, altitude. These are the main things I need.</w:t>
@@ -559,7 +640,15 @@
     </w:p>
     <w:p>
       <w:r>
-        <w:t xml:space="preserve">In the german files, I can use the </w:t>
+        <w:t xml:space="preserve">In the </w:t>
+      </w:r>
+      <w:proofErr w:type="spellStart"/>
+      <w:r>
+        <w:t>german</w:t>
+      </w:r>
+      <w:proofErr w:type="spellEnd"/>
+      <w:r>
+        <w:t xml:space="preserve"> files, I can use the </w:t>
       </w:r>
       <w:r>
         <w:t>Metadaten_Sekunde_Aero_03015.txt</w:t>
@@ -586,7 +675,7 @@
         </w:rPr>
         <w:lastRenderedPageBreak/>
         <w:drawing>
-          <wp:anchor distT="0" distB="0" distL="114300" distR="114300" simplePos="0" relativeHeight="251662336" behindDoc="1" locked="0" layoutInCell="1" allowOverlap="1" wp14:anchorId="1B50E1EB" wp14:editId="1D085E25">
+          <wp:anchor distT="0" distB="0" distL="114300" distR="114300" simplePos="0" relativeHeight="251662336" behindDoc="1" locked="0" layoutInCell="1" allowOverlap="1" wp14:anchorId="1B50E1EB" wp14:editId="74626FCB">
             <wp:simplePos x="0" y="0"/>
             <wp:positionH relativeFrom="column">
               <wp:posOffset>-361481</wp:posOffset>
@@ -665,7 +754,7 @@
           <w:noProof/>
         </w:rPr>
         <w:drawing>
-          <wp:anchor distT="0" distB="0" distL="114300" distR="114300" simplePos="0" relativeHeight="251663360" behindDoc="1" locked="0" layoutInCell="1" allowOverlap="1" wp14:anchorId="6BDF185A" wp14:editId="23B2CA51">
+          <wp:anchor distT="0" distB="0" distL="114300" distR="114300" simplePos="0" relativeHeight="251663360" behindDoc="1" locked="0" layoutInCell="1" allowOverlap="1" wp14:anchorId="6BDF185A" wp14:editId="3532AEA3">
             <wp:simplePos x="0" y="0"/>
             <wp:positionH relativeFrom="column">
               <wp:posOffset>1385918</wp:posOffset>
@@ -727,7 +816,15 @@
       </w:r>
       <w:r>
         <w:br/>
-        <w:t>And instead of using windspeed + windDir I could use north and east, but I won’t.</w:t>
+        <w:t xml:space="preserve">And instead of using windspeed + </w:t>
+      </w:r>
+      <w:proofErr w:type="spellStart"/>
+      <w:r>
+        <w:t>windDir</w:t>
+      </w:r>
+      <w:proofErr w:type="spellEnd"/>
+      <w:r>
+        <w:t xml:space="preserve"> I could use north and east, but I won’t.</w:t>
       </w:r>
     </w:p>
     <w:p>
@@ -736,13 +833,26 @@
       </w:r>
     </w:p>
     <w:p>
-      <w:r>
-        <w:t>Lets make DWD work.</w:t>
-      </w:r>
-    </w:p>
-    <w:p>
-      <w:r>
-        <w:t>Alrighty, got it also working, it was way more complicated. Its is not that much slower luckily. But I do need a way to choose the date of these.</w:t>
+      <w:proofErr w:type="spellStart"/>
+      <w:r>
+        <w:t>Lets</w:t>
+      </w:r>
+      <w:proofErr w:type="spellEnd"/>
+      <w:r>
+        <w:t xml:space="preserve"> make DWD work.</w:t>
+      </w:r>
+    </w:p>
+    <w:p>
+      <w:r>
+        <w:t xml:space="preserve">Alrighty, got it also working, it was way more complicated. </w:t>
+      </w:r>
+      <w:proofErr w:type="spellStart"/>
+      <w:r>
+        <w:t>Its</w:t>
+      </w:r>
+      <w:proofErr w:type="spellEnd"/>
+      <w:r>
+        <w:t xml:space="preserve"> is not that much slower luckily. But I do need a way to choose the date of these.</w:t>
       </w:r>
     </w:p>
     <w:p>
@@ -756,7 +866,7 @@
           <w:noProof/>
         </w:rPr>
         <w:drawing>
-          <wp:anchor distT="0" distB="0" distL="114300" distR="114300" simplePos="0" relativeHeight="251664384" behindDoc="1" locked="0" layoutInCell="1" allowOverlap="1" wp14:anchorId="1061808A" wp14:editId="5A08EE82">
+          <wp:anchor distT="0" distB="0" distL="114300" distR="114300" simplePos="0" relativeHeight="251664384" behindDoc="1" locked="0" layoutInCell="1" allowOverlap="1" wp14:anchorId="1061808A" wp14:editId="0310C3C2">
             <wp:simplePos x="0" y="0"/>
             <wp:positionH relativeFrom="page">
               <wp:align>left</wp:align>
@@ -819,8 +929,13 @@
           </wp:anchor>
         </w:drawing>
       </w:r>
-      <w:r>
-        <w:t>Lets make it actually skewed.</w:t>
+      <w:proofErr w:type="spellStart"/>
+      <w:r>
+        <w:t>Lets</w:t>
+      </w:r>
+      <w:proofErr w:type="spellEnd"/>
+      <w:r>
+        <w:t xml:space="preserve"> make it actually skewed.</w:t>
       </w:r>
     </w:p>
     <w:p>
@@ -840,11 +955,16 @@
         <w:br/>
         <w:t xml:space="preserve">I also need the dry and moist </w:t>
       </w:r>
+      <w:proofErr w:type="spellStart"/>
       <w:r>
         <w:t>adiabatic</w:t>
       </w:r>
       <w:r>
-        <w:t xml:space="preserve">s. </w:t>
+        <w:t>s</w:t>
+      </w:r>
+      <w:proofErr w:type="spellEnd"/>
+      <w:r>
+        <w:t xml:space="preserve">. </w:t>
       </w:r>
     </w:p>
     <w:p/>
@@ -872,7 +992,7 @@
           <w:noProof/>
         </w:rPr>
         <w:drawing>
-          <wp:anchor distT="0" distB="0" distL="114300" distR="114300" simplePos="0" relativeHeight="251666432" behindDoc="1" locked="0" layoutInCell="1" allowOverlap="1" wp14:anchorId="30EAEABE" wp14:editId="7670A222">
+          <wp:anchor distT="0" distB="0" distL="114300" distR="114300" simplePos="0" relativeHeight="251666432" behindDoc="1" locked="0" layoutInCell="1" allowOverlap="1" wp14:anchorId="30EAEABE" wp14:editId="44DD9102">
             <wp:simplePos x="0" y="0"/>
             <wp:positionH relativeFrom="column">
               <wp:posOffset>1936185</wp:posOffset>
@@ -1032,13 +1152,34 @@
         <w:t xml:space="preserve">Tw = g * ((1 + </w:t>
       </w:r>
       <w:r>
-        <w:t>(Hv * r) / (Rsd * T)</w:t>
+        <w:t>(Hv * r) / (</w:t>
+      </w:r>
+      <w:proofErr w:type="spellStart"/>
+      <w:r>
+        <w:t>Rsd</w:t>
+      </w:r>
+      <w:proofErr w:type="spellEnd"/>
+      <w:r>
+        <w:t xml:space="preserve"> * T)</w:t>
       </w:r>
       <w:r>
         <w:t>) / (</w:t>
       </w:r>
-      <w:r>
-        <w:t>cpd + (Hv^2 * r) / Rsw * T^2</w:t>
+      <w:proofErr w:type="spellStart"/>
+      <w:r>
+        <w:t>cpd</w:t>
+      </w:r>
+      <w:proofErr w:type="spellEnd"/>
+      <w:r>
+        <w:t xml:space="preserve"> + (Hv^2 * r) / </w:t>
+      </w:r>
+      <w:proofErr w:type="spellStart"/>
+      <w:r>
+        <w:t>Rsw</w:t>
+      </w:r>
+      <w:proofErr w:type="spellEnd"/>
+      <w:r>
+        <w:t xml:space="preserve"> * T^2</w:t>
       </w:r>
       <w:r>
         <w:t>))</w:t>
@@ -1068,7 +1209,15 @@
       </w:r>
       <w:r>
         <w:br/>
-        <w:t>I cant seem to get them right.</w:t>
+        <w:t xml:space="preserve">I </w:t>
+      </w:r>
+      <w:proofErr w:type="spellStart"/>
+      <w:r>
+        <w:t>cant</w:t>
+      </w:r>
+      <w:proofErr w:type="spellEnd"/>
+      <w:r>
+        <w:t xml:space="preserve"> seem to get them right.</w:t>
       </w:r>
       <w:r>
         <w:br/>
@@ -1144,8 +1293,13 @@
       </w:r>
       <w:r>
         <w:br/>
-        <w:t>dh = Cp * dT + a / ã * g  * dz</w:t>
-      </w:r>
+        <w:t xml:space="preserve">dh = Cp * dT + a / ã * g  * </w:t>
+      </w:r>
+      <w:proofErr w:type="spellStart"/>
+      <w:r>
+        <w:t>dz</w:t>
+      </w:r>
+      <w:proofErr w:type="spellEnd"/>
       <w:r>
         <w:br/>
         <w:t>ã =  (a1 + a2) / 2</w:t>
@@ -1160,16 +1314,31 @@
       </w:r>
       <w:r>
         <w:br/>
-        <w:t>0 = Cp * dT + a/ã * g * dz</w:t>
-      </w:r>
-      <w:r>
-        <w:br/>
-        <w:t>Cp * dT = -a/ã * g * dz</w:t>
-      </w:r>
-      <w:r>
-        <w:br/>
-        <w:t>dT = -a/ã * g /Cp * dz</w:t>
-      </w:r>
+        <w:t xml:space="preserve">0 = Cp * dT + a/ã * g * </w:t>
+      </w:r>
+      <w:proofErr w:type="spellStart"/>
+      <w:r>
+        <w:t>dz</w:t>
+      </w:r>
+      <w:proofErr w:type="spellEnd"/>
+      <w:r>
+        <w:br/>
+        <w:t xml:space="preserve">Cp * dT = -a/ã * g * </w:t>
+      </w:r>
+      <w:proofErr w:type="spellStart"/>
+      <w:r>
+        <w:t>dz</w:t>
+      </w:r>
+      <w:proofErr w:type="spellEnd"/>
+      <w:r>
+        <w:br/>
+        <w:t xml:space="preserve">dT = -a/ã * g /Cp * </w:t>
+      </w:r>
+      <w:proofErr w:type="spellStart"/>
+      <w:r>
+        <w:t>dz</w:t>
+      </w:r>
+      <w:proofErr w:type="spellEnd"/>
       <w:r>
         <w:br/>
         <w:t>Good enough</w:t>
@@ -1243,7 +1412,15 @@
       </w:r>
       <w:r>
         <w:br/>
-        <w:t>Okay also Cp – Cv = R;</w:t>
+        <w:t xml:space="preserve">Okay also Cp – </w:t>
+      </w:r>
+      <w:proofErr w:type="spellStart"/>
+      <w:r>
+        <w:t>Cv</w:t>
+      </w:r>
+      <w:proofErr w:type="spellEnd"/>
+      <w:r>
+        <w:t xml:space="preserve"> = R;</w:t>
       </w:r>
       <w:r>
         <w:br/>
@@ -1251,7 +1428,15 @@
       </w:r>
       <w:r>
         <w:br/>
-        <w:t>The author believes that we do not work in a constant pressure environment thus we use Cv, because our volume is constant. (I think)</w:t>
+        <w:t xml:space="preserve">The author believes that we do not work in a constant pressure environment thus we use </w:t>
+      </w:r>
+      <w:proofErr w:type="spellStart"/>
+      <w:r>
+        <w:t>Cv</w:t>
+      </w:r>
+      <w:proofErr w:type="spellEnd"/>
+      <w:r>
+        <w:t>, because our volume is constant. (I think)</w:t>
       </w:r>
       <w:r>
         <w:br/>
@@ -1285,7 +1470,15 @@
       </w:r>
       <w:r>
         <w:br/>
-        <w:t xml:space="preserve">I found out why. So, they are called also log-p diagrams, this means that the distance between 1000 and 500 hPa is the same as 500 and 250. </w:t>
+        <w:t xml:space="preserve">I found out why. So, they are called also log-p diagrams, this means that the distance between 1000 and 500 </w:t>
+      </w:r>
+      <w:proofErr w:type="spellStart"/>
+      <w:r>
+        <w:t>hPa</w:t>
+      </w:r>
+      <w:proofErr w:type="spellEnd"/>
+      <w:r>
+        <w:t xml:space="preserve"> is the same as 500 and 250. </w:t>
       </w:r>
       <w:r>
         <w:br/>
@@ -1319,7 +1512,15 @@
         </w:r>
       </w:hyperlink>
       <w:r>
-        <w:t xml:space="preserve"> This is exactly what I want to do, but it is not open source unfortunately. Nvm, got it: </w:t>
+        <w:t xml:space="preserve"> This is exactly what I want to do, but it is not open source unfortunately. </w:t>
+      </w:r>
+      <w:proofErr w:type="spellStart"/>
+      <w:r>
+        <w:t>Nvm</w:t>
+      </w:r>
+      <w:proofErr w:type="spellEnd"/>
+      <w:r>
+        <w:t xml:space="preserve">, got it: </w:t>
       </w:r>
       <w:hyperlink r:id="rId25" w:history="1">
         <w:r>
@@ -1383,7 +1584,15 @@
     </w:p>
     <w:p>
       <w:r>
-        <w:t xml:space="preserve">Seems to not fully work, I tried using it on a dry adiabatics, but they curved okay but bended to the right. </w:t>
+        <w:t xml:space="preserve">Seems to not fully work, I tried using it on a dry </w:t>
+      </w:r>
+      <w:proofErr w:type="spellStart"/>
+      <w:r>
+        <w:t>adiabatics</w:t>
+      </w:r>
+      <w:proofErr w:type="spellEnd"/>
+      <w:r>
+        <w:t xml:space="preserve">, but they curved okay but bended to the right. </w:t>
       </w:r>
       <w:r>
         <w:br/>
@@ -1407,12 +1616,28 @@
         <w:t>Okay, s</w:t>
       </w:r>
       <w:r>
-        <w:t xml:space="preserve">o I got the height I think working, so the pressure height now scales correctly, I wanted to use this with the dry adiabatic, yet it seems that the curvature is sooo small that I am still confused. </w:t>
-      </w:r>
-    </w:p>
-    <w:p>
-      <w:r>
-        <w:t>So, what do we do? In like 48 we did not move a centimeter.</w:t>
+        <w:t xml:space="preserve">o I got the height I think working, so the pressure height now scales correctly, I wanted to use this with the dry adiabatic, yet it seems that the curvature is </w:t>
+      </w:r>
+      <w:proofErr w:type="spellStart"/>
+      <w:r>
+        <w:t>sooo</w:t>
+      </w:r>
+      <w:proofErr w:type="spellEnd"/>
+      <w:r>
+        <w:t xml:space="preserve"> small that I am still confused. </w:t>
+      </w:r>
+    </w:p>
+    <w:p>
+      <w:r>
+        <w:t xml:space="preserve">So, what do we do? In like 48 we did not move a </w:t>
+      </w:r>
+      <w:proofErr w:type="spellStart"/>
+      <w:r>
+        <w:t>centimeter</w:t>
+      </w:r>
+      <w:proofErr w:type="spellEnd"/>
+      <w:r>
+        <w:t>.</w:t>
       </w:r>
       <w:r>
         <w:br/>
@@ -1427,7 +1652,7 @@
           <w:noProof/>
         </w:rPr>
         <w:drawing>
-          <wp:anchor distT="0" distB="0" distL="114300" distR="114300" simplePos="0" relativeHeight="251667456" behindDoc="1" locked="0" layoutInCell="1" allowOverlap="1" wp14:anchorId="06503D00" wp14:editId="57371014">
+          <wp:anchor distT="0" distB="0" distL="114300" distR="114300" simplePos="0" relativeHeight="251667456" behindDoc="1" locked="0" layoutInCell="1" allowOverlap="1" wp14:anchorId="06503D00" wp14:editId="1DF46BF0">
             <wp:simplePos x="0" y="0"/>
             <wp:positionH relativeFrom="page">
               <wp:align>left</wp:align>
@@ -1522,7 +1747,15 @@
         <w:br/>
       </w:r>
       <w:r>
-        <w:t>The moist adiabatics. I tried some formulas, but they did not work. So, I took a look at the one the other codebase uses:</w:t>
+        <w:t xml:space="preserve">The moist </w:t>
+      </w:r>
+      <w:proofErr w:type="spellStart"/>
+      <w:r>
+        <w:t>adiabatics</w:t>
+      </w:r>
+      <w:proofErr w:type="spellEnd"/>
+      <w:r>
+        <w:t>. I tried some formulas, but they did not work. So, I took a look at the one the other codebase uses:</w:t>
       </w:r>
       <w:r>
         <w:br/>
@@ -1601,7 +1834,15 @@
     <w:p>
       <w:r>
         <w:lastRenderedPageBreak/>
-        <w:t xml:space="preserve">Uhm, yeah, so I think I see nothing wrong, but so many ways to calculate rs. Jeez. </w:t>
+        <w:t xml:space="preserve">Uhm, yeah, so I think I see nothing wrong, but so many ways to calculate </w:t>
+      </w:r>
+      <w:proofErr w:type="spellStart"/>
+      <w:r>
+        <w:t>rs</w:t>
+      </w:r>
+      <w:proofErr w:type="spellEnd"/>
+      <w:r>
+        <w:t xml:space="preserve">. Jeez. </w:t>
       </w:r>
       <w:r>
         <w:br/>
@@ -1625,11 +1866,27 @@
       </w:r>
       <w:r>
         <w:br/>
-        <w:t>Okay that was because I was using the wrong ws formula?</w:t>
-      </w:r>
-      <w:r>
-        <w:br/>
-        <w:t>Still the plotting is not correct. They are bended way to much to the right.</w:t>
+        <w:t xml:space="preserve">Okay that was because I was using the wrong </w:t>
+      </w:r>
+      <w:proofErr w:type="spellStart"/>
+      <w:r>
+        <w:t>ws</w:t>
+      </w:r>
+      <w:proofErr w:type="spellEnd"/>
+      <w:r>
+        <w:t xml:space="preserve"> formula?</w:t>
+      </w:r>
+      <w:r>
+        <w:br/>
+        <w:t xml:space="preserve">Still the plotting is not correct. They are bended way </w:t>
+      </w:r>
+      <w:proofErr w:type="spellStart"/>
+      <w:r>
+        <w:t>to</w:t>
+      </w:r>
+      <w:proofErr w:type="spellEnd"/>
+      <w:r>
+        <w:t xml:space="preserve"> much to the right.</w:t>
       </w:r>
       <w:r>
         <w:br/>
@@ -1649,12 +1906,28 @@
     </w:p>
     <w:p>
       <w:r>
-        <w:t>I feel like I am at the same problem at where I was with the dry adiabatics. Getting the correct change in temps but plotting it seems weird. I believe I have to reconstruct my function, but how.</w:t>
-      </w:r>
-    </w:p>
-    <w:p>
-      <w:r>
-        <w:t>Okay I implemented the code from that pdf, but its weird…</w:t>
+        <w:t xml:space="preserve">I feel like I am at the same problem at where I was with the dry </w:t>
+      </w:r>
+      <w:proofErr w:type="spellStart"/>
+      <w:r>
+        <w:t>adiabatics</w:t>
+      </w:r>
+      <w:proofErr w:type="spellEnd"/>
+      <w:r>
+        <w:t>. Getting the correct change in temps but plotting it seems weird. I believe I have to reconstruct my function, but how.</w:t>
+      </w:r>
+    </w:p>
+    <w:p>
+      <w:r>
+        <w:t xml:space="preserve">Okay I implemented the code from that pdf, but </w:t>
+      </w:r>
+      <w:proofErr w:type="spellStart"/>
+      <w:r>
+        <w:t>its</w:t>
+      </w:r>
+      <w:proofErr w:type="spellEnd"/>
+      <w:r>
+        <w:t xml:space="preserve"> weird…</w:t>
       </w:r>
     </w:p>
     <w:p>
@@ -1749,11 +2022,27 @@
       </w:r>
       <w:r>
         <w:br/>
-        <w:t xml:space="preserve">I think I need to give again a look at the py code. </w:t>
-      </w:r>
-      <w:r>
-        <w:br/>
-        <w:t xml:space="preserve">Btw, good yt video: </w:t>
+        <w:t xml:space="preserve">I think I need to give again a look at the </w:t>
+      </w:r>
+      <w:proofErr w:type="spellStart"/>
+      <w:r>
+        <w:t>py</w:t>
+      </w:r>
+      <w:proofErr w:type="spellEnd"/>
+      <w:r>
+        <w:t xml:space="preserve"> code. </w:t>
+      </w:r>
+      <w:r>
+        <w:br/>
+        <w:t xml:space="preserve">Btw, good </w:t>
+      </w:r>
+      <w:proofErr w:type="spellStart"/>
+      <w:r>
+        <w:t>yt</w:t>
+      </w:r>
+      <w:proofErr w:type="spellEnd"/>
+      <w:r>
+        <w:t xml:space="preserve"> video: </w:t>
       </w:r>
       <w:hyperlink r:id="rId36" w:history="1">
         <w:r>
@@ -1768,7 +2057,23 @@
       </w:r>
       <w:r>
         <w:br/>
-        <w:t xml:space="preserve">I may see the problem, what I have been doing is checking temperature change between 1000 hPa and 600 hPa, but I should take small steps: 600 and 605 and 605 and 610 etc. </w:t>
+        <w:t xml:space="preserve">I may see the problem, what I have been doing is checking temperature change between 1000 </w:t>
+      </w:r>
+      <w:proofErr w:type="spellStart"/>
+      <w:r>
+        <w:t>hPa</w:t>
+      </w:r>
+      <w:proofErr w:type="spellEnd"/>
+      <w:r>
+        <w:t xml:space="preserve"> and 600 </w:t>
+      </w:r>
+      <w:proofErr w:type="spellStart"/>
+      <w:r>
+        <w:t>hPa</w:t>
+      </w:r>
+      <w:proofErr w:type="spellEnd"/>
+      <w:r>
+        <w:t xml:space="preserve">, but I should take small steps: 600 and 605 and 605 and 610 etc. </w:t>
       </w:r>
     </w:p>
     <w:p>
@@ -1823,7 +2128,15 @@
       </w:r>
       <w:r>
         <w:br/>
-        <w:t>I think its good enough:</w:t>
+        <w:t xml:space="preserve">I think </w:t>
+      </w:r>
+      <w:proofErr w:type="spellStart"/>
+      <w:r>
+        <w:t>its</w:t>
+      </w:r>
+      <w:proofErr w:type="spellEnd"/>
+      <w:r>
+        <w:t xml:space="preserve"> good enough:</w:t>
       </w:r>
     </w:p>
     <w:p>
@@ -1833,7 +2146,7 @@
         </w:rPr>
         <w:lastRenderedPageBreak/>
         <w:drawing>
-          <wp:anchor distT="0" distB="0" distL="114300" distR="114300" simplePos="0" relativeHeight="251669504" behindDoc="1" locked="0" layoutInCell="1" allowOverlap="1" wp14:anchorId="5FB435B6" wp14:editId="2A74A051">
+          <wp:anchor distT="0" distB="0" distL="114300" distR="114300" simplePos="0" relativeHeight="251669504" behindDoc="1" locked="0" layoutInCell="1" allowOverlap="1" wp14:anchorId="5FB435B6" wp14:editId="4EBF5A34">
             <wp:simplePos x="0" y="0"/>
             <wp:positionH relativeFrom="page">
               <wp:align>left</wp:align>
@@ -1901,12 +2214,28 @@
       </w:r>
       <w:r>
         <w:br/>
-        <w:t xml:space="preserve">So the first few hPa is direct on point, but the higher the worse. </w:t>
-      </w:r>
-    </w:p>
-    <w:p>
-      <w:r>
-        <w:t>I am going to make this a github project since I see a future in this.</w:t>
+        <w:t xml:space="preserve">So the first few </w:t>
+      </w:r>
+      <w:proofErr w:type="spellStart"/>
+      <w:r>
+        <w:t>hPa</w:t>
+      </w:r>
+      <w:proofErr w:type="spellEnd"/>
+      <w:r>
+        <w:t xml:space="preserve"> is direct on point, but the higher the worse. </w:t>
+      </w:r>
+    </w:p>
+    <w:p>
+      <w:r>
+        <w:t xml:space="preserve">I am going to make this a </w:t>
+      </w:r>
+      <w:proofErr w:type="spellStart"/>
+      <w:r>
+        <w:t>github</w:t>
+      </w:r>
+      <w:proofErr w:type="spellEnd"/>
+      <w:r>
+        <w:t xml:space="preserve"> project since I see a future in this.</w:t>
       </w:r>
     </w:p>
     <w:p/>
@@ -1936,7 +2265,14 @@
       </w:r>
       <w:r>
         <w:br/>
-        <w:t>Lets calculate the LCL, EL and more.</w:t>
+      </w:r>
+      <w:proofErr w:type="spellStart"/>
+      <w:r>
+        <w:t>Lets</w:t>
+      </w:r>
+      <w:proofErr w:type="spellEnd"/>
+      <w:r>
+        <w:t xml:space="preserve"> calculate the LCL, EL and more.</w:t>
       </w:r>
     </w:p>
     <w:p>
@@ -2035,8 +2371,29 @@
       </w:r>
       <w:r>
         <w:br/>
-        <w:t>What is Cva? Is that not just Cpd and Cpv</w:t>
-      </w:r>
+        <w:t xml:space="preserve">What is </w:t>
+      </w:r>
+      <w:proofErr w:type="spellStart"/>
+      <w:r>
+        <w:t>Cva</w:t>
+      </w:r>
+      <w:proofErr w:type="spellEnd"/>
+      <w:r>
+        <w:t xml:space="preserve">? Is that not just </w:t>
+      </w:r>
+      <w:proofErr w:type="spellStart"/>
+      <w:r>
+        <w:t>Cpd</w:t>
+      </w:r>
+      <w:proofErr w:type="spellEnd"/>
+      <w:r>
+        <w:t xml:space="preserve"> and </w:t>
+      </w:r>
+      <w:proofErr w:type="spellStart"/>
+      <w:r>
+        <w:t>Cpv</w:t>
+      </w:r>
+      <w:proofErr w:type="spellEnd"/>
       <w:r>
         <w:br/>
         <w:t>but why are the values different?</w:t>
@@ -2047,16 +2404,47 @@
       </w:r>
       <w:r>
         <w:tab/>
-        <w:t>2.2, and as example it is in between: 2.37, confusing. Lets use the 2.2 for now.</w:t>
-      </w:r>
-      <w:r>
-        <w:br/>
-        <w:t>oeh! I could use laberts function of boost.</w:t>
-      </w:r>
-    </w:p>
-    <w:p>
-      <w:r>
-        <w:t>First test, went okay. Values are wrong, but I think its pretty easy solvable.</w:t>
+        <w:t xml:space="preserve">2.2, and as example it is in between: 2.37, confusing. </w:t>
+      </w:r>
+      <w:proofErr w:type="spellStart"/>
+      <w:r>
+        <w:t>Lets</w:t>
+      </w:r>
+      <w:proofErr w:type="spellEnd"/>
+      <w:r>
+        <w:t xml:space="preserve"> use the 2.2 for now.</w:t>
+      </w:r>
+      <w:r>
+        <w:br/>
+      </w:r>
+      <w:proofErr w:type="spellStart"/>
+      <w:r>
+        <w:t>oeh</w:t>
+      </w:r>
+      <w:proofErr w:type="spellEnd"/>
+      <w:r>
+        <w:t xml:space="preserve">! I could use </w:t>
+      </w:r>
+      <w:proofErr w:type="spellStart"/>
+      <w:r>
+        <w:t>laberts</w:t>
+      </w:r>
+      <w:proofErr w:type="spellEnd"/>
+      <w:r>
+        <w:t xml:space="preserve"> function of boost.</w:t>
+      </w:r>
+    </w:p>
+    <w:p>
+      <w:r>
+        <w:t xml:space="preserve">First test, went okay. Values are wrong, but I think </w:t>
+      </w:r>
+      <w:proofErr w:type="spellStart"/>
+      <w:r>
+        <w:t>its</w:t>
+      </w:r>
+      <w:proofErr w:type="spellEnd"/>
+      <w:r>
+        <w:t xml:space="preserve"> pretty easy solvable.</w:t>
       </w:r>
     </w:p>
     <w:p>
@@ -2086,7 +2474,7 @@
           <w:noProof/>
         </w:rPr>
         <w:drawing>
-          <wp:anchor distT="0" distB="0" distL="114300" distR="114300" simplePos="0" relativeHeight="251673600" behindDoc="1" locked="0" layoutInCell="1" allowOverlap="1" wp14:anchorId="301D5EFD" wp14:editId="7CBE4547">
+          <wp:anchor distT="0" distB="0" distL="114300" distR="114300" simplePos="0" relativeHeight="251673600" behindDoc="1" locked="0" layoutInCell="1" allowOverlap="1" wp14:anchorId="301D5EFD" wp14:editId="639B0FF0">
             <wp:simplePos x="0" y="0"/>
             <wp:positionH relativeFrom="column">
               <wp:posOffset>3367405</wp:posOffset>
@@ -2222,7 +2610,7 @@
           <w:noProof/>
         </w:rPr>
         <w:drawing>
-          <wp:anchor distT="0" distB="0" distL="114300" distR="114300" simplePos="0" relativeHeight="251671552" behindDoc="1" locked="0" layoutInCell="1" allowOverlap="1" wp14:anchorId="3B1247BB" wp14:editId="49813440">
+          <wp:anchor distT="0" distB="0" distL="114300" distR="114300" simplePos="0" relativeHeight="251671552" behindDoc="1" locked="0" layoutInCell="1" allowOverlap="1" wp14:anchorId="3B1247BB" wp14:editId="7D2084FE">
             <wp:simplePos x="0" y="0"/>
             <wp:positionH relativeFrom="margin">
               <wp:posOffset>-819150</wp:posOffset>
@@ -2439,13 +2827,23 @@
     </w:p>
     <w:p/>
     <w:p>
-      <w:r>
-        <w:t>Lets just do what I said. Weird how I can just not find a formula for EL.</w:t>
-      </w:r>
-    </w:p>
-    <w:p>
-      <w:r>
-        <w:t>MetPy: “</w:t>
+      <w:proofErr w:type="spellStart"/>
+      <w:r>
+        <w:t>Lets</w:t>
+      </w:r>
+      <w:proofErr w:type="spellEnd"/>
+      <w:r>
+        <w:t xml:space="preserve"> just do what I said. Weird how I can just not find a formula for EL.</w:t>
+      </w:r>
+    </w:p>
+    <w:p>
+      <w:proofErr w:type="spellStart"/>
+      <w:r>
+        <w:t>MetPy</w:t>
+      </w:r>
+      <w:proofErr w:type="spellEnd"/>
+      <w:r>
+        <w:t>: “</w:t>
       </w:r>
       <w:r>
         <w:t>This works by finding the last intersection of the ideal parcel path and the measured environmental temperature. If there is one or fewer intersections, there is no equilibrium level.</w:t>
@@ -2468,7 +2866,15 @@
       </w:r>
       <w:r>
         <w:br/>
-        <w:t>Ah I see, at the return I divided by Pa instead of hPa.</w:t>
+        <w:t xml:space="preserve">Ah I see, at the return I divided by Pa instead of </w:t>
+      </w:r>
+      <w:proofErr w:type="spellStart"/>
+      <w:r>
+        <w:t>hPa</w:t>
+      </w:r>
+      <w:proofErr w:type="spellEnd"/>
+      <w:r>
+        <w:t>.</w:t>
       </w:r>
     </w:p>
     <w:p>
@@ -2494,11 +2900,27 @@
       </w:r>
       <w:r>
         <w:br/>
-        <w:t>It may could be because the values start at hPa of 993 instead of above 1000</w:t>
-      </w:r>
-      <w:r>
-        <w:br/>
-        <w:t>And the fact that I use observed pressure data changes the adiabatics. Yes I believe this is the main case.</w:t>
+        <w:t xml:space="preserve">It may could be because the values start at </w:t>
+      </w:r>
+      <w:proofErr w:type="spellStart"/>
+      <w:r>
+        <w:t>hPa</w:t>
+      </w:r>
+      <w:proofErr w:type="spellEnd"/>
+      <w:r>
+        <w:t xml:space="preserve"> of 993 instead of above 1000</w:t>
+      </w:r>
+      <w:r>
+        <w:br/>
+        <w:t xml:space="preserve">And the fact that I use observed pressure data changes the </w:t>
+      </w:r>
+      <w:proofErr w:type="spellStart"/>
+      <w:r>
+        <w:t>adiabatics</w:t>
+      </w:r>
+      <w:proofErr w:type="spellEnd"/>
+      <w:r>
+        <w:t>. Yes I believe this is the main case.</w:t>
       </w:r>
       <w:r>
         <w:br/>
@@ -2522,7 +2944,15 @@
         <w:br/>
       </w:r>
       <w:r>
-        <w:t>It looks alright but at some places it is still wrong, its weird…</w:t>
+        <w:t xml:space="preserve">It looks alright but at some places it is still wrong, </w:t>
+      </w:r>
+      <w:proofErr w:type="spellStart"/>
+      <w:r>
+        <w:t>its</w:t>
+      </w:r>
+      <w:proofErr w:type="spellEnd"/>
+      <w:r>
+        <w:t xml:space="preserve"> weird…</w:t>
       </w:r>
       <w:r>
         <w:t xml:space="preserve"> </w:t>
@@ -2688,8 +3118,13 @@
     <w:p/>
     <w:p/>
     <w:p>
-      <w:r>
-        <w:t xml:space="preserve">Lets compare some values to see if the problem is with our calculations or our plotting. </w:t>
+      <w:proofErr w:type="spellStart"/>
+      <w:r>
+        <w:t>Lets</w:t>
+      </w:r>
+      <w:proofErr w:type="spellEnd"/>
+      <w:r>
+        <w:t xml:space="preserve"> compare some values to see if the problem is with our calculations or our plotting. </w:t>
       </w:r>
       <w:r>
         <w:br/>
@@ -2697,7 +3132,15 @@
       </w:r>
       <w:r>
         <w:br/>
-        <w:t xml:space="preserve">But my constants are exactly the same as for example metPy uses. </w:t>
+        <w:t xml:space="preserve">But my constants are exactly the same as for example </w:t>
+      </w:r>
+      <w:proofErr w:type="spellStart"/>
+      <w:r>
+        <w:t>metPy</w:t>
+      </w:r>
+      <w:proofErr w:type="spellEnd"/>
+      <w:r>
+        <w:t xml:space="preserve"> uses. </w:t>
       </w:r>
       <w:r>
         <w:br/>
@@ -2705,28 +3148,68 @@
       </w:r>
       <w:r>
         <w:br/>
-        <w:t>Found an issue, I was calculating the vapor pressure using 611 instead of 6.11 (triple point in hPa)</w:t>
-      </w:r>
-    </w:p>
-    <w:p>
-      <w:r>
-        <w:t>Currently my values are very close to the ones of metPy, but still off.</w:t>
-      </w:r>
-    </w:p>
-    <w:p>
-      <w:r>
-        <w:t xml:space="preserve">Huh, I get a weird offset of value,it should be </w:t>
+        <w:t xml:space="preserve">Found an issue, I was calculating the vapor pressure using 611 instead of 6.11 (triple point in </w:t>
+      </w:r>
+      <w:proofErr w:type="spellStart"/>
+      <w:r>
+        <w:t>hPa</w:t>
+      </w:r>
+      <w:proofErr w:type="spellEnd"/>
+      <w:r>
+        <w:t>)</w:t>
+      </w:r>
+    </w:p>
+    <w:p>
+      <w:r>
+        <w:t xml:space="preserve">Currently my values are very close to the ones of </w:t>
+      </w:r>
+      <w:proofErr w:type="spellStart"/>
+      <w:r>
+        <w:t>metPy</w:t>
+      </w:r>
+      <w:proofErr w:type="spellEnd"/>
+      <w:r>
+        <w:t>, but still off.</w:t>
+      </w:r>
+    </w:p>
+    <w:p>
+      <w:r>
+        <w:t xml:space="preserve">Huh, I get a weird offset of </w:t>
+      </w:r>
+      <w:proofErr w:type="spellStart"/>
+      <w:r>
+        <w:t>value,it</w:t>
+      </w:r>
+      <w:proofErr w:type="spellEnd"/>
+      <w:r>
+        <w:t xml:space="preserve"> should be </w:t>
       </w:r>
       <w:r>
         <w:t xml:space="preserve">20.7079, but I get 20.709, small difference but still. </w:t>
       </w:r>
       <w:r>
         <w:br/>
-        <w:t>Now the temps are off again… nvm its closer again.</w:t>
-      </w:r>
-      <w:r>
-        <w:br/>
-        <w:t xml:space="preserve">My adiabatics are plotted around 0.3 temp to cold. </w:t>
+        <w:t xml:space="preserve">Now the temps are off again… </w:t>
+      </w:r>
+      <w:proofErr w:type="spellStart"/>
+      <w:r>
+        <w:t>nvm</w:t>
+      </w:r>
+      <w:proofErr w:type="spellEnd"/>
+      <w:r>
+        <w:t xml:space="preserve"> its closer again.</w:t>
+      </w:r>
+      <w:r>
+        <w:br/>
+        <w:t xml:space="preserve">My </w:t>
+      </w:r>
+      <w:proofErr w:type="spellStart"/>
+      <w:r>
+        <w:t>adiabatics</w:t>
+      </w:r>
+      <w:proofErr w:type="spellEnd"/>
+      <w:r>
+        <w:t xml:space="preserve"> are plotted around 0.3 temp to cold. </w:t>
       </w:r>
     </w:p>
     <w:p>
@@ -2736,7 +3219,15 @@
     </w:p>
     <w:p>
       <w:r>
-        <w:t xml:space="preserve">Using the height at standard pressure, the height at 1000 hPa (bottom line in skew-T) should be </w:t>
+        <w:t xml:space="preserve">Using the height at standard pressure, the height at 1000 </w:t>
+      </w:r>
+      <w:proofErr w:type="spellStart"/>
+      <w:r>
+        <w:t>hPa</w:t>
+      </w:r>
+      <w:proofErr w:type="spellEnd"/>
+      <w:r>
+        <w:t xml:space="preserve"> (bottom line in skew-T) should be </w:t>
       </w:r>
       <w:r>
         <w:t>89.7071991</w:t>
@@ -2747,14 +3238,27 @@
       </w:r>
       <w:r>
         <w:br/>
-        <w:t>It looks like in the skew-T they plant the ground temp at 1000 hPa</w:t>
-      </w:r>
+        <w:t xml:space="preserve">It looks like in the skew-T they plant the ground temp at 1000 </w:t>
+      </w:r>
+      <w:proofErr w:type="spellStart"/>
+      <w:r>
+        <w:t>hPa</w:t>
+      </w:r>
+      <w:proofErr w:type="spellEnd"/>
       <w:r>
         <w:t>.</w:t>
       </w:r>
       <w:r>
         <w:br/>
-        <w:t>what I should do is grab the ground temp, add it to the list and make it 1000 hPa (bottom)</w:t>
+        <w:t xml:space="preserve">what I should do is grab the ground temp, add it to the list and make it 1000 </w:t>
+      </w:r>
+      <w:proofErr w:type="spellStart"/>
+      <w:r>
+        <w:t>hPa</w:t>
+      </w:r>
+      <w:proofErr w:type="spellEnd"/>
+      <w:r>
+        <w:t xml:space="preserve"> (bottom)</w:t>
       </w:r>
       <w:r>
         <w:br/>
@@ -2776,7 +3280,15 @@
     </w:p>
     <w:p>
       <w:r>
-        <w:t>Now the EL seem to be the same as the one on meteologix, nice. Now just offset the temps.</w:t>
+        <w:t xml:space="preserve">Now the EL seem to be the same as the one on </w:t>
+      </w:r>
+      <w:proofErr w:type="spellStart"/>
+      <w:r>
+        <w:t>meteologix</w:t>
+      </w:r>
+      <w:proofErr w:type="spellEnd"/>
+      <w:r>
+        <w:t>, nice. Now just offset the temps.</w:t>
       </w:r>
       <w:r>
         <w:br/>
@@ -2799,7 +3311,7 @@
         </w:rPr>
         <w:lastRenderedPageBreak/>
         <w:drawing>
-          <wp:anchor distT="0" distB="0" distL="114300" distR="114300" simplePos="0" relativeHeight="251678720" behindDoc="1" locked="0" layoutInCell="1" allowOverlap="1" wp14:anchorId="5A7E72E5" wp14:editId="65FA2C45">
+          <wp:anchor distT="0" distB="0" distL="114300" distR="114300" simplePos="0" relativeHeight="251678720" behindDoc="1" locked="0" layoutInCell="1" allowOverlap="1" wp14:anchorId="5A7E72E5" wp14:editId="3AA8E9DD">
             <wp:simplePos x="0" y="0"/>
             <wp:positionH relativeFrom="column">
               <wp:posOffset>3665855</wp:posOffset>
@@ -2927,7 +3439,23 @@
     </w:p>
     <w:p>
       <w:r>
-        <w:t>I am a bit confused on how it still is wrong. The temp difference I got from my calculations (comparing) was only like 1 degree. So it must be the plotting. The temps probably have to be plotted somehow else? No its probably the adiabatics that are wrong. But also temps differ?</w:t>
+        <w:t xml:space="preserve">I am a bit confused on how it still is wrong. The temp difference I got from my calculations (comparing) was only like 1 degree. So it must be the plotting. The temps probably have to be plotted somehow else? No </w:t>
+      </w:r>
+      <w:proofErr w:type="spellStart"/>
+      <w:r>
+        <w:t>its</w:t>
+      </w:r>
+      <w:proofErr w:type="spellEnd"/>
+      <w:r>
+        <w:t xml:space="preserve"> probably the </w:t>
+      </w:r>
+      <w:proofErr w:type="spellStart"/>
+      <w:r>
+        <w:t>adiabatics</w:t>
+      </w:r>
+      <w:proofErr w:type="spellEnd"/>
+      <w:r>
+        <w:t xml:space="preserve"> that are wrong. But also temps differ?</w:t>
       </w:r>
     </w:p>
     <w:p>
@@ -2936,7 +3464,15 @@
       </w:r>
       <w:r>
         <w:br/>
-        <w:t>The second thing is that the adiabatics don’t correctly follow.</w:t>
+        <w:t xml:space="preserve">The second thing is that the </w:t>
+      </w:r>
+      <w:proofErr w:type="spellStart"/>
+      <w:r>
+        <w:t>adiabatics</w:t>
+      </w:r>
+      <w:proofErr w:type="spellEnd"/>
+      <w:r>
+        <w:t xml:space="preserve"> don’t correctly follow.</w:t>
       </w:r>
     </w:p>
     <w:p>
@@ -2945,7 +3481,15 @@
       </w:r>
       <w:r>
         <w:br/>
-        <w:t>First I want to set the pressure to height to use 0 instead of i.</w:t>
+        <w:t xml:space="preserve">First I want to set the pressure to height to use 0 instead of </w:t>
+      </w:r>
+      <w:proofErr w:type="spellStart"/>
+      <w:r>
+        <w:t>i</w:t>
+      </w:r>
+      <w:proofErr w:type="spellEnd"/>
+      <w:r>
+        <w:t>.</w:t>
       </w:r>
       <w:r>
         <w:br/>
@@ -2953,7 +3497,15 @@
       </w:r>
       <w:r>
         <w:br/>
-        <w:t>Then I need to debug my values of moist lapse rate vs dry lapse rate at like 0 degrees and 700 hPa.</w:t>
+        <w:t xml:space="preserve">Then I need to debug my values of moist lapse rate vs dry lapse rate at like 0 degrees and 700 </w:t>
+      </w:r>
+      <w:proofErr w:type="spellStart"/>
+      <w:r>
+        <w:t>hPa</w:t>
+      </w:r>
+      <w:proofErr w:type="spellEnd"/>
+      <w:r>
+        <w:t>.</w:t>
       </w:r>
       <w:r>
         <w:br/>
@@ -2986,7 +3538,7 @@
           <w:noProof/>
         </w:rPr>
         <w:drawing>
-          <wp:anchor distT="0" distB="0" distL="114300" distR="114300" simplePos="0" relativeHeight="251679744" behindDoc="1" locked="0" layoutInCell="1" allowOverlap="1" wp14:anchorId="31CDDE59" wp14:editId="20E0AA83">
+          <wp:anchor distT="0" distB="0" distL="114300" distR="114300" simplePos="0" relativeHeight="251679744" behindDoc="1" locked="0" layoutInCell="1" allowOverlap="1" wp14:anchorId="31CDDE59" wp14:editId="3F910CE8">
             <wp:simplePos x="0" y="0"/>
             <wp:positionH relativeFrom="page">
               <wp:align>left</wp:align>
@@ -3056,12 +3608,28 @@
       </w:r>
       <w:r>
         <w:br/>
-        <w:t>The higher the moist lapse rate goes, the smaller the decrease, sure. But the change on a skew-T is much larger, it curves way to much to the right.</w:t>
-      </w:r>
-    </w:p>
-    <w:p>
-      <w:r>
-        <w:t xml:space="preserve">On metPy, the MLR in the higher elevation does not curve back. </w:t>
+        <w:t xml:space="preserve">The higher the moist lapse rate goes, the smaller the decrease, sure. But the change on a skew-T is much larger, it curves way </w:t>
+      </w:r>
+      <w:proofErr w:type="spellStart"/>
+      <w:r>
+        <w:t>to</w:t>
+      </w:r>
+      <w:proofErr w:type="spellEnd"/>
+      <w:r>
+        <w:t xml:space="preserve"> much to the right.</w:t>
+      </w:r>
+    </w:p>
+    <w:p>
+      <w:r>
+        <w:t xml:space="preserve">On </w:t>
+      </w:r>
+      <w:proofErr w:type="spellStart"/>
+      <w:r>
+        <w:t>metPy</w:t>
+      </w:r>
+      <w:proofErr w:type="spellEnd"/>
+      <w:r>
+        <w:t xml:space="preserve">, the MLR in the higher elevation does not curve back. </w:t>
       </w:r>
     </w:p>
     <w:p>
@@ -3087,7 +3655,15 @@
     </w:p>
     <w:p>
       <w:r>
-        <w:t>Alright skew-T is scaleable, now I need to add a log value so I can check how that works.</w:t>
+        <w:t xml:space="preserve">Alright skew-T is </w:t>
+      </w:r>
+      <w:proofErr w:type="spellStart"/>
+      <w:r>
+        <w:t>scaleable</w:t>
+      </w:r>
+      <w:proofErr w:type="spellEnd"/>
+      <w:r>
+        <w:t>, now I need to add a log value so I can check how that works.</w:t>
       </w:r>
     </w:p>
     <w:p>
@@ -3096,15 +3672,37 @@
       </w:r>
       <w:r>
         <w:br/>
-        <w:t>I feel like my RHl calculator is broken.|</w:t>
-      </w:r>
-      <w:r>
-        <w:br/>
-        <w:t>ohhh, I did not update them to Celsius.</w:t>
-      </w:r>
-      <w:r>
-        <w:br/>
-        <w:t>Lets calculate the LFC  (level of free convection)</w:t>
+        <w:t xml:space="preserve">I feel like my </w:t>
+      </w:r>
+      <w:proofErr w:type="spellStart"/>
+      <w:r>
+        <w:t>RHl</w:t>
+      </w:r>
+      <w:proofErr w:type="spellEnd"/>
+      <w:r>
+        <w:t xml:space="preserve"> calculator is broken.|</w:t>
+      </w:r>
+      <w:r>
+        <w:br/>
+      </w:r>
+      <w:proofErr w:type="spellStart"/>
+      <w:r>
+        <w:t>ohhh</w:t>
+      </w:r>
+      <w:proofErr w:type="spellEnd"/>
+      <w:r>
+        <w:t>, I did not update them to Celsius.</w:t>
+      </w:r>
+      <w:r>
+        <w:br/>
+      </w:r>
+      <w:proofErr w:type="spellStart"/>
+      <w:r>
+        <w:t>Lets</w:t>
+      </w:r>
+      <w:proofErr w:type="spellEnd"/>
+      <w:r>
+        <w:t xml:space="preserve"> calculate the LFC  (level of free convection)</w:t>
       </w:r>
       <w:r>
         <w:br/>
@@ -3118,11 +3716,27 @@
         <w:t>temperature. If this intersection occurs below the LCL, the LFC is determined to be the same as the LCL</w:t>
       </w:r>
       <w:r>
-        <w:t>” -metPy.</w:t>
-      </w:r>
-      <w:r>
-        <w:br/>
-        <w:t>We will take the same approach, which is essentially the same as the one of EL, but this time we will only look at the first intersection. If we only get a intersection going inside, we will put the LFC at the LCL.</w:t>
+        <w:t>” -</w:t>
+      </w:r>
+      <w:proofErr w:type="spellStart"/>
+      <w:r>
+        <w:t>metPy</w:t>
+      </w:r>
+      <w:proofErr w:type="spellEnd"/>
+      <w:r>
+        <w:t>.</w:t>
+      </w:r>
+      <w:r>
+        <w:br/>
+        <w:t xml:space="preserve">We will take the same approach, which is essentially the same as the one of EL, but this time we will only look at the first intersection. If we only get </w:t>
+      </w:r>
+      <w:proofErr w:type="spellStart"/>
+      <w:r>
+        <w:t>a</w:t>
+      </w:r>
+      <w:proofErr w:type="spellEnd"/>
+      <w:r>
+        <w:t xml:space="preserve"> intersection going inside, we will put the LFC at the LCL.</w:t>
       </w:r>
     </w:p>
     <w:p>
@@ -3204,7 +3818,7 @@
           <w:noProof/>
         </w:rPr>
         <w:drawing>
-          <wp:anchor distT="0" distB="0" distL="114300" distR="114300" simplePos="0" relativeHeight="251680768" behindDoc="1" locked="0" layoutInCell="1" allowOverlap="1" wp14:anchorId="59437869" wp14:editId="1E5E4097">
+          <wp:anchor distT="0" distB="0" distL="114300" distR="114300" simplePos="0" relativeHeight="251680768" behindDoc="1" locked="0" layoutInCell="1" allowOverlap="1" wp14:anchorId="59437869" wp14:editId="21D9E774">
             <wp:simplePos x="0" y="0"/>
             <wp:positionH relativeFrom="margin">
               <wp:align>left</wp:align>
@@ -3328,7 +3942,15 @@
       </w:r>
       <w:r>
         <w:br/>
-        <w:t>My cape is a bit lower than MLcape, but this could be because of the usages of observed pressure</w:t>
+        <w:t xml:space="preserve">My cape is a bit lower than </w:t>
+      </w:r>
+      <w:proofErr w:type="spellStart"/>
+      <w:r>
+        <w:t>MLcape</w:t>
+      </w:r>
+      <w:proofErr w:type="spellEnd"/>
+      <w:r>
+        <w:t>, but this could be because of the usages of observed pressure</w:t>
       </w:r>
     </w:p>
     <w:p/>
@@ -3347,7 +3969,15 @@
       </w:r>
       <w:r>
         <w:br/>
-        <w:t xml:space="preserve">When I do the I thing, it looks correct again. So, maybe I do need the i. </w:t>
+        <w:t xml:space="preserve">When I do the I thing, it looks correct again. So, maybe I do need the </w:t>
+      </w:r>
+      <w:proofErr w:type="spellStart"/>
+      <w:r>
+        <w:t>i</w:t>
+      </w:r>
+      <w:proofErr w:type="spellEnd"/>
+      <w:r>
+        <w:t xml:space="preserve">. </w:t>
       </w:r>
       <w:r>
         <w:br/>
@@ -3379,7 +4009,15 @@
     </w:p>
     <w:p>
       <w:r>
-        <w:t xml:space="preserve">I just compared with the results of metpy and indeed my values are awfully wrong. </w:t>
+        <w:t xml:space="preserve">I just compared with the results of </w:t>
+      </w:r>
+      <w:proofErr w:type="spellStart"/>
+      <w:r>
+        <w:t>metpy</w:t>
+      </w:r>
+      <w:proofErr w:type="spellEnd"/>
+      <w:r>
+        <w:t xml:space="preserve"> and indeed my values are awfully wrong. </w:t>
       </w:r>
       <w:r>
         <w:br/>
@@ -3429,7 +4067,15 @@
         </w:r>
       </w:hyperlink>
       <w:r>
-        <w:t xml:space="preserve"> DALES, a dutch weather model.</w:t>
+        <w:t xml:space="preserve"> DALES, a </w:t>
+      </w:r>
+      <w:proofErr w:type="spellStart"/>
+      <w:r>
+        <w:t>dutch</w:t>
+      </w:r>
+      <w:proofErr w:type="spellEnd"/>
+      <w:r>
+        <w:t xml:space="preserve"> weather model.</w:t>
       </w:r>
       <w:r>
         <w:br/>
@@ -3495,15 +4141,46 @@
       </w:r>
       <w:r>
         <w:br/>
-        <w:t>Seems like the temps x pressure bars x isotherms x dry-adiabatics are perfect.</w:t>
-      </w:r>
-      <w:r>
-        <w:br/>
-        <w:t>But the wet-adiabatics are still off…</w:t>
-      </w:r>
-      <w:r>
-        <w:br/>
-        <w:t>nvm, found it, was not doing the increment of 1 yet on the debug. Okay that fixed the moist adiabatics, now only the LCL stuff.</w:t>
+        <w:t>Seems like the temps x pressure bars x isotherms x dry-</w:t>
+      </w:r>
+      <w:proofErr w:type="spellStart"/>
+      <w:r>
+        <w:t>adiabatics</w:t>
+      </w:r>
+      <w:proofErr w:type="spellEnd"/>
+      <w:r>
+        <w:t xml:space="preserve"> are perfect.</w:t>
+      </w:r>
+      <w:r>
+        <w:br/>
+        <w:t>But the wet-</w:t>
+      </w:r>
+      <w:proofErr w:type="spellStart"/>
+      <w:r>
+        <w:t>adiabatics</w:t>
+      </w:r>
+      <w:proofErr w:type="spellEnd"/>
+      <w:r>
+        <w:t xml:space="preserve"> are still off…</w:t>
+      </w:r>
+      <w:r>
+        <w:br/>
+      </w:r>
+      <w:proofErr w:type="spellStart"/>
+      <w:r>
+        <w:t>nvm</w:t>
+      </w:r>
+      <w:proofErr w:type="spellEnd"/>
+      <w:r>
+        <w:t xml:space="preserve">, found it, was not doing the increment of 1 yet on the debug. Okay that fixed the moist </w:t>
+      </w:r>
+      <w:proofErr w:type="spellStart"/>
+      <w:r>
+        <w:t>adiabatics</w:t>
+      </w:r>
+      <w:proofErr w:type="spellEnd"/>
+      <w:r>
+        <w:t>, now only the LCL stuff.</w:t>
       </w:r>
       <w:r>
         <w:br/>
@@ -3533,11 +4210,27 @@
     </w:p>
     <w:p>
       <w:r>
-        <w:t>Okay fixed mixing ratio by adding the MWratio (0.622)</w:t>
-      </w:r>
-      <w:r>
-        <w:br/>
-        <w:t>Still its just a tad bit offset.</w:t>
+        <w:t xml:space="preserve">Okay fixed mixing ratio by adding the </w:t>
+      </w:r>
+      <w:proofErr w:type="spellStart"/>
+      <w:r>
+        <w:t>MWratio</w:t>
+      </w:r>
+      <w:proofErr w:type="spellEnd"/>
+      <w:r>
+        <w:t xml:space="preserve"> (0.622)</w:t>
+      </w:r>
+      <w:r>
+        <w:br/>
+        <w:t xml:space="preserve">Still </w:t>
+      </w:r>
+      <w:proofErr w:type="spellStart"/>
+      <w:r>
+        <w:t>its</w:t>
+      </w:r>
+      <w:proofErr w:type="spellEnd"/>
+      <w:r>
+        <w:t xml:space="preserve"> just a tad bit offset.</w:t>
       </w:r>
     </w:p>
     <w:p/>
@@ -3551,7 +4244,15 @@
     </w:p>
     <w:p>
       <w:r>
-        <w:t>It’s a bit of a mess atm since I am ‘fixing’ some formulas.</w:t>
+        <w:t xml:space="preserve">It’s a bit of a mess </w:t>
+      </w:r>
+      <w:proofErr w:type="spellStart"/>
+      <w:r>
+        <w:t>atm</w:t>
+      </w:r>
+      <w:proofErr w:type="spellEnd"/>
+      <w:r>
+        <w:t xml:space="preserve"> since I am ‘fixing’ some formulas.</w:t>
       </w:r>
       <w:r>
         <w:br/>
@@ -3563,7 +4264,14 @@
       </w:r>
       <w:r>
         <w:br/>
-        <w:t>Its just plotted wrong due to idk what.</w:t>
+      </w:r>
+      <w:proofErr w:type="spellStart"/>
+      <w:r>
+        <w:t>Its</w:t>
+      </w:r>
+      <w:proofErr w:type="spellEnd"/>
+      <w:r>
+        <w:t xml:space="preserve"> just plotted wrong due to idk what.</w:t>
       </w:r>
       <w:r>
         <w:br/>
@@ -3580,7 +4288,15 @@
         <w:t xml:space="preserve">I may see the issue, </w:t>
       </w:r>
       <w:r>
-        <w:t>after a while, the difference between p and pref becomes like 300+ which breaks it of course. So how do I fix it?</w:t>
+        <w:t xml:space="preserve">after a while, the difference between p and </w:t>
+      </w:r>
+      <w:proofErr w:type="spellStart"/>
+      <w:r>
+        <w:t>pref</w:t>
+      </w:r>
+      <w:proofErr w:type="spellEnd"/>
+      <w:r>
+        <w:t xml:space="preserve"> becomes like 300+ which breaks it of course. So how do I fix it?</w:t>
       </w:r>
       <w:r>
         <w:br/>
@@ -3590,7 +4306,15 @@
       </w:r>
       <w:r>
         <w:br/>
-        <w:t xml:space="preserve">I see that I have to do the same for CalculateCAPE(). </w:t>
+        <w:t xml:space="preserve">I see that I have to do the same for </w:t>
+      </w:r>
+      <w:proofErr w:type="spellStart"/>
+      <w:r>
+        <w:t>CalculateCAPE</w:t>
+      </w:r>
+      <w:proofErr w:type="spellEnd"/>
+      <w:r>
+        <w:t xml:space="preserve">(). </w:t>
       </w:r>
       <w:r>
         <w:br/>
@@ -3626,7 +4350,15 @@
       </w:r>
       <w:r>
         <w:br/>
-        <w:t>My LCL and my EL are both just a bit higher which probably causes the difference, lets check another example. 1938 VS 1790</w:t>
+        <w:t xml:space="preserve">My LCL and my EL are both just a bit higher which probably causes the difference, </w:t>
+      </w:r>
+      <w:proofErr w:type="spellStart"/>
+      <w:r>
+        <w:t>lets</w:t>
+      </w:r>
+      <w:proofErr w:type="spellEnd"/>
+      <w:r>
+        <w:t xml:space="preserve"> check another example. 1938 VS 1790</w:t>
       </w:r>
       <w:r>
         <w:br/>
@@ -3634,7 +4366,15 @@
       </w:r>
       <w:r>
         <w:br/>
-        <w:t>On Meteociel (sharpy) it has no LFC?</w:t>
+        <w:t xml:space="preserve">On </w:t>
+      </w:r>
+      <w:proofErr w:type="spellStart"/>
+      <w:r>
+        <w:t>Meteociel</w:t>
+      </w:r>
+      <w:proofErr w:type="spellEnd"/>
+      <w:r>
+        <w:t xml:space="preserve"> (sharpy) it has no LFC?</w:t>
       </w:r>
       <w:r>
         <w:br/>
@@ -3762,7 +4502,23 @@
     </w:p>
     <w:p>
       <w:r>
-        <w:t>Okay I also need the CCL, so lets start making that, it will probably be very easy since it it just the following of the mixed ratio.</w:t>
+        <w:t xml:space="preserve">Okay I also need the CCL, so </w:t>
+      </w:r>
+      <w:proofErr w:type="spellStart"/>
+      <w:r>
+        <w:t>lets</w:t>
+      </w:r>
+      <w:proofErr w:type="spellEnd"/>
+      <w:r>
+        <w:t xml:space="preserve"> start making that, it will probably be very easy since it </w:t>
+      </w:r>
+      <w:proofErr w:type="spellStart"/>
+      <w:r>
+        <w:t>it</w:t>
+      </w:r>
+      <w:proofErr w:type="spellEnd"/>
+      <w:r>
+        <w:t xml:space="preserve"> just the following of the mixed ratio.</w:t>
       </w:r>
       <w:r>
         <w:br/>
@@ -3887,7 +4643,15 @@
       </w:r>
       <w:r>
         <w:br/>
-        <w:t>All particles have the same environment, the environment does not change and it only accounts for winds in the x and z direction (y being up). Meaning wind can not force particles up thus no fronts can.</w:t>
+        <w:t xml:space="preserve">All particles have the same environment, the environment does not change and it only accounts for winds in the x and z direction (y being up). Meaning wind </w:t>
+      </w:r>
+      <w:proofErr w:type="spellStart"/>
+      <w:r>
+        <w:t>can not</w:t>
+      </w:r>
+      <w:proofErr w:type="spellEnd"/>
+      <w:r>
+        <w:t xml:space="preserve"> force particles up thus no fronts can.</w:t>
       </w:r>
       <w:r>
         <w:t xml:space="preserve"> Also they have dissipating in their future work while I want to have this, because I want to spit out particles on the go and not stick with a certain amount.</w:t>
@@ -3907,7 +4671,15 @@
       </w:r>
       <w:r>
         <w:br/>
-        <w:t>I did calculations and if I want a 1024 by 1024 grid with an height of 256 filled with 4 bytes (temp, dew, wind dir, extra) it will be like 1 GB, which is too much.</w:t>
+        <w:t xml:space="preserve">I did calculations and if I want a 1024 by 1024 grid with an height of 256 filled with 4 bytes (temp, dew, wind </w:t>
+      </w:r>
+      <w:proofErr w:type="spellStart"/>
+      <w:r>
+        <w:t>dir</w:t>
+      </w:r>
+      <w:proofErr w:type="spellEnd"/>
+      <w:r>
+        <w:t>, extra) it will be like 1 GB, which is too much.</w:t>
       </w:r>
       <w:r>
         <w:br/>
@@ -3915,7 +4687,14 @@
       </w:r>
       <w:r>
         <w:br/>
-        <w:t>Oeh, I can use 4 and 5 bits from temp and dew to get 9 bits for wind. Having still 4 bytes.</w:t>
+      </w:r>
+      <w:proofErr w:type="spellStart"/>
+      <w:r>
+        <w:t>Oeh</w:t>
+      </w:r>
+      <w:proofErr w:type="spellEnd"/>
+      <w:r>
+        <w:t>, I can use 4 and 5 bits from temp and dew to get 9 bits for wind. Having still 4 bytes.</w:t>
       </w:r>
       <w:r>
         <w:br/>
@@ -3949,7 +4728,15 @@
         </w:numPr>
       </w:pPr>
       <w:r>
-        <w:t>Packing using Zstd or LZ4 libraries, improvement of 2-4 times?</w:t>
+        <w:t xml:space="preserve">Packing using </w:t>
+      </w:r>
+      <w:proofErr w:type="spellStart"/>
+      <w:r>
+        <w:t>Zstd</w:t>
+      </w:r>
+      <w:proofErr w:type="spellEnd"/>
+      <w:r>
+        <w:t xml:space="preserve"> or LZ4 libraries, improvement of 2-4 times?</w:t>
       </w:r>
     </w:p>
     <w:p>
@@ -4174,14 +4961,24 @@
     </w:p>
     <w:p>
       <w:r>
-        <w:t xml:space="preserve">Okay, I did some research, and it appears that I can get the same gpu data in OpenGL by just a simple function, this way I can still do the heavy calculations using CUDA and after that render using OpenGL, brilliant! </w:t>
+        <w:t xml:space="preserve">Okay, I did some research, and it appears that I can get the same </w:t>
+      </w:r>
+      <w:proofErr w:type="spellStart"/>
+      <w:r>
+        <w:t>gpu</w:t>
+      </w:r>
+      <w:proofErr w:type="spellEnd"/>
+      <w:r>
+        <w:t xml:space="preserve"> data in OpenGL by just a simple function, this way I can still do the heavy calculations using CUDA and after that render using OpenGL, brilliant! </w:t>
       </w:r>
       <w:r>
         <w:t xml:space="preserve"> (</w:t>
       </w:r>
+      <w:proofErr w:type="spellStart"/>
       <w:r>
         <w:t>cudaGraphicsGLRegisterBuffer</w:t>
       </w:r>
+      <w:proofErr w:type="spellEnd"/>
       <w:r>
         <w:t>)</w:t>
       </w:r>
@@ -4909,8 +5706,13 @@
       </w:r>
       <w:r>
         <w:br/>
-        <w:t>struct WeatherData</w:t>
-      </w:r>
+        <w:t xml:space="preserve">struct </w:t>
+      </w:r>
+      <w:proofErr w:type="spellStart"/>
+      <w:r>
+        <w:t>WeatherData</w:t>
+      </w:r>
+      <w:proofErr w:type="spellEnd"/>
       <w:r>
         <w:br/>
         <w:t>{</w:t>
@@ -4920,7 +5722,15 @@
       </w:r>
       <w:r>
         <w:tab/>
-        <w:t>Uint64_t packedData;</w:t>
+        <w:t xml:space="preserve">Uint64_t </w:t>
+      </w:r>
+      <w:proofErr w:type="spellStart"/>
+      <w:r>
+        <w:t>packedData</w:t>
+      </w:r>
+      <w:proofErr w:type="spellEnd"/>
+      <w:r>
+        <w:t>;</w:t>
       </w:r>
       <w:r>
         <w:br/>
@@ -4942,7 +5752,14 @@
       </w:r>
       <w:r>
         <w:br/>
-        <w:t>WeatherData map[256 * 256 * 64];</w:t>
+      </w:r>
+      <w:proofErr w:type="spellStart"/>
+      <w:r>
+        <w:t>WeatherData</w:t>
+      </w:r>
+      <w:proofErr w:type="spellEnd"/>
+      <w:r>
+        <w:t xml:space="preserve"> map[256 * 256 * 64];</w:t>
       </w:r>
     </w:p>
     <w:p>
@@ -4953,7 +5770,23 @@
     </w:p>
     <w:p>
       <w:r>
-        <w:t>So we have cpp files and Cu files. I rather have the data stored inside a cpp file, but I don’t think this matters that much and it will not be helpful to the performance?</w:t>
+        <w:t xml:space="preserve">So we have </w:t>
+      </w:r>
+      <w:proofErr w:type="spellStart"/>
+      <w:r>
+        <w:t>cpp</w:t>
+      </w:r>
+      <w:proofErr w:type="spellEnd"/>
+      <w:r>
+        <w:t xml:space="preserve"> files and Cu files. I rather have the data stored inside a </w:t>
+      </w:r>
+      <w:proofErr w:type="spellStart"/>
+      <w:r>
+        <w:t>cpp</w:t>
+      </w:r>
+      <w:proofErr w:type="spellEnd"/>
+      <w:r>
+        <w:t xml:space="preserve"> file, but I don’t think this matters that much and it will not be helpful to the performance?</w:t>
       </w:r>
       <w:r>
         <w:br/>
@@ -5149,7 +5982,15 @@
     </w:p>
     <w:p>
       <w:r>
-        <w:t>Reading this paper, I realize I am no where near done.</w:t>
+        <w:t xml:space="preserve">Reading this paper, I realize I am </w:t>
+      </w:r>
+      <w:proofErr w:type="spellStart"/>
+      <w:r>
+        <w:t>no where</w:t>
+      </w:r>
+      <w:proofErr w:type="spellEnd"/>
+      <w:r>
+        <w:t xml:space="preserve"> near done.</w:t>
       </w:r>
       <w:r>
         <w:br/>
@@ -5280,6 +6121,7 @@
             <w:tcW w:w="4469" w:type="dxa"/>
           </w:tcPr>
           <w:p>
+            <w:proofErr w:type="spellStart"/>
             <w:r>
               <w:t>q</w:t>
             </w:r>
@@ -5290,6 +6132,7 @@
               </w:rPr>
               <w:t>w</w:t>
             </w:r>
+            <w:proofErr w:type="spellEnd"/>
           </w:p>
         </w:tc>
         <w:tc>
@@ -5344,6 +6187,7 @@
             <w:tcW w:w="4469" w:type="dxa"/>
           </w:tcPr>
           <w:p>
+            <w:proofErr w:type="spellStart"/>
             <w:r>
               <w:t>q</w:t>
             </w:r>
@@ -5354,6 +6198,7 @@
               </w:rPr>
               <w:t>r</w:t>
             </w:r>
+            <w:proofErr w:type="spellEnd"/>
           </w:p>
         </w:tc>
         <w:tc>
@@ -5376,6 +6221,7 @@
             <w:tcW w:w="4469" w:type="dxa"/>
           </w:tcPr>
           <w:p>
+            <w:proofErr w:type="spellStart"/>
             <w:r>
               <w:t>q</w:t>
             </w:r>
@@ -5386,6 +6232,7 @@
               </w:rPr>
               <w:t>s</w:t>
             </w:r>
+            <w:proofErr w:type="spellEnd"/>
           </w:p>
         </w:tc>
         <w:tc>
@@ -5426,7 +6273,15 @@
           </w:tcPr>
           <w:p>
             <w:r>
-              <w:t>Mixing ratio of ice (precip)</w:t>
+              <w:t>Mixing ratio of ice (</w:t>
+            </w:r>
+            <w:proofErr w:type="spellStart"/>
+            <w:r>
+              <w:t>precip</w:t>
+            </w:r>
+            <w:proofErr w:type="spellEnd"/>
+            <w:r>
+              <w:t>)</w:t>
             </w:r>
           </w:p>
         </w:tc>
@@ -5511,7 +6366,15 @@
       </w:r>
       <w:r>
         <w:br/>
-        <w:t>Meaning that one voxel will be 40 bytes, I may could subtract one byte out of mixing ratios and others so it will be 32. But we will see.</w:t>
+        <w:t xml:space="preserve">Meaning that one voxel will be 40 bytes, I may could subtract one </w:t>
+      </w:r>
+      <w:proofErr w:type="spellStart"/>
+      <w:r>
+        <w:t>byte</w:t>
+      </w:r>
+      <w:proofErr w:type="spellEnd"/>
+      <w:r>
+        <w:t xml:space="preserve"> out of mixing ratios and others so it will be 32. But we will see.</w:t>
       </w:r>
     </w:p>
     <w:p>
@@ -5678,7 +6541,15 @@
       </w:r>
       <w:r>
         <w:br/>
-        <w:t>I need to know which part goes into the Cu files and which in the cpp.</w:t>
+        <w:t xml:space="preserve">I need to know which part goes into the Cu files and which in the </w:t>
+      </w:r>
+      <w:proofErr w:type="spellStart"/>
+      <w:r>
+        <w:t>cpp</w:t>
+      </w:r>
+      <w:proofErr w:type="spellEnd"/>
+      <w:r>
+        <w:t>.</w:t>
       </w:r>
       <w:r>
         <w:t xml:space="preserve"> </w:t>
@@ -5708,7 +6579,15 @@
         <w:t>Than we just need something to draw. Of course I want to not already make big shaders and stuff, but a debug drawer would be nice.</w:t>
       </w:r>
       <w:r>
-        <w:t xml:space="preserve"> (nvm, got one already)</w:t>
+        <w:t xml:space="preserve"> (</w:t>
+      </w:r>
+      <w:proofErr w:type="spellStart"/>
+      <w:r>
+        <w:t>nvm</w:t>
+      </w:r>
+      <w:proofErr w:type="spellEnd"/>
+      <w:r>
+        <w:t>, got one already)</w:t>
       </w:r>
     </w:p>
     <w:p>
@@ -5736,15 +6615,36 @@
     </w:p>
     <w:p>
       <w:r>
-        <w:t>Okay for adding the data from the file, it works a bit different since we are using an array. I still want to proceed with the array, so we have to manually resize the array if it is too small and trim it when its done.</w:t>
-      </w:r>
-      <w:r>
-        <w:t xml:space="preserve"> Nvm, I just made them vectors and copied that data into the arrays.</w:t>
-      </w:r>
-    </w:p>
-    <w:p>
-      <w:r>
-        <w:t>Its now all fixed, yet, not prepared.</w:t>
+        <w:t xml:space="preserve">Okay for adding the data from the file, it works a bit different since we are using an array. I still want to proceed with the array, so we have to manually resize the array if it is too small and trim it when </w:t>
+      </w:r>
+      <w:proofErr w:type="spellStart"/>
+      <w:r>
+        <w:t>its</w:t>
+      </w:r>
+      <w:proofErr w:type="spellEnd"/>
+      <w:r>
+        <w:t xml:space="preserve"> done.</w:t>
+      </w:r>
+      <w:r>
+        <w:t xml:space="preserve"> </w:t>
+      </w:r>
+      <w:proofErr w:type="spellStart"/>
+      <w:r>
+        <w:t>Nvm</w:t>
+      </w:r>
+      <w:proofErr w:type="spellEnd"/>
+      <w:r>
+        <w:t>, I just made them vectors and copied that data into the arrays.</w:t>
+      </w:r>
+    </w:p>
+    <w:p>
+      <w:proofErr w:type="spellStart"/>
+      <w:r>
+        <w:t>Its</w:t>
+      </w:r>
+      <w:proofErr w:type="spellEnd"/>
+      <w:r>
+        <w:t xml:space="preserve"> now all fixed, yet, not prepared.</w:t>
       </w:r>
     </w:p>
     <w:p>
@@ -5777,8 +6677,13 @@
       </w:r>
     </w:p>
     <w:p>
-      <w:r>
-        <w:t xml:space="preserve">Its going really well, currently adding the code for the microphysics. It’s a lot of writing, but its satisfying. </w:t>
+      <w:proofErr w:type="spellStart"/>
+      <w:r>
+        <w:t>Its</w:t>
+      </w:r>
+      <w:proofErr w:type="spellEnd"/>
+      <w:r>
+        <w:t xml:space="preserve"> going really well, currently adding the code for the microphysics. It’s a lot of writing, but its satisfying. </w:t>
       </w:r>
     </w:p>
     <w:p/>
@@ -5797,7 +6702,15 @@
     </w:p>
     <w:p>
       <w:r>
-        <w:t>Okay, so I guess I can update the falling velocity in the advect part of updating the water content, and not in the microphysics.</w:t>
+        <w:t xml:space="preserve">Okay, so I guess I can update the falling velocity in the </w:t>
+      </w:r>
+      <w:proofErr w:type="spellStart"/>
+      <w:r>
+        <w:t>advect</w:t>
+      </w:r>
+      <w:proofErr w:type="spellEnd"/>
+      <w:r>
+        <w:t xml:space="preserve"> part of updating the water content, and not in the microphysics.</w:t>
       </w:r>
     </w:p>
     <w:p>
@@ -5844,13 +6757,19 @@
         <w:pStyle w:val="Kop1"/>
       </w:pPr>
       <w:r>
-        <w:t>Sunday 30-4-2025</w:t>
-      </w:r>
-    </w:p>
-    <w:p>
-      <w:r>
+        <w:t>Wednesday</w:t>
+      </w:r>
+      <w:r>
+        <w:t xml:space="preserve"> 30-4-2025</w:t>
+      </w:r>
+    </w:p>
+    <w:p>
+      <w:r>
+        <w:rPr>
+          <w:noProof/>
+        </w:rPr>
         <w:drawing>
-          <wp:anchor distT="0" distB="0" distL="114300" distR="114300" simplePos="0" relativeHeight="251686912" behindDoc="1" locked="0" layoutInCell="1" allowOverlap="1" wp14:anchorId="3904F5B1" wp14:editId="2AED1519">
+          <wp:anchor distT="0" distB="0" distL="114300" distR="114300" simplePos="0" relativeHeight="251686912" behindDoc="1" locked="0" layoutInCell="1" allowOverlap="1" wp14:anchorId="3904F5B1" wp14:editId="10D3A126">
             <wp:simplePos x="0" y="0"/>
             <wp:positionH relativeFrom="margin">
               <wp:posOffset>-184150</wp:posOffset>
@@ -5918,20 +6837,84 @@
       </w:r>
       <w:r>
         <w:br/>
-        <w:t>I think I can just reuse the vao and vbo of the line drawer. Hmm, not really</w:t>
-      </w:r>
-      <w:r>
-        <w:br/>
-        <w:t>Would you look at that, its beautifull!</w:t>
-      </w:r>
-      <w:r>
-        <w:br/>
-        <w:t>Had a little problem, but after a small renderdoc session I found out that I need to call attribute pointer for every vao/vbo.</w:t>
-      </w:r>
-    </w:p>
-    <w:p>
-      <w:r>
-        <w:t>Now I want to make an function to create color schemes, so you pass in some colors and it will vary between them based on numbers put in.</w:t>
+        <w:t xml:space="preserve">I think I can just reuse the </w:t>
+      </w:r>
+      <w:proofErr w:type="spellStart"/>
+      <w:r>
+        <w:t>vao</w:t>
+      </w:r>
+      <w:proofErr w:type="spellEnd"/>
+      <w:r>
+        <w:t xml:space="preserve"> and </w:t>
+      </w:r>
+      <w:proofErr w:type="spellStart"/>
+      <w:r>
+        <w:t>vbo</w:t>
+      </w:r>
+      <w:proofErr w:type="spellEnd"/>
+      <w:r>
+        <w:t xml:space="preserve"> of the line drawer. Hmm, not really</w:t>
+      </w:r>
+      <w:r>
+        <w:br/>
+        <w:t xml:space="preserve">Would you look at that, its </w:t>
+      </w:r>
+      <w:proofErr w:type="spellStart"/>
+      <w:r>
+        <w:t>beautifull</w:t>
+      </w:r>
+      <w:proofErr w:type="spellEnd"/>
+      <w:r>
+        <w:t>!</w:t>
+      </w:r>
+      <w:r>
+        <w:br/>
+        <w:t xml:space="preserve">Had a little problem, but after a small </w:t>
+      </w:r>
+      <w:proofErr w:type="spellStart"/>
+      <w:r>
+        <w:t>renderdoc</w:t>
+      </w:r>
+      <w:proofErr w:type="spellEnd"/>
+      <w:r>
+        <w:t xml:space="preserve"> session I found out that I need to call attribute pointer for every </w:t>
+      </w:r>
+      <w:proofErr w:type="spellStart"/>
+      <w:r>
+        <w:t>vao</w:t>
+      </w:r>
+      <w:proofErr w:type="spellEnd"/>
+      <w:r>
+        <w:t>/</w:t>
+      </w:r>
+      <w:proofErr w:type="spellStart"/>
+      <w:r>
+        <w:t>vbo</w:t>
+      </w:r>
+      <w:proofErr w:type="spellEnd"/>
+      <w:r>
+        <w:t>.</w:t>
+      </w:r>
+    </w:p>
+    <w:p>
+      <w:r>
+        <w:t xml:space="preserve">Now I want to make an function to create </w:t>
+      </w:r>
+      <w:proofErr w:type="spellStart"/>
+      <w:r>
+        <w:t>color</w:t>
+      </w:r>
+      <w:proofErr w:type="spellEnd"/>
+      <w:r>
+        <w:t xml:space="preserve"> schemes, so you pass in some </w:t>
+      </w:r>
+      <w:proofErr w:type="spellStart"/>
+      <w:r>
+        <w:t>colors</w:t>
+      </w:r>
+      <w:proofErr w:type="spellEnd"/>
+      <w:r>
+        <w:t xml:space="preserve"> and it will vary between them based on numbers put in.</w:t>
       </w:r>
       <w:r>
         <w:br/>
@@ -5940,9 +6923,12 @@
     <w:p/>
     <w:p>
       <w:r>
+        <w:rPr>
+          <w:noProof/>
+        </w:rPr>
         <w:lastRenderedPageBreak/>
         <w:drawing>
-          <wp:anchor distT="0" distB="0" distL="114300" distR="114300" simplePos="0" relativeHeight="251687936" behindDoc="1" locked="0" layoutInCell="1" allowOverlap="1" wp14:anchorId="46D6F2FA" wp14:editId="4C0BE25A">
+          <wp:anchor distT="0" distB="0" distL="114300" distR="114300" simplePos="0" relativeHeight="251687936" behindDoc="1" locked="0" layoutInCell="1" allowOverlap="1" wp14:anchorId="46D6F2FA" wp14:editId="3A0299D0">
             <wp:simplePos x="0" y="0"/>
             <wp:positionH relativeFrom="page">
               <wp:align>left</wp:align>
@@ -6014,17 +7000,65 @@
       </w:r>
       <w:r>
         <w:br/>
-        <w:t>Probably going to store color schemes in a map.</w:t>
-      </w:r>
-      <w:r>
-        <w:br/>
-        <w:t>It stores a color with a number. So:</w:t>
-      </w:r>
-      <w:r>
-        <w:br/>
-      </w:r>
-      <w:r>
-        <w:t>std::unordered_map&lt;const char*, std::pair&lt;int, glm::vec3&gt;&gt; colorSchemes;</w:t>
+        <w:t xml:space="preserve">Probably going to store </w:t>
+      </w:r>
+      <w:proofErr w:type="spellStart"/>
+      <w:r>
+        <w:t>color</w:t>
+      </w:r>
+      <w:proofErr w:type="spellEnd"/>
+      <w:r>
+        <w:t xml:space="preserve"> schemes in a map.</w:t>
+      </w:r>
+      <w:r>
+        <w:br/>
+        <w:t xml:space="preserve">It stores a </w:t>
+      </w:r>
+      <w:proofErr w:type="spellStart"/>
+      <w:r>
+        <w:t>color</w:t>
+      </w:r>
+      <w:proofErr w:type="spellEnd"/>
+      <w:r>
+        <w:t xml:space="preserve"> with a number. So:</w:t>
+      </w:r>
+      <w:r>
+        <w:br/>
+      </w:r>
+      <w:r>
+        <w:t>std::</w:t>
+      </w:r>
+      <w:proofErr w:type="spellStart"/>
+      <w:r>
+        <w:t>unordered_map</w:t>
+      </w:r>
+      <w:proofErr w:type="spellEnd"/>
+      <w:r>
+        <w:t>&lt;</w:t>
+      </w:r>
+      <w:proofErr w:type="spellStart"/>
+      <w:r>
+        <w:t>const</w:t>
+      </w:r>
+      <w:proofErr w:type="spellEnd"/>
+      <w:r>
+        <w:t xml:space="preserve"> char*, std::pair&lt;int, </w:t>
+      </w:r>
+      <w:proofErr w:type="spellStart"/>
+      <w:r>
+        <w:t>glm</w:t>
+      </w:r>
+      <w:proofErr w:type="spellEnd"/>
+      <w:r>
+        <w:t xml:space="preserve">::vec3&gt;&gt; </w:t>
+      </w:r>
+      <w:proofErr w:type="spellStart"/>
+      <w:r>
+        <w:t>colorSchemes</w:t>
+      </w:r>
+      <w:proofErr w:type="spellEnd"/>
+      <w:r>
+        <w:t>;</w:t>
       </w:r>
       <w:r>
         <w:br/>
@@ -6032,7 +7066,15 @@
       </w:r>
       <w:r>
         <w:br/>
-        <w:t>For now I won’t store anything, so to retrieve a color it will always calculate.</w:t>
+        <w:t xml:space="preserve">For now I won’t store anything, so to retrieve a </w:t>
+      </w:r>
+      <w:proofErr w:type="spellStart"/>
+      <w:r>
+        <w:t>color</w:t>
+      </w:r>
+      <w:proofErr w:type="spellEnd"/>
+      <w:r>
+        <w:t xml:space="preserve"> it will always calculate.</w:t>
       </w:r>
       <w:r>
         <w:br/>
@@ -6041,7 +7083,15 @@
     </w:p>
     <w:p>
       <w:r>
-        <w:t>Yeah, just going to create a color file.</w:t>
+        <w:t xml:space="preserve">Yeah, just going to create a </w:t>
+      </w:r>
+      <w:proofErr w:type="spellStart"/>
+      <w:r>
+        <w:t>color</w:t>
+      </w:r>
+      <w:proofErr w:type="spellEnd"/>
+      <w:r>
+        <w:t xml:space="preserve"> file.</w:t>
       </w:r>
       <w:r>
         <w:br/>
@@ -6049,7 +7099,15 @@
       </w:r>
       <w:r>
         <w:br/>
-        <w:t>Also I should probably use string instead of const char*</w:t>
+        <w:t xml:space="preserve">Also I should probably use string instead of </w:t>
+      </w:r>
+      <w:proofErr w:type="spellStart"/>
+      <w:r>
+        <w:t>const</w:t>
+      </w:r>
+      <w:proofErr w:type="spellEnd"/>
+      <w:r>
+        <w:t xml:space="preserve"> char*</w:t>
       </w:r>
     </w:p>
     <w:p>
@@ -6058,7 +7116,2049 @@
       </w:r>
       <w:r>
         <w:br/>
-        <w:t xml:space="preserve">On load (first time I try to grab a number after inserting the last number) I will use std::sort to sort numbers from low to high, and use std::lower_bound to retrieve the iterator that’s just above. </w:t>
+        <w:t>On load (first time I try to grab a number after inserting the last number) I will use std::sort to sort numbers from low to high, and use std::</w:t>
+      </w:r>
+      <w:proofErr w:type="spellStart"/>
+      <w:r>
+        <w:t>lower_bound</w:t>
+      </w:r>
+      <w:proofErr w:type="spellEnd"/>
+      <w:r>
+        <w:t xml:space="preserve"> to retrieve the iterator that’s just above. </w:t>
+      </w:r>
+    </w:p>
+    <w:p>
+      <w:r>
+        <w:t>Wait, (it – 1)-&gt;number works??? Wow, did not expect that.</w:t>
+      </w:r>
+      <w:r>
+        <w:br/>
+        <w:t xml:space="preserve">Shall I just add </w:t>
+      </w:r>
+      <w:proofErr w:type="spellStart"/>
+      <w:r>
+        <w:t>colors</w:t>
+      </w:r>
+      <w:proofErr w:type="spellEnd"/>
+      <w:r>
+        <w:t xml:space="preserve"> class object to </w:t>
+      </w:r>
+      <w:proofErr w:type="spellStart"/>
+      <w:r>
+        <w:t>debug_renderer</w:t>
+      </w:r>
+      <w:proofErr w:type="spellEnd"/>
+      <w:r>
+        <w:t>?</w:t>
+      </w:r>
+    </w:p>
+    <w:p/>
+    <w:p>
+      <w:pPr>
+        <w:pStyle w:val="Kop1"/>
+      </w:pPr>
+      <w:r>
+        <w:t>Thursday 1-5-2025</w:t>
+      </w:r>
+    </w:p>
+    <w:p>
+      <w:r>
+        <w:t>Alright, I am just going to add the functions for the ground now.</w:t>
+      </w:r>
+    </w:p>
+    <w:p>
+      <w:r>
+        <w:t>Wait, I think the ground does not only store water content, but also snow and ice??</w:t>
+      </w:r>
+      <w:r>
+        <w:br/>
+        <w:t>Yup, we have to change some things…</w:t>
+      </w:r>
+      <w:r>
+        <w:br/>
+        <w:t>Wait, we don’t? I am so confused. Subsurface water content has to be stored.</w:t>
+      </w:r>
+      <w:r>
+        <w:br/>
+        <w:t xml:space="preserve">We only need the other ones for the Diurnal cycle </w:t>
+      </w:r>
+      <w:proofErr w:type="spellStart"/>
+      <w:r>
+        <w:t>nvm</w:t>
+      </w:r>
+      <w:proofErr w:type="spellEnd"/>
+      <w:r>
+        <w:t xml:space="preserve">, the paper says we need to </w:t>
+      </w:r>
+      <w:proofErr w:type="spellStart"/>
+      <w:r>
+        <w:t>advect</w:t>
+      </w:r>
+      <w:proofErr w:type="spellEnd"/>
+      <w:r>
+        <w:t xml:space="preserve"> and diffuse the water quantities.</w:t>
+      </w:r>
+      <w:r>
+        <w:br/>
+        <w:t>So, I removed the Lc that I stored (which was unnecessary since I already calculate it each step apart) and added the subsurface water content.</w:t>
+      </w:r>
+      <w:r>
+        <w:br/>
+        <w:t xml:space="preserve">The ground advection and diffusion are the same as just updating the microphysics. </w:t>
+      </w:r>
+      <w:r>
+        <w:br/>
+        <w:t xml:space="preserve">I need to transfer over some of the variables needed for the </w:t>
+      </w:r>
+      <w:proofErr w:type="spellStart"/>
+      <w:r>
+        <w:t>mircrophysics</w:t>
+      </w:r>
+      <w:proofErr w:type="spellEnd"/>
+      <w:r>
+        <w:t>, like GR or GS</w:t>
+      </w:r>
+      <w:r>
+        <w:br/>
+        <w:t>Do I need to recalculate them?</w:t>
+      </w:r>
+      <w:r>
+        <w:br/>
+        <w:t>Yeah I guess.</w:t>
+      </w:r>
+    </w:p>
+    <w:p/>
+    <w:p>
+      <w:pPr>
+        <w:pStyle w:val="Kop1"/>
+      </w:pPr>
+      <w:r>
+        <w:t>Friday 2-5-2025</w:t>
+      </w:r>
+    </w:p>
+    <w:p>
+      <w:r>
+        <w:t>Oh no, I should also store time since the ground was last wet?</w:t>
+      </w:r>
+      <w:r>
+        <w:br/>
+        <w:t>Ground calculations are done, now I want to do the initializations.</w:t>
+      </w:r>
+      <w:r>
+        <w:br/>
+      </w:r>
+      <w:r>
+        <w:t xml:space="preserve">Wait, currently my size is 64 x 64 of 1 meter, meaning it goes 64 meters high… </w:t>
+      </w:r>
+      <w:r>
+        <w:br/>
+      </w:r>
+      <w:proofErr w:type="spellStart"/>
+      <w:r>
+        <w:t>Lets</w:t>
+      </w:r>
+      <w:proofErr w:type="spellEnd"/>
+      <w:r>
+        <w:t xml:space="preserve"> increase that to 10 meter for now.</w:t>
+      </w:r>
+      <w:r>
+        <w:br/>
+        <w:t>I think that is done.</w:t>
+      </w:r>
+    </w:p>
+    <w:p>
+      <w:r>
+        <w:lastRenderedPageBreak/>
+        <w:t xml:space="preserve">Okay for the </w:t>
+      </w:r>
+      <w:proofErr w:type="spellStart"/>
+      <w:r>
+        <w:t>Xj</w:t>
+      </w:r>
+      <w:proofErr w:type="spellEnd"/>
+      <w:r>
+        <w:t>, I should use delta, meaning previous value minus new one to get heat from phase transition, it does make sense.</w:t>
+      </w:r>
+      <w:r>
+        <w:br/>
+        <w:t>Ah I made a mistake, I used function 64 to calculate ground temp, but I should first use 63.</w:t>
+      </w:r>
+    </w:p>
+    <w:p>
+      <w:r>
+        <w:t xml:space="preserve">Okay but why do they call it </w:t>
+      </w:r>
+      <w:proofErr w:type="spellStart"/>
+      <w:r>
+        <w:t>Tdaily</w:t>
+      </w:r>
+      <w:proofErr w:type="spellEnd"/>
+      <w:r>
+        <w:t xml:space="preserve">? </w:t>
+      </w:r>
+      <w:proofErr w:type="spellStart"/>
+      <w:r>
+        <w:t>Its</w:t>
+      </w:r>
+      <w:proofErr w:type="spellEnd"/>
+      <w:r>
+        <w:t xml:space="preserve"> so strange.</w:t>
+      </w:r>
+      <w:r>
+        <w:br/>
+        <w:t xml:space="preserve">Oh </w:t>
+      </w:r>
+      <w:proofErr w:type="spellStart"/>
+      <w:r>
+        <w:t>oh</w:t>
+      </w:r>
+      <w:proofErr w:type="spellEnd"/>
+      <w:r>
+        <w:t>, I think I have a memory leak. Yeah, random things are crashing.</w:t>
+      </w:r>
+      <w:r>
+        <w:br/>
+        <w:t>Let me restart my laptop.</w:t>
+      </w:r>
+      <w:r>
+        <w:br/>
+        <w:t>That did not help, hmmm.</w:t>
+      </w:r>
+    </w:p>
+    <w:p>
+      <w:r>
+        <w:t xml:space="preserve">Yup, found the memory leaks. Many times I did not call delete </w:t>
+      </w:r>
+      <w:r>
+        <w:rPr>
+          <mc:AlternateContent>
+            <mc:Choice Requires="w16se"/>
+            <mc:Fallback>
+              <w:rFonts w:ascii="Segoe UI Emoji" w:eastAsia="Segoe UI Emoji" w:hAnsi="Segoe UI Emoji" w:cs="Segoe UI Emoji"/>
+            </mc:Fallback>
+          </mc:AlternateContent>
+        </w:rPr>
+        <mc:AlternateContent>
+          <mc:Choice Requires="w16se">
+            <w16se:symEx w16se:font="Segoe UI Emoji" w16se:char="1F610"/>
+          </mc:Choice>
+          <mc:Fallback>
+            <w:t>😐</w:t>
+          </mc:Fallback>
+        </mc:AlternateContent>
+      </w:r>
+      <w:r>
+        <w:br/>
+        <w:t>Still the error, try to restart again?</w:t>
+      </w:r>
+      <w:r>
+        <w:br/>
+        <w:t>I ran a memory dump and I have many leaks, so what I will do is use smart pointers.</w:t>
+      </w:r>
+    </w:p>
+    <w:p>
+      <w:r>
+        <w:t>Still crashes…</w:t>
+      </w:r>
+      <w:r>
+        <w:br/>
+        <w:t>I get errors deleting smart pointers? Dude, what is going on?</w:t>
+      </w:r>
+    </w:p>
+    <w:p/>
+    <w:p>
+      <w:pPr>
+        <w:pStyle w:val="Kop1"/>
+      </w:pPr>
+      <w:r>
+        <w:t>Saturday 3-5-2025</w:t>
+      </w:r>
+    </w:p>
+    <w:p>
+      <w:r>
+        <w:rPr>
+          <w:noProof/>
+        </w:rPr>
+        <w:drawing>
+          <wp:anchor distT="0" distB="0" distL="114300" distR="114300" simplePos="0" relativeHeight="251688960" behindDoc="1" locked="0" layoutInCell="1" allowOverlap="1" wp14:anchorId="0EE64812" wp14:editId="0DEC1066">
+            <wp:simplePos x="0" y="0"/>
+            <wp:positionH relativeFrom="page">
+              <wp:align>left</wp:align>
+            </wp:positionH>
+            <wp:positionV relativeFrom="paragraph">
+              <wp:posOffset>2207260</wp:posOffset>
+            </wp:positionV>
+            <wp:extent cx="3352800" cy="434975"/>
+            <wp:effectExtent l="0" t="0" r="0" b="3175"/>
+            <wp:wrapTight wrapText="bothSides">
+              <wp:wrapPolygon edited="0">
+                <wp:start x="0" y="0"/>
+                <wp:lineTo x="0" y="20812"/>
+                <wp:lineTo x="21477" y="20812"/>
+                <wp:lineTo x="21477" y="0"/>
+                <wp:lineTo x="0" y="0"/>
+              </wp:wrapPolygon>
+            </wp:wrapTight>
+            <wp:docPr id="1774102741" name="Afbeelding 1" descr="Afbeelding met tekst, schermopname, Lettertype&#10;&#10;Door AI gegenereerde inhoud is mogelijk onjuist."/>
+            <wp:cNvGraphicFramePr>
+              <a:graphicFrameLocks xmlns:a="http://schemas.openxmlformats.org/drawingml/2006/main" noChangeAspect="1"/>
+            </wp:cNvGraphicFramePr>
+            <a:graphic xmlns:a="http://schemas.openxmlformats.org/drawingml/2006/main">
+              <a:graphicData uri="http://schemas.openxmlformats.org/drawingml/2006/picture">
+                <pic:pic xmlns:pic="http://schemas.openxmlformats.org/drawingml/2006/picture">
+                  <pic:nvPicPr>
+                    <pic:cNvPr id="1774102741" name="Afbeelding 1" descr="Afbeelding met tekst, schermopname, Lettertype&#10;&#10;Door AI gegenereerde inhoud is mogelijk onjuist."/>
+                    <pic:cNvPicPr/>
+                  </pic:nvPicPr>
+                  <pic:blipFill>
+                    <a:blip r:embed="rId75">
+                      <a:extLst>
+                        <a:ext uri="{28A0092B-C50C-407E-A947-70E740481C1C}">
+                          <a14:useLocalDpi xmlns:a14="http://schemas.microsoft.com/office/drawing/2010/main" val="0"/>
+                        </a:ext>
+                      </a:extLst>
+                    </a:blip>
+                    <a:stretch>
+                      <a:fillRect/>
+                    </a:stretch>
+                  </pic:blipFill>
+                  <pic:spPr>
+                    <a:xfrm>
+                      <a:off x="0" y="0"/>
+                      <a:ext cx="3352800" cy="434975"/>
+                    </a:xfrm>
+                    <a:prstGeom prst="rect">
+                      <a:avLst/>
+                    </a:prstGeom>
+                  </pic:spPr>
+                </pic:pic>
+              </a:graphicData>
+            </a:graphic>
+            <wp14:sizeRelH relativeFrom="margin">
+              <wp14:pctWidth>0</wp14:pctWidth>
+            </wp14:sizeRelH>
+            <wp14:sizeRelV relativeFrom="margin">
+              <wp14:pctHeight>0</wp14:pctHeight>
+            </wp14:sizeRelV>
+          </wp:anchor>
+        </w:drawing>
+      </w:r>
+      <w:r>
+        <w:t>Its debugging time.</w:t>
+      </w:r>
+      <w:r>
+        <w:br/>
+        <w:t>Thought of something: I don’t need smart pointers or news, I can just initialize as an array in one part.</w:t>
+      </w:r>
+      <w:r>
+        <w:br/>
+        <w:t xml:space="preserve">Okay the function is too big, since </w:t>
+      </w:r>
+      <w:proofErr w:type="spellStart"/>
+      <w:r>
+        <w:t>its</w:t>
+      </w:r>
+      <w:proofErr w:type="spellEnd"/>
+      <w:r>
+        <w:t xml:space="preserve"> just an </w:t>
+      </w:r>
+      <w:proofErr w:type="spellStart"/>
+      <w:r>
+        <w:t>init</w:t>
+      </w:r>
+      <w:proofErr w:type="spellEnd"/>
+      <w:r>
+        <w:t>, I can use vectors.</w:t>
+      </w:r>
+      <w:r>
+        <w:br/>
+      </w:r>
+      <w:proofErr w:type="spellStart"/>
+      <w:r>
+        <w:t>Pffff</w:t>
+      </w:r>
+      <w:proofErr w:type="spellEnd"/>
+      <w:r>
+        <w:t>.</w:t>
+      </w:r>
+      <w:r>
+        <w:br/>
+        <w:t>Where is the leak</w:t>
+      </w:r>
+      <w:r>
+        <w:br/>
+        <w:t>The problem lies within environment();</w:t>
+      </w:r>
+      <w:r>
+        <w:br/>
+        <w:t xml:space="preserve">Oh </w:t>
+      </w:r>
+      <w:proofErr w:type="spellStart"/>
+      <w:r>
+        <w:t>its</w:t>
+      </w:r>
+      <w:proofErr w:type="spellEnd"/>
+      <w:r>
+        <w:t xml:space="preserve"> because it’s a system, so it lies in update()?</w:t>
+      </w:r>
+      <w:r>
+        <w:br/>
+        <w:t>Okay in the second half.</w:t>
+      </w:r>
+      <w:r>
+        <w:br/>
+        <w:t>Made ‘pressures’ on the heap, it works now?</w:t>
+      </w:r>
+      <w:r>
+        <w:br/>
+        <w:t>Yeah I guess.</w:t>
+      </w:r>
+      <w:r>
+        <w:br/>
+        <w:t>It works!</w:t>
+      </w:r>
+    </w:p>
+    <w:p>
+      <w:r>
+        <w:t>Ah yes, if 0 multiply by 0. Absolutely perfect.</w:t>
+      </w:r>
+      <w:r>
+        <w:br/>
+        <w:t xml:space="preserve">Found it, it should have been </w:t>
+      </w:r>
+      <w:proofErr w:type="spellStart"/>
+      <w:r>
+        <w:t>qrs</w:t>
+      </w:r>
+      <w:proofErr w:type="spellEnd"/>
+      <w:r>
+        <w:t xml:space="preserve"> instead of </w:t>
+      </w:r>
+      <w:proofErr w:type="spellStart"/>
+      <w:r>
+        <w:t>qgr</w:t>
+      </w:r>
+      <w:proofErr w:type="spellEnd"/>
+      <w:r>
+        <w:t>.</w:t>
+      </w:r>
+      <w:r>
+        <w:br/>
+        <w:t>Also meaning I should probably exclude it from the other j’s</w:t>
+      </w:r>
+    </w:p>
+    <w:p>
+      <w:r>
+        <w:t xml:space="preserve">Randomly </w:t>
+      </w:r>
+      <w:proofErr w:type="spellStart"/>
+      <w:r>
+        <w:t>hourOfSunrise</w:t>
+      </w:r>
+      <w:proofErr w:type="spellEnd"/>
+      <w:r>
+        <w:t xml:space="preserve"> and </w:t>
+      </w:r>
+      <w:proofErr w:type="spellStart"/>
+      <w:r>
+        <w:t>dayLightDuration</w:t>
+      </w:r>
+      <w:proofErr w:type="spellEnd"/>
+      <w:r>
+        <w:t xml:space="preserve"> get r</w:t>
+      </w:r>
+      <w:r>
+        <w:t>eset after 1 loop? This while they are member variables?</w:t>
+      </w:r>
+      <w:r>
+        <w:br/>
+        <w:t>Found an out of bound error with updating microphysics of the ground; I was using previous and next y while there is no y…</w:t>
+      </w:r>
+      <w:r>
+        <w:br/>
+        <w:t>Found another one.</w:t>
+      </w:r>
+      <w:r>
+        <w:br/>
+        <w:t>YES, that fixed the set to 0!</w:t>
+      </w:r>
+    </w:p>
+    <w:p>
+      <w:r>
+        <w:t>Currently nan hunting, found out Qi is &lt; 0, which should be impossible.</w:t>
+      </w:r>
+    </w:p>
+    <w:p>
+      <w:r>
+        <w:t xml:space="preserve">No way, it works?! I just maxed Qi to 0, so if its minus, it just sets to 0, </w:t>
+      </w:r>
+      <w:proofErr w:type="spellStart"/>
+      <w:r>
+        <w:t>its</w:t>
+      </w:r>
+      <w:proofErr w:type="spellEnd"/>
+      <w:r>
+        <w:t xml:space="preserve"> not perfect, but for now it works.</w:t>
+      </w:r>
+      <w:r>
+        <w:br/>
+        <w:t>Let me make debug views for all other parameters.</w:t>
+      </w:r>
+    </w:p>
+    <w:p>
+      <w:r>
+        <w:t>Yeah, crazy that it works</w:t>
+      </w:r>
+    </w:p>
+    <w:p>
+      <w:pPr>
+        <w:pStyle w:val="Kop1"/>
+      </w:pPr>
+      <w:r>
+        <w:lastRenderedPageBreak/>
+        <w:t>Sunday 4-5-2025</w:t>
+      </w:r>
+    </w:p>
+    <w:p>
+      <w:r>
+        <w:rPr>
+          <w:noProof/>
+        </w:rPr>
+        <w:drawing>
+          <wp:anchor distT="0" distB="0" distL="114300" distR="114300" simplePos="0" relativeHeight="251689984" behindDoc="1" locked="0" layoutInCell="1" allowOverlap="1" wp14:anchorId="70745D51" wp14:editId="15A24229">
+            <wp:simplePos x="0" y="0"/>
+            <wp:positionH relativeFrom="column">
+              <wp:posOffset>-137795</wp:posOffset>
+            </wp:positionH>
+            <wp:positionV relativeFrom="paragraph">
+              <wp:posOffset>295910</wp:posOffset>
+            </wp:positionV>
+            <wp:extent cx="2946400" cy="1124712"/>
+            <wp:effectExtent l="0" t="0" r="6350" b="0"/>
+            <wp:wrapTight wrapText="bothSides">
+              <wp:wrapPolygon edited="0">
+                <wp:start x="0" y="0"/>
+                <wp:lineTo x="0" y="21222"/>
+                <wp:lineTo x="21507" y="21222"/>
+                <wp:lineTo x="21507" y="0"/>
+                <wp:lineTo x="0" y="0"/>
+              </wp:wrapPolygon>
+            </wp:wrapTight>
+            <wp:docPr id="776181583" name="Afbeelding 1" descr="Afbeelding met tekst, schermopname, Lettertype, ontwerp&#10;&#10;Door AI gegenereerde inhoud is mogelijk onjuist."/>
+            <wp:cNvGraphicFramePr>
+              <a:graphicFrameLocks xmlns:a="http://schemas.openxmlformats.org/drawingml/2006/main" noChangeAspect="1"/>
+            </wp:cNvGraphicFramePr>
+            <a:graphic xmlns:a="http://schemas.openxmlformats.org/drawingml/2006/main">
+              <a:graphicData uri="http://schemas.openxmlformats.org/drawingml/2006/picture">
+                <pic:pic xmlns:pic="http://schemas.openxmlformats.org/drawingml/2006/picture">
+                  <pic:nvPicPr>
+                    <pic:cNvPr id="776181583" name="Afbeelding 1" descr="Afbeelding met tekst, schermopname, Lettertype, ontwerp&#10;&#10;Door AI gegenereerde inhoud is mogelijk onjuist."/>
+                    <pic:cNvPicPr>
+                      <a:picLocks noChangeAspect="1" noChangeArrowheads="1"/>
+                    </pic:cNvPicPr>
+                  </pic:nvPicPr>
+                  <pic:blipFill>
+                    <a:blip r:embed="rId76" cstate="print">
+                      <a:extLst>
+                        <a:ext uri="{28A0092B-C50C-407E-A947-70E740481C1C}">
+                          <a14:useLocalDpi xmlns:a14="http://schemas.microsoft.com/office/drawing/2010/main" val="0"/>
+                        </a:ext>
+                      </a:extLst>
+                    </a:blip>
+                    <a:srcRect/>
+                    <a:stretch>
+                      <a:fillRect/>
+                    </a:stretch>
+                  </pic:blipFill>
+                  <pic:spPr bwMode="auto">
+                    <a:xfrm>
+                      <a:off x="0" y="0"/>
+                      <a:ext cx="2946400" cy="1124712"/>
+                    </a:xfrm>
+                    <a:prstGeom prst="rect">
+                      <a:avLst/>
+                    </a:prstGeom>
+                    <a:noFill/>
+                    <a:ln>
+                      <a:noFill/>
+                    </a:ln>
+                  </pic:spPr>
+                </pic:pic>
+              </a:graphicData>
+            </a:graphic>
+          </wp:anchor>
+        </w:drawing>
+      </w:r>
+      <w:r>
+        <w:t>Btw, here is the new version of how I store everything, and also a video of the current program (sort of working)</w:t>
+      </w:r>
+      <w:r>
+        <w:t xml:space="preserve"> </w:t>
+      </w:r>
+      <w:r>
+        <w:object w:dxaOrig="3000" w:dyaOrig="830" w14:anchorId="59818594">
+          <v:shapetype id="_x0000_t75" coordsize="21600,21600" o:spt="75" o:preferrelative="t" path="m@4@5l@4@11@9@11@9@5xe" filled="f" stroked="f">
+            <v:stroke joinstyle="miter"/>
+            <v:formulas>
+              <v:f eqn="if lineDrawn pixelLineWidth 0"/>
+              <v:f eqn="sum @0 1 0"/>
+              <v:f eqn="sum 0 0 @1"/>
+              <v:f eqn="prod @2 1 2"/>
+              <v:f eqn="prod @3 21600 pixelWidth"/>
+              <v:f eqn="prod @3 21600 pixelHeight"/>
+              <v:f eqn="sum @0 0 1"/>
+              <v:f eqn="prod @6 1 2"/>
+              <v:f eqn="prod @7 21600 pixelWidth"/>
+              <v:f eqn="sum @8 21600 0"/>
+              <v:f eqn="prod @7 21600 pixelHeight"/>
+              <v:f eqn="sum @10 21600 0"/>
+            </v:formulas>
+            <v:path o:extrusionok="f" gradientshapeok="t" o:connecttype="rect"/>
+            <o:lock v:ext="edit" aspectratio="t"/>
+          </v:shapetype>
+          <v:shape id="_x0000_i1025" type="#_x0000_t75" style="width:149.85pt;height:41.6pt" o:ole="">
+            <v:imagedata r:id="rId77" o:title=""/>
+          </v:shape>
+          <o:OLEObject Type="Embed" ProgID="Package" ShapeID="_x0000_i1025" DrawAspect="Content" ObjectID="_1809281662" r:id="rId78"/>
+        </w:object>
+      </w:r>
+    </w:p>
+    <w:p/>
+    <w:p/>
+    <w:p>
+      <w:r>
+        <w:t xml:space="preserve">Many things to fix, but first I want to match the </w:t>
+      </w:r>
+      <w:proofErr w:type="spellStart"/>
+      <w:r>
+        <w:t>advecting</w:t>
+      </w:r>
+      <w:proofErr w:type="spellEnd"/>
+      <w:r>
+        <w:t xml:space="preserve"> to the size of voxels.</w:t>
+      </w:r>
+    </w:p>
+    <w:p>
+      <w:r>
+        <w:t>I think some of the formulas I use, use kelvin instead of Celsius.</w:t>
+      </w:r>
+      <w:r>
+        <w:br/>
+        <w:t>Yeah I believe I need to transfer everything to kelvin except for 2 formulas.</w:t>
+      </w:r>
+      <w:r>
+        <w:br/>
+        <w:t xml:space="preserve">Oh wow, </w:t>
+      </w:r>
+      <w:proofErr w:type="spellStart"/>
+      <w:r>
+        <w:t>pottemp</w:t>
+      </w:r>
+      <w:proofErr w:type="spellEnd"/>
+      <w:r>
+        <w:t xml:space="preserve"> was not even filled up fully, that’s why there was a noticeable line.</w:t>
+      </w:r>
+    </w:p>
+    <w:p>
+      <w:r>
+        <w:t>Huh, same with velocity field and also the Qv, but the Qv is filled up after 1024 until 2048?</w:t>
+      </w:r>
+    </w:p>
+    <w:p>
+      <w:proofErr w:type="spellStart"/>
+      <w:r>
+        <w:t>Ohh</w:t>
+      </w:r>
+      <w:proofErr w:type="spellEnd"/>
+      <w:r>
+        <w:t xml:space="preserve">, I had to set the </w:t>
+      </w:r>
+      <w:proofErr w:type="spellStart"/>
+      <w:r>
+        <w:t>memcpy</w:t>
+      </w:r>
+      <w:proofErr w:type="spellEnd"/>
+      <w:r>
+        <w:t xml:space="preserve"> size to * </w:t>
+      </w:r>
+      <w:proofErr w:type="spellStart"/>
+      <w:r>
+        <w:t>sizeof</w:t>
+      </w:r>
+      <w:proofErr w:type="spellEnd"/>
+      <w:r>
+        <w:t>(…) duh.</w:t>
+      </w:r>
+      <w:r>
+        <w:br/>
+        <w:t>Okay next.</w:t>
+      </w:r>
+      <w:r>
+        <w:br/>
+      </w:r>
+      <w:proofErr w:type="spellStart"/>
+      <w:r>
+        <w:t>Lets</w:t>
+      </w:r>
+      <w:proofErr w:type="spellEnd"/>
+      <w:r>
+        <w:t xml:space="preserve"> add the calculations of the buoyancy.</w:t>
+      </w:r>
+      <w:r>
+        <w:br/>
+        <w:t>nice. Still very unstable though, meaning after a while it goes wild.</w:t>
+      </w:r>
+    </w:p>
+    <w:p>
+      <w:r>
+        <w:t xml:space="preserve">So many </w:t>
+      </w:r>
+      <w:r>
+        <w:t>issues I need to fix.</w:t>
+      </w:r>
+      <w:r>
+        <w:br/>
+        <w:t xml:space="preserve">MI is a problem for real. </w:t>
+      </w:r>
+    </w:p>
+    <w:p/>
+    <w:p>
+      <w:pPr>
+        <w:pStyle w:val="Kop1"/>
+      </w:pPr>
+      <w:r>
+        <w:t>Monday 5-5-2025</w:t>
+      </w:r>
+    </w:p>
+    <w:p>
+      <w:r>
+        <w:t>Last day before the new block start, meaning less time for this.</w:t>
+      </w:r>
+      <w:r>
+        <w:br/>
+        <w:t>But I want to start with adding the water transfer in the ground and vorticity confinement.</w:t>
+      </w:r>
+    </w:p>
+    <w:p>
+      <w:r>
+        <w:t>We also need to fix the boundary issues.</w:t>
+      </w:r>
+      <w:r>
+        <w:br/>
+        <w:t>Oh wait the water transfer in the ground in the sky update means we also update the ground in the microphysics update.</w:t>
+      </w:r>
+    </w:p>
+    <w:p>
+      <w:r>
+        <w:t>Okay, so I guess for the vorticity confinement “</w:t>
+      </w:r>
+      <w:r>
+        <w:t>to avoid nonphysical damping caused by numerical dissipation</w:t>
+      </w:r>
+      <w:r>
+        <w:t>” Meaning we prevent numerical errors causing dissipation of velocity by enhancing forcing structure.</w:t>
+      </w:r>
+      <w:r>
+        <w:br/>
+        <w:t xml:space="preserve">we use the </w:t>
+      </w:r>
+      <w:proofErr w:type="spellStart"/>
+      <w:r>
+        <w:t>formule</w:t>
+      </w:r>
+      <w:proofErr w:type="spellEnd"/>
+      <w:r>
+        <w:t xml:space="preserve"> k = -ň*ω. </w:t>
+      </w:r>
+      <w:r>
+        <w:br/>
+        <w:t>This I then will add at the ‘extra forces’ part of the velocity formula (f).</w:t>
+      </w:r>
+    </w:p>
+    <w:p>
+      <w:r>
+        <w:t xml:space="preserve">I think I see why MI is always wrong, I never implemented the restriction of </w:t>
+      </w:r>
+      <w:proofErr w:type="spellStart"/>
+      <w:r>
+        <w:t>precip</w:t>
+      </w:r>
+      <w:proofErr w:type="spellEnd"/>
+      <w:r>
+        <w:t xml:space="preserve"> melting.</w:t>
+      </w:r>
+      <w:r>
+        <w:br/>
+        <w:t>Ah I get it, yeah I was wrong in many parts.</w:t>
+      </w:r>
+      <w:r>
+        <w:br/>
+        <w:t>I need to clamp the melting to only when possible.</w:t>
+      </w:r>
+      <w:r>
+        <w:br/>
+        <w:t>So first I check if there is something to melt, (if there is nothing to melt, we don’t melt)</w:t>
+      </w:r>
+      <w:r>
+        <w:br/>
+        <w:t xml:space="preserve">Then we check if we will exceed the maximum melting in a timestep. </w:t>
+      </w:r>
+      <w:r>
+        <w:br/>
+        <w:t>And we melt appropriately.</w:t>
+      </w:r>
+    </w:p>
+    <w:p>
+      <w:r>
+        <w:lastRenderedPageBreak/>
+        <w:t>Okay the simulation is way more stable, yet currently it seems that the boundaries are the issue.</w:t>
+      </w:r>
+      <w:r>
+        <w:br/>
+        <w:t>Also for the ground I probably should use ground variables and not sky, for example melting of snow I should use the ground snow, right? Of course!</w:t>
+      </w:r>
+      <w:r>
+        <w:br/>
+        <w:t>Yeah currently I should look logical to the code and not just following the paper.</w:t>
+      </w:r>
+      <w:r>
+        <w:br/>
+        <w:t>Oh wait, it is already correct? Like I am already doing copying if outside boundary (using the same value (previous X becomes X))</w:t>
+      </w:r>
+    </w:p>
+    <w:p>
+      <w:r>
+        <w:t>I have been lied to! (or mistaken)</w:t>
+      </w:r>
+      <w:r>
+        <w:br/>
+        <w:t>So, currently I set my mixing ratios: Qv = …</w:t>
+      </w:r>
+      <w:r>
+        <w:br/>
+        <w:t>But apparently I need to add to them: Qv += …</w:t>
+      </w:r>
+      <w:r>
+        <w:br/>
+      </w:r>
+    </w:p>
+    <w:p>
+      <w:r>
+        <w:t xml:space="preserve">My </w:t>
+      </w:r>
+      <w:proofErr w:type="spellStart"/>
+      <w:r>
+        <w:t>Advecting</w:t>
+      </w:r>
+      <w:proofErr w:type="spellEnd"/>
+      <w:r>
+        <w:t xml:space="preserve"> is wrong: Qv can become negative.</w:t>
+      </w:r>
+      <w:r>
+        <w:br/>
+        <w:t xml:space="preserve">Hmm boundary issue? No. </w:t>
+      </w:r>
+    </w:p>
+    <w:p>
+      <w:r>
+        <w:t>Oh the eta is probably dividing by 0.</w:t>
+      </w:r>
+    </w:p>
+    <w:p>
+      <w:pPr>
+        <w:pStyle w:val="Kop1"/>
+      </w:pPr>
+      <w:r>
+        <w:t>Tuesday 6-5-2025</w:t>
+      </w:r>
+    </w:p>
+    <w:p>
+      <w:r>
+        <w:t>A problem with the debug drawer: it will always draw the triangles in front, idk how to fix this.</w:t>
+      </w:r>
+      <w:r>
+        <w:br/>
+        <w:t xml:space="preserve">I will just put the lines to last, since they are not filled. </w:t>
+      </w:r>
+      <w:r>
+        <w:br/>
+        <w:t>I made arrow drawings as ability to debug draw.</w:t>
+      </w:r>
+    </w:p>
+    <w:p>
+      <w:r>
+        <w:t xml:space="preserve">Its </w:t>
+      </w:r>
+      <w:proofErr w:type="spellStart"/>
+      <w:r>
+        <w:t>soo</w:t>
+      </w:r>
+      <w:proofErr w:type="spellEnd"/>
+      <w:r>
+        <w:t xml:space="preserve"> ugly.</w:t>
+      </w:r>
+      <w:r>
+        <w:br/>
+        <w:t>Oh I fixed it.</w:t>
+      </w:r>
+      <w:r>
+        <w:br/>
+        <w:t>I can now see that the velocity values spike very high, Also I want my mouse to show me values of the boxes I hover over.</w:t>
+      </w:r>
+    </w:p>
+    <w:p>
+      <w:r>
+        <w:t>Alrighty, that nicely works.</w:t>
+      </w:r>
+      <w:r>
+        <w:br/>
+        <w:t>Now I want to fix the velocity, because for some reason it rushes up to 100 to 200 knots.</w:t>
+      </w:r>
+    </w:p>
+    <w:p>
+      <w:r>
+        <w:t>Let me add a way to start and stop the simulation.</w:t>
+      </w:r>
+      <w:r>
+        <w:br/>
+        <w:t xml:space="preserve">Now </w:t>
+      </w:r>
+      <w:proofErr w:type="spellStart"/>
+      <w:r>
+        <w:t>lets</w:t>
+      </w:r>
+      <w:proofErr w:type="spellEnd"/>
+      <w:r>
+        <w:t xml:space="preserve"> fix the wind.</w:t>
+      </w:r>
+    </w:p>
+    <w:p>
+      <w:r>
+        <w:t xml:space="preserve">I see the issue, this is the popular problem where air will convert into nothing. </w:t>
+      </w:r>
+      <w:r>
+        <w:br/>
+        <w:t>“</w:t>
+      </w:r>
+      <w:r>
+        <w:t xml:space="preserve">This is followed by the enforcement of incompressibility due to pressure projection by solving the Poisson pressure equation r2p = t1r·u and subtracting the pressure gradient form the velocity </w:t>
+      </w:r>
+      <w:r>
+        <w:t>fi</w:t>
+      </w:r>
+      <w:r>
+        <w:t>eld</w:t>
+      </w:r>
+      <w:r>
+        <w:t>”</w:t>
+      </w:r>
+      <w:r>
+        <w:br/>
+        <w:t xml:space="preserve">Alright, so I have a function to fix this. </w:t>
+      </w:r>
+      <w:proofErr w:type="spellStart"/>
+      <w:r>
+        <w:t>Lets</w:t>
+      </w:r>
+      <w:proofErr w:type="spellEnd"/>
+      <w:r>
+        <w:t xml:space="preserve"> try it.</w:t>
+      </w:r>
+    </w:p>
+    <w:p>
+      <w:r>
+        <w:t>Yeah wait, we don’t change the pressures atm. Do we need to in the future? (yes)</w:t>
+      </w:r>
+      <w:r>
+        <w:br/>
+        <w:t>Wait, what is going on, I am not sure if this all is correct.</w:t>
+      </w:r>
+    </w:p>
+    <w:p/>
+    <w:p>
+      <w:pPr>
+        <w:pStyle w:val="Kop1"/>
+      </w:pPr>
+      <w:r>
+        <w:t>Wednesday 7-5-2025</w:t>
+      </w:r>
+    </w:p>
+    <w:p>
+      <w:proofErr w:type="spellStart"/>
+      <w:r>
+        <w:t>Lets</w:t>
+      </w:r>
+      <w:proofErr w:type="spellEnd"/>
+      <w:r>
+        <w:t xml:space="preserve"> re-evaluate the velocity calculations.</w:t>
+      </w:r>
+      <w:r>
+        <w:br/>
+        <w:t>I think Buoyancy is the problem, its value is way too high.</w:t>
+      </w:r>
+      <w:r>
+        <w:br/>
+        <w:t xml:space="preserve">Oh I may see the issue I was using </w:t>
+      </w:r>
+      <w:proofErr w:type="spellStart"/>
+      <w:r>
+        <w:t>Mwater</w:t>
+      </w:r>
+      <w:proofErr w:type="spellEnd"/>
+      <w:r>
+        <w:t xml:space="preserve"> instead of </w:t>
+      </w:r>
+      <w:proofErr w:type="spellStart"/>
+      <w:r>
+        <w:t>Mth</w:t>
+      </w:r>
+      <w:proofErr w:type="spellEnd"/>
+      <w:r>
+        <w:br/>
+        <w:t>Okay its way more stable now, yet, the wind speed still rises fast.</w:t>
+      </w:r>
+    </w:p>
+    <w:p>
+      <w:proofErr w:type="spellStart"/>
+      <w:r>
+        <w:lastRenderedPageBreak/>
+        <w:t>Lets</w:t>
+      </w:r>
+      <w:proofErr w:type="spellEnd"/>
+      <w:r>
+        <w:t xml:space="preserve"> calculate all the things using the ‘Red-Black Gauss Seidel’.</w:t>
+      </w:r>
+      <w:r>
+        <w:br/>
+        <w:t>Or to say it in better words, not calculating everything in one loop, but use two loops to first iterate over x % 2 (so skip) meaning we never touch a neighbouring cell (which would be bad for calculations)</w:t>
+      </w:r>
+    </w:p>
+    <w:p>
+      <w:r>
+        <w:t>Okay, did not fix anything I believe, but I removed Buoyancy and the wind speed still went up.</w:t>
+      </w:r>
+      <w:r>
+        <w:br/>
+        <w:t>I may be stupid? Like for Pair, what do I exactly use?</w:t>
+      </w:r>
+      <w:r>
+        <w:br/>
+        <w:t>I see, I should have used Pa instead of Pha…</w:t>
+      </w:r>
+    </w:p>
+    <w:p>
+      <w:r>
+        <w:t>Yes! That fixed the wind issue!</w:t>
+      </w:r>
+      <w:r>
+        <w:br/>
+        <w:t>Btw, the temperature is like not updating at all.</w:t>
+      </w:r>
+      <w:r>
+        <w:br/>
+        <w:t xml:space="preserve">Yeah </w:t>
+      </w:r>
+      <w:proofErr w:type="spellStart"/>
+      <w:r>
+        <w:t>its</w:t>
+      </w:r>
+      <w:proofErr w:type="spellEnd"/>
+      <w:r>
+        <w:t xml:space="preserve"> so much more stable now, but also very slow.</w:t>
+      </w:r>
+      <w:r>
+        <w:br/>
+        <w:t>Btw, the nan or 0 values of Qv always come from the boundaries.</w:t>
+      </w:r>
+      <w:r>
+        <w:br/>
+      </w:r>
+      <w:r>
+        <w:br/>
+        <w:t xml:space="preserve">Wait, in the latent heat calculation I </w:t>
+      </w:r>
+      <w:proofErr w:type="spellStart"/>
+      <w:r>
+        <w:t>dó</w:t>
+      </w:r>
+      <w:proofErr w:type="spellEnd"/>
+      <w:r>
+        <w:t xml:space="preserve"> use </w:t>
+      </w:r>
+      <w:proofErr w:type="spellStart"/>
+      <w:r>
+        <w:t>Xj</w:t>
+      </w:r>
+      <w:proofErr w:type="spellEnd"/>
+      <w:r>
+        <w:t xml:space="preserve"> / </w:t>
+      </w:r>
+      <w:proofErr w:type="spellStart"/>
+      <w:r>
+        <w:t>Xj</w:t>
+      </w:r>
+      <w:proofErr w:type="spellEnd"/>
+      <w:r>
+        <w:t xml:space="preserve"> + 1?</w:t>
+      </w:r>
+      <w:r>
+        <w:br/>
+        <w:t>Or do I use both delta AND the division?</w:t>
+      </w:r>
+      <w:r>
+        <w:br/>
+        <w:t>But in the formula it does not say ‘delta’</w:t>
+      </w:r>
+      <w:r>
+        <w:br/>
+      </w:r>
+      <w:proofErr w:type="spellStart"/>
+      <w:r>
+        <w:t>Its</w:t>
+      </w:r>
+      <w:proofErr w:type="spellEnd"/>
+      <w:r>
+        <w:t xml:space="preserve"> so weird, my </w:t>
+      </w:r>
+      <w:proofErr w:type="spellStart"/>
+      <w:r>
+        <w:t>pQv</w:t>
+      </w:r>
+      <w:proofErr w:type="spellEnd"/>
+      <w:r>
+        <w:t xml:space="preserve"> is never different than the current Qv?</w:t>
+      </w:r>
+      <w:r>
+        <w:br/>
+        <w:t>What if that’s true and it only changes due to advection?</w:t>
+      </w:r>
+    </w:p>
+    <w:p>
+      <w:r>
+        <w:rPr>
+          <w:noProof/>
+        </w:rPr>
+        <w:drawing>
+          <wp:anchor distT="0" distB="0" distL="114300" distR="114300" simplePos="0" relativeHeight="251691008" behindDoc="1" locked="0" layoutInCell="1" allowOverlap="1" wp14:anchorId="5BDE8DD3" wp14:editId="08FFEAEF">
+            <wp:simplePos x="0" y="0"/>
+            <wp:positionH relativeFrom="column">
+              <wp:posOffset>1905</wp:posOffset>
+            </wp:positionH>
+            <wp:positionV relativeFrom="paragraph">
+              <wp:posOffset>-2540</wp:posOffset>
+            </wp:positionV>
+            <wp:extent cx="2921000" cy="1171764"/>
+            <wp:effectExtent l="0" t="0" r="0" b="9525"/>
+            <wp:wrapTight wrapText="bothSides">
+              <wp:wrapPolygon edited="0">
+                <wp:start x="0" y="0"/>
+                <wp:lineTo x="0" y="21424"/>
+                <wp:lineTo x="21412" y="21424"/>
+                <wp:lineTo x="21412" y="0"/>
+                <wp:lineTo x="0" y="0"/>
+              </wp:wrapPolygon>
+            </wp:wrapTight>
+            <wp:docPr id="563766668" name="Afbeelding 1" descr="Afbeelding met tekst, Lettertype, schermopname&#10;&#10;Door AI gegenereerde inhoud is mogelijk onjuist."/>
+            <wp:cNvGraphicFramePr>
+              <a:graphicFrameLocks xmlns:a="http://schemas.openxmlformats.org/drawingml/2006/main" noChangeAspect="1"/>
+            </wp:cNvGraphicFramePr>
+            <a:graphic xmlns:a="http://schemas.openxmlformats.org/drawingml/2006/main">
+              <a:graphicData uri="http://schemas.openxmlformats.org/drawingml/2006/picture">
+                <pic:pic xmlns:pic="http://schemas.openxmlformats.org/drawingml/2006/picture">
+                  <pic:nvPicPr>
+                    <pic:cNvPr id="563766668" name="Afbeelding 1" descr="Afbeelding met tekst, Lettertype, schermopname&#10;&#10;Door AI gegenereerde inhoud is mogelijk onjuist."/>
+                    <pic:cNvPicPr/>
+                  </pic:nvPicPr>
+                  <pic:blipFill>
+                    <a:blip r:embed="rId79">
+                      <a:extLst>
+                        <a:ext uri="{28A0092B-C50C-407E-A947-70E740481C1C}">
+                          <a14:useLocalDpi xmlns:a14="http://schemas.microsoft.com/office/drawing/2010/main" val="0"/>
+                        </a:ext>
+                      </a:extLst>
+                    </a:blip>
+                    <a:stretch>
+                      <a:fillRect/>
+                    </a:stretch>
+                  </pic:blipFill>
+                  <pic:spPr>
+                    <a:xfrm>
+                      <a:off x="0" y="0"/>
+                      <a:ext cx="2921000" cy="1171764"/>
+                    </a:xfrm>
+                    <a:prstGeom prst="rect">
+                      <a:avLst/>
+                    </a:prstGeom>
+                  </pic:spPr>
+                </pic:pic>
+              </a:graphicData>
+            </a:graphic>
+          </wp:anchor>
+        </w:drawing>
+      </w:r>
+      <w:r>
+        <w:t xml:space="preserve">Well, that solves it: </w:t>
+      </w:r>
+      <w:proofErr w:type="spellStart"/>
+      <w:r>
+        <w:t>its</w:t>
+      </w:r>
+      <w:proofErr w:type="spellEnd"/>
+      <w:r>
+        <w:t xml:space="preserve"> not delta </w:t>
+      </w:r>
+      <w:proofErr w:type="spellStart"/>
+      <w:r>
+        <w:t>Xj</w:t>
+      </w:r>
+      <w:proofErr w:type="spellEnd"/>
+      <w:r>
+        <w:t>.</w:t>
+      </w:r>
+      <w:r>
+        <w:br/>
+        <w:t>Also I never do this part… (I think) or is it included in formula (67)?</w:t>
+      </w:r>
+      <w:r>
+        <w:br/>
+        <w:t>Okay wait I do need the delta, this because I calculate the change in transition, if there was no phase transition, it would change nothing.</w:t>
+      </w:r>
+    </w:p>
+    <w:p>
+      <w:r>
+        <w:t xml:space="preserve">And I found a new formula I never used, in formula 6 I calculate </w:t>
+      </w:r>
+      <w:proofErr w:type="spellStart"/>
+      <w:r>
+        <w:t>Tth</w:t>
+      </w:r>
+      <w:proofErr w:type="spellEnd"/>
+      <w:r>
+        <w:t>, but I should take account the phase transitions, thus I need to do extra calculations</w:t>
+      </w:r>
+      <w:r>
+        <w:br/>
+        <w:t xml:space="preserve">But, does that mean I have to save the transitions throughout a whole loop? Huh. </w:t>
+      </w:r>
+    </w:p>
+    <w:p>
+      <w:r>
+        <w:t>I don’t know anymore…</w:t>
+      </w:r>
+    </w:p>
+    <w:p/>
+    <w:p>
+      <w:pPr>
+        <w:pStyle w:val="Kop1"/>
+      </w:pPr>
+      <w:r>
+        <w:rPr>
+          <w:noProof/>
+        </w:rPr>
+        <w:drawing>
+          <wp:anchor distT="0" distB="0" distL="114300" distR="114300" simplePos="0" relativeHeight="251692032" behindDoc="1" locked="0" layoutInCell="1" allowOverlap="1" wp14:anchorId="5A44194A" wp14:editId="125DF813">
+            <wp:simplePos x="0" y="0"/>
+            <wp:positionH relativeFrom="page">
+              <wp:align>left</wp:align>
+            </wp:positionH>
+            <wp:positionV relativeFrom="paragraph">
+              <wp:posOffset>610235</wp:posOffset>
+            </wp:positionV>
+            <wp:extent cx="1879600" cy="2226310"/>
+            <wp:effectExtent l="0" t="0" r="6350" b="2540"/>
+            <wp:wrapTight wrapText="bothSides">
+              <wp:wrapPolygon edited="0">
+                <wp:start x="0" y="0"/>
+                <wp:lineTo x="0" y="21440"/>
+                <wp:lineTo x="21454" y="21440"/>
+                <wp:lineTo x="21454" y="0"/>
+                <wp:lineTo x="0" y="0"/>
+              </wp:wrapPolygon>
+            </wp:wrapTight>
+            <wp:docPr id="571438403" name="Afbeelding 1" descr="Afbeelding met tekst, schermopname, Lettertype, nummer&#10;&#10;Door AI gegenereerde inhoud is mogelijk onjuist."/>
+            <wp:cNvGraphicFramePr>
+              <a:graphicFrameLocks xmlns:a="http://schemas.openxmlformats.org/drawingml/2006/main" noChangeAspect="1"/>
+            </wp:cNvGraphicFramePr>
+            <a:graphic xmlns:a="http://schemas.openxmlformats.org/drawingml/2006/main">
+              <a:graphicData uri="http://schemas.openxmlformats.org/drawingml/2006/picture">
+                <pic:pic xmlns:pic="http://schemas.openxmlformats.org/drawingml/2006/picture">
+                  <pic:nvPicPr>
+                    <pic:cNvPr id="571438403" name="Afbeelding 1" descr="Afbeelding met tekst, schermopname, Lettertype, nummer&#10;&#10;Door AI gegenereerde inhoud is mogelijk onjuist."/>
+                    <pic:cNvPicPr/>
+                  </pic:nvPicPr>
+                  <pic:blipFill>
+                    <a:blip r:embed="rId80" cstate="print">
+                      <a:extLst>
+                        <a:ext uri="{28A0092B-C50C-407E-A947-70E740481C1C}">
+                          <a14:useLocalDpi xmlns:a14="http://schemas.microsoft.com/office/drawing/2010/main" val="0"/>
+                        </a:ext>
+                      </a:extLst>
+                    </a:blip>
+                    <a:stretch>
+                      <a:fillRect/>
+                    </a:stretch>
+                  </pic:blipFill>
+                  <pic:spPr>
+                    <a:xfrm>
+                      <a:off x="0" y="0"/>
+                      <a:ext cx="1879600" cy="2226310"/>
+                    </a:xfrm>
+                    <a:prstGeom prst="rect">
+                      <a:avLst/>
+                    </a:prstGeom>
+                  </pic:spPr>
+                </pic:pic>
+              </a:graphicData>
+            </a:graphic>
+            <wp14:sizeRelH relativeFrom="margin">
+              <wp14:pctWidth>0</wp14:pctWidth>
+            </wp14:sizeRelH>
+            <wp14:sizeRelV relativeFrom="margin">
+              <wp14:pctHeight>0</wp14:pctHeight>
+            </wp14:sizeRelV>
+          </wp:anchor>
+        </w:drawing>
+      </w:r>
+      <w:r>
+        <w:t>Thursday 8-5-2025</w:t>
+      </w:r>
+    </w:p>
+    <w:p>
+      <w:r>
+        <w:t>Wait, I think I found it in the old paper:</w:t>
+      </w:r>
+      <w:r>
+        <w:br/>
+        <w:t>This algorithm is written in more detail, I like it.</w:t>
+      </w:r>
+      <w:r>
+        <w:br/>
+        <w:t>What is said here, is that I calculate the changes in mole fraction are calculated after the microphysics update, and after that I update the potential temperature, I don’t need it for the buoyancy, for that, the old formula is used.</w:t>
+      </w:r>
+    </w:p>
+    <w:p>
+      <w:r>
+        <w:t>Meaning, no worries.</w:t>
+      </w:r>
+    </w:p>
+    <w:p/>
+    <w:p/>
+    <w:p/>
+    <w:p/>
+    <w:p>
+      <w:pPr>
+        <w:pStyle w:val="Kop1"/>
+      </w:pPr>
+      <w:r>
+        <w:t>Friday 9-5-2025</w:t>
+      </w:r>
+    </w:p>
+    <w:p>
+      <w:proofErr w:type="spellStart"/>
+      <w:r>
+        <w:t>Lets</w:t>
+      </w:r>
+      <w:proofErr w:type="spellEnd"/>
+      <w:r>
+        <w:t xml:space="preserve"> implement that.</w:t>
+      </w:r>
+      <w:r>
+        <w:br/>
+        <w:t>Fixed division by 0 in the velocity calculation by already calculating the inverse of the voxel size and then multiplying by that.</w:t>
+      </w:r>
+      <w:r>
+        <w:br/>
+        <w:t xml:space="preserve">Hmmm, about what I read yesterday, or at least my take on it, is wrong. </w:t>
+      </w:r>
+      <w:r>
+        <w:br/>
+        <w:t>There are 2 formulas described, one I already do, which is the energy conservation equation, which updated the temperature and the other one is the thermal temperature equation, apparently, this one conducts/diffuses the temp. Meaning I have to do this in the diffuse part?</w:t>
+      </w:r>
+      <w:r>
+        <w:br/>
+        <w:t xml:space="preserve">But </w:t>
+      </w:r>
+      <w:proofErr w:type="spellStart"/>
+      <w:r>
+        <w:t>than</w:t>
+      </w:r>
+      <w:proofErr w:type="spellEnd"/>
+      <w:r>
+        <w:t xml:space="preserve"> we loop back to the problem I had earlier of not having the deltas already.</w:t>
+      </w:r>
+    </w:p>
+    <w:p>
+      <w:r>
+        <w:t>Back to being confused. So:</w:t>
+      </w:r>
+      <w:r>
+        <w:br/>
+        <w:t xml:space="preserve">Old Paper: Using </w:t>
+      </w:r>
+      <w:r>
+        <w:t>L/</w:t>
+      </w:r>
+      <w:proofErr w:type="spellStart"/>
+      <w:r>
+        <w:t>Cpth</w:t>
+      </w:r>
+      <w:proofErr w:type="spellEnd"/>
+      <w:r>
+        <w:t xml:space="preserve"> for updating temp at the end.</w:t>
+      </w:r>
+      <w:r>
+        <w:br/>
+        <w:t xml:space="preserve">New </w:t>
+      </w:r>
+      <w:proofErr w:type="spellStart"/>
+      <w:r>
+        <w:t>paper:Using</w:t>
+      </w:r>
+      <w:proofErr w:type="spellEnd"/>
+      <w:r>
+        <w:t xml:space="preserve"> L/cp][][ at the end.</w:t>
+      </w:r>
+    </w:p>
+    <w:p>
+      <w:r>
+        <w:t>None of the papers use the other formula, so new paper does not mention L/</w:t>
+      </w:r>
+      <w:proofErr w:type="spellStart"/>
+      <w:r>
+        <w:t>Cpth</w:t>
+      </w:r>
+      <w:proofErr w:type="spellEnd"/>
+      <w:r>
+        <w:t xml:space="preserve"> in their algorithm and </w:t>
+      </w:r>
+      <w:proofErr w:type="spellStart"/>
+      <w:r>
+        <w:t>visa</w:t>
+      </w:r>
+      <w:proofErr w:type="spellEnd"/>
+      <w:r>
+        <w:t xml:space="preserve"> versa for the old paper.</w:t>
+      </w:r>
+      <w:r>
+        <w:t xml:space="preserve"> </w:t>
+      </w:r>
+      <w:r>
+        <w:br/>
+        <w:t xml:space="preserve">Alright, I would just say that using the formula 67, does include enough and I don’t need formula 50 for some reason. </w:t>
+      </w:r>
+      <w:r>
+        <w:br/>
+      </w:r>
+      <w:proofErr w:type="spellStart"/>
+      <w:r>
+        <w:t>Lets</w:t>
+      </w:r>
+      <w:proofErr w:type="spellEnd"/>
+      <w:r>
+        <w:t xml:space="preserve"> debug something else.</w:t>
+      </w:r>
+      <w:r>
+        <w:br/>
+        <w:t>For example, does water vapor go up or down?</w:t>
+      </w:r>
+    </w:p>
+    <w:p>
+      <w:r>
+        <w:t xml:space="preserve">Oh no… I forgot to put () around the updating of microphysics, currently it does dt * </w:t>
+      </w:r>
+      <w:proofErr w:type="spellStart"/>
+      <w:r>
+        <w:t>first_element</w:t>
+      </w:r>
+      <w:proofErr w:type="spellEnd"/>
+      <w:r>
+        <w:t xml:space="preserve">, and adds all the other elements… </w:t>
+      </w:r>
+      <w:r>
+        <w:br/>
+        <w:t>and I even forgot dt in the ground update…</w:t>
+      </w:r>
+    </w:p>
+    <w:p>
+      <w:r>
+        <w:t>The problem lies within the advection at the moment.</w:t>
+      </w:r>
+      <w:r>
+        <w:br/>
+        <w:t xml:space="preserve">Could it be that I have my </w:t>
+      </w:r>
+      <w:proofErr w:type="spellStart"/>
+      <w:r>
+        <w:t>pY</w:t>
+      </w:r>
+      <w:proofErr w:type="spellEnd"/>
+      <w:r>
+        <w:t xml:space="preserve"> and </w:t>
+      </w:r>
+      <w:proofErr w:type="spellStart"/>
+      <w:r>
+        <w:t>nY</w:t>
+      </w:r>
+      <w:proofErr w:type="spellEnd"/>
+      <w:r>
+        <w:t xml:space="preserve"> in the wrong order?</w:t>
+      </w:r>
+    </w:p>
+    <w:p>
+      <w:proofErr w:type="spellStart"/>
+      <w:r>
+        <w:t>Ohhh</w:t>
+      </w:r>
+      <w:proofErr w:type="spellEnd"/>
+      <w:r>
+        <w:t xml:space="preserve">, at boundaries, all </w:t>
+      </w:r>
+      <w:proofErr w:type="spellStart"/>
+      <w:r>
+        <w:t>Qa</w:t>
+      </w:r>
+      <w:proofErr w:type="spellEnd"/>
+      <w:r>
+        <w:t xml:space="preserve"> have to be set to 0.</w:t>
+      </w:r>
+      <w:r>
+        <w:br/>
+        <w:t>That made it worse?</w:t>
+      </w:r>
+      <w:r>
+        <w:br/>
+        <w:t xml:space="preserve">Oh wait, I misread, you have different boundary rules for qv and other </w:t>
+      </w:r>
+      <w:proofErr w:type="spellStart"/>
+      <w:r>
+        <w:t>qjs</w:t>
+      </w:r>
+      <w:proofErr w:type="spellEnd"/>
+      <w:r>
+        <w:t>.</w:t>
+      </w:r>
+      <w:r>
+        <w:br/>
+        <w:t xml:space="preserve">Qv wraps around the boundaries. </w:t>
+      </w:r>
+      <w:r>
+        <w:br/>
+        <w:t>Wait, shall I first apply pressure project</w:t>
+      </w:r>
+      <w:r>
+        <w:br/>
+      </w:r>
+      <w:r>
+        <w:rPr>
+          <w:noProof/>
+        </w:rPr>
+        <w:drawing>
+          <wp:inline distT="0" distB="0" distL="0" distR="0" wp14:anchorId="2E72F29B" wp14:editId="0AD1EB6B">
+            <wp:extent cx="3086531" cy="390580"/>
+            <wp:effectExtent l="0" t="0" r="0" b="9525"/>
+            <wp:docPr id="2004859560" name="Afbeelding 1"/>
+            <wp:cNvGraphicFramePr>
+              <a:graphicFrameLocks xmlns:a="http://schemas.openxmlformats.org/drawingml/2006/main" noChangeAspect="1"/>
+            </wp:cNvGraphicFramePr>
+            <a:graphic xmlns:a="http://schemas.openxmlformats.org/drawingml/2006/main">
+              <a:graphicData uri="http://schemas.openxmlformats.org/drawingml/2006/picture">
+                <pic:pic xmlns:pic="http://schemas.openxmlformats.org/drawingml/2006/picture">
+                  <pic:nvPicPr>
+                    <pic:cNvPr id="2004859560" name=""/>
+                    <pic:cNvPicPr/>
+                  </pic:nvPicPr>
+                  <pic:blipFill>
+                    <a:blip r:embed="rId81"/>
+                    <a:stretch>
+                      <a:fillRect/>
+                    </a:stretch>
+                  </pic:blipFill>
+                  <pic:spPr>
+                    <a:xfrm>
+                      <a:off x="0" y="0"/>
+                      <a:ext cx="3086531" cy="390580"/>
+                    </a:xfrm>
+                    <a:prstGeom prst="rect">
+                      <a:avLst/>
+                    </a:prstGeom>
+                  </pic:spPr>
+                </pic:pic>
+              </a:graphicData>
+            </a:graphic>
+          </wp:inline>
+        </w:drawing>
+      </w:r>
+    </w:p>
+    <w:p>
+      <w:r>
+        <w:rPr>
+          <w:noProof/>
+        </w:rPr>
+        <w:drawing>
+          <wp:anchor distT="0" distB="0" distL="114300" distR="114300" simplePos="0" relativeHeight="251693056" behindDoc="1" locked="0" layoutInCell="1" allowOverlap="1" wp14:anchorId="562C8E1A" wp14:editId="6FCA7B4C">
+            <wp:simplePos x="0" y="0"/>
+            <wp:positionH relativeFrom="column">
+              <wp:posOffset>-804545</wp:posOffset>
+            </wp:positionH>
+            <wp:positionV relativeFrom="paragraph">
+              <wp:posOffset>431800</wp:posOffset>
+            </wp:positionV>
+            <wp:extent cx="2241550" cy="670940"/>
+            <wp:effectExtent l="0" t="0" r="6350" b="0"/>
+            <wp:wrapTight wrapText="bothSides">
+              <wp:wrapPolygon edited="0">
+                <wp:start x="0" y="0"/>
+                <wp:lineTo x="0" y="20864"/>
+                <wp:lineTo x="21478" y="20864"/>
+                <wp:lineTo x="21478" y="0"/>
+                <wp:lineTo x="0" y="0"/>
+              </wp:wrapPolygon>
+            </wp:wrapTight>
+            <wp:docPr id="296381087" name="Afbeelding 1" descr="Afbeelding met tekst, Lettertype, lijn, diagram&#10;&#10;Door AI gegenereerde inhoud is mogelijk onjuist."/>
+            <wp:cNvGraphicFramePr>
+              <a:graphicFrameLocks xmlns:a="http://schemas.openxmlformats.org/drawingml/2006/main" noChangeAspect="1"/>
+            </wp:cNvGraphicFramePr>
+            <a:graphic xmlns:a="http://schemas.openxmlformats.org/drawingml/2006/main">
+              <a:graphicData uri="http://schemas.openxmlformats.org/drawingml/2006/picture">
+                <pic:pic xmlns:pic="http://schemas.openxmlformats.org/drawingml/2006/picture">
+                  <pic:nvPicPr>
+                    <pic:cNvPr id="296381087" name="Afbeelding 1" descr="Afbeelding met tekst, Lettertype, lijn, diagram&#10;&#10;Door AI gegenereerde inhoud is mogelijk onjuist."/>
+                    <pic:cNvPicPr/>
+                  </pic:nvPicPr>
+                  <pic:blipFill>
+                    <a:blip r:embed="rId82">
+                      <a:extLst>
+                        <a:ext uri="{28A0092B-C50C-407E-A947-70E740481C1C}">
+                          <a14:useLocalDpi xmlns:a14="http://schemas.microsoft.com/office/drawing/2010/main" val="0"/>
+                        </a:ext>
+                      </a:extLst>
+                    </a:blip>
+                    <a:stretch>
+                      <a:fillRect/>
+                    </a:stretch>
+                  </pic:blipFill>
+                  <pic:spPr>
+                    <a:xfrm>
+                      <a:off x="0" y="0"/>
+                      <a:ext cx="2241550" cy="670940"/>
+                    </a:xfrm>
+                    <a:prstGeom prst="rect">
+                      <a:avLst/>
+                    </a:prstGeom>
+                  </pic:spPr>
+                </pic:pic>
+              </a:graphicData>
+            </a:graphic>
+          </wp:anchor>
+        </w:drawing>
+      </w:r>
+      <w:r>
+        <w:t>Reading the fluid sim paper which describes project()</w:t>
+      </w:r>
+      <w:r>
+        <w:br/>
+        <w:t>(Chapter 4)</w:t>
+      </w:r>
+    </w:p>
+    <w:p>
+      <w:r>
+        <w:t>So, what is p?</w:t>
+      </w:r>
+      <w:r>
+        <w:br/>
+        <w:t xml:space="preserve">When we encounter a solid cell (boundary, we differ in formula) </w:t>
+      </w:r>
+      <w:r>
+        <w:br/>
+        <w:t xml:space="preserve">Wait, the paper states I should use a MAC grid, the </w:t>
+      </w:r>
+      <w:proofErr w:type="spellStart"/>
+      <w:r>
+        <w:t>WeatherScapes</w:t>
+      </w:r>
+      <w:proofErr w:type="spellEnd"/>
+      <w:r>
+        <w:t xml:space="preserve"> does not mention that.</w:t>
+      </w:r>
+    </w:p>
+    <w:p>
+      <w:r>
+        <w:t>Okay, so I may change up my whole velocity grid, since that may be a lot better:</w:t>
+      </w:r>
+      <w:r>
+        <w:br/>
+      </w:r>
+    </w:p>
+    <w:p>
+      <w:r>
+        <w:rPr>
+          <w:noProof/>
+        </w:rPr>
+        <w:lastRenderedPageBreak/>
+        <w:drawing>
+          <wp:anchor distT="0" distB="0" distL="114300" distR="114300" simplePos="0" relativeHeight="251694080" behindDoc="1" locked="0" layoutInCell="1" allowOverlap="1" wp14:anchorId="392A1D3A" wp14:editId="0557BF99">
+            <wp:simplePos x="0" y="0"/>
+            <wp:positionH relativeFrom="page">
+              <wp:align>left</wp:align>
+            </wp:positionH>
+            <wp:positionV relativeFrom="paragraph">
+              <wp:posOffset>0</wp:posOffset>
+            </wp:positionV>
+            <wp:extent cx="3308350" cy="1529820"/>
+            <wp:effectExtent l="0" t="0" r="6350" b="0"/>
+            <wp:wrapTight wrapText="bothSides">
+              <wp:wrapPolygon edited="0">
+                <wp:start x="0" y="0"/>
+                <wp:lineTo x="0" y="21250"/>
+                <wp:lineTo x="21517" y="21250"/>
+                <wp:lineTo x="21517" y="0"/>
+                <wp:lineTo x="0" y="0"/>
+              </wp:wrapPolygon>
+            </wp:wrapTight>
+            <wp:docPr id="423770563" name="Afbeelding 1" descr="Afbeelding met schermopname, Graphics, plein, kunst&#10;&#10;Door AI gegenereerde inhoud is mogelijk onjuist."/>
+            <wp:cNvGraphicFramePr>
+              <a:graphicFrameLocks xmlns:a="http://schemas.openxmlformats.org/drawingml/2006/main" noChangeAspect="1"/>
+            </wp:cNvGraphicFramePr>
+            <a:graphic xmlns:a="http://schemas.openxmlformats.org/drawingml/2006/main">
+              <a:graphicData uri="http://schemas.openxmlformats.org/drawingml/2006/picture">
+                <pic:pic xmlns:pic="http://schemas.openxmlformats.org/drawingml/2006/picture">
+                  <pic:nvPicPr>
+                    <pic:cNvPr id="423770563" name="Afbeelding 1" descr="Afbeelding met schermopname, Graphics, plein, kunst&#10;&#10;Door AI gegenereerde inhoud is mogelijk onjuist."/>
+                    <pic:cNvPicPr/>
+                  </pic:nvPicPr>
+                  <pic:blipFill>
+                    <a:blip r:embed="rId83" cstate="print">
+                      <a:extLst>
+                        <a:ext uri="{28A0092B-C50C-407E-A947-70E740481C1C}">
+                          <a14:useLocalDpi xmlns:a14="http://schemas.microsoft.com/office/drawing/2010/main" val="0"/>
+                        </a:ext>
+                      </a:extLst>
+                    </a:blip>
+                    <a:stretch>
+                      <a:fillRect/>
+                    </a:stretch>
+                  </pic:blipFill>
+                  <pic:spPr>
+                    <a:xfrm>
+                      <a:off x="0" y="0"/>
+                      <a:ext cx="3308350" cy="1529820"/>
+                    </a:xfrm>
+                    <a:prstGeom prst="rect">
+                      <a:avLst/>
+                    </a:prstGeom>
+                  </pic:spPr>
+                </pic:pic>
+              </a:graphicData>
+            </a:graphic>
+          </wp:anchor>
+        </w:drawing>
+      </w:r>
+      <w:r>
+        <w:t>Here I colour coded a part of a grid.</w:t>
+      </w:r>
+      <w:r>
+        <w:br/>
+        <w:t>Every grid has a u and a v vector, pointing out or in. (- or +). For 0 that is the left arrow pointing in (meaning its +). It has no down arrow, since that is the ground which is incompressible (I still need to handle this case), on the right edge, we have a left-over vector, we will have the same for edges on the top. But those are boundary case scenarios, which are special.</w:t>
+      </w:r>
+      <w:r>
+        <w:br/>
+        <w:t>Using this, its staggered/MAC grid, yet I can still use the same setup I had, though, the calculations probably will be a bit different. That, I need to figure out.</w:t>
+      </w:r>
+    </w:p>
+    <w:p/>
+    <w:p>
+      <w:pPr>
+        <w:pStyle w:val="Kop1"/>
+      </w:pPr>
+      <w:r>
+        <w:rPr>
+          <w:noProof/>
+        </w:rPr>
+        <w:drawing>
+          <wp:anchor distT="0" distB="0" distL="114300" distR="114300" simplePos="0" relativeHeight="251695104" behindDoc="1" locked="0" layoutInCell="1" allowOverlap="1" wp14:anchorId="439C1747" wp14:editId="683DDC93">
+            <wp:simplePos x="0" y="0"/>
+            <wp:positionH relativeFrom="page">
+              <wp:align>left</wp:align>
+            </wp:positionH>
+            <wp:positionV relativeFrom="paragraph">
+              <wp:posOffset>492125</wp:posOffset>
+            </wp:positionV>
+            <wp:extent cx="2457450" cy="1507193"/>
+            <wp:effectExtent l="0" t="0" r="0" b="0"/>
+            <wp:wrapTight wrapText="bothSides">
+              <wp:wrapPolygon edited="0">
+                <wp:start x="0" y="0"/>
+                <wp:lineTo x="0" y="21300"/>
+                <wp:lineTo x="21433" y="21300"/>
+                <wp:lineTo x="21433" y="0"/>
+                <wp:lineTo x="0" y="0"/>
+              </wp:wrapPolygon>
+            </wp:wrapTight>
+            <wp:docPr id="1231240809" name="Afbeelding 1" descr="Afbeelding met tekst, schermopname, Lettertype, diagram&#10;&#10;Door AI gegenereerde inhoud is mogelijk onjuist."/>
+            <wp:cNvGraphicFramePr>
+              <a:graphicFrameLocks xmlns:a="http://schemas.openxmlformats.org/drawingml/2006/main" noChangeAspect="1"/>
+            </wp:cNvGraphicFramePr>
+            <a:graphic xmlns:a="http://schemas.openxmlformats.org/drawingml/2006/main">
+              <a:graphicData uri="http://schemas.openxmlformats.org/drawingml/2006/picture">
+                <pic:pic xmlns:pic="http://schemas.openxmlformats.org/drawingml/2006/picture">
+                  <pic:nvPicPr>
+                    <pic:cNvPr id="1231240809" name="Afbeelding 1" descr="Afbeelding met tekst, schermopname, Lettertype, diagram&#10;&#10;Door AI gegenereerde inhoud is mogelijk onjuist."/>
+                    <pic:cNvPicPr/>
+                  </pic:nvPicPr>
+                  <pic:blipFill>
+                    <a:blip r:embed="rId84" cstate="print">
+                      <a:extLst>
+                        <a:ext uri="{28A0092B-C50C-407E-A947-70E740481C1C}">
+                          <a14:useLocalDpi xmlns:a14="http://schemas.microsoft.com/office/drawing/2010/main" val="0"/>
+                        </a:ext>
+                      </a:extLst>
+                    </a:blip>
+                    <a:stretch>
+                      <a:fillRect/>
+                    </a:stretch>
+                  </pic:blipFill>
+                  <pic:spPr>
+                    <a:xfrm>
+                      <a:off x="0" y="0"/>
+                      <a:ext cx="2457450" cy="1507193"/>
+                    </a:xfrm>
+                    <a:prstGeom prst="rect">
+                      <a:avLst/>
+                    </a:prstGeom>
+                  </pic:spPr>
+                </pic:pic>
+              </a:graphicData>
+            </a:graphic>
+          </wp:anchor>
+        </w:drawing>
+      </w:r>
+      <w:r>
+        <w:t>Saturday 10-5-2025</w:t>
+      </w:r>
+    </w:p>
+    <w:p>
+      <w:r>
+        <w:t>Created an image of how I would update incompressibility.</w:t>
+      </w:r>
+      <w:r>
+        <w:br/>
+        <w:t>Advection is just: V(</w:t>
+      </w:r>
+      <w:proofErr w:type="spellStart"/>
+      <w:r>
+        <w:t>u,v</w:t>
+      </w:r>
+      <w:proofErr w:type="spellEnd"/>
+      <w:r>
+        <w:t>) = -Dt * V(</w:t>
+      </w:r>
+      <w:proofErr w:type="spellStart"/>
+      <w:r>
+        <w:t>u,v</w:t>
+      </w:r>
+      <w:proofErr w:type="spellEnd"/>
+      <w:r>
+        <w:t>). At least, I hope that is correct.</w:t>
+      </w:r>
+      <w:r>
+        <w:br/>
+        <w:t>I guess diffusion stays the same.</w:t>
+      </w:r>
+      <w:r>
+        <w:br/>
+        <w:t>Not sure about diffusion though. (maybe chapter 8 of fluid sim)</w:t>
+      </w:r>
+    </w:p>
+    <w:p/>
+    <w:p/>
+    <w:p/>
+    <w:p/>
+    <w:p>
+      <w:pPr>
+        <w:pStyle w:val="Kop1"/>
+      </w:pPr>
+      <w:r>
+        <w:t>Sunday 11-5-2025</w:t>
+      </w:r>
+    </w:p>
+    <w:p>
+      <w:r>
+        <w:t>So, I want to change the pressure gradient, velocity advection and maybe more.</w:t>
+      </w:r>
+    </w:p>
+    <w:p>
+      <w:r>
+        <w:t>Yeah I just need to read more of the fluid sim paper.</w:t>
+      </w:r>
+      <w:r>
+        <w:br/>
+        <w:t>Also, if I want value inside a grid, I might need to use half or something?(Like the midpoint):</w:t>
+      </w:r>
+      <w:r>
+        <w:br/>
+      </w:r>
+      <w:r>
+        <w:rPr>
+          <w:noProof/>
+        </w:rPr>
+        <w:drawing>
+          <wp:inline distT="0" distB="0" distL="0" distR="0" wp14:anchorId="304648F7" wp14:editId="7CA5A046">
+            <wp:extent cx="3816350" cy="890145"/>
+            <wp:effectExtent l="0" t="0" r="0" b="5715"/>
+            <wp:docPr id="465429276" name="Afbeelding 1" descr="Afbeelding met tekst, lijn, Lettertype, diagram&#10;&#10;Door AI gegenereerde inhoud is mogelijk onjuist."/>
+            <wp:cNvGraphicFramePr>
+              <a:graphicFrameLocks xmlns:a="http://schemas.openxmlformats.org/drawingml/2006/main" noChangeAspect="1"/>
+            </wp:cNvGraphicFramePr>
+            <a:graphic xmlns:a="http://schemas.openxmlformats.org/drawingml/2006/main">
+              <a:graphicData uri="http://schemas.openxmlformats.org/drawingml/2006/picture">
+                <pic:pic xmlns:pic="http://schemas.openxmlformats.org/drawingml/2006/picture">
+                  <pic:nvPicPr>
+                    <pic:cNvPr id="465429276" name="Afbeelding 1" descr="Afbeelding met tekst, lijn, Lettertype, diagram&#10;&#10;Door AI gegenereerde inhoud is mogelijk onjuist."/>
+                    <pic:cNvPicPr/>
+                  </pic:nvPicPr>
+                  <pic:blipFill>
+                    <a:blip r:embed="rId85"/>
+                    <a:stretch>
+                      <a:fillRect/>
+                    </a:stretch>
+                  </pic:blipFill>
+                  <pic:spPr>
+                    <a:xfrm>
+                      <a:off x="0" y="0"/>
+                      <a:ext cx="3822493" cy="891578"/>
+                    </a:xfrm>
+                    <a:prstGeom prst="rect">
+                      <a:avLst/>
+                    </a:prstGeom>
+                  </pic:spPr>
+                </pic:pic>
+              </a:graphicData>
+            </a:graphic>
+          </wp:inline>
+        </w:drawing>
+      </w:r>
+    </w:p>
+    <w:p/>
+    <w:p>
+      <w:r>
+        <w:t>Oh no, projection seems very complicated.</w:t>
+      </w:r>
+    </w:p>
+    <w:p/>
+    <w:p>
+      <w:pPr>
+        <w:pStyle w:val="Kop1"/>
+      </w:pPr>
+      <w:r>
+        <w:t>Friday 16-5-2025</w:t>
+      </w:r>
+    </w:p>
+    <w:p>
+      <w:r>
+        <w:t xml:space="preserve">I think I </w:t>
+      </w:r>
+      <w:proofErr w:type="spellStart"/>
+      <w:r>
+        <w:t>kinda</w:t>
+      </w:r>
+      <w:proofErr w:type="spellEnd"/>
+      <w:r>
+        <w:t xml:space="preserve"> understand:</w:t>
+      </w:r>
+      <w:r>
+        <w:br/>
+        <w:t xml:space="preserve">I first need to calculate the divergence (d) </w:t>
+      </w:r>
+      <w:r>
+        <w:br/>
+      </w:r>
+      <w:r>
+        <w:lastRenderedPageBreak/>
+        <w:t xml:space="preserve">After that I solve Ap = d, using </w:t>
+      </w:r>
+      <w:r>
+        <w:t>the Preconditioned Conjugate Gradient (PCG) algorithm with Modified Incomplete Cholesky (MIC(0)) as a preconditioner</w:t>
+      </w:r>
+      <w:r>
+        <w:t xml:space="preserve">, what a mouth full. </w:t>
+      </w:r>
+      <w:r>
+        <w:br/>
+        <w:t xml:space="preserve">Finally I use this to compute the new velocities. </w:t>
+      </w:r>
+    </w:p>
+    <w:p>
+      <w:r>
+        <w:t xml:space="preserve">As you can maybe see is the second step a bit harder than the rest. In the </w:t>
+      </w:r>
+      <w:proofErr w:type="spellStart"/>
+      <w:r>
+        <w:t>stormscapes</w:t>
+      </w:r>
+      <w:proofErr w:type="spellEnd"/>
+      <w:r>
+        <w:t xml:space="preserve"> paper, they iterate 20 times.</w:t>
+      </w:r>
+    </w:p>
+    <w:p>
+      <w:r>
+        <w:t>Weird that they don’t go deeper in the fact that this calculation is so deep.</w:t>
+      </w:r>
+    </w:p>
+    <w:p/>
+    <w:p>
+      <w:pPr>
+        <w:pStyle w:val="Kop1"/>
+      </w:pPr>
+      <w:r>
+        <w:t>Sunday 18-5-2025</w:t>
+      </w:r>
+    </w:p>
+    <w:p>
+      <w:r>
+        <w:t>Trying to understand the MIC(0) and MICCG(0) a bit more.</w:t>
+      </w:r>
+      <w:r>
+        <w:br/>
+        <w:t>If I ever need more performance and want it really bad, I could always take a look at finding a better solution to solve ‘matrix’ A. As stated: “</w:t>
+      </w:r>
+      <w:r>
+        <w:t xml:space="preserve">The matrix A is a very </w:t>
+      </w:r>
+      <w:proofErr w:type="spellStart"/>
+      <w:r>
+        <w:t>well known</w:t>
+      </w:r>
+      <w:proofErr w:type="spellEnd"/>
+      <w:r>
+        <w:t xml:space="preserve"> type of matrix, sometimes referred to as the five- or seven-point Laplacian matrix (in two or three dimensions respectively). It has been exhaustively studied</w:t>
+      </w:r>
+      <w:r>
+        <w:t>…” and: “</w:t>
+      </w:r>
+      <w:r>
+        <w:t>We won’t look very far into this vast body of work, beyond one particular algorithm that is both efficient and simple to implement</w:t>
+      </w:r>
+      <w:r>
+        <w:t xml:space="preserve">…”, this means that there probably is a more effective way, but way more complex. Also, this was from 2007 (if I am right) meaning, within 18 years, there probably is found a better way. </w:t>
+      </w:r>
+    </w:p>
+    <w:p/>
+    <w:p>
+      <w:pPr>
+        <w:pStyle w:val="Kop1"/>
+      </w:pPr>
+      <w:r>
+        <w:t>Tuesday 20-5-2025</w:t>
+      </w:r>
+    </w:p>
+    <w:p>
+      <w:r>
+        <w:t>Tried to understand Cholesky by trying it myself.</w:t>
+      </w:r>
+      <w:r>
+        <w:br/>
+        <w:t>I got the right mind, but I failed by calculating the lower and higher triangle… I understand it better though!</w:t>
       </w:r>
     </w:p>
     <w:sectPr>
@@ -6948,6 +10048,7 @@
   <w:style w:type="character" w:default="1" w:styleId="Standaardalinea-lettertype">
     <w:name w:val="Default Paragraph Font"/>
     <w:uiPriority w:val="1"/>
+    <w:semiHidden/>
     <w:unhideWhenUsed/>
   </w:style>
   <w:style w:type="table" w:default="1" w:styleId="Standaardtabel">

</xml_diff>